<commit_message>
docs(pr12): preserve report table accessibility
</commit_message>
<xml_diff>
--- a/docs/labs/pr12/ds/reports/0104-pz01-ds.docx
+++ b/docs/labs/pr12/ds/reports/0104-pz01-ds.docx
@@ -57,6 +57,9 @@
         <w:gridCol w:w="2743"/>
       </w:tblGrid>
       <w:tr>
+        <w:trPr>
+          <w:tblHeader w:val="true"/>
+        </w:trPr>
         <w:tc>
           <w:tcPr>
             <w:tcW w:w="3261" w:type="dxa"/>
@@ -300,6 +303,9 @@
         <w:gridCol w:w="9356"/>
       </w:tblGrid>
       <w:tr>
+        <w:trPr>
+          <w:tblHeader w:val="true"/>
+        </w:trPr>
         <w:tc>
           <w:tcPr>
             <w:tcW w:w="9356" w:type="dxa"/>
@@ -435,6 +441,9 @@
         <w:gridCol w:w="3018"/>
       </w:tblGrid>
       <w:tr>
+        <w:trPr>
+          <w:tblHeader w:val="true"/>
+        </w:trPr>
         <w:tc>
           <w:tcPr>
             <w:tcW w:w="1560" w:type="dxa"/>
@@ -818,6 +827,9 @@
         <w:gridCol w:w="4677"/>
       </w:tblGrid>
       <w:tr>
+        <w:trPr>
+          <w:tblHeader w:val="true"/>
+        </w:trPr>
         <w:tc>
           <w:tcPr>
             <w:tcW w:type="dxa" w:w="4677"/>
@@ -1028,6 +1040,9 @@
         <w:gridCol w:w="2339"/>
       </w:tblGrid>
       <w:tr>
+        <w:trPr>
+          <w:tblHeader w:val="true"/>
+        </w:trPr>
         <w:tc>
           <w:tcPr>
             <w:tcW w:type="dxa" w:w="2339"/>
@@ -1418,6 +1433,9 @@
         <w:gridCol w:w="3118"/>
       </w:tblGrid>
       <w:tr>
+        <w:trPr>
+          <w:tblHeader w:val="true"/>
+        </w:trPr>
         <w:tc>
           <w:tcPr>
             <w:tcW w:type="dxa" w:w="3118"/>
@@ -1676,6 +1694,9 @@
         <w:gridCol w:w="2339"/>
       </w:tblGrid>
       <w:tr>
+        <w:trPr>
+          <w:tblHeader w:val="true"/>
+        </w:trPr>
         <w:tc>
           <w:tcPr>
             <w:tcW w:type="dxa" w:w="2339"/>

</xml_diff>

<commit_message>
HIT-47: add correction evidence and full report package
</commit_message>
<xml_diff>
--- a/docs/labs/pr12/ds/reports/0104-pz01-ds.docx
+++ b/docs/labs/pr12/ds/reports/0104-pz01-ds.docx
@@ -801,11 +801,6 @@
     </w:p>
     <w:p>
       <w:r>
-        <w:t>Шаблон адаптирован к приложенной актуальной методичке. Это НЕ выполненный отчёт. Автор заполняет только фактические результаты со ссылками на commit, команды и журналы. Агент не делает и не генерирует скриншоты: каждый рисунок вставляет студент по инструкции. После заполнения текста, таблиц, ссылок и точных инструкций, но до вставки реальных изображений, допустим статус CONTENT_READY_IMAGES_PENDING; он не означает готовность к сдаче. Непроведённые действия имеют статус NOT RUN, реальные ограничения — BLOCKED. Независимые проверки, оппонирование, разговор с пользователем и подписи нельзя имитировать. Перед экспортом обновить оглавление и номера страниц в Word/LibreOffice.</w:t>
-      </w:r>
-    </w:p>
-    <w:p>
-      <w:r>
         <w:t>Экспортная форма подготовлена по разделу 5 и приложению А актуальной методички МДК01.04. Отдельного исходного шаблона преподавателя для этой дисциплины во вложениях нет. Совместную сдачу с отчётом другого МДК не считать автоматически разрешённой.</w:t>
       </w:r>
     </w:p>
@@ -934,7 +929,7 @@
           </w:tcPr>
           <w:p>
             <w:r>
-              <w:t>0104-pz01-ds-v1 → 2ac0797ab620c7a6af23320ef8872751c40898aa</w:t>
+              <w:t>0104-pz01-ds-v1 → 7e815aa790e0ebba58e453e786bda45b9266161d</w:t>
             </w:r>
           </w:p>
         </w:tc>
@@ -1016,7 +1011,7 @@
     </w:p>
     <w:p>
       <w:r>
-        <w:t>Цель: подготовить воспроизводимо исполняемый компонент и объяснить путь от исходного кода к процессу. Собственная существенная часть: CLI delivery-contractcheck, exact fixture smoke, version/config diagnostics and release-outside-checkout reproduction. Граница результата и среда: synthetic delivery contract only; Windows local run and Ubuntu 24.04 GitHub Actions. ADR выбора стека https://github.com/hitpipe/hitpipe/blob/2ac0797ab620c7a6af23320ef8872751c40898aa/docs/labs/pr12/ds/implementation-adr.md; автор общей записи Дмитрий Стацюк, применение к своему участку TargetReadback keeps provider IO outside domain and exposes deterministic diagnostics. Не присваивать себе существующий общий ADR.</w:t>
+        <w:t>Цель: подготовить воспроизводимо исполняемый компонент и объяснить путь от исходного кода к процессу. Собственная существенная часть: CLI delivery-contractcheck, exact fixture smoke, version/config diagnostics and release-outside-checkout reproduction. Граница результата и среда: synthetic delivery contract only; Windows local run and Ubuntu 24.04 GitHub Actions. ADR выбора стека https://github.com/hitpipe/hitpipe/blob/7e815aa790e0ebba58e453e786bda45b9266161d/docs/labs/pr12/ds/implementation-adr.md; автор общей записи Дмитрий Стацюк, применение к своему участку TargetReadback keeps provider IO outside domain and exposes deterministic diagnostics. Не присваивать себе существующий общий ADR.</w:t>
       </w:r>
     </w:p>
     <w:p>
@@ -1121,7 +1116,7 @@
           </w:tcPr>
           <w:p>
             <w:r>
-              <w:t>Candidate / In Review; автоматические проверки PASS</w:t>
+              <w:t>Candidate / In Review; local automated checks PASS; independent re-review pending</w:t>
             </w:r>
           </w:p>
         </w:tc>
@@ -1163,7 +1158,7 @@
           </w:tcPr>
           <w:p>
             <w:r>
-              <w:t>Candidate / In Review; автоматические проверки PASS</w:t>
+              <w:t>Candidate / In Review; local automated checks PASS; independent re-review pending</w:t>
             </w:r>
           </w:p>
         </w:tc>
@@ -1205,7 +1200,7 @@
           </w:tcPr>
           <w:p>
             <w:r>
-              <w:t>Candidate / In Review; автоматические проверки PASS</w:t>
+              <w:t>Candidate / In Review; local automated checks PASS; independent re-review pending</w:t>
             </w:r>
           </w:p>
         </w:tc>
@@ -1247,7 +1242,7 @@
           </w:tcPr>
           <w:p>
             <w:r>
-              <w:t>Candidate / In Review; автоматические проверки PASS</w:t>
+              <w:t>Candidate / In Review; local automated checks PASS; independent re-review pending</w:t>
             </w:r>
           </w:p>
         </w:tc>
@@ -1289,7 +1284,7 @@
           </w:tcPr>
           <w:p>
             <w:r>
-              <w:t>Candidate / In Review; автоматические проверки PASS</w:t>
+              <w:t>Candidate / In Review; local automated checks PASS; independent re-review pending</w:t>
             </w:r>
           </w:p>
         </w:tc>
@@ -1331,7 +1326,7 @@
           </w:tcPr>
           <w:p>
             <w:r>
-              <w:t>Candidate / In Review; автоматические проверки PASS</w:t>
+              <w:t>Candidate / In Review; local automated checks PASS; independent re-review pending</w:t>
             </w:r>
           </w:p>
         </w:tc>
@@ -1373,7 +1368,7 @@
           </w:tcPr>
           <w:p>
             <w:r>
-              <w:t>Candidate / In Review; автоматические проверки PASS</w:t>
+              <w:t>Candidate / In Review; local automated checks PASS; independent re-review pending</w:t>
             </w:r>
           </w:p>
         </w:tc>
@@ -1397,7 +1392,7 @@
     </w:p>
     <w:p>
       <w:r>
-        <w:t>Задача https://hitpipe.atlassian.net/browse/HIT-46 → ветка work/HIT-46-ds-module-adr → PR https://github.com/hitpipe/hitpipe/pull/27 → реальные проверки https://github.com/hitpipe/hitpipe/actions/runs/39249913415 → независимый review PENDING HUMAN REVIEW → merge NOT MERGED. Показать собственный фрагмент (рисунок 1); прямые изменения main не допускаются.</w:t>
+        <w:t>Задача https://hitpipe.atlassian.net/browse/HIT-46 → ветка work/HIT-47-ds-corrections → PR https://github.com/hitpipe/hitpipe/pull/27 → реальные проверки PENDING NEW CI RUN FOR CORRECTION HEAD → независимый review PENDING HUMAN REVIEW → merge NOT MERGED. Показать собственный фрагмент (рисунок 1); прямые изменения main не допускаются.</w:t>
       </w:r>
     </w:p>
     <w:p>
@@ -1410,7 +1405,7 @@
     </w:p>
     <w:p>
       <w:r>
-        <w:t>Схема: services/delivery/go.mod + internal/domain/readback + cmd/delivery-contractcheck + testdata → go mod tidy; Go 1.27.2; golang.org/x/text v0.28.0 → go build with dev/release flags; CLI reads fixture, validates config/format, emits JSON → .pr12-build/delivery/{dev,release}/delivery-contractcheck → run --version and --fixture ... --format json from a temporary directory outside checkout. Указывать только существующие стадии Go/Node/Python. Команда просмотра результата go version -m .pr12-build/delivery/release/delivery-contractcheck, существенный фактический вывод NOT RECORDED in the current evidence log; human capture is required before final submission. Для Go подходят go version -m, file/readelf/ldd с честным выводом о статической линковке; для Next/Python — пакет/модули/bytecode и закреплённые зависимости. Наличие инструмента не равно выполненному наблюдению.</w:t>
+        <w:t>Схема: services/delivery/go.mod + internal/domain/readback + cmd/delivery-contractcheck + testdata → go mod tidy; Go 1.27.2; golang.org/x/text v0.28.0 → go build with dev/release flags; CLI reads fixture, validates config/format, emits JSON → .pr12-build/delivery/{dev,release}/delivery-contractcheck → run --version and --fixture ... --format json from a temporary directory outside checkout. Указывать только существующие стадии Go/Node/Python. Команда просмотра результата go version -m .pr12-build/delivery/release/delivery-contractcheck, существенный фактический вывод workspace.py smoke recorded dev/release PASS; go version -m inspection is a human capture step. Для Go подходят go version -m, file/readelf/ldd с честным выводом о статической линковке; для Next/Python — пакет/модули/bytecode и закреплённые зависимости. Наличие инструмента не равно выполненному наблюдению.</w:t>
       </w:r>
     </w:p>
     <w:p>
@@ -1977,7 +1972,7 @@
     </w:p>
     <w:p>
       <w:r>
-        <w:t>CI сдаваемой версии https://github.com/hitpipe/hitpipe/actions/runs/39249913415 выполняет workspace.py check delivery; workspace.py smoke delivery --require, сбой условия даёт ненулевой exit. Долгий процесс имеет timeout readiness и корректную остановку. Локальная отрицательная демонстрация той же проверки workspace.py smoke log; actual negative exit observed locally, после неё исправный код восстановлен. Граница автоматизации/ручной проверки synthetic fixtures; no provider GET/POST, permissions, state transition or customer data. Рисунок 7.</w:t>
+        <w:t>CI сдаваемой версии PENDING NEW CI RUN FOR CORRECTION HEAD выполняет workspace.py check delivery; workspace.py smoke delivery --require, сбой условия даёт ненулевой exit. Долгий процесс имеет timeout readiness и корректную остановку. Локальная отрицательная демонстрация той же проверки workspace.py smoke log; actual negative exit observed locally, после неё исправный код восстановлен. Граница автоматизации/ручной проверки synthetic fixtures; no provider GET/POST, permissions, state transition or customer data. Рисунок 7.</w:t>
       </w:r>
     </w:p>
     <w:p>
@@ -2034,7 +2029,7 @@
     </w:p>
     <w:p>
       <w:r>
-        <w:t>Что открыть/выполнить: Открыть https://github.com/hitpipe/hitpipe/blob/2ac0797ab620c7a6af23320ef8872751c40898aa/services/delivery/cmd/delivery-contractcheck/main.go#L1-L80 либо тот же файл в редакторе на этой версии. Показать путь, существенную собственную логику конфигурации/версии/диагностики и связь с PR https://github.com/hitpipe/hitpipe/pull/27.</w:t>
+        <w:t>Что открыть/выполнить: Открыть https://github.com/hitpipe/hitpipe/blob/7e815aa790e0ebba58e453e786bda45b9266161d/services/delivery/cmd/delivery-contractcheck/main.go#L1-L80 либо тот же файл в редакторе на этой версии. Показать путь, существенную собственную логику конфигурации/версии/диагностики и связь с PR https://github.com/hitpipe/hitpipe/pull/27.</w:t>
       </w:r>
     </w:p>
     <w:p>
@@ -2062,7 +2057,7 @@
     </w:p>
     <w:p>
       <w:r>
-        <w:t>Что открыть/выполнить: На одной версии 2ac0797ab620c7a6af23320ef8872751c40898aa выполнить go build -ldflags "-X main.version=pr12 -X main.commit=2ac0797..." -gcflags=all=-N -l -o .pr12-build/delivery/dev/delivery-contractcheck ./cmd/delivery-contractcheck и go build -trimpath -ldflags "-X main.version=pr12 -X main.commit=2ac0797..." -o .pr12-build/delivery/release/delivery-contractcheck ./cmd/delivery-contractcheck. Показать команды и реальные существенные настройки: оптимизации, отладочную информацию, runtime-проверки/конфигурацию, фактические результаты сборок. Если строка не различается между режимами, сохранить вывод и объяснить это в таблице.</w:t>
+        <w:t>Что открыть/выполнить: На одной версии 7e815aa790e0ebba58e453e786bda45b9266161d выполнить go build -ldflags "-X main.version=pr12 -X main.commit=7e815aa790e0ebba58e453e786bda45b9266161d" -gcflags=all=-N -l -o .pr12-build/delivery/dev/delivery-contractcheck ./cmd/delivery-contractcheck и go build -trimpath -ldflags "-X main.version=pr12 -X main.commit=7e815aa790e0ebba58e453e786bda45b9266161d" -o .pr12-build/delivery/release/delivery-contractcheck ./cmd/delivery-contractcheck. Показать команды и реальные существенные настройки: оптимизации, отладочную информацию, runtime-проверки/конфигурацию, фактические результаты сборок. Если строка не различается между режимами, сохранить вывод и объяснить это в таблице.</w:t>
       </w:r>
     </w:p>
     <w:p>
@@ -2118,7 +2113,7 @@
     </w:p>
     <w:p>
       <w:r>
-        <w:t>Что открыть/выполнить: На версии 2ac0797ab620c7a6af23320ef8872751c40898aa выполнить delivery-contractcheck --config default --fixture testdata/match.json --format json; показать безопасное значение конфигурации, версию/SHA, диагностическую запись, ожидаемый результат и код завершения. Для долгого сервиса показать ограниченную проверку готовности и корректную остановку.</w:t>
+        <w:t>Что открыть/выполнить: На версии 7e815aa790e0ebba58e453e786bda45b9266161d выполнить delivery-contractcheck --config default --fixture testdata/match.json --format json; показать безопасное значение конфигурации, версию/SHA, диагностическую запись, ожидаемый результат и код завершения. Для долгого сервиса показать ограниченную проверку готовности и корректную остановку.</w:t>
       </w:r>
     </w:p>
     <w:p>
@@ -2202,7 +2197,7 @@
     </w:p>
     <w:p>
       <w:r>
-        <w:t>Что открыть/выполнить: В изолированной временной ветке нарушить условие unsupported CLI config or format, затем выполнить py -3 tools/pr12/workspace.py check delivery. Показать смысловое нарушение, точную команду той же проверки, реально неуспешный результат и код завершения. После фиксации журнала восстановить исправный код; ссылка на обычный CI прогон — https://github.com/hitpipe/hitpipe/actions/runs/39249913415.</w:t>
+        <w:t>Что открыть/выполнить: В изолированной временной ветке нарушить условие unsupported CLI config or format, затем выполнить py -3 tools/pr12/workspace.py check delivery. Показать смысловое нарушение, точную команду той же проверки, реально неуспешный результат и код завершения. После фиксации журнала восстановить исправный код; ссылка на обычный CI прогон — PENDING NEW CI RUN FOR CORRECTION HEAD.</w:t>
       </w:r>
     </w:p>
     <w:p>

</xml_diff>

<commit_message>
HIT-47: complete report text and screenshot instructions
</commit_message>
<xml_diff>
--- a/docs/labs/pr12/ds/reports/0104-pz01-ds.docx
+++ b/docs/labs/pr12/ds/reports/0104-pz01-ds.docx
@@ -1116,7 +1116,7 @@
           </w:tcPr>
           <w:p>
             <w:r>
-              <w:t>Candidate / In Review; local automated checks PASS; independent re-review pending</w:t>
+              <w:t>Candidate / In Review; local and remote automated checks PASS for the evidence/report commit; independent delegated repeat review pending</w:t>
             </w:r>
           </w:p>
         </w:tc>
@@ -1158,7 +1158,7 @@
           </w:tcPr>
           <w:p>
             <w:r>
-              <w:t>Candidate / In Review; local automated checks PASS; independent re-review pending</w:t>
+              <w:t>Candidate / In Review; local and remote automated checks PASS for the evidence/report commit; independent delegated repeat review pending</w:t>
             </w:r>
           </w:p>
         </w:tc>
@@ -1200,7 +1200,7 @@
           </w:tcPr>
           <w:p>
             <w:r>
-              <w:t>Candidate / In Review; local automated checks PASS; independent re-review pending</w:t>
+              <w:t>Candidate / In Review; local and remote automated checks PASS for the evidence/report commit; independent delegated repeat review pending</w:t>
             </w:r>
           </w:p>
         </w:tc>
@@ -1242,7 +1242,7 @@
           </w:tcPr>
           <w:p>
             <w:r>
-              <w:t>Candidate / In Review; local automated checks PASS; independent re-review pending</w:t>
+              <w:t>Candidate / In Review; local and remote automated checks PASS for the evidence/report commit; independent delegated repeat review pending</w:t>
             </w:r>
           </w:p>
         </w:tc>
@@ -1284,7 +1284,7 @@
           </w:tcPr>
           <w:p>
             <w:r>
-              <w:t>Candidate / In Review; local automated checks PASS; independent re-review pending</w:t>
+              <w:t>Candidate / In Review; local and remote automated checks PASS for the evidence/report commit; independent delegated repeat review pending</w:t>
             </w:r>
           </w:p>
         </w:tc>
@@ -1326,7 +1326,7 @@
           </w:tcPr>
           <w:p>
             <w:r>
-              <w:t>Candidate / In Review; local automated checks PASS; independent re-review pending</w:t>
+              <w:t>Candidate / In Review; local and remote automated checks PASS for the evidence/report commit; independent delegated repeat review pending</w:t>
             </w:r>
           </w:p>
         </w:tc>
@@ -1368,7 +1368,7 @@
           </w:tcPr>
           <w:p>
             <w:r>
-              <w:t>Candidate / In Review; local automated checks PASS; independent re-review pending</w:t>
+              <w:t>Candidate / In Review; local and remote automated checks PASS for the evidence/report commit; independent delegated repeat review pending</w:t>
             </w:r>
           </w:p>
         </w:tc>
@@ -1392,7 +1392,7 @@
     </w:p>
     <w:p>
       <w:r>
-        <w:t>Задача https://hitpipe.atlassian.net/browse/HIT-46 → ветка work/HIT-47-ds-corrections → PR https://github.com/hitpipe/hitpipe/pull/27 → реальные проверки PENDING NEW CI RUN FOR CORRECTION HEAD → независимый review PENDING HUMAN REVIEW → merge NOT MERGED. Показать собственный фрагмент (рисунок 1); прямые изменения main не допускаются.</w:t>
+        <w:t>Задача https://hitpipe.atlassian.net/browse/HIT-47 → ветка work/HIT-47-ds-corrections → PR https://github.com/hitpipe/hitpipe/pull/29 → реальные проверки https://github.com/hitpipe/hitpipe/actions/runs/39271075578 (success for evidence/report commit c365ad5689da032fb9d53c115fe8f9791bbc031e; latest docs-only head 9ebe6373467ded83f32939a849bac31905eed99 has no separate run attached) → независимый review PENDING HUMAN REVIEW → merge NOT MERGED. Показать собственный фрагмент (рисунок 1); прямые изменения main не допускаются.</w:t>
       </w:r>
     </w:p>
     <w:p>
@@ -1405,7 +1405,7 @@
     </w:p>
     <w:p>
       <w:r>
-        <w:t>Схема: services/delivery/go.mod + internal/domain/readback + cmd/delivery-contractcheck + testdata → go mod tidy; Go 1.27.2; golang.org/x/text v0.28.0 → go build with dev/release flags; CLI reads fixture, validates config/format, emits JSON → .pr12-build/delivery/{dev,release}/delivery-contractcheck → run --version and --fixture ... --format json from a temporary directory outside checkout. Указывать только существующие стадии Go/Node/Python. Команда просмотра результата go version -m .pr12-build/delivery/release/delivery-contractcheck, существенный фактический вывод workspace.py smoke recorded dev/release PASS; go version -m inspection is a human capture step. Для Go подходят go version -m, file/readelf/ldd с честным выводом о статической линковке; для Next/Python — пакет/модули/bytecode и закреплённые зависимости. Наличие инструмента не равно выполненному наблюдению.</w:t>
+        <w:t>Схема: services/delivery/go.mod + internal/domain/readback + cmd/delivery-contractcheck + testdata → go mod tidy; Go 1.27.2; golang.org/x/text v0.28.0 → go build with dev/release flags; CLI reads fixture, validates config/format, emits JSON → .pr12-build/delivery/{dev,release}/delivery-contractcheck → run --version and --fixture ... --format json from a temporary directory outside checkout. Указывать только существующие стадии Go/Node/Python. Команда просмотра результата go version -m .pr12-build/delivery/release/delivery-contractcheck, существенный фактический вывод workspace.py smoke recorded dev/release PASS; go version -m inspection is an explicit human capture step and is not claimed as completed by the agent. Для Go подходят go version -m, file/readelf/ldd с честным выводом о статической линковке; для Next/Python — пакет/модули/bytecode и закреплённые зависимости. Наличие инструмента не равно выполненному наблюдению.</w:t>
       </w:r>
     </w:p>
     <w:p>
@@ -1972,7 +1972,7 @@
     </w:p>
     <w:p>
       <w:r>
-        <w:t>CI сдаваемой версии PENDING NEW CI RUN FOR CORRECTION HEAD выполняет workspace.py check delivery; workspace.py smoke delivery --require, сбой условия даёт ненулевой exit. Долгий процесс имеет timeout readiness и корректную остановку. Локальная отрицательная демонстрация той же проверки workspace.py smoke log; actual negative exit observed locally, после неё исправный код восстановлен. Граница автоматизации/ручной проверки synthetic fixtures; no provider GET/POST, permissions, state transition or customer data. Рисунок 7.</w:t>
+        <w:t>CI сдаваемой версии https://github.com/hitpipe/hitpipe/actions/runs/39271075578 (success for evidence/report commit c365ad5689da032fb9d53c115fe8f9791bbc031e; latest docs-only head 9ebe6373467ded83f32939a849bac31905eed99 has no separate run attached) выполняет workspace.py check delivery; workspace.py smoke delivery --require, сбой условия даёт ненулевой exit. Долгий процесс имеет timeout readiness и корректную остановку. Локальная отрицательная демонстрация той же проверки workspace.py smoke log; actual negative exit observed locally, после неё исправный код восстановлен. Граница автоматизации/ручной проверки synthetic fixtures; no provider GET/POST, permissions, state transition or customer data. Рисунок 7.</w:t>
       </w:r>
     </w:p>
     <w:p>
@@ -2011,7 +2011,7 @@
     </w:p>
     <w:p>
       <w:r>
-        <w:t>Каждый слот заполнить реальным снимком вручную. До выдачи инструкции студенту агент обязан заменить все NOT CONDUCTED / HUMAN ACTION REQUIRED в инструкции фактическими URL, путями, командами, SHA, тегом и именами из выполненной задачи. Неразрешённый адрес или команда не считаются готовой инструкцией. Если действие не выполнено, отметить NOT RUN/BLOCKED и конкретное действие ответственного человека; не рисовать подтверждение.</w:t>
+        <w:t>Каждый слот заполнить реальным снимком вручную. Все агентские команды, URL, cwd, SHA, версии, ожидаемые признаки, имена PNG, подписи и правила сокрытия уже указаны в инструкции к конкретному рисунку. Слоты NOT CONDUCTED / HUMAN ACTION REQUIRED относятся только к личным учебным действиям или независимому human gate; их нельзя выдавать за PASS и нельзя заменять выдуманными данными.</w:t>
       </w:r>
     </w:p>
     <w:p>
@@ -2029,7 +2029,7 @@
     </w:p>
     <w:p>
       <w:r>
-        <w:t>Что открыть/выполнить: Открыть https://github.com/hitpipe/hitpipe/blob/7e815aa790e0ebba58e453e786bda45b9266161d/services/delivery/cmd/delivery-contractcheck/main.go#L1-L80 либо тот же файл в редакторе на этой версии. Показать путь, существенную собственную логику конфигурации/версии/диагностики и связь с PR https://github.com/hitpipe/hitpipe/pull/27.</w:t>
+        <w:t>Что открыть/выполнить: Открыть https://github.com/hitpipe/hitpipe/blob/7e815aa790e0ebba58e453e786bda45b9266161d/services/delivery/cmd/delivery-contractcheck/main.go#L1-L80 либо тот же файл в редакторе на этой версии. Показать путь, существенную собственную логику конфигурации/версии/диагностики и связь с PR https://github.com/hitpipe/hitpipe/pull/29.</w:t>
       </w:r>
     </w:p>
     <w:p>
@@ -2197,7 +2197,7 @@
     </w:p>
     <w:p>
       <w:r>
-        <w:t>Что открыть/выполнить: В изолированной временной ветке нарушить условие unsupported CLI config or format, затем выполнить py -3 tools/pr12/workspace.py check delivery. Показать смысловое нарушение, точную команду той же проверки, реально неуспешный результат и код завершения. После фиксации журнала восстановить исправный код; ссылка на обычный CI прогон — PENDING NEW CI RUN FOR CORRECTION HEAD.</w:t>
+        <w:t>Что открыть/выполнить: В изолированной временной ветке нарушить условие unsupported CLI config or format, затем выполнить py -3 tools/pr12/workspace.py check delivery. Показать смысловое нарушение, точную команду той же проверки, реально неуспешный результат и код завершения. После фиксации журнала восстановить исправный код; ссылка на обычный CI прогон — https://github.com/hitpipe/hitpipe/actions/runs/39271075578 (success for evidence/report commit c365ad5689da032fb9d53c115fe8f9791bbc031e; latest docs-only head 9ebe6373467ded83f32939a849bac31905eed99 has no separate run attached).</w:t>
       </w:r>
     </w:p>
     <w:p>
@@ -2235,7 +2235,7 @@
     </w:p>
     <w:p>
       <w:r>
-        <w:t>• Artifact inspection with go version -m: NOT RECORDED; human capture remains required.</w:t>
+        <w:t>• Artifact inspection command is fully specified in the figure instructions and remains a human capture step; the agent does not claim a screenshot or completed artifact-inspection capture.</w:t>
       </w:r>
     </w:p>
     <w:p>

</xml_diff>

<commit_message>
HIT-47: complete round-two reports and evidence
</commit_message>
<xml_diff>
--- a/docs/labs/pr12/ds/reports/0104-pz01-ds.docx
+++ b/docs/labs/pr12/ds/reports/0104-pz01-ds.docx
@@ -351,6 +351,7 @@
           <w:rFonts w:eastAsia="Times New Roman"/>
         </w:rPr>
       </w:pPr>
+      <w:r/>
     </w:p>
     <w:p>
       <w:pPr>
@@ -360,6 +361,7 @@
           <w:rFonts w:eastAsia="Times New Roman"/>
         </w:rPr>
       </w:pPr>
+      <w:r/>
     </w:p>
     <w:p>
       <w:pPr>
@@ -369,6 +371,7 @@
           <w:rFonts w:eastAsia="Times New Roman"/>
         </w:rPr>
       </w:pPr>
+      <w:r/>
     </w:p>
     <w:p>
       <w:pPr>
@@ -378,6 +381,7 @@
           <w:rFonts w:eastAsia="Times New Roman"/>
         </w:rPr>
       </w:pPr>
+      <w:r/>
     </w:p>
     <w:p>
       <w:pPr>
@@ -387,6 +391,7 @@
           <w:rFonts w:eastAsia="Times New Roman"/>
         </w:rPr>
       </w:pPr>
+      <w:r/>
     </w:p>
     <w:p>
       <w:pPr>
@@ -396,6 +401,7 @@
           <w:rFonts w:eastAsia="Times New Roman"/>
         </w:rPr>
       </w:pPr>
+      <w:r/>
     </w:p>
     <w:p>
       <w:pPr>
@@ -405,6 +411,7 @@
           <w:rFonts w:eastAsia="Times New Roman"/>
         </w:rPr>
       </w:pPr>
+      <w:r/>
     </w:p>
     <w:p>
       <w:pPr>
@@ -787,9 +794,7 @@
       </w:r>
     </w:p>
     <w:p>
-      <w:r>
-        <w:br w:type="page"/>
-      </w:r>
+      <w:r/>
     </w:p>
     <w:p>
       <w:pPr>
@@ -929,7 +934,7 @@
           </w:tcPr>
           <w:p>
             <w:r>
-              <w:t>0104-pz01-ds-v1 → 7e815aa790e0ebba58e453e786bda45b9266161d</w:t>
+              <w:t>не создан — human/Lead gate; correction source bafc97a0eb5cc2b2aba68c04a74b179b61432d82</w:t>
             </w:r>
           </w:p>
         </w:tc>
@@ -995,7 +1000,7 @@
           </w:tcPr>
           <w:p>
             <w:r>
-              <w:t>TEMPLATE_UNFILLED</w:t>
+              <w:t>CONTENT_READY_IMAGES_PENDING; automated content available, human screenshots/review/merge pending</w:t>
             </w:r>
           </w:p>
         </w:tc>
@@ -1011,7 +1016,7 @@
     </w:p>
     <w:p>
       <w:r>
-        <w:t>Цель: подготовить воспроизводимо исполняемый компонент и объяснить путь от исходного кода к процессу. Собственная существенная часть: CLI delivery-contractcheck, exact fixture smoke, version/config diagnostics and release-outside-checkout reproduction. Граница результата и среда: synthetic delivery contract only; Windows local run and Ubuntu 24.04 GitHub Actions. ADR выбора стека https://github.com/hitpipe/hitpipe/blob/7e815aa790e0ebba58e453e786bda45b9266161d/docs/labs/pr12/ds/implementation-adr.md; автор общей записи Дмитрий Стацюк, применение к своему участку TargetReadback keeps provider IO outside domain and exposes deterministic diagnostics. Не присваивать себе существующий общий ADR.</w:t>
+        <w:t>Цель: подготовить воспроизводимо исполняемый компонент и объяснить путь от исходного кода к процессу. Собственная существенная часть: CLI delivery-contractcheck, exact fixture smoke, version/config diagnostics and release-outside-checkout reproduction. Граница результата и среда: synthetic delivery contract only; Windows local run and Ubuntu 24.04 GitHub Actions. ADR выбора стека https://github.com/hitpipe/hitpipe/blob/bafc97a0eb5cc2b2aba68c04a74b179b61432d82/docs/labs/pr12/ds/implementation-adr.md; автор общей записи Дмитрий Стацюк, применение к своему участку TargetReadback keeps provider IO outside domain and exposes deterministic diagnostics. Не присваивать себе существующий общий ADR.</w:t>
       </w:r>
     </w:p>
     <w:p>
@@ -1096,7 +1101,7 @@
           </w:tcPr>
           <w:p>
             <w:r>
-              <w:t>Go 1.27.2; GCC 16.2.0 (MSYS2 UCRT64)</w:t>
+              <w:t>Go 1.27.2; GCC 16.2.0</w:t>
             </w:r>
           </w:p>
         </w:tc>
@@ -1106,7 +1111,7 @@
           </w:tcPr>
           <w:p>
             <w:r>
-              <w:t>services/delivery/cmd/delivery-contractcheck</w:t>
+              <w:t>go build; services/delivery/cmd/delivery-contractcheck; dev/release output</w:t>
             </w:r>
           </w:p>
         </w:tc>
@@ -1116,7 +1121,7 @@
           </w:tcPr>
           <w:p>
             <w:r>
-              <w:t>Candidate / In Review; local and remote automated checks PASS for the evidence/report commit; independent delegated repeat review pending</w:t>
+              <w:t>PASS locally; source commit and log recorded</w:t>
             </w:r>
           </w:p>
         </w:tc>
@@ -1138,7 +1143,7 @@
           </w:tcPr>
           <w:p>
             <w:r>
-              <w:t>Go 1.27.2; GCC 16.2.0 (MSYS2 UCRT64)</w:t>
+              <w:t>Go modules; golang.org/x/text v0.28.0</w:t>
             </w:r>
           </w:p>
         </w:tc>
@@ -1148,7 +1153,7 @@
           </w:tcPr>
           <w:p>
             <w:r>
-              <w:t>services/delivery/cmd/delivery-contractcheck</w:t>
+              <w:t>services/delivery/go.mod + go.sum; go mod download/tidy</w:t>
             </w:r>
           </w:p>
         </w:tc>
@@ -1158,7 +1163,7 @@
           </w:tcPr>
           <w:p>
             <w:r>
-              <w:t>Candidate / In Review; local and remote automated checks PASS for the evidence/report commit; independent delegated repeat review pending</w:t>
+              <w:t>PASS; lockfiles committed</w:t>
             </w:r>
           </w:p>
         </w:tc>
@@ -1180,7 +1185,7 @@
           </w:tcPr>
           <w:p>
             <w:r>
-              <w:t>Go 1.27.2; GCC 16.2.0 (MSYS2 UCRT64)</w:t>
+              <w:t>Go test; race detector with GCC 16.2.0</w:t>
             </w:r>
           </w:p>
         </w:tc>
@@ -1190,7 +1195,7 @@
           </w:tcPr>
           <w:p>
             <w:r>
-              <w:t>services/delivery/cmd/delivery-contractcheck</w:t>
+              <w:t>go test ./... and CGO_ENABLED=1 go test -race ./...</w:t>
             </w:r>
           </w:p>
         </w:tc>
@@ -1200,7 +1205,7 @@
           </w:tcPr>
           <w:p>
             <w:r>
-              <w:t>Candidate / In Review; local and remote automated checks PASS for the evidence/report commit; independent delegated repeat review pending</w:t>
+              <w:t>PASS locally; logs in docs/labs/pr12/ds/evidence/</w:t>
             </w:r>
           </w:p>
         </w:tc>
@@ -1222,7 +1227,7 @@
           </w:tcPr>
           <w:p>
             <w:r>
-              <w:t>Go 1.27.2; GCC 16.2.0 (MSYS2 UCRT64)</w:t>
+              <w:t>go vet Go 1.27.2</w:t>
             </w:r>
           </w:p>
         </w:tc>
@@ -1232,7 +1237,7 @@
           </w:tcPr>
           <w:p>
             <w:r>
-              <w:t>services/delivery/cmd/delivery-contractcheck</w:t>
+              <w:t>go vet ./... from services/delivery</w:t>
             </w:r>
           </w:p>
         </w:tc>
@@ -1242,7 +1247,7 @@
           </w:tcPr>
           <w:p>
             <w:r>
-              <w:t>Candidate / In Review; local and remote automated checks PASS for the evidence/report commit; independent delegated repeat review pending</w:t>
+              <w:t>PASS locally; log recorded</w:t>
             </w:r>
           </w:p>
         </w:tc>
@@ -1264,7 +1269,7 @@
           </w:tcPr>
           <w:p>
             <w:r>
-              <w:t>Go 1.27.2; GCC 16.2.0 (MSYS2 UCRT64)</w:t>
+              <w:t>delivery-contractcheck synthetic fixture CLI</w:t>
             </w:r>
           </w:p>
         </w:tc>
@@ -1274,7 +1279,7 @@
           </w:tcPr>
           <w:p>
             <w:r>
-              <w:t>services/delivery/cmd/delivery-contractcheck</w:t>
+              <w:t>workspace.py smoke delivery --require outside checkout</w:t>
             </w:r>
           </w:p>
         </w:tc>
@@ -1284,7 +1289,7 @@
           </w:tcPr>
           <w:p>
             <w:r>
-              <w:t>Candidate / In Review; local and remote automated checks PASS for the evidence/report commit; independent delegated repeat review pending</w:t>
+              <w:t>PASS; positive and negative exit recorded</w:t>
             </w:r>
           </w:p>
         </w:tc>
@@ -1306,7 +1311,7 @@
           </w:tcPr>
           <w:p>
             <w:r>
-              <w:t>Go 1.27.2; GCC 16.2.0 (MSYS2 UCRT64)</w:t>
+              <w:t>Go pprof — not executed in this correction</w:t>
             </w:r>
           </w:p>
         </w:tc>
@@ -1316,7 +1321,7 @@
           </w:tcPr>
           <w:p>
             <w:r>
-              <w:t>services/delivery/cmd/delivery-contractcheck</w:t>
+              <w:t>planned after acceptance for CPU/memory of comparator and FileReader</w:t>
             </w:r>
           </w:p>
         </w:tc>
@@ -1326,7 +1331,7 @@
           </w:tcPr>
           <w:p>
             <w:r>
-              <w:t>Candidate / In Review; local and remote automated checks PASS for the evidence/report commit; independent delegated repeat review pending</w:t>
+              <w:t>PLANNED; no performance claim</w:t>
             </w:r>
           </w:p>
         </w:tc>
@@ -1348,7 +1353,7 @@
           </w:tcPr>
           <w:p>
             <w:r>
-              <w:t>Go 1.27.2; GCC 16.2.0 (MSYS2 UCRT64)</w:t>
+              <w:t>GitHub Actions</w:t>
             </w:r>
           </w:p>
         </w:tc>
@@ -1358,7 +1363,7 @@
           </w:tcPr>
           <w:p>
             <w:r>
-              <w:t>services/delivery/cmd/delivery-contractcheck</w:t>
+              <w:t>https://github.com/hitpipe/hitpipe/actions/runs/39271075578 (evidence/report commit c365ad5; latest correction head gets a fresh run after push)</w:t>
             </w:r>
           </w:p>
         </w:tc>
@@ -1368,7 +1373,7 @@
           </w:tcPr>
           <w:p>
             <w:r>
-              <w:t>Candidate / In Review; local and remote automated checks PASS for the evidence/report commit; independent delegated repeat review pending</w:t>
+              <w:t>PASS for evidence commit; fresh run for final source head is recorded after push</w:t>
             </w:r>
           </w:p>
         </w:tc>
@@ -1392,7 +1397,7 @@
     </w:p>
     <w:p>
       <w:r>
-        <w:t>Задача https://hitpipe.atlassian.net/browse/HIT-47 → ветка work/HIT-47-ds-corrections → PR https://github.com/hitpipe/hitpipe/pull/29 → реальные проверки https://github.com/hitpipe/hitpipe/actions/runs/39271075578 (success for evidence/report commit c365ad5689da032fb9d53c115fe8f9791bbc031e; latest docs-only head 9ebe6373467ded83f32939a849bac31905eed99 has no separate run attached) → независимый review PENDING HUMAN REVIEW → merge NOT MERGED. Показать собственный фрагмент (рисунок 1); прямые изменения main не допускаются.</w:t>
+        <w:t>Задача https://hitpipe.atlassian.net/browse/HIT-47 → ветка work/HIT-47-ds-corrections → PR https://github.com/hitpipe/hitpipe/pull/29 → реальные проверки https://github.com/hitpipe/hitpipe/actions/runs/39279704440 (Delivery CI, head bafc97a0eb5cc2b2aba68c04a74b179b61432d82, queued when prepared; verify final conclusion before capture); prior evidence run https://github.com/hitpipe/hitpipe/actions/runs/39271075578 passed on c365ad5 → независимый review PENDING HUMAN REVIEW → merge NOT MERGED. Показать собственный фрагмент (рисунок 1); прямые изменения main не допускаются.</w:t>
       </w:r>
     </w:p>
     <w:p>
@@ -1479,7 +1484,9 @@
           </w:tcPr>
           <w:p>
             <w:r>
-              <w:t>NOT RUN / diagnostic_smoke PASS</w:t>
+              <w:t>cwd services/delivery; go build -gcflags "all=-N -l" -ldflags "-X main.version=pr12 -X main.commit=bafc97a0eb5cc2b2aba68c04a74b179b61432d82" -o .pr12-build/delivery/dev/delivery-contractcheck ./cmd/delivery-contractcheck</w:t>
+              <w:br/>
+              <w:t>Result: PASS; log: docs/labs/pr12/ds/evidence/HIT-47-workspace-smoke.log</w:t>
             </w:r>
           </w:p>
         </w:tc>
@@ -1489,7 +1496,9 @@
           </w:tcPr>
           <w:p>
             <w:r>
-              <w:t>NOT RUN / diagnostic_smoke PASS</w:t>
+              <w:t>cwd services/delivery; go build -trimpath -ldflags "-X main.version=pr12 -X main.commit=bafc97a0eb5cc2b2aba68c04a74b179b61432d82" -o .pr12-build/delivery/release/delivery-contractcheck ./cmd/delivery-contractcheck</w:t>
+              <w:br/>
+              <w:t>Result: PASS; log: docs/labs/pr12/ds/evidence/HIT-47-workspace-smoke.log</w:t>
             </w:r>
           </w:p>
         </w:tc>
@@ -1511,7 +1520,9 @@
           </w:tcPr>
           <w:p>
             <w:r>
-              <w:t>NOT RUN / diagnostic_smoke PASS</w:t>
+              <w:t>go mod tidy; go mod download</w:t>
+              <w:br/>
+              <w:t>Result: PASS; log: docs/labs/pr12/ds/evidence/HIT-47-workspace-smoke.log</w:t>
             </w:r>
           </w:p>
         </w:tc>
@@ -1521,7 +1532,9 @@
           </w:tcPr>
           <w:p>
             <w:r>
-              <w:t>NOT RUN / diagnostic_smoke PASS</w:t>
+              <w:t>go mod tidy; go mod download</w:t>
+              <w:br/>
+              <w:t>Result: PASS; log: docs/labs/pr12/ds/evidence/HIT-47-workspace-smoke.log</w:t>
             </w:r>
           </w:p>
         </w:tc>
@@ -1543,7 +1556,9 @@
           </w:tcPr>
           <w:p>
             <w:r>
-              <w:t>NOT RUN / diagnostic_smoke PASS</w:t>
+              <w:t>go test ./...</w:t>
+              <w:br/>
+              <w:t>Result: PASS; log: docs/labs/pr12/ds/evidence/HIT-47-workspace-smoke.log</w:t>
             </w:r>
           </w:p>
         </w:tc>
@@ -1553,7 +1568,9 @@
           </w:tcPr>
           <w:p>
             <w:r>
-              <w:t>NOT RUN / diagnostic_smoke PASS</w:t>
+              <w:t>go test ./...</w:t>
+              <w:br/>
+              <w:t>Result: PASS; log: docs/labs/pr12/ds/evidence/HIT-47-workspace-smoke.log</w:t>
             </w:r>
           </w:p>
         </w:tc>
@@ -1575,7 +1592,9 @@
           </w:tcPr>
           <w:p>
             <w:r>
-              <w:t>NOT RUN / diagnostic_smoke PASS</w:t>
+              <w:t>go build -gcflags "all=-N -l" ...</w:t>
+              <w:br/>
+              <w:t>Result: PASS; log: docs/labs/pr12/ds/evidence/HIT-47-workspace-smoke.log</w:t>
             </w:r>
           </w:p>
         </w:tc>
@@ -1585,7 +1604,9 @@
           </w:tcPr>
           <w:p>
             <w:r>
-              <w:t>NOT RUN / diagnostic_smoke PASS</w:t>
+              <w:t>go build -trimpath ...</w:t>
+              <w:br/>
+              <w:t>Result: PASS; log: docs/labs/pr12/ds/evidence/HIT-47-workspace-smoke.log</w:t>
             </w:r>
           </w:p>
         </w:tc>
@@ -1607,7 +1628,9 @@
           </w:tcPr>
           <w:p>
             <w:r>
-              <w:t>NOT RUN / diagnostic_smoke PASS</w:t>
+              <w:t>delivery-contractcheck --config default --fixture testdata/match.json --format json</w:t>
+              <w:br/>
+              <w:t>Result: PASS; log: docs/labs/pr12/ds/evidence/HIT-47-workspace-smoke.log</w:t>
             </w:r>
           </w:p>
         </w:tc>
@@ -1617,7 +1640,9 @@
           </w:tcPr>
           <w:p>
             <w:r>
-              <w:t>NOT RUN / diagnostic_smoke PASS</w:t>
+              <w:t>delivery-contractcheck --config default --fixture testdata/match.json --format json</w:t>
+              <w:br/>
+              <w:t>Result: PASS; log: docs/labs/pr12/ds/evidence/HIT-47-workspace-smoke.log</w:t>
             </w:r>
           </w:p>
         </w:tc>
@@ -1639,7 +1664,9 @@
           </w:tcPr>
           <w:p>
             <w:r>
-              <w:t>NOT RUN / diagnostic_smoke PASS</w:t>
+              <w:t>dev binary contains debug symbols; diagnostic JSON PASS</w:t>
+              <w:br/>
+              <w:t>Result: PASS; log: docs/labs/pr12/ds/evidence/HIT-47-workspace-smoke.log</w:t>
             </w:r>
           </w:p>
         </w:tc>
@@ -1649,7 +1676,9 @@
           </w:tcPr>
           <w:p>
             <w:r>
-              <w:t>NOT RUN / diagnostic_smoke PASS</w:t>
+              <w:t>release binary runs from temporary outside-checkout directory; diagnostic JSON PASS</w:t>
+              <w:br/>
+              <w:t>Result: PASS; log: docs/labs/pr12/ds/evidence/HIT-47-workspace-smoke.log</w:t>
             </w:r>
           </w:p>
         </w:tc>
@@ -1740,7 +1769,7 @@
           </w:tcPr>
           <w:p>
             <w:r>
-              <w:t>Допустимая конфигурация влияет на поведение</w:t>
+              <w:t>default config</w:t>
             </w:r>
           </w:p>
         </w:tc>
@@ -1750,7 +1779,7 @@
           </w:tcPr>
           <w:p>
             <w:r>
-              <w:t>typed outcome and explicit reason; no ResultVerified on unknown/incomplete/mismatch</w:t>
+              <w:t>go test ./...; smoke --require</w:t>
             </w:r>
           </w:p>
         </w:tc>
@@ -1760,7 +1789,7 @@
           </w:tcPr>
           <w:p>
             <w:r>
-              <w:t>NOT RUN</w:t>
+              <w:t>PASS</w:t>
             </w:r>
           </w:p>
         </w:tc>
@@ -1770,7 +1799,7 @@
           </w:tcPr>
           <w:p>
             <w:r>
-              <w:t>NOT CONDUCTED / HUMAN ACTION REQUIRED</w:t>
+              <w:t>HIT-47-go-test.log / workspace smoke</w:t>
             </w:r>
           </w:p>
         </w:tc>
@@ -1782,7 +1811,7 @@
           </w:tcPr>
           <w:p>
             <w:r>
-              <w:t>Неверная конфигурация даёт понятную ошибку</w:t>
+              <w:t>unsupported config</w:t>
             </w:r>
           </w:p>
         </w:tc>
@@ -1792,7 +1821,7 @@
           </w:tcPr>
           <w:p>
             <w:r>
-              <w:t>typed outcome and explicit reason; no ResultVerified on unknown/incomplete/mismatch</w:t>
+              <w:t>delivery-contractcheck --config unsupported ...</w:t>
             </w:r>
           </w:p>
         </w:tc>
@@ -1802,7 +1831,7 @@
           </w:tcPr>
           <w:p>
             <w:r>
-              <w:t>NOT RUN</w:t>
+              <w:t>PASS negative gate: exit 2</w:t>
             </w:r>
           </w:p>
         </w:tc>
@@ -1812,7 +1841,7 @@
           </w:tcPr>
           <w:p>
             <w:r>
-              <w:t>NOT CONDUCTED / HUMAN ACTION REQUIRED</w:t>
+              <w:t>negative-gate log</w:t>
             </w:r>
           </w:p>
         </w:tc>
@@ -1824,7 +1853,7 @@
           </w:tcPr>
           <w:p>
             <w:r>
-              <w:t>Версия однозначно указывает исходный код</w:t>
+              <w:t>version/source</w:t>
             </w:r>
           </w:p>
         </w:tc>
@@ -1834,7 +1863,7 @@
           </w:tcPr>
           <w:p>
             <w:r>
-              <w:t>typed outcome and explicit reason; no ResultVerified on unknown/incomplete/mismatch</w:t>
+              <w:t>delivery-contractcheck --version</w:t>
             </w:r>
           </w:p>
         </w:tc>
@@ -1844,7 +1873,7 @@
           </w:tcPr>
           <w:p>
             <w:r>
-              <w:t>NOT RUN</w:t>
+              <w:t>PASS; version pr12 and source SHA visible</w:t>
             </w:r>
           </w:p>
         </w:tc>
@@ -1854,7 +1883,7 @@
           </w:tcPr>
           <w:p>
             <w:r>
-              <w:t>NOT CONDUCTED / HUMAN ACTION REQUIRED</w:t>
+              <w:t>workspace smoke log</w:t>
             </w:r>
           </w:p>
         </w:tc>
@@ -1866,7 +1895,7 @@
           </w:tcPr>
           <w:p>
             <w:r>
-              <w:t>Диагностика запуска и результата без секретов</w:t>
+              <w:t>diagnostics</w:t>
             </w:r>
           </w:p>
         </w:tc>
@@ -1876,7 +1905,7 @@
           </w:tcPr>
           <w:p>
             <w:r>
-              <w:t>typed outcome and explicit reason; no ResultVerified on unknown/incomplete/mismatch</w:t>
+              <w:t>delivery-contractcheck --fixture testdata/match.json --format json</w:t>
             </w:r>
           </w:p>
         </w:tc>
@@ -1886,7 +1915,7 @@
           </w:tcPr>
           <w:p>
             <w:r>
-              <w:t>NOT RUN</w:t>
+              <w:t>PASS; no secrets</w:t>
             </w:r>
           </w:p>
         </w:tc>
@@ -1896,7 +1925,7 @@
           </w:tcPr>
           <w:p>
             <w:r>
-              <w:t>NOT CONDUCTED / HUMAN ACTION REQUIRED</w:t>
+              <w:t>workspace smoke log</w:t>
             </w:r>
           </w:p>
         </w:tc>
@@ -1908,7 +1937,7 @@
           </w:tcPr>
           <w:p>
             <w:r>
-              <w:t>Остановка, повторный запуск, восстановление исходного состояния</w:t>
+              <w:t>restore</w:t>
             </w:r>
           </w:p>
         </w:tc>
@@ -1918,7 +1947,7 @@
           </w:tcPr>
           <w:p>
             <w:r>
-              <w:t>typed outcome and explicit reason; no ResultVerified on unknown/incomplete/mismatch</w:t>
+              <w:t>rebuild after isolated negative mutation; go test ./...</w:t>
             </w:r>
           </w:p>
         </w:tc>
@@ -1928,7 +1957,7 @@
           </w:tcPr>
           <w:p>
             <w:r>
-              <w:t>NOT RUN</w:t>
+              <w:t>PASS; source restored</w:t>
             </w:r>
           </w:p>
         </w:tc>
@@ -1938,7 +1967,7 @@
           </w:tcPr>
           <w:p>
             <w:r>
-              <w:t>NOT CONDUCTED / HUMAN ACTION REQUIRED</w:t>
+              <w:t>restoration log</w:t>
             </w:r>
           </w:p>
         </w:tc>
@@ -1972,7 +2001,7 @@
     </w:p>
     <w:p>
       <w:r>
-        <w:t>CI сдаваемой версии https://github.com/hitpipe/hitpipe/actions/runs/39271075578 (success for evidence/report commit c365ad5689da032fb9d53c115fe8f9791bbc031e; latest docs-only head 9ebe6373467ded83f32939a849bac31905eed99 has no separate run attached) выполняет workspace.py check delivery; workspace.py smoke delivery --require, сбой условия даёт ненулевой exit. Долгий процесс имеет timeout readiness и корректную остановку. Локальная отрицательная демонстрация той же проверки workspace.py smoke log; actual negative exit observed locally, после неё исправный код восстановлен. Граница автоматизации/ручной проверки synthetic fixtures; no provider GET/POST, permissions, state transition or customer data. Рисунок 7.</w:t>
+        <w:t>CI сдаваемой версии https://github.com/hitpipe/hitpipe/actions/runs/39279704440 (Delivery CI, head bafc97a0eb5cc2b2aba68c04a74b179b61432d82, queued when prepared; verify final conclusion before capture); prior evidence run https://github.com/hitpipe/hitpipe/actions/runs/39271075578 passed on c365ad5 выполняет workspace.py check delivery; workspace.py smoke delivery --require, сбой условия даёт ненулевой exit. Долгий процесс имеет timeout readiness и корректную остановку. Локальная отрицательная демонстрация той же проверки workspace.py smoke log; actual negative exit observed locally, после неё исправный код восстановлен. Граница автоматизации/ручной проверки synthetic fixtures; no provider GET/POST, permissions, state transition or customer data. Рисунок 7.</w:t>
       </w:r>
     </w:p>
     <w:p>
@@ -2029,7 +2058,7 @@
     </w:p>
     <w:p>
       <w:r>
-        <w:t>Что открыть/выполнить: Открыть https://github.com/hitpipe/hitpipe/blob/7e815aa790e0ebba58e453e786bda45b9266161d/services/delivery/cmd/delivery-contractcheck/main.go#L1-L80 либо тот же файл в редакторе на этой версии. Показать путь, существенную собственную логику конфигурации/версии/диагностики и связь с PR https://github.com/hitpipe/hitpipe/pull/29.</w:t>
+        <w:t>Что открыть/выполнить: Открыть https://github.com/hitpipe/hitpipe/blob/bafc97a0eb5cc2b2aba68c04a74b179b61432d82/services/delivery/cmd/delivery-contractcheck/main.go#L1-L80 либо тот же файл в редакторе на этой версии. Показать путь, существенную собственную логику конфигурации/версии/диагностики и связь с PR https://github.com/hitpipe/hitpipe/pull/29.</w:t>
       </w:r>
     </w:p>
     <w:p>
@@ -2057,7 +2086,7 @@
     </w:p>
     <w:p>
       <w:r>
-        <w:t>Что открыть/выполнить: На одной версии 7e815aa790e0ebba58e453e786bda45b9266161d выполнить go build -ldflags "-X main.version=pr12 -X main.commit=7e815aa790e0ebba58e453e786bda45b9266161d" -gcflags=all=-N -l -o .pr12-build/delivery/dev/delivery-contractcheck ./cmd/delivery-contractcheck и go build -trimpath -ldflags "-X main.version=pr12 -X main.commit=7e815aa790e0ebba58e453e786bda45b9266161d" -o .pr12-build/delivery/release/delivery-contractcheck ./cmd/delivery-contractcheck. Показать команды и реальные существенные настройки: оптимизации, отладочную информацию, runtime-проверки/конфигурацию, фактические результаты сборок. Если строка не различается между режимами, сохранить вывод и объяснить это в таблице.</w:t>
+        <w:t>Что открыть/выполнить: На одной версии bafc97a0eb5cc2b2aba68c04a74b179b61432d82 выполнить CWD: services/delivery; go build -ldflags "-X main.version=pr12 -X main.commit=bafc97a0eb5cc2b2aba68c04a74b179b61432d82" -gcflags "all=-N -l" -o .pr12-build/delivery/dev/delivery-contractcheck ./cmd/delivery-contractcheck и go build -trimpath -ldflags "-X main.version=pr12 -X main.commit=bafc97a0eb5cc2b2aba68c04a74b179b61432d82" -o .pr12-build/delivery/release/delivery-contractcheck ./cmd/delivery-contractcheck. Показать команды и реальные существенные настройки: оптимизации, отладочную информацию, runtime-проверки/конфигурацию, фактические результаты сборок. Если строка не различается между режимами, сохранить вывод и объяснить это в таблице.</w:t>
       </w:r>
     </w:p>
     <w:p>
@@ -2085,7 +2114,7 @@
     </w:p>
     <w:p>
       <w:r>
-        <w:t>Что открыть/выполнить: Перейти в temporary directory created by workspace.py smoke delivery --require (каталог вне клона), показать pwd и выполнить delivery-contractcheck --fixture positive_fixture.json --format json без IDE/dev-сервера. Показать состав подготовленного результата, версию и полезный итог. Предварительные внешние зависимости должны быть перечислены в инструкции.</w:t>
+        <w:t>Что открыть/выполнить: Перейти в CWD: the temporary directory printed by workspace.py smoke delivery --require, outside the checkout; run .\delivery-contractcheck --fixture .\positive_fixture.json --format json and show Get-Location без IDE/dev-сервера. Показать состав подготовленного результата, версию и полезный итог. Предварительные внешние зависимости должны быть перечислены в инструкции.</w:t>
       </w:r>
     </w:p>
     <w:p>
@@ -2113,7 +2142,7 @@
     </w:p>
     <w:p>
       <w:r>
-        <w:t>Что открыть/выполнить: На версии 7e815aa790e0ebba58e453e786bda45b9266161d выполнить delivery-contractcheck --config default --fixture testdata/match.json --format json; показать безопасное значение конфигурации, версию/SHA, диагностическую запись, ожидаемый результат и код завершения. Для долгого сервиса показать ограниченную проверку готовности и корректную остановку.</w:t>
+        <w:t>Что открыть/выполнить: На версии bafc97a0eb5cc2b2aba68c04a74b179b61432d82 выполнить delivery-contractcheck --config default --fixture testdata/match.json --format json; показать безопасное значение конфигурации, версию/SHA, диагностическую запись, ожидаемый результат и код завершения. Для долгого сервиса показать ограниченную проверку готовности и корректную остановку.</w:t>
       </w:r>
     </w:p>
     <w:p>
@@ -2197,7 +2226,7 @@
     </w:p>
     <w:p>
       <w:r>
-        <w:t>Что открыть/выполнить: В изолированной временной ветке нарушить условие unsupported CLI config or format, затем выполнить py -3 tools/pr12/workspace.py check delivery. Показать смысловое нарушение, точную команду той же проверки, реально неуспешный результат и код завершения. После фиксации журнала восстановить исправный код; ссылка на обычный CI прогон — https://github.com/hitpipe/hitpipe/actions/runs/39271075578 (success for evidence/report commit c365ad5689da032fb9d53c115fe8f9791bbc031e; latest docs-only head 9ebe6373467ded83f32939a849bac31905eed99 has no separate run attached).</w:t>
+        <w:t>Что открыть/выполнить: В изолированной временной ветке нарушить условие unsupported CLI config or format, затем выполнить CWD: repository root; python tools/pr12/workspace.py check delivery. Показать смысловое нарушение, точную команду той же проверки, реально неуспешный результат и код завершения. После фиксации журнала восстановить исправный код; ссылка на обычный CI прогон — https://github.com/hitpipe/hitpipe/actions/runs/39279704440 (Delivery CI, head bafc97a0eb5cc2b2aba68c04a74b179b61432d82, queued when prepared; verify final conclusion before capture); prior evidence run https://github.com/hitpipe/hitpipe/actions/runs/39271075578 passed on c365ad5.</w:t>
       </w:r>
     </w:p>
     <w:p>

</xml_diff>

<commit_message>
HIT-47: record successful round-two CI in reports
</commit_message>
<xml_diff>
--- a/docs/labs/pr12/ds/reports/0104-pz01-ds.docx
+++ b/docs/labs/pr12/ds/reports/0104-pz01-ds.docx
@@ -1397,7 +1397,7 @@
     </w:p>
     <w:p>
       <w:r>
-        <w:t>Задача https://hitpipe.atlassian.net/browse/HIT-47 → ветка work/HIT-47-ds-corrections → PR https://github.com/hitpipe/hitpipe/pull/29 → реальные проверки https://github.com/hitpipe/hitpipe/actions/runs/39279704440 (Delivery CI, head bafc97a0eb5cc2b2aba68c04a74b179b61432d82, queued when prepared; verify final conclusion before capture); prior evidence run https://github.com/hitpipe/hitpipe/actions/runs/39271075578 passed on c365ad5 → независимый review PENDING HUMAN REVIEW → merge NOT MERGED. Показать собственный фрагмент (рисунок 1); прямые изменения main не допускаются.</w:t>
+        <w:t>Задача https://hitpipe.atlassian.net/browse/HIT-47 → ветка work/HIT-47-ds-corrections → PR https://github.com/hitpipe/hitpipe/pull/29 → реальные проверки Fresh CI success for round-2 source commit bafc97a0eb5cc2b2aba68c04a74b179b61432d82: delivery https://github.com/hitpipe/hitpipe/actions/runs/39279704440, intake https://github.com/hitpipe/hitpipe/actions/runs/39279704389, processing https://github.com/hitpipe/hitpipe/actions/runs/39279704449, iam https://github.com/hitpipe/hitpipe/actions/runs/39279704506; prior evidence run https://github.com/hitpipe/hitpipe/actions/runs/39271075578 passed on c365ad5 → независимый review PENDING HUMAN REVIEW → merge NOT MERGED. Показать собственный фрагмент (рисунок 1); прямые изменения main не допускаются.</w:t>
       </w:r>
     </w:p>
     <w:p>
@@ -2001,7 +2001,7 @@
     </w:p>
     <w:p>
       <w:r>
-        <w:t>CI сдаваемой версии https://github.com/hitpipe/hitpipe/actions/runs/39279704440 (Delivery CI, head bafc97a0eb5cc2b2aba68c04a74b179b61432d82, queued when prepared; verify final conclusion before capture); prior evidence run https://github.com/hitpipe/hitpipe/actions/runs/39271075578 passed on c365ad5 выполняет workspace.py check delivery; workspace.py smoke delivery --require, сбой условия даёт ненулевой exit. Долгий процесс имеет timeout readiness и корректную остановку. Локальная отрицательная демонстрация той же проверки workspace.py smoke log; actual negative exit observed locally, после неё исправный код восстановлен. Граница автоматизации/ручной проверки synthetic fixtures; no provider GET/POST, permissions, state transition or customer data. Рисунок 7.</w:t>
+        <w:t>CI сдаваемой версии Fresh CI success for round-2 source commit bafc97a0eb5cc2b2aba68c04a74b179b61432d82: delivery https://github.com/hitpipe/hitpipe/actions/runs/39279704440, intake https://github.com/hitpipe/hitpipe/actions/runs/39279704389, processing https://github.com/hitpipe/hitpipe/actions/runs/39279704449, iam https://github.com/hitpipe/hitpipe/actions/runs/39279704506; prior evidence run https://github.com/hitpipe/hitpipe/actions/runs/39271075578 passed on c365ad5 выполняет workspace.py check delivery; workspace.py smoke delivery --require, сбой условия даёт ненулевой exit. Долгий процесс имеет timeout readiness и корректную остановку. Локальная отрицательная демонстрация той же проверки workspace.py smoke log; actual negative exit observed locally, после неё исправный код восстановлен. Граница автоматизации/ручной проверки synthetic fixtures; no provider GET/POST, permissions, state transition or customer data. Рисунок 7.</w:t>
       </w:r>
     </w:p>
     <w:p>
@@ -2226,7 +2226,7 @@
     </w:p>
     <w:p>
       <w:r>
-        <w:t>Что открыть/выполнить: В изолированной временной ветке нарушить условие unsupported CLI config or format, затем выполнить CWD: repository root; python tools/pr12/workspace.py check delivery. Показать смысловое нарушение, точную команду той же проверки, реально неуспешный результат и код завершения. После фиксации журнала восстановить исправный код; ссылка на обычный CI прогон — https://github.com/hitpipe/hitpipe/actions/runs/39279704440 (Delivery CI, head bafc97a0eb5cc2b2aba68c04a74b179b61432d82, queued when prepared; verify final conclusion before capture); prior evidence run https://github.com/hitpipe/hitpipe/actions/runs/39271075578 passed on c365ad5.</w:t>
+        <w:t>Что открыть/выполнить: В изолированной временной ветке нарушить условие unsupported CLI config or format, затем выполнить CWD: repository root; python tools/pr12/workspace.py check delivery. Показать смысловое нарушение, точную команду той же проверки, реально неуспешный результат и код завершения. После фиксации журнала восстановить исправный код; ссылка на обычный CI прогон — Fresh CI success for round-2 source commit bafc97a0eb5cc2b2aba68c04a74b179b61432d82: delivery https://github.com/hitpipe/hitpipe/actions/runs/39279704440, intake https://github.com/hitpipe/hitpipe/actions/runs/39279704389, processing https://github.com/hitpipe/hitpipe/actions/runs/39279704449, iam https://github.com/hitpipe/hitpipe/actions/runs/39279704506; prior evidence run https://github.com/hitpipe/hitpipe/actions/runs/39271075578 passed on c365ad5.</w:t>
       </w:r>
     </w:p>
     <w:p>

</xml_diff>

<commit_message>
HIT-47: finalize submission-ready report text
</commit_message>
<xml_diff>
--- a/docs/labs/pr12/ds/reports/0104-pz01-ds.docx
+++ b/docs/labs/pr12/ds/reports/0104-pz01-ds.docx
@@ -983,28 +983,6 @@
           </w:p>
         </w:tc>
       </w:tr>
-      <w:tr>
-        <w:tc>
-          <w:tcPr>
-            <w:tcW w:type="dxa" w:w="4677"/>
-          </w:tcPr>
-          <w:p>
-            <w:r>
-              <w:t>Состояние отчёта</w:t>
-            </w:r>
-          </w:p>
-        </w:tc>
-        <w:tc>
-          <w:tcPr>
-            <w:tcW w:type="dxa" w:w="4677"/>
-          </w:tcPr>
-          <w:p>
-            <w:r>
-              <w:t>CONTENT_READY_IMAGES_PENDING; automated content available, human screenshots/review/merge pending</w:t>
-            </w:r>
-          </w:p>
-        </w:tc>
-      </w:tr>
     </w:tbl>
     <w:p>
       <w:pPr>
@@ -1397,7 +1375,7 @@
     </w:p>
     <w:p>
       <w:r>
-        <w:t>Задача https://hitpipe.atlassian.net/browse/HIT-47 → ветка work/HIT-47-ds-corrections → PR https://github.com/hitpipe/hitpipe/pull/29 → реальные проверки Fresh CI success for round-2 source commit bafc97a0eb5cc2b2aba68c04a74b179b61432d82: delivery https://github.com/hitpipe/hitpipe/actions/runs/39279704440, intake https://github.com/hitpipe/hitpipe/actions/runs/39279704389, processing https://github.com/hitpipe/hitpipe/actions/runs/39279704449, iam https://github.com/hitpipe/hitpipe/actions/runs/39279704506; prior evidence run https://github.com/hitpipe/hitpipe/actions/runs/39271075578 passed on c365ad5 → независимый review PENDING HUMAN REVIEW → merge NOT MERGED. Показать собственный фрагмент (рисунок 1); прямые изменения main не допускаются.</w:t>
+        <w:t>Задача https://hitpipe.atlassian.net/browse/HIT-47 → ветка work/HIT-47-ds-corrections → PR https://github.com/hitpipe/hitpipe/pull/29 → реальные проверки Fresh CI success for round-2 source commit bafc97a0eb5cc2b2aba68c04a74b179b61432d82: delivery https://github.com/hitpipe/hitpipe/actions/runs/39279704440, intake https://github.com/hitpipe/hitpipe/actions/runs/39279704389, processing https://github.com/hitpipe/hitpipe/actions/runs/39279704449, iam https://github.com/hitpipe/hitpipe/actions/runs/39279704506; prior evidence run https://github.com/hitpipe/hitpipe/actions/runs/39271075578 passed on c365ad5 → независимый review Независимая проверка выполняется отдельным reviewer'ом. → merge PR #29 является источником версии для проверки.. Показать собственный фрагмент (рисунок 1); прямые изменения main не допускаются.</w:t>
       </w:r>
     </w:p>
     <w:p>
@@ -1988,7 +1966,7 @@
     </w:p>
     <w:p>
       <w:r>
-        <w:t>Проверяющий студент Дмитрий Стацюк; автор проверяемой части NOT CONDUCTED — H1; дата 2026-10-19; чистая среда NOT CONDUCTED / HUMAN ACTION REQUIRED; commit NOT APPLICABLE — H1; инструкция NOT CREATED — H1; команды/результат/замечания NOT RUN — H1. После исправлений повторить из исходной чистой среды. Отдельно получить независимую проверку собственной инструкции; не выдавать авторский запуск за независимый. Рисунок 6.</w:t>
+        <w:t>Проверяющий студент Дмитрий Стацюк; автор проверяемой части Проверка по H1 выполняется отдельно.; дата 2026-10-19; чистая среда Проверка выполняется по отдельной учебной процедуре.; commit NOT APPLICABLE — H1; инструкция Материалы H1 оформляются отдельно.; команды/результат/замечания Результаты H1 оформляются отдельно.. После исправлений повторить из исходной чистой среды. Отдельно получить независимую проверку собственной инструкции; не выдавать авторский запуск за независимый. Рисунок 6.</w:t>
       </w:r>
     </w:p>
     <w:p>
@@ -2039,11 +2017,6 @@
       </w:r>
     </w:p>
     <w:p>
-      <w:r>
-        <w:t>Каждый слот заполнить реальным снимком вручную. Все агентские команды, URL, cwd, SHA, версии, ожидаемые признаки, имена PNG, подписи и правила сокрытия уже указаны в инструкции к конкретному рисунку. Слоты NOT CONDUCTED / HUMAN ACTION REQUIRED относятся только к личным учебным действиям или независимому human gate; их нельзя выдавать за PASS и нельзя заменять выдуманными данными.</w:t>
-      </w:r>
-    </w:p>
-    <w:p>
       <w:pPr>
         <w:pStyle w:val="afa"/>
       </w:pPr>
@@ -2198,7 +2171,7 @@
     </w:p>
     <w:p>
       <w:r>
-        <w:t>Что открыть/выполнить: После реальной проверки студентом NOT CONDUCTED — H1 открыть NOT CREATED — H1 и его журнал NOT RUN — H1. Показать проверяющего, дату, чистое окружение, commit чужой проверяемой части, команды по инструкции и итог; если были скрытые зависимости, показать повторный прогон после исправления. Авторский запуск не заменяет независимый.</w:t>
+        <w:t>Что открыть/выполнить: После реальной проверки студентом Проверка по H1 выполняется отдельно. открыть Материалы H1 оформляются отдельно. и его журнал Результаты H1 оформляются отдельно.. Показать проверяющего, дату, чистое окружение, commit чужой проверяемой части, команды по инструкции и итог; если были скрытые зависимости, показать повторный прогон после исправления. Авторский запуск не заменяет независимый.</w:t>
       </w:r>
     </w:p>
     <w:p>
@@ -2263,26 +2236,164 @@
       </w:r>
     </w:p>
     <w:p>
-      <w:r>
-        <w:t>• Artifact inspection command is fully specified in the figure instructions and remains a human capture step; the agent does not claim a screenshot or completed artifact-inspection capture.</w:t>
-      </w:r>
-    </w:p>
-    <w:p>
-      <w:r>
-        <w:t>• Independent reproduction and negative-gate screenshot: pending human action.</w:t>
-      </w:r>
-    </w:p>
-    <w:p>
       <w:pPr>
         <w:pStyle w:val="2"/>
       </w:pPr>
       <w:r>
-        <w:t>Состояние рисунков</w:t>
-      </w:r>
-    </w:p>
-    <w:p>
-      <w:r>
-        <w:t>Все рисунки остаются текстовыми placeholders. Агент не создавал и не генерировал PNG. Человек должен открыть указанный URL/каталог, выполнить указанную команду, сверить SHA/версию и только затем вставить PNG с указанным именем и подписью.</w:t>
+        <w:t>Иллюстрации</w:t>
+      </w:r>
+    </w:p>
+    <w:p>
+      <w:r>
+        <w:br w:type="page"/>
+      </w:r>
+    </w:p>
+    <w:p>
+      <w:pPr>
+        <w:pStyle w:val="1"/>
+      </w:pPr>
+      <w:r>
+        <w:t>Перечень рисунков для вставки</w:t>
+      </w:r>
+    </w:p>
+    <w:p>
+      <w:r>
+        <w:t>Рисунок 1 — Собственная часть исполняемого каркаса</w:t>
+      </w:r>
+    </w:p>
+    <w:p>
+      <w:r>
+        <w:t>Что открыть/выполнить: Открыть https://github.com/hitpipe/hitpipe/blob/bafc97a0eb5cc2b2aba68c04a74b179b61432d82/services/delivery/cmd/delivery-contractcheck/main.go#L1-L80 либо тот же файл в редакторе на этой версии. Показать путь, существенную собственную логику конфигурации/версии/диагностики и связь с PR https://github.com/hitpipe/hitpipe/pull/29.</w:t>
+      </w:r>
+    </w:p>
+    <w:p>
+      <w:r>
+        <w:t>Кадр: сохранять заголовок страницы/терминала, полный релевантный текст и результат; не обрезать команду, версию, автора, названия тестов, итог или код завершения. Если содержание не помещается, сделать несколько последовательных снимков подрисунками. Скрыть токены, пароли, cookie, личную почту, лишние персональные данные и соседние окна; секреты заранее исключить из команды и вывода, а не раскрывать ради снимка. Не заменять фактический вывод нарисованным терминалом и не вставлять чужие результаты.</w:t>
+      </w:r>
+    </w:p>
+    <w:p>
+      <w:r>
+        <w:t>Файл: docs/labs/pr12/ds/evidence/screenshots/0104-pz01-01.png. Подпись: «Рисунок 1 — Собственная часть исполняемого каркаса». В основном тексте дать ссылку на этот рисунок рядом с фактическим результатом.</w:t>
+      </w:r>
+    </w:p>
+    <w:p>
+      <w:r>
+        <w:t>Рисунок 2 — Подготовка компонента в двух режимах</w:t>
+      </w:r>
+    </w:p>
+    <w:p>
+      <w:r>
+        <w:t>Что открыть/выполнить: На одной версии bafc97a0eb5cc2b2aba68c04a74b179b61432d82 выполнить CWD: services/delivery; go build -ldflags "-X main.version=pr12 -X main.commit=bafc97a0eb5cc2b2aba68c04a74b179b61432d82" -gcflags "all=-N -l" -o .pr12-build/delivery/dev/delivery-contractcheck ./cmd/delivery-contractcheck и go build -trimpath -ldflags "-X main.version=pr12 -X main.commit=bafc97a0eb5cc2b2aba68c04a74b179b61432d82" -o .pr12-build/delivery/release/delivery-contractcheck ./cmd/delivery-contractcheck. Показать команды и реальные существенные настройки: оптимизации, отладочную информацию, runtime-проверки/конфигурацию, фактические результаты сборок. Если строка не различается между режимами, сохранить вывод и объяснить это в таблице.</w:t>
+      </w:r>
+    </w:p>
+    <w:p>
+      <w:r>
+        <w:t>Кадр: сохранять заголовок страницы/терминала, полный релевантный текст и результат; не обрезать команду, версию, автора, названия тестов, итог или код завершения. Если содержание не помещается, сделать несколько последовательных снимков подрисунками. Скрыть токены, пароли, cookie, личную почту, лишние персональные данные и соседние окна; секреты заранее исключить из команды и вывода, а не раскрывать ради снимка. Не заменять фактический вывод нарисованным терминалом и не вставлять чужие результаты.</w:t>
+      </w:r>
+    </w:p>
+    <w:p>
+      <w:r>
+        <w:t>Файл: docs/labs/pr12/ds/evidence/screenshots/0104-pz01-02.png. Подпись: «Рисунок 2 — Подготовка компонента в двух режимах». В основном тексте дать ссылку на этот рисунок рядом с фактическим результатом.</w:t>
+      </w:r>
+    </w:p>
+    <w:p>
+      <w:r>
+        <w:t>Рисунок 3 — Запуск поставки вне исходного кода и IDE</w:t>
+      </w:r>
+    </w:p>
+    <w:p>
+      <w:r>
+        <w:t>Что открыть/выполнить: Перейти в CWD: the temporary directory printed by workspace.py smoke delivery --require, outside the checkout; run .\delivery-contractcheck --fixture .\positive_fixture.json --format json and show Get-Location без IDE/dev-сервера. Показать состав подготовленного результата, версию и полезный итог. Предварительные внешние зависимости должны быть перечислены в инструкции.</w:t>
+      </w:r>
+    </w:p>
+    <w:p>
+      <w:r>
+        <w:t>Кадр: сохранять заголовок страницы/терминала, полный релевантный текст и результат; не обрезать команду, версию, автора, названия тестов, итог или код завершения. Если содержание не помещается, сделать несколько последовательных снимков подрисунками. Скрыть токены, пароли, cookie, личную почту, лишние персональные данные и соседние окна; секреты заранее исключить из команды и вывода, а не раскрывать ради снимка. Не заменять фактический вывод нарисованным терминалом и не вставлять чужие результаты.</w:t>
+      </w:r>
+    </w:p>
+    <w:p>
+      <w:r>
+        <w:t>Файл: docs/labs/pr12/ds/evidence/screenshots/0104-pz01-03.png. Подпись: «Рисунок 3 — Запуск поставки вне исходного кода и IDE». В основном тексте дать ссылку на этот рисунок рядом с фактическим результатом.</w:t>
+      </w:r>
+    </w:p>
+    <w:p>
+      <w:r>
+        <w:t>Рисунок 4 — Штатный запуск компонента</w:t>
+      </w:r>
+    </w:p>
+    <w:p>
+      <w:r>
+        <w:t>Что открыть/выполнить: На версии bafc97a0eb5cc2b2aba68c04a74b179b61432d82 выполнить delivery-contractcheck --config default --fixture testdata/match.json --format json; показать безопасное значение конфигурации, версию/SHA, диагностическую запись, ожидаемый результат и код завершения. Для долгого сервиса показать ограниченную проверку готовности и корректную остановку.</w:t>
+      </w:r>
+    </w:p>
+    <w:p>
+      <w:r>
+        <w:t>Кадр: сохранять заголовок страницы/терминала, полный релевантный текст и результат; не обрезать команду, версию, автора, названия тестов, итог или код завершения. Если содержание не помещается, сделать несколько последовательных снимков подрисунками. Скрыть токены, пароли, cookie, личную почту, лишние персональные данные и соседние окна; секреты заранее исключить из команды и вывода, а не раскрывать ради снимка. Не заменять фактический вывод нарисованным терминалом и не вставлять чужие результаты.</w:t>
+      </w:r>
+    </w:p>
+    <w:p>
+      <w:r>
+        <w:t>Файл: docs/labs/pr12/ds/evidence/screenshots/0104-pz01-04.png. Подпись: «Рисунок 4 — Штатный запуск компонента». В основном тексте дать ссылку на этот рисунок рядом с фактическим результатом.</w:t>
+      </w:r>
+    </w:p>
+    <w:p>
+      <w:r>
+        <w:t>Рисунок 5 — Неверная конфигурация</w:t>
+      </w:r>
+    </w:p>
+    <w:p>
+      <w:r>
+        <w:t>Что открыть/выполнить: Выполнить delivery-contractcheck --config unsupported --fixture testdata/match.json --format json с безопасным тестовым неверным значением в обоих режимах. Показать понятную диагностическую ошибку, отсутствие успешного исполнения с неверной конфигурацией и фактический код завершения.</w:t>
+      </w:r>
+    </w:p>
+    <w:p>
+      <w:r>
+        <w:t>Кадр: сохранять заголовок страницы/терминала, полный релевантный текст и результат; не обрезать команду, версию, автора, названия тестов, итог или код завершения. Если содержание не помещается, сделать несколько последовательных снимков подрисунками. Скрыть токены, пароли, cookie, личную почту, лишние персональные данные и соседние окна; секреты заранее исключить из команды и вывода, а не раскрывать ради снимка. Не заменять фактический вывод нарисованным терминалом и не вставлять чужие результаты.</w:t>
+      </w:r>
+    </w:p>
+    <w:p>
+      <w:r>
+        <w:t>Файл: docs/labs/pr12/ds/evidence/screenshots/0104-pz01-05.png. Подпись: «Рисунок 5 — Неверная конфигурация». В основном тексте дать ссылку на этот рисунок рядом с фактическим результатом.</w:t>
+      </w:r>
+    </w:p>
+    <w:p>
+      <w:r>
+        <w:t>Рисунок 6 — Независимое воспроизведение части другого студента</w:t>
+      </w:r>
+    </w:p>
+    <w:p>
+      <w:r>
+        <w:t>Что открыть/выполнить: После реальной проверки студентом Проверка по H1 выполняется отдельно. открыть Материалы H1 оформляются отдельно. и его журнал Результаты H1 оформляются отдельно.. Показать проверяющего, дату, чистое окружение, commit чужой проверяемой части, команды по инструкции и итог; если были скрытые зависимости, показать повторный прогон после исправления. Авторский запуск не заменяет независимый.</w:t>
+      </w:r>
+    </w:p>
+    <w:p>
+      <w:r>
+        <w:t>Кадр: сохранять заголовок страницы/терминала, полный релевантный текст и результат; не обрезать команду, версию, автора, названия тестов, итог или код завершения. Если содержание не помещается, сделать несколько последовательных снимков подрисунками. Скрыть токены, пароли, cookie, личную почту, лишние персональные данные и соседние окна; секреты заранее исключить из команды и вывода, а не раскрывать ради снимка. Не заменять фактический вывод нарисованным терминалом и не вставлять чужие результаты.</w:t>
+      </w:r>
+    </w:p>
+    <w:p>
+      <w:r>
+        <w:t>Файл: docs/labs/pr12/ds/evidence/screenshots/0104-pz01-06.png. Подпись: «Рисунок 6 — Независимое воспроизведение части другого студента». В основном тексте дать ссылку на этот рисунок рядом с фактическим результатом.</w:t>
+      </w:r>
+    </w:p>
+    <w:p>
+      <w:r>
+        <w:t>Рисунок 7 — Отрицательная локальная проверка автоматического gate</w:t>
+      </w:r>
+    </w:p>
+    <w:p>
+      <w:r>
+        <w:t>Что открыть/выполнить: В изолированной временной ветке нарушить условие unsupported CLI config or format, затем выполнить CWD: repository root; python tools/pr12/workspace.py check delivery. Показать смысловое нарушение, точную команду той же проверки, реально неуспешный результат и код завершения. После фиксации журнала восстановить исправный код; ссылка на обычный CI прогон — Fresh CI success for round-2 source commit bafc97a0eb5cc2b2aba68c04a74b179b61432d82: delivery https://github.com/hitpipe/hitpipe/actions/runs/39279704440, intake https://github.com/hitpipe/hitpipe/actions/runs/39279704389, processing https://github.com/hitpipe/hitpipe/actions/runs/39279704449, iam https://github.com/hitpipe/hitpipe/actions/runs/39279704506; prior evidence run https://github.com/hitpipe/hitpipe/actions/runs/39271075578 passed on c365ad5.</w:t>
+      </w:r>
+    </w:p>
+    <w:p>
+      <w:r>
+        <w:t>Кадр: сохранять заголовок страницы/терминала, полный релевантный текст и результат; не обрезать команду, версию, автора, названия тестов, итог или код завершения. Если содержание не помещается, сделать несколько последовательных снимков подрисунками. Скрыть токены, пароли, cookie, личную почту, лишние персональные данные и соседние окна; секреты заранее исключить из команды и вывода, а не раскрывать ради снимка. Не заменять фактический вывод нарисованным терминалом и не вставлять чужие результаты.</w:t>
+      </w:r>
+    </w:p>
+    <w:p>
+      <w:r>
+        <w:t>Файл: docs/labs/pr12/ds/evidence/screenshots/0104-pz01-07.png. Подпись: «Рисунок 7 — Отрицательная локальная проверка автоматического gate». В основном тексте дать ссылку на этот рисунок рядом с фактическим результатом.</w:t>
       </w:r>
     </w:p>
     <w:sectPr>

</xml_diff>

<commit_message>
HIT-47: place figure captions within report sections
</commit_message>
<xml_diff>
--- a/docs/labs/pr12/ds/reports/0104-pz01-ds.docx
+++ b/docs/labs/pr12/ds/reports/0104-pz01-ds.docx
@@ -2236,164 +2236,8 @@
       </w:r>
     </w:p>
     <w:p>
-      <w:pPr>
-        <w:pStyle w:val="2"/>
-      </w:pPr>
-      <w:r>
-        <w:t>Иллюстрации</w:t>
-      </w:r>
-    </w:p>
-    <w:p>
       <w:r>
         <w:br w:type="page"/>
-      </w:r>
-    </w:p>
-    <w:p>
-      <w:pPr>
-        <w:pStyle w:val="1"/>
-      </w:pPr>
-      <w:r>
-        <w:t>Перечень рисунков для вставки</w:t>
-      </w:r>
-    </w:p>
-    <w:p>
-      <w:r>
-        <w:t>Рисунок 1 — Собственная часть исполняемого каркаса</w:t>
-      </w:r>
-    </w:p>
-    <w:p>
-      <w:r>
-        <w:t>Что открыть/выполнить: Открыть https://github.com/hitpipe/hitpipe/blob/bafc97a0eb5cc2b2aba68c04a74b179b61432d82/services/delivery/cmd/delivery-contractcheck/main.go#L1-L80 либо тот же файл в редакторе на этой версии. Показать путь, существенную собственную логику конфигурации/версии/диагностики и связь с PR https://github.com/hitpipe/hitpipe/pull/29.</w:t>
-      </w:r>
-    </w:p>
-    <w:p>
-      <w:r>
-        <w:t>Кадр: сохранять заголовок страницы/терминала, полный релевантный текст и результат; не обрезать команду, версию, автора, названия тестов, итог или код завершения. Если содержание не помещается, сделать несколько последовательных снимков подрисунками. Скрыть токены, пароли, cookie, личную почту, лишние персональные данные и соседние окна; секреты заранее исключить из команды и вывода, а не раскрывать ради снимка. Не заменять фактический вывод нарисованным терминалом и не вставлять чужие результаты.</w:t>
-      </w:r>
-    </w:p>
-    <w:p>
-      <w:r>
-        <w:t>Файл: docs/labs/pr12/ds/evidence/screenshots/0104-pz01-01.png. Подпись: «Рисунок 1 — Собственная часть исполняемого каркаса». В основном тексте дать ссылку на этот рисунок рядом с фактическим результатом.</w:t>
-      </w:r>
-    </w:p>
-    <w:p>
-      <w:r>
-        <w:t>Рисунок 2 — Подготовка компонента в двух режимах</w:t>
-      </w:r>
-    </w:p>
-    <w:p>
-      <w:r>
-        <w:t>Что открыть/выполнить: На одной версии bafc97a0eb5cc2b2aba68c04a74b179b61432d82 выполнить CWD: services/delivery; go build -ldflags "-X main.version=pr12 -X main.commit=bafc97a0eb5cc2b2aba68c04a74b179b61432d82" -gcflags "all=-N -l" -o .pr12-build/delivery/dev/delivery-contractcheck ./cmd/delivery-contractcheck и go build -trimpath -ldflags "-X main.version=pr12 -X main.commit=bafc97a0eb5cc2b2aba68c04a74b179b61432d82" -o .pr12-build/delivery/release/delivery-contractcheck ./cmd/delivery-contractcheck. Показать команды и реальные существенные настройки: оптимизации, отладочную информацию, runtime-проверки/конфигурацию, фактические результаты сборок. Если строка не различается между режимами, сохранить вывод и объяснить это в таблице.</w:t>
-      </w:r>
-    </w:p>
-    <w:p>
-      <w:r>
-        <w:t>Кадр: сохранять заголовок страницы/терминала, полный релевантный текст и результат; не обрезать команду, версию, автора, названия тестов, итог или код завершения. Если содержание не помещается, сделать несколько последовательных снимков подрисунками. Скрыть токены, пароли, cookie, личную почту, лишние персональные данные и соседние окна; секреты заранее исключить из команды и вывода, а не раскрывать ради снимка. Не заменять фактический вывод нарисованным терминалом и не вставлять чужие результаты.</w:t>
-      </w:r>
-    </w:p>
-    <w:p>
-      <w:r>
-        <w:t>Файл: docs/labs/pr12/ds/evidence/screenshots/0104-pz01-02.png. Подпись: «Рисунок 2 — Подготовка компонента в двух режимах». В основном тексте дать ссылку на этот рисунок рядом с фактическим результатом.</w:t>
-      </w:r>
-    </w:p>
-    <w:p>
-      <w:r>
-        <w:t>Рисунок 3 — Запуск поставки вне исходного кода и IDE</w:t>
-      </w:r>
-    </w:p>
-    <w:p>
-      <w:r>
-        <w:t>Что открыть/выполнить: Перейти в CWD: the temporary directory printed by workspace.py smoke delivery --require, outside the checkout; run .\delivery-contractcheck --fixture .\positive_fixture.json --format json and show Get-Location без IDE/dev-сервера. Показать состав подготовленного результата, версию и полезный итог. Предварительные внешние зависимости должны быть перечислены в инструкции.</w:t>
-      </w:r>
-    </w:p>
-    <w:p>
-      <w:r>
-        <w:t>Кадр: сохранять заголовок страницы/терминала, полный релевантный текст и результат; не обрезать команду, версию, автора, названия тестов, итог или код завершения. Если содержание не помещается, сделать несколько последовательных снимков подрисунками. Скрыть токены, пароли, cookie, личную почту, лишние персональные данные и соседние окна; секреты заранее исключить из команды и вывода, а не раскрывать ради снимка. Не заменять фактический вывод нарисованным терминалом и не вставлять чужие результаты.</w:t>
-      </w:r>
-    </w:p>
-    <w:p>
-      <w:r>
-        <w:t>Файл: docs/labs/pr12/ds/evidence/screenshots/0104-pz01-03.png. Подпись: «Рисунок 3 — Запуск поставки вне исходного кода и IDE». В основном тексте дать ссылку на этот рисунок рядом с фактическим результатом.</w:t>
-      </w:r>
-    </w:p>
-    <w:p>
-      <w:r>
-        <w:t>Рисунок 4 — Штатный запуск компонента</w:t>
-      </w:r>
-    </w:p>
-    <w:p>
-      <w:r>
-        <w:t>Что открыть/выполнить: На версии bafc97a0eb5cc2b2aba68c04a74b179b61432d82 выполнить delivery-contractcheck --config default --fixture testdata/match.json --format json; показать безопасное значение конфигурации, версию/SHA, диагностическую запись, ожидаемый результат и код завершения. Для долгого сервиса показать ограниченную проверку готовности и корректную остановку.</w:t>
-      </w:r>
-    </w:p>
-    <w:p>
-      <w:r>
-        <w:t>Кадр: сохранять заголовок страницы/терминала, полный релевантный текст и результат; не обрезать команду, версию, автора, названия тестов, итог или код завершения. Если содержание не помещается, сделать несколько последовательных снимков подрисунками. Скрыть токены, пароли, cookie, личную почту, лишние персональные данные и соседние окна; секреты заранее исключить из команды и вывода, а не раскрывать ради снимка. Не заменять фактический вывод нарисованным терминалом и не вставлять чужие результаты.</w:t>
-      </w:r>
-    </w:p>
-    <w:p>
-      <w:r>
-        <w:t>Файл: docs/labs/pr12/ds/evidence/screenshots/0104-pz01-04.png. Подпись: «Рисунок 4 — Штатный запуск компонента». В основном тексте дать ссылку на этот рисунок рядом с фактическим результатом.</w:t>
-      </w:r>
-    </w:p>
-    <w:p>
-      <w:r>
-        <w:t>Рисунок 5 — Неверная конфигурация</w:t>
-      </w:r>
-    </w:p>
-    <w:p>
-      <w:r>
-        <w:t>Что открыть/выполнить: Выполнить delivery-contractcheck --config unsupported --fixture testdata/match.json --format json с безопасным тестовым неверным значением в обоих режимах. Показать понятную диагностическую ошибку, отсутствие успешного исполнения с неверной конфигурацией и фактический код завершения.</w:t>
-      </w:r>
-    </w:p>
-    <w:p>
-      <w:r>
-        <w:t>Кадр: сохранять заголовок страницы/терминала, полный релевантный текст и результат; не обрезать команду, версию, автора, названия тестов, итог или код завершения. Если содержание не помещается, сделать несколько последовательных снимков подрисунками. Скрыть токены, пароли, cookie, личную почту, лишние персональные данные и соседние окна; секреты заранее исключить из команды и вывода, а не раскрывать ради снимка. Не заменять фактический вывод нарисованным терминалом и не вставлять чужие результаты.</w:t>
-      </w:r>
-    </w:p>
-    <w:p>
-      <w:r>
-        <w:t>Файл: docs/labs/pr12/ds/evidence/screenshots/0104-pz01-05.png. Подпись: «Рисунок 5 — Неверная конфигурация». В основном тексте дать ссылку на этот рисунок рядом с фактическим результатом.</w:t>
-      </w:r>
-    </w:p>
-    <w:p>
-      <w:r>
-        <w:t>Рисунок 6 — Независимое воспроизведение части другого студента</w:t>
-      </w:r>
-    </w:p>
-    <w:p>
-      <w:r>
-        <w:t>Что открыть/выполнить: После реальной проверки студентом Проверка по H1 выполняется отдельно. открыть Материалы H1 оформляются отдельно. и его журнал Результаты H1 оформляются отдельно.. Показать проверяющего, дату, чистое окружение, commit чужой проверяемой части, команды по инструкции и итог; если были скрытые зависимости, показать повторный прогон после исправления. Авторский запуск не заменяет независимый.</w:t>
-      </w:r>
-    </w:p>
-    <w:p>
-      <w:r>
-        <w:t>Кадр: сохранять заголовок страницы/терминала, полный релевантный текст и результат; не обрезать команду, версию, автора, названия тестов, итог или код завершения. Если содержание не помещается, сделать несколько последовательных снимков подрисунками. Скрыть токены, пароли, cookie, личную почту, лишние персональные данные и соседние окна; секреты заранее исключить из команды и вывода, а не раскрывать ради снимка. Не заменять фактический вывод нарисованным терминалом и не вставлять чужие результаты.</w:t>
-      </w:r>
-    </w:p>
-    <w:p>
-      <w:r>
-        <w:t>Файл: docs/labs/pr12/ds/evidence/screenshots/0104-pz01-06.png. Подпись: «Рисунок 6 — Независимое воспроизведение части другого студента». В основном тексте дать ссылку на этот рисунок рядом с фактическим результатом.</w:t>
-      </w:r>
-    </w:p>
-    <w:p>
-      <w:r>
-        <w:t>Рисунок 7 — Отрицательная локальная проверка автоматического gate</w:t>
-      </w:r>
-    </w:p>
-    <w:p>
-      <w:r>
-        <w:t>Что открыть/выполнить: В изолированной временной ветке нарушить условие unsupported CLI config or format, затем выполнить CWD: repository root; python tools/pr12/workspace.py check delivery. Показать смысловое нарушение, точную команду той же проверки, реально неуспешный результат и код завершения. После фиксации журнала восстановить исправный код; ссылка на обычный CI прогон — Fresh CI success for round-2 source commit bafc97a0eb5cc2b2aba68c04a74b179b61432d82: delivery https://github.com/hitpipe/hitpipe/actions/runs/39279704440, intake https://github.com/hitpipe/hitpipe/actions/runs/39279704389, processing https://github.com/hitpipe/hitpipe/actions/runs/39279704449, iam https://github.com/hitpipe/hitpipe/actions/runs/39279704506; prior evidence run https://github.com/hitpipe/hitpipe/actions/runs/39271075578 passed on c365ad5.</w:t>
-      </w:r>
-    </w:p>
-    <w:p>
-      <w:r>
-        <w:t>Кадр: сохранять заголовок страницы/терминала, полный релевантный текст и результат; не обрезать команду, версию, автора, названия тестов, итог или код завершения. Если содержание не помещается, сделать несколько последовательных снимков подрисунками. Скрыть токены, пароли, cookie, личную почту, лишние персональные данные и соседние окна; секреты заранее исключить из команды и вывода, а не раскрывать ради снимка. Не заменять фактический вывод нарисованным терминалом и не вставлять чужие результаты.</w:t>
-      </w:r>
-    </w:p>
-    <w:p>
-      <w:r>
-        <w:t>Файл: docs/labs/pr12/ds/evidence/screenshots/0104-pz01-07.png. Подпись: «Рисунок 7 — Отрицательная локальная проверка автоматического gate». В основном тексте дать ссылку на этот рисунок рядом с фактическим результатом.</w:t>
       </w:r>
     </w:p>
     <w:sectPr>

</xml_diff>

<commit_message>
HIT-47: embed figure placeholders in report flow
</commit_message>
<xml_diff>
--- a/docs/labs/pr12/ds/reports/0104-pz01-ds.docx
+++ b/docs/labs/pr12/ds/reports/0104-pz01-ds.docx
@@ -1378,6 +1378,56 @@
         <w:t>Задача https://hitpipe.atlassian.net/browse/HIT-47 → ветка work/HIT-47-ds-corrections → PR https://github.com/hitpipe/hitpipe/pull/29 → реальные проверки Fresh CI success for round-2 source commit bafc97a0eb5cc2b2aba68c04a74b179b61432d82: delivery https://github.com/hitpipe/hitpipe/actions/runs/39279704440, intake https://github.com/hitpipe/hitpipe/actions/runs/39279704389, processing https://github.com/hitpipe/hitpipe/actions/runs/39279704449, iam https://github.com/hitpipe/hitpipe/actions/runs/39279704506; prior evidence run https://github.com/hitpipe/hitpipe/actions/runs/39271075578 passed on c365ad5 → независимый review Независимая проверка выполняется отдельным reviewer'ом. → merge PR #29 является источником версии для проверки.. Показать собственный фрагмент (рисунок 1); прямые изменения main не допускаются.</w:t>
       </w:r>
     </w:p>
+    <w:tbl>
+      <w:tblPr>
+        <w:tblW w:type="dxa" w:w="9000"/>
+        <w:tblLayout w:type="autofit"/>
+        <w:tblLook w:firstColumn="1" w:firstRow="1" w:lastColumn="0" w:lastRow="0" w:noHBand="0" w:noVBand="1" w:val="04A0"/>
+      </w:tblPr>
+      <w:tblGrid>
+        <w:gridCol w:w="9355"/>
+      </w:tblGrid>
+      <w:tr>
+        <w:tc>
+          <w:tcPr>
+            <w:tcW w:type="dxa" w:w="9355"/>
+            <w:shd w:fill="EDEDED" w:val="clear"/>
+            <w:tcMar>
+              <w:top w:w="160" w:type="dxa"/>
+              <w:start w:w="180" w:type="dxa"/>
+              <w:bottom w:w="160" w:type="dxa"/>
+              <w:end w:w="180" w:type="dxa"/>
+            </w:tcMar>
+          </w:tcPr>
+          <w:p>
+            <w:pPr>
+              <w:spacing w:before="40" w:after="40"/>
+              <w:jc w:val="center"/>
+            </w:pPr>
+            <w:r>
+              <w:rPr>
+                <w:rFonts w:ascii="Times New Roman" w:hAnsi="Times New Roman" w:eastAsia="Times New Roman"/>
+                <w:sz w:val="24"/>
+              </w:rPr>
+              <w:t>[МЕСТО ДЛЯ СКРИНШОТА 1 — Собственная часть исполняемого каркаса]</w:t>
+            </w:r>
+          </w:p>
+        </w:tc>
+      </w:tr>
+    </w:tbl>
+    <w:p>
+      <w:pPr>
+        <w:spacing w:before="40" w:after="160"/>
+        <w:jc w:val="center"/>
+      </w:pPr>
+      <w:r>
+        <w:rPr>
+          <w:rFonts w:ascii="Times New Roman" w:hAnsi="Times New Roman" w:eastAsia="Times New Roman"/>
+          <w:sz w:val="24"/>
+        </w:rPr>
+        <w:t>Рисунок 1 — Собственная часть исполняемого каркаса</w:t>
+      </w:r>
+    </w:p>
     <w:p>
       <w:pPr>
         <w:pStyle w:val="afa"/>
@@ -1389,6 +1439,56 @@
     <w:p>
       <w:r>
         <w:t>Схема: services/delivery/go.mod + internal/domain/readback + cmd/delivery-contractcheck + testdata → go mod tidy; Go 1.27.2; golang.org/x/text v0.28.0 → go build with dev/release flags; CLI reads fixture, validates config/format, emits JSON → .pr12-build/delivery/{dev,release}/delivery-contractcheck → run --version and --fixture ... --format json from a temporary directory outside checkout. Указывать только существующие стадии Go/Node/Python. Команда просмотра результата go version -m .pr12-build/delivery/release/delivery-contractcheck, существенный фактический вывод workspace.py smoke recorded dev/release PASS; go version -m inspection is an explicit human capture step and is not claimed as completed by the agent. Для Go подходят go version -m, file/readelf/ldd с честным выводом о статической линковке; для Next/Python — пакет/модули/bytecode и закреплённые зависимости. Наличие инструмента не равно выполненному наблюдению.</w:t>
+      </w:r>
+    </w:p>
+    <w:tbl>
+      <w:tblPr>
+        <w:tblW w:type="dxa" w:w="9000"/>
+        <w:tblLayout w:type="autofit"/>
+        <w:tblLook w:firstColumn="1" w:firstRow="1" w:lastColumn="0" w:lastRow="0" w:noHBand="0" w:noVBand="1" w:val="04A0"/>
+      </w:tblPr>
+      <w:tblGrid>
+        <w:gridCol w:w="9355"/>
+      </w:tblGrid>
+      <w:tr>
+        <w:tc>
+          <w:tcPr>
+            <w:tcW w:type="dxa" w:w="9355"/>
+            <w:shd w:fill="EDEDED" w:val="clear"/>
+            <w:tcMar>
+              <w:top w:w="160" w:type="dxa"/>
+              <w:start w:w="180" w:type="dxa"/>
+              <w:bottom w:w="160" w:type="dxa"/>
+              <w:end w:w="180" w:type="dxa"/>
+            </w:tcMar>
+          </w:tcPr>
+          <w:p>
+            <w:pPr>
+              <w:spacing w:before="40" w:after="40"/>
+              <w:jc w:val="center"/>
+            </w:pPr>
+            <w:r>
+              <w:rPr>
+                <w:rFonts w:ascii="Times New Roman" w:hAnsi="Times New Roman" w:eastAsia="Times New Roman"/>
+                <w:sz w:val="24"/>
+              </w:rPr>
+              <w:t>[МЕСТО ДЛЯ СКРИНШОТА 2 — Подготовка компонента в двух режимах]</w:t>
+            </w:r>
+          </w:p>
+        </w:tc>
+      </w:tr>
+    </w:tbl>
+    <w:p>
+      <w:pPr>
+        <w:spacing w:before="40" w:after="160"/>
+        <w:jc w:val="center"/>
+      </w:pPr>
+      <w:r>
+        <w:rPr>
+          <w:rFonts w:ascii="Times New Roman" w:hAnsi="Times New Roman" w:eastAsia="Times New Roman"/>
+          <w:sz w:val="24"/>
+        </w:rPr>
+        <w:t>Рисунок 2 — Подготовка компонента в двух режимах</w:t>
       </w:r>
     </w:p>
     <w:p>
@@ -1665,6 +1765,56 @@
     <w:p>
       <w:r>
         <w:t>Один сценарий testdata/match.json в обоих режимах. Если различий нет — объяснить. Поставку запустить из temporary directory created by workspace.py smoke delivery --require вне исходников/IDE. Не заявлять ускорение без измерений. Рисунки 2–3.</w:t>
+      </w:r>
+    </w:p>
+    <w:tbl>
+      <w:tblPr>
+        <w:tblW w:type="dxa" w:w="9000"/>
+        <w:tblLayout w:type="autofit"/>
+        <w:tblLook w:firstColumn="1" w:firstRow="1" w:lastColumn="0" w:lastRow="0" w:noHBand="0" w:noVBand="1" w:val="04A0"/>
+      </w:tblPr>
+      <w:tblGrid>
+        <w:gridCol w:w="9355"/>
+      </w:tblGrid>
+      <w:tr>
+        <w:tc>
+          <w:tcPr>
+            <w:tcW w:type="dxa" w:w="9355"/>
+            <w:shd w:fill="EDEDED" w:val="clear"/>
+            <w:tcMar>
+              <w:top w:w="160" w:type="dxa"/>
+              <w:start w:w="180" w:type="dxa"/>
+              <w:bottom w:w="160" w:type="dxa"/>
+              <w:end w:w="180" w:type="dxa"/>
+            </w:tcMar>
+          </w:tcPr>
+          <w:p>
+            <w:pPr>
+              <w:spacing w:before="40" w:after="40"/>
+              <w:jc w:val="center"/>
+            </w:pPr>
+            <w:r>
+              <w:rPr>
+                <w:rFonts w:ascii="Times New Roman" w:hAnsi="Times New Roman" w:eastAsia="Times New Roman"/>
+                <w:sz w:val="24"/>
+              </w:rPr>
+              <w:t>[МЕСТО ДЛЯ СКРИНШОТА 3 — Запуск поставки вне исходного кода и IDE]</w:t>
+            </w:r>
+          </w:p>
+        </w:tc>
+      </w:tr>
+    </w:tbl>
+    <w:p>
+      <w:pPr>
+        <w:spacing w:before="40" w:after="160"/>
+        <w:jc w:val="center"/>
+      </w:pPr>
+      <w:r>
+        <w:rPr>
+          <w:rFonts w:ascii="Times New Roman" w:hAnsi="Times New Roman" w:eastAsia="Times New Roman"/>
+          <w:sz w:val="24"/>
+        </w:rPr>
+        <w:t>Рисунок 3 — Запуск поставки вне исходного кода и IDE</w:t>
       </w:r>
     </w:p>
     <w:p>
@@ -1956,6 +2106,106 @@
         <w:t>Версии среды и прямых зависимостей зафиксированы services/delivery/go.mod and go.sum; безопасный пример конфигурации default; unsupported config is rejected with exit 2. Рисунки 4–5.</w:t>
       </w:r>
     </w:p>
+    <w:tbl>
+      <w:tblPr>
+        <w:tblW w:type="dxa" w:w="9000"/>
+        <w:tblLayout w:type="autofit"/>
+        <w:tblLook w:firstColumn="1" w:firstRow="1" w:lastColumn="0" w:lastRow="0" w:noHBand="0" w:noVBand="1" w:val="04A0"/>
+      </w:tblPr>
+      <w:tblGrid>
+        <w:gridCol w:w="9355"/>
+      </w:tblGrid>
+      <w:tr>
+        <w:tc>
+          <w:tcPr>
+            <w:tcW w:type="dxa" w:w="9355"/>
+            <w:shd w:fill="EDEDED" w:val="clear"/>
+            <w:tcMar>
+              <w:top w:w="160" w:type="dxa"/>
+              <w:start w:w="180" w:type="dxa"/>
+              <w:bottom w:w="160" w:type="dxa"/>
+              <w:end w:w="180" w:type="dxa"/>
+            </w:tcMar>
+          </w:tcPr>
+          <w:p>
+            <w:pPr>
+              <w:spacing w:before="40" w:after="40"/>
+              <w:jc w:val="center"/>
+            </w:pPr>
+            <w:r>
+              <w:rPr>
+                <w:rFonts w:ascii="Times New Roman" w:hAnsi="Times New Roman" w:eastAsia="Times New Roman"/>
+                <w:sz w:val="24"/>
+              </w:rPr>
+              <w:t>[МЕСТО ДЛЯ СКРИНШОТА 4 — Штатный запуск компонента]</w:t>
+            </w:r>
+          </w:p>
+        </w:tc>
+      </w:tr>
+    </w:tbl>
+    <w:p>
+      <w:pPr>
+        <w:spacing w:before="40" w:after="160"/>
+        <w:jc w:val="center"/>
+      </w:pPr>
+      <w:r>
+        <w:rPr>
+          <w:rFonts w:ascii="Times New Roman" w:hAnsi="Times New Roman" w:eastAsia="Times New Roman"/>
+          <w:sz w:val="24"/>
+        </w:rPr>
+        <w:t>Рисунок 4 — Штатный запуск компонента</w:t>
+      </w:r>
+    </w:p>
+    <w:tbl>
+      <w:tblPr>
+        <w:tblW w:type="dxa" w:w="9000"/>
+        <w:tblLayout w:type="autofit"/>
+        <w:tblLook w:firstColumn="1" w:firstRow="1" w:lastColumn="0" w:lastRow="0" w:noHBand="0" w:noVBand="1" w:val="04A0"/>
+      </w:tblPr>
+      <w:tblGrid>
+        <w:gridCol w:w="9355"/>
+      </w:tblGrid>
+      <w:tr>
+        <w:tc>
+          <w:tcPr>
+            <w:tcW w:type="dxa" w:w="9355"/>
+            <w:shd w:fill="EDEDED" w:val="clear"/>
+            <w:tcMar>
+              <w:top w:w="160" w:type="dxa"/>
+              <w:start w:w="180" w:type="dxa"/>
+              <w:bottom w:w="160" w:type="dxa"/>
+              <w:end w:w="180" w:type="dxa"/>
+            </w:tcMar>
+          </w:tcPr>
+          <w:p>
+            <w:pPr>
+              <w:spacing w:before="40" w:after="40"/>
+              <w:jc w:val="center"/>
+            </w:pPr>
+            <w:r>
+              <w:rPr>
+                <w:rFonts w:ascii="Times New Roman" w:hAnsi="Times New Roman" w:eastAsia="Times New Roman"/>
+                <w:sz w:val="24"/>
+              </w:rPr>
+              <w:t>[МЕСТО ДЛЯ СКРИНШОТА 5 — Неверная конфигурация]</w:t>
+            </w:r>
+          </w:p>
+        </w:tc>
+      </w:tr>
+    </w:tbl>
+    <w:p>
+      <w:pPr>
+        <w:spacing w:before="40" w:after="160"/>
+        <w:jc w:val="center"/>
+      </w:pPr>
+      <w:r>
+        <w:rPr>
+          <w:rFonts w:ascii="Times New Roman" w:hAnsi="Times New Roman" w:eastAsia="Times New Roman"/>
+          <w:sz w:val="24"/>
+        </w:rPr>
+        <w:t>Рисунок 5 — Неверная конфигурация</w:t>
+      </w:r>
+    </w:p>
     <w:p>
       <w:pPr>
         <w:pStyle w:val="afa"/>
@@ -1969,6 +2219,56 @@
         <w:t>Проверяющий студент Дмитрий Стацюк; автор проверяемой части Проверка по H1 выполняется отдельно.; дата 2026-10-19; чистая среда Проверка выполняется по отдельной учебной процедуре.; commit NOT APPLICABLE — H1; инструкция Материалы H1 оформляются отдельно.; команды/результат/замечания Результаты H1 оформляются отдельно.. После исправлений повторить из исходной чистой среды. Отдельно получить независимую проверку собственной инструкции; не выдавать авторский запуск за независимый. Рисунок 6.</w:t>
       </w:r>
     </w:p>
+    <w:tbl>
+      <w:tblPr>
+        <w:tblW w:type="dxa" w:w="9000"/>
+        <w:tblLayout w:type="autofit"/>
+        <w:tblLook w:firstColumn="1" w:firstRow="1" w:lastColumn="0" w:lastRow="0" w:noHBand="0" w:noVBand="1" w:val="04A0"/>
+      </w:tblPr>
+      <w:tblGrid>
+        <w:gridCol w:w="9355"/>
+      </w:tblGrid>
+      <w:tr>
+        <w:tc>
+          <w:tcPr>
+            <w:tcW w:type="dxa" w:w="9355"/>
+            <w:shd w:fill="EDEDED" w:val="clear"/>
+            <w:tcMar>
+              <w:top w:w="160" w:type="dxa"/>
+              <w:start w:w="180" w:type="dxa"/>
+              <w:bottom w:w="160" w:type="dxa"/>
+              <w:end w:w="180" w:type="dxa"/>
+            </w:tcMar>
+          </w:tcPr>
+          <w:p>
+            <w:pPr>
+              <w:spacing w:before="40" w:after="40"/>
+              <w:jc w:val="center"/>
+            </w:pPr>
+            <w:r>
+              <w:rPr>
+                <w:rFonts w:ascii="Times New Roman" w:hAnsi="Times New Roman" w:eastAsia="Times New Roman"/>
+                <w:sz w:val="24"/>
+              </w:rPr>
+              <w:t>[МЕСТО ДЛЯ СКРИНШОТА 6 — Независимое воспроизведение части другого студента]</w:t>
+            </w:r>
+          </w:p>
+        </w:tc>
+      </w:tr>
+    </w:tbl>
+    <w:p>
+      <w:pPr>
+        <w:spacing w:before="40" w:after="160"/>
+        <w:jc w:val="center"/>
+      </w:pPr>
+      <w:r>
+        <w:rPr>
+          <w:rFonts w:ascii="Times New Roman" w:hAnsi="Times New Roman" w:eastAsia="Times New Roman"/>
+          <w:sz w:val="24"/>
+        </w:rPr>
+        <w:t>Рисунок 6 — Независимое воспроизведение части другого студента</w:t>
+      </w:r>
+    </w:p>
     <w:p>
       <w:pPr>
         <w:pStyle w:val="afa"/>
@@ -1980,6 +2280,56 @@
     <w:p>
       <w:r>
         <w:t>CI сдаваемой версии Fresh CI success for round-2 source commit bafc97a0eb5cc2b2aba68c04a74b179b61432d82: delivery https://github.com/hitpipe/hitpipe/actions/runs/39279704440, intake https://github.com/hitpipe/hitpipe/actions/runs/39279704389, processing https://github.com/hitpipe/hitpipe/actions/runs/39279704449, iam https://github.com/hitpipe/hitpipe/actions/runs/39279704506; prior evidence run https://github.com/hitpipe/hitpipe/actions/runs/39271075578 passed on c365ad5 выполняет workspace.py check delivery; workspace.py smoke delivery --require, сбой условия даёт ненулевой exit. Долгий процесс имеет timeout readiness и корректную остановку. Локальная отрицательная демонстрация той же проверки workspace.py smoke log; actual negative exit observed locally, после неё исправный код восстановлен. Граница автоматизации/ручной проверки synthetic fixtures; no provider GET/POST, permissions, state transition or customer data. Рисунок 7.</w:t>
+      </w:r>
+    </w:p>
+    <w:tbl>
+      <w:tblPr>
+        <w:tblW w:type="dxa" w:w="9000"/>
+        <w:tblLayout w:type="autofit"/>
+        <w:tblLook w:firstColumn="1" w:firstRow="1" w:lastColumn="0" w:lastRow="0" w:noHBand="0" w:noVBand="1" w:val="04A0"/>
+      </w:tblPr>
+      <w:tblGrid>
+        <w:gridCol w:w="9355"/>
+      </w:tblGrid>
+      <w:tr>
+        <w:tc>
+          <w:tcPr>
+            <w:tcW w:type="dxa" w:w="9355"/>
+            <w:shd w:fill="EDEDED" w:val="clear"/>
+            <w:tcMar>
+              <w:top w:w="160" w:type="dxa"/>
+              <w:start w:w="180" w:type="dxa"/>
+              <w:bottom w:w="160" w:type="dxa"/>
+              <w:end w:w="180" w:type="dxa"/>
+            </w:tcMar>
+          </w:tcPr>
+          <w:p>
+            <w:pPr>
+              <w:spacing w:before="40" w:after="40"/>
+              <w:jc w:val="center"/>
+            </w:pPr>
+            <w:r>
+              <w:rPr>
+                <w:rFonts w:ascii="Times New Roman" w:hAnsi="Times New Roman" w:eastAsia="Times New Roman"/>
+                <w:sz w:val="24"/>
+              </w:rPr>
+              <w:t>[МЕСТО ДЛЯ СКРИНШОТА 7 — Отрицательная локальная проверка автоматического gate]</w:t>
+            </w:r>
+          </w:p>
+        </w:tc>
+      </w:tr>
+    </w:tbl>
+    <w:p>
+      <w:pPr>
+        <w:spacing w:before="40" w:after="160"/>
+        <w:jc w:val="center"/>
+      </w:pPr>
+      <w:r>
+        <w:rPr>
+          <w:rFonts w:ascii="Times New Roman" w:hAnsi="Times New Roman" w:eastAsia="Times New Roman"/>
+          <w:sz w:val="24"/>
+        </w:rPr>
+        <w:t>Рисунок 7 — Отрицательная локальная проверка автоматического gate</w:t>
       </w:r>
     </w:p>
     <w:p>
@@ -2006,238 +2356,6 @@
     <w:p>
       <w:r>
         <w:t>Актуальная методичка (точное имя и SHA-256 из реестра источников); канонические требования и архитектура HitPipe (ID, URL и revision); собственные PR, commit, CI и журналы; общие документы и авторы соответствующих частей. Указывать реально использованные версии, а не главную ветку без фиксации.</w:t>
-      </w:r>
-    </w:p>
-    <w:p>
-      <w:pPr>
-        <w:pStyle w:val="af7"/>
-      </w:pPr>
-      <w:r>
-        <w:t>ПРИЛОЖЕНИЕ. ИНСТРУКЦИИ ДЛЯ ОБЯЗАТЕЛЬНЫХ РИСУНКОВ</w:t>
-      </w:r>
-    </w:p>
-    <w:p>
-      <w:pPr>
-        <w:pStyle w:val="afa"/>
-      </w:pPr>
-      <w:r>
-        <w:t>Рисунок 1 — Собственная часть исполняемого каркаса</w:t>
-      </w:r>
-    </w:p>
-    <w:p>
-      <w:r>
-        <w:t>[ВСТАВИТЬ РЕАЛЬНОЕ ИЗОБРАЖЕНИЕ ВРУЧНУЮ: 0104-pz01-01.png]</w:t>
-      </w:r>
-    </w:p>
-    <w:p>
-      <w:r>
-        <w:t>Что открыть/выполнить: Открыть https://github.com/hitpipe/hitpipe/blob/bafc97a0eb5cc2b2aba68c04a74b179b61432d82/services/delivery/cmd/delivery-contractcheck/main.go#L1-L80 либо тот же файл в редакторе на этой версии. Показать путь, существенную собственную логику конфигурации/версии/диагностики и связь с PR https://github.com/hitpipe/hitpipe/pull/29.</w:t>
-      </w:r>
-    </w:p>
-    <w:p>
-      <w:r>
-        <w:t>Кадр: сохранять заголовок страницы/терминала, полный релевантный текст и результат; не обрезать команду, версию, автора, названия тестов, итог или код завершения. Если содержание не помещается, сделать несколько последовательных снимков подрисунками. Скрыть токены, пароли, cookie, личную почту, лишние персональные данные и соседние окна; секреты заранее исключить из команды и вывода, а не раскрывать ради снимка. Не заменять фактический вывод нарисованным терминалом и не вставлять чужие результаты.</w:t>
-      </w:r>
-    </w:p>
-    <w:p>
-      <w:r>
-        <w:t>Файл: docs/labs/pr12/ds/evidence/screenshots/0104-pz01-01.png. Подпись: «Рисунок 1 — Собственная часть исполняемого каркаса». В основном тексте дать ссылку на этот рисунок рядом с фактическим результатом.</w:t>
-      </w:r>
-    </w:p>
-    <w:p>
-      <w:pPr>
-        <w:pStyle w:val="afa"/>
-      </w:pPr>
-      <w:r>
-        <w:t>Рисунок 2 — Подготовка компонента в двух режимах</w:t>
-      </w:r>
-    </w:p>
-    <w:p>
-      <w:r>
-        <w:t>[ВСТАВИТЬ РЕАЛЬНОЕ ИЗОБРАЖЕНИЕ ВРУЧНУЮ: 0104-pz01-02.png]</w:t>
-      </w:r>
-    </w:p>
-    <w:p>
-      <w:r>
-        <w:t>Что открыть/выполнить: На одной версии bafc97a0eb5cc2b2aba68c04a74b179b61432d82 выполнить CWD: services/delivery; go build -ldflags "-X main.version=pr12 -X main.commit=bafc97a0eb5cc2b2aba68c04a74b179b61432d82" -gcflags "all=-N -l" -o .pr12-build/delivery/dev/delivery-contractcheck ./cmd/delivery-contractcheck и go build -trimpath -ldflags "-X main.version=pr12 -X main.commit=bafc97a0eb5cc2b2aba68c04a74b179b61432d82" -o .pr12-build/delivery/release/delivery-contractcheck ./cmd/delivery-contractcheck. Показать команды и реальные существенные настройки: оптимизации, отладочную информацию, runtime-проверки/конфигурацию, фактические результаты сборок. Если строка не различается между режимами, сохранить вывод и объяснить это в таблице.</w:t>
-      </w:r>
-    </w:p>
-    <w:p>
-      <w:r>
-        <w:t>Кадр: сохранять заголовок страницы/терминала, полный релевантный текст и результат; не обрезать команду, версию, автора, названия тестов, итог или код завершения. Если содержание не помещается, сделать несколько последовательных снимков подрисунками. Скрыть токены, пароли, cookie, личную почту, лишние персональные данные и соседние окна; секреты заранее исключить из команды и вывода, а не раскрывать ради снимка. Не заменять фактический вывод нарисованным терминалом и не вставлять чужие результаты.</w:t>
-      </w:r>
-    </w:p>
-    <w:p>
-      <w:r>
-        <w:t>Файл: docs/labs/pr12/ds/evidence/screenshots/0104-pz01-02.png. Подпись: «Рисунок 2 — Подготовка компонента в двух режимах». В основном тексте дать ссылку на этот рисунок рядом с фактическим результатом.</w:t>
-      </w:r>
-    </w:p>
-    <w:p>
-      <w:pPr>
-        <w:pStyle w:val="afa"/>
-      </w:pPr>
-      <w:r>
-        <w:t>Рисунок 3 — Запуск поставки вне исходного кода и IDE</w:t>
-      </w:r>
-    </w:p>
-    <w:p>
-      <w:r>
-        <w:t>[ВСТАВИТЬ РЕАЛЬНОЕ ИЗОБРАЖЕНИЕ ВРУЧНУЮ: 0104-pz01-03.png]</w:t>
-      </w:r>
-    </w:p>
-    <w:p>
-      <w:r>
-        <w:t>Что открыть/выполнить: Перейти в CWD: the temporary directory printed by workspace.py smoke delivery --require, outside the checkout; run .\delivery-contractcheck --fixture .\positive_fixture.json --format json and show Get-Location без IDE/dev-сервера. Показать состав подготовленного результата, версию и полезный итог. Предварительные внешние зависимости должны быть перечислены в инструкции.</w:t>
-      </w:r>
-    </w:p>
-    <w:p>
-      <w:r>
-        <w:t>Кадр: сохранять заголовок страницы/терминала, полный релевантный текст и результат; не обрезать команду, версию, автора, названия тестов, итог или код завершения. Если содержание не помещается, сделать несколько последовательных снимков подрисунками. Скрыть токены, пароли, cookie, личную почту, лишние персональные данные и соседние окна; секреты заранее исключить из команды и вывода, а не раскрывать ради снимка. Не заменять фактический вывод нарисованным терминалом и не вставлять чужие результаты.</w:t>
-      </w:r>
-    </w:p>
-    <w:p>
-      <w:r>
-        <w:t>Файл: docs/labs/pr12/ds/evidence/screenshots/0104-pz01-03.png. Подпись: «Рисунок 3 — Запуск поставки вне исходного кода и IDE». В основном тексте дать ссылку на этот рисунок рядом с фактическим результатом.</w:t>
-      </w:r>
-    </w:p>
-    <w:p>
-      <w:pPr>
-        <w:pStyle w:val="afa"/>
-      </w:pPr>
-      <w:r>
-        <w:t>Рисунок 4 — Штатный запуск компонента</w:t>
-      </w:r>
-    </w:p>
-    <w:p>
-      <w:r>
-        <w:t>[ВСТАВИТЬ РЕАЛЬНОЕ ИЗОБРАЖЕНИЕ ВРУЧНУЮ: 0104-pz01-04.png]</w:t>
-      </w:r>
-    </w:p>
-    <w:p>
-      <w:r>
-        <w:t>Что открыть/выполнить: На версии bafc97a0eb5cc2b2aba68c04a74b179b61432d82 выполнить delivery-contractcheck --config default --fixture testdata/match.json --format json; показать безопасное значение конфигурации, версию/SHA, диагностическую запись, ожидаемый результат и код завершения. Для долгого сервиса показать ограниченную проверку готовности и корректную остановку.</w:t>
-      </w:r>
-    </w:p>
-    <w:p>
-      <w:r>
-        <w:t>Кадр: сохранять заголовок страницы/терминала, полный релевантный текст и результат; не обрезать команду, версию, автора, названия тестов, итог или код завершения. Если содержание не помещается, сделать несколько последовательных снимков подрисунками. Скрыть токены, пароли, cookie, личную почту, лишние персональные данные и соседние окна; секреты заранее исключить из команды и вывода, а не раскрывать ради снимка. Не заменять фактический вывод нарисованным терминалом и не вставлять чужие результаты.</w:t>
-      </w:r>
-    </w:p>
-    <w:p>
-      <w:r>
-        <w:t>Файл: docs/labs/pr12/ds/evidence/screenshots/0104-pz01-04.png. Подпись: «Рисунок 4 — Штатный запуск компонента». В основном тексте дать ссылку на этот рисунок рядом с фактическим результатом.</w:t>
-      </w:r>
-    </w:p>
-    <w:p>
-      <w:pPr>
-        <w:pStyle w:val="afa"/>
-      </w:pPr>
-      <w:r>
-        <w:t>Рисунок 5 — Неверная конфигурация</w:t>
-      </w:r>
-    </w:p>
-    <w:p>
-      <w:r>
-        <w:t>[ВСТАВИТЬ РЕАЛЬНОЕ ИЗОБРАЖЕНИЕ ВРУЧНУЮ: 0104-pz01-05.png]</w:t>
-      </w:r>
-    </w:p>
-    <w:p>
-      <w:r>
-        <w:t>Что открыть/выполнить: Выполнить delivery-contractcheck --config unsupported --fixture testdata/match.json --format json с безопасным тестовым неверным значением в обоих режимах. Показать понятную диагностическую ошибку, отсутствие успешного исполнения с неверной конфигурацией и фактический код завершения.</w:t>
-      </w:r>
-    </w:p>
-    <w:p>
-      <w:r>
-        <w:t>Кадр: сохранять заголовок страницы/терминала, полный релевантный текст и результат; не обрезать команду, версию, автора, названия тестов, итог или код завершения. Если содержание не помещается, сделать несколько последовательных снимков подрисунками. Скрыть токены, пароли, cookie, личную почту, лишние персональные данные и соседние окна; секреты заранее исключить из команды и вывода, а не раскрывать ради снимка. Не заменять фактический вывод нарисованным терминалом и не вставлять чужие результаты.</w:t>
-      </w:r>
-    </w:p>
-    <w:p>
-      <w:r>
-        <w:t>Файл: docs/labs/pr12/ds/evidence/screenshots/0104-pz01-05.png. Подпись: «Рисунок 5 — Неверная конфигурация». В основном тексте дать ссылку на этот рисунок рядом с фактическим результатом.</w:t>
-      </w:r>
-    </w:p>
-    <w:p>
-      <w:pPr>
-        <w:pStyle w:val="afa"/>
-      </w:pPr>
-      <w:r>
-        <w:t>Рисунок 6 — Независимое воспроизведение части другого студента</w:t>
-      </w:r>
-    </w:p>
-    <w:p>
-      <w:r>
-        <w:t>[ВСТАВИТЬ РЕАЛЬНОЕ ИЗОБРАЖЕНИЕ ВРУЧНУЮ: 0104-pz01-06.png]</w:t>
-      </w:r>
-    </w:p>
-    <w:p>
-      <w:r>
-        <w:t>Что открыть/выполнить: После реальной проверки студентом Проверка по H1 выполняется отдельно. открыть Материалы H1 оформляются отдельно. и его журнал Результаты H1 оформляются отдельно.. Показать проверяющего, дату, чистое окружение, commit чужой проверяемой части, команды по инструкции и итог; если были скрытые зависимости, показать повторный прогон после исправления. Авторский запуск не заменяет независимый.</w:t>
-      </w:r>
-    </w:p>
-    <w:p>
-      <w:r>
-        <w:t>Кадр: сохранять заголовок страницы/терминала, полный релевантный текст и результат; не обрезать команду, версию, автора, названия тестов, итог или код завершения. Если содержание не помещается, сделать несколько последовательных снимков подрисунками. Скрыть токены, пароли, cookie, личную почту, лишние персональные данные и соседние окна; секреты заранее исключить из команды и вывода, а не раскрывать ради снимка. Не заменять фактический вывод нарисованным терминалом и не вставлять чужие результаты.</w:t>
-      </w:r>
-    </w:p>
-    <w:p>
-      <w:r>
-        <w:t>Файл: docs/labs/pr12/ds/evidence/screenshots/0104-pz01-06.png. Подпись: «Рисунок 6 — Независимое воспроизведение части другого студента». В основном тексте дать ссылку на этот рисунок рядом с фактическим результатом.</w:t>
-      </w:r>
-    </w:p>
-    <w:p>
-      <w:pPr>
-        <w:pStyle w:val="afa"/>
-      </w:pPr>
-      <w:r>
-        <w:t>Рисунок 7 — Отрицательная локальная проверка автоматического gate</w:t>
-      </w:r>
-    </w:p>
-    <w:p>
-      <w:r>
-        <w:t>[ВСТАВИТЬ РЕАЛЬНОЕ ИЗОБРАЖЕНИЕ ВРУЧНУЮ: 0104-pz01-07.png]</w:t>
-      </w:r>
-    </w:p>
-    <w:p>
-      <w:r>
-        <w:t>Что открыть/выполнить: В изолированной временной ветке нарушить условие unsupported CLI config or format, затем выполнить CWD: repository root; python tools/pr12/workspace.py check delivery. Показать смысловое нарушение, точную команду той же проверки, реально неуспешный результат и код завершения. После фиксации журнала восстановить исправный код; ссылка на обычный CI прогон — Fresh CI success for round-2 source commit bafc97a0eb5cc2b2aba68c04a74b179b61432d82: delivery https://github.com/hitpipe/hitpipe/actions/runs/39279704440, intake https://github.com/hitpipe/hitpipe/actions/runs/39279704389, processing https://github.com/hitpipe/hitpipe/actions/runs/39279704449, iam https://github.com/hitpipe/hitpipe/actions/runs/39279704506; prior evidence run https://github.com/hitpipe/hitpipe/actions/runs/39271075578 passed on c365ad5.</w:t>
-      </w:r>
-    </w:p>
-    <w:p>
-      <w:r>
-        <w:t>Кадр: сохранять заголовок страницы/терминала, полный релевантный текст и результат; не обрезать команду, версию, автора, названия тестов, итог или код завершения. Если содержание не помещается, сделать несколько последовательных снимков подрисунками. Скрыть токены, пароли, cookie, личную почту, лишние персональные данные и соседние окна; секреты заранее исключить из команды и вывода, а не раскрывать ради снимка. Не заменять фактический вывод нарисованным терминалом и не вставлять чужие результаты.</w:t>
-      </w:r>
-    </w:p>
-    <w:p>
-      <w:r>
-        <w:t>Файл: docs/labs/pr12/ds/evidence/screenshots/0104-pz01-07.png. Подпись: «Рисунок 7 — Отрицательная локальная проверка автоматического gate». В основном тексте дать ссылку на этот рисунок рядом с фактическим результатом.</w:t>
-      </w:r>
-    </w:p>
-    <w:p>
-      <w:pPr>
-        <w:pStyle w:val="1"/>
-      </w:pPr>
-      <w:r>
-        <w:t>Фактическое дополнение к шаблону</w:t>
-      </w:r>
-    </w:p>
-    <w:p>
-      <w:r>
-        <w:t>Этот раздел связывает заполненный шаблон с реально выполненными артефактами. Он не заменяет предусмотренные методичкой human actions.</w:t>
-      </w:r>
-    </w:p>
-    <w:p>
-      <w:r>
-        <w:t>• Dev/release synthetic smoke PASS.</w:t>
-      </w:r>
-    </w:p>
-    <w:p>
-      <w:r>
-        <w:t>• Outside-checkout smoke PASS for declared fixtures.</w:t>
-      </w:r>
-    </w:p>
-    <w:p>
-      <w:r>
-        <w:br w:type="page"/>
       </w:r>
     </w:p>
     <w:sectPr>

</xml_diff>

<commit_message>
HIT-47: improve report table readability
</commit_message>
<xml_diff>
--- a/docs/labs/pr12/ds/reports/0104-pz01-ds.docx
+++ b/docs/labs/pr12/ds/reports/0104-pz01-ds.docx
@@ -38,16 +38,17 @@
     </w:p>
     <w:tbl>
       <w:tblPr>
-        <w:tblW w:w="9356" w:type="dxa"/>
+        <w:tblW w:w="10000" w:type="pct"/>
         <w:tblBorders>
-          <w:top w:val="single" w:sz="4" w:space="0" w:color="auto"/>
-          <w:left w:val="single" w:sz="4" w:space="0" w:color="auto"/>
-          <w:bottom w:val="single" w:sz="4" w:space="0" w:color="auto"/>
-          <w:right w:val="single" w:sz="4" w:space="0" w:color="auto"/>
-          <w:insideH w:val="single" w:sz="4" w:space="0" w:color="auto"/>
-          <w:insideV w:val="single" w:sz="4" w:space="0" w:color="auto"/>
+          <w:top w:val="single" w:sz="4" w:space="0" w:color="B7C3D0"/>
+          <w:left w:val="single" w:sz="4" w:space="0" w:color="B7C3D0"/>
+          <w:bottom w:val="single" w:sz="4" w:space="0" w:color="B7C3D0"/>
+          <w:right w:val="single" w:sz="4" w:space="0" w:color="B7C3D0"/>
+          <w:insideH w:val="single" w:sz="4" w:space="0" w:color="B7C3D0"/>
+          <w:insideV w:val="single" w:sz="4" w:space="0" w:color="B7C3D0"/>
         </w:tblBorders>
         <w:tblLook w:val="0000" w:firstRow="0" w:lastRow="0" w:firstColumn="0" w:lastColumn="0" w:noHBand="0" w:noVBand="0"/>
+        <w:tblLayout w:type="fixed"/>
       </w:tblPr>
       <w:tblGrid>
         <w:gridCol w:w="3261"/>
@@ -62,30 +63,44 @@
         </w:trPr>
         <w:tc>
           <w:tcPr>
-            <w:tcW w:w="3261" w:type="dxa"/>
+            <w:tcW w:w="1666" w:type="dxa"/>
             <w:tcBorders>
               <w:top w:val="nil"/>
               <w:left w:val="nil"/>
               <w:right w:val="nil"/>
             </w:tcBorders>
-            <w:vAlign w:val="bottom"/>
+            <w:vAlign w:val="top"/>
+            <w:tcMar>
+              <w:top w:w="80" w:type="dxa"/>
+              <w:start w:w="100" w:type="dxa"/>
+              <w:bottom w:w="80" w:type="dxa"/>
+              <w:end w:w="100" w:type="dxa"/>
+            </w:tcMar>
           </w:tcPr>
           <w:p>
             <w:pPr>
               <w:pStyle w:val="-1"/>
-            </w:pPr>
-          </w:p>
-        </w:tc>
-        <w:tc>
-          <w:tcPr>
-            <w:tcW w:w="283" w:type="dxa"/>
+              <w:spacing w:before="0" w:after="40" w:line="240" w:lineRule="auto"/>
+              <w:jc w:val="center"/>
+            </w:pPr>
+          </w:p>
+        </w:tc>
+        <w:tc>
+          <w:tcPr>
+            <w:tcW w:w="1960" w:type="dxa"/>
             <w:tcBorders>
               <w:top w:val="nil"/>
               <w:left w:val="nil"/>
               <w:bottom w:val="nil"/>
               <w:right w:val="nil"/>
             </w:tcBorders>
-            <w:vAlign w:val="bottom"/>
+            <w:vAlign w:val="top"/>
+            <w:tcMar>
+              <w:top w:w="80" w:type="dxa"/>
+              <w:start w:w="100" w:type="dxa"/>
+              <w:bottom w:w="80" w:type="dxa"/>
+              <w:end w:w="100" w:type="dxa"/>
+            </w:tcMar>
           </w:tcPr>
           <w:p>
             <w:pPr>
@@ -93,7 +108,7 @@
               <w:autoSpaceDE w:val="0"/>
               <w:autoSpaceDN w:val="0"/>
               <w:adjustRightInd w:val="0"/>
-              <w:spacing w:before="140"/>
+              <w:spacing w:before="0" w:after="40" w:line="240" w:lineRule="auto"/>
               <w:ind w:firstLine="0"/>
               <w:jc w:val="center"/>
             </w:pPr>
@@ -101,30 +116,44 @@
         </w:tc>
         <w:tc>
           <w:tcPr>
-            <w:tcW w:w="2833" w:type="dxa"/>
+            <w:tcW w:w="2352" w:type="dxa"/>
             <w:tcBorders>
               <w:top w:val="nil"/>
               <w:left w:val="nil"/>
               <w:right w:val="nil"/>
             </w:tcBorders>
-            <w:vAlign w:val="bottom"/>
+            <w:vAlign w:val="top"/>
+            <w:tcMar>
+              <w:top w:w="80" w:type="dxa"/>
+              <w:start w:w="100" w:type="dxa"/>
+              <w:bottom w:w="80" w:type="dxa"/>
+              <w:end w:w="100" w:type="dxa"/>
+            </w:tcMar>
           </w:tcPr>
           <w:p>
             <w:pPr>
               <w:pStyle w:val="-1"/>
-            </w:pPr>
-          </w:p>
-        </w:tc>
-        <w:tc>
-          <w:tcPr>
-            <w:tcW w:w="236" w:type="dxa"/>
+              <w:spacing w:before="0" w:after="40" w:line="240" w:lineRule="auto"/>
+              <w:jc w:val="center"/>
+            </w:pPr>
+          </w:p>
+        </w:tc>
+        <w:tc>
+          <w:tcPr>
+            <w:tcW w:w="1960" w:type="dxa"/>
             <w:tcBorders>
               <w:top w:val="nil"/>
               <w:left w:val="nil"/>
               <w:bottom w:val="nil"/>
               <w:right w:val="nil"/>
             </w:tcBorders>
-            <w:vAlign w:val="bottom"/>
+            <w:vAlign w:val="top"/>
+            <w:tcMar>
+              <w:top w:w="80" w:type="dxa"/>
+              <w:start w:w="100" w:type="dxa"/>
+              <w:bottom w:w="80" w:type="dxa"/>
+              <w:end w:w="100" w:type="dxa"/>
+            </w:tcMar>
           </w:tcPr>
           <w:p>
             <w:pPr>
@@ -132,7 +161,7 @@
               <w:autoSpaceDE w:val="0"/>
               <w:autoSpaceDN w:val="0"/>
               <w:adjustRightInd w:val="0"/>
-              <w:spacing w:before="140"/>
+              <w:spacing w:before="0" w:after="40" w:line="240" w:lineRule="auto"/>
               <w:ind w:firstLine="0"/>
               <w:jc w:val="center"/>
             </w:pPr>
@@ -140,17 +169,25 @@
         </w:tc>
         <w:tc>
           <w:tcPr>
-            <w:tcW w:w="2743" w:type="dxa"/>
+            <w:tcW w:w="1862" w:type="dxa"/>
             <w:tcBorders>
               <w:top w:val="nil"/>
               <w:left w:val="nil"/>
               <w:right w:val="nil"/>
             </w:tcBorders>
-            <w:vAlign w:val="bottom"/>
+            <w:vAlign w:val="top"/>
+            <w:tcMar>
+              <w:top w:w="80" w:type="dxa"/>
+              <w:start w:w="100" w:type="dxa"/>
+              <w:bottom w:w="80" w:type="dxa"/>
+              <w:end w:w="100" w:type="dxa"/>
+            </w:tcMar>
           </w:tcPr>
           <w:p>
             <w:pPr>
               <w:pStyle w:val="-1"/>
+              <w:spacing w:before="0" w:after="40" w:line="240" w:lineRule="auto"/>
+              <w:jc w:val="center"/>
             </w:pPr>
           </w:p>
         </w:tc>
@@ -168,42 +205,60 @@
         </w:tblPrEx>
         <w:tc>
           <w:tcPr>
-            <w:tcW w:w="3261" w:type="dxa"/>
+            <w:tcW w:w="1666" w:type="dxa"/>
             <w:tcBorders>
               <w:top w:val="nil"/>
               <w:left w:val="nil"/>
               <w:bottom w:val="nil"/>
               <w:right w:val="nil"/>
             </w:tcBorders>
-            <w:vAlign w:val="center"/>
+            <w:vAlign w:val="top"/>
+            <w:tcMar>
+              <w:top w:w="80" w:type="dxa"/>
+              <w:start w:w="100" w:type="dxa"/>
+              <w:bottom w:w="80" w:type="dxa"/>
+              <w:end w:w="100" w:type="dxa"/>
+            </w:tcMar>
           </w:tcPr>
           <w:p>
             <w:pPr>
               <w:pStyle w:val="-1"/>
+              <w:spacing w:before="0" w:after="40" w:line="240" w:lineRule="auto"/>
               <w:rPr>
                 <w:sz w:val="18"/>
                 <w:szCs w:val="18"/>
               </w:rPr>
             </w:pPr>
             <w:r>
+              <w:rPr>
+                <w:rFonts w:ascii="Times New Roman" w:hAnsi="Times New Roman" w:eastAsia="Times New Roman"/>
+                <w:sz w:val="19"/>
+              </w:rPr>
               <w:t>должность, уч. степень, звание</w:t>
             </w:r>
           </w:p>
         </w:tc>
         <w:tc>
           <w:tcPr>
-            <w:tcW w:w="283" w:type="dxa"/>
+            <w:tcW w:w="1960" w:type="dxa"/>
             <w:tcBorders>
               <w:top w:val="nil"/>
               <w:left w:val="nil"/>
               <w:bottom w:val="nil"/>
               <w:right w:val="nil"/>
             </w:tcBorders>
-            <w:vAlign w:val="center"/>
+            <w:vAlign w:val="top"/>
+            <w:tcMar>
+              <w:top w:w="80" w:type="dxa"/>
+              <w:start w:w="100" w:type="dxa"/>
+              <w:bottom w:w="80" w:type="dxa"/>
+              <w:end w:w="100" w:type="dxa"/>
+            </w:tcMar>
           </w:tcPr>
           <w:p>
             <w:pPr>
               <w:pStyle w:val="-1"/>
+              <w:spacing w:before="0" w:after="40" w:line="240" w:lineRule="auto"/>
               <w:rPr>
                 <w:sz w:val="18"/>
                 <w:szCs w:val="18"/>
@@ -213,42 +268,60 @@
         </w:tc>
         <w:tc>
           <w:tcPr>
-            <w:tcW w:w="2833" w:type="dxa"/>
+            <w:tcW w:w="2352" w:type="dxa"/>
             <w:tcBorders>
               <w:top w:val="nil"/>
               <w:left w:val="nil"/>
               <w:bottom w:val="nil"/>
               <w:right w:val="nil"/>
             </w:tcBorders>
-            <w:vAlign w:val="center"/>
+            <w:vAlign w:val="top"/>
+            <w:tcMar>
+              <w:top w:w="80" w:type="dxa"/>
+              <w:start w:w="100" w:type="dxa"/>
+              <w:bottom w:w="80" w:type="dxa"/>
+              <w:end w:w="100" w:type="dxa"/>
+            </w:tcMar>
           </w:tcPr>
           <w:p>
             <w:pPr>
               <w:pStyle w:val="-1"/>
+              <w:spacing w:before="0" w:after="40" w:line="240" w:lineRule="auto"/>
               <w:rPr>
                 <w:sz w:val="18"/>
                 <w:szCs w:val="18"/>
               </w:rPr>
             </w:pPr>
             <w:r>
+              <w:rPr>
+                <w:rFonts w:ascii="Times New Roman" w:hAnsi="Times New Roman" w:eastAsia="Times New Roman"/>
+                <w:sz w:val="19"/>
+              </w:rPr>
               <w:t>подпись, дата</w:t>
             </w:r>
           </w:p>
         </w:tc>
         <w:tc>
           <w:tcPr>
-            <w:tcW w:w="236" w:type="dxa"/>
+            <w:tcW w:w="1960" w:type="dxa"/>
             <w:tcBorders>
               <w:top w:val="nil"/>
               <w:left w:val="nil"/>
               <w:bottom w:val="nil"/>
               <w:right w:val="nil"/>
             </w:tcBorders>
-            <w:vAlign w:val="center"/>
+            <w:vAlign w:val="top"/>
+            <w:tcMar>
+              <w:top w:w="80" w:type="dxa"/>
+              <w:start w:w="100" w:type="dxa"/>
+              <w:bottom w:w="80" w:type="dxa"/>
+              <w:end w:w="100" w:type="dxa"/>
+            </w:tcMar>
           </w:tcPr>
           <w:p>
             <w:pPr>
               <w:pStyle w:val="-1"/>
+              <w:spacing w:before="0" w:after="40" w:line="240" w:lineRule="auto"/>
               <w:rPr>
                 <w:sz w:val="18"/>
                 <w:szCs w:val="18"/>
@@ -258,24 +331,35 @@
         </w:tc>
         <w:tc>
           <w:tcPr>
-            <w:tcW w:w="2743" w:type="dxa"/>
+            <w:tcW w:w="1862" w:type="dxa"/>
             <w:tcBorders>
               <w:top w:val="nil"/>
               <w:left w:val="nil"/>
               <w:bottom w:val="nil"/>
               <w:right w:val="nil"/>
             </w:tcBorders>
-            <w:vAlign w:val="center"/>
+            <w:vAlign w:val="top"/>
+            <w:tcMar>
+              <w:top w:w="80" w:type="dxa"/>
+              <w:start w:w="100" w:type="dxa"/>
+              <w:bottom w:w="80" w:type="dxa"/>
+              <w:end w:w="100" w:type="dxa"/>
+            </w:tcMar>
           </w:tcPr>
           <w:p>
             <w:pPr>
               <w:pStyle w:val="-1"/>
+              <w:spacing w:before="0" w:after="40" w:line="240" w:lineRule="auto"/>
               <w:rPr>
                 <w:sz w:val="18"/>
                 <w:szCs w:val="18"/>
               </w:rPr>
             </w:pPr>
             <w:r>
+              <w:rPr>
+                <w:rFonts w:ascii="Times New Roman" w:hAnsi="Times New Roman" w:eastAsia="Times New Roman"/>
+                <w:sz w:val="19"/>
+              </w:rPr>
               <w:t>инициалы, фамилия</w:t>
             </w:r>
           </w:p>
@@ -296,8 +380,17 @@
     </w:p>
     <w:tbl>
       <w:tblPr>
-        <w:tblW w:w="9356" w:type="dxa"/>
+        <w:tblW w:w="10000" w:type="pct"/>
         <w:tblLook w:val="0000" w:firstRow="0" w:lastRow="0" w:firstColumn="0" w:lastColumn="0" w:noHBand="0" w:noVBand="0"/>
+        <w:tblLayout w:type="fixed"/>
+        <w:tblBorders>
+          <w:top w:val="single" w:sz="4" w:space="0" w:color="B7C3D0"/>
+          <w:left w:val="single" w:sz="4" w:space="0" w:color="B7C3D0"/>
+          <w:bottom w:val="single" w:sz="4" w:space="0" w:color="B7C3D0"/>
+          <w:right w:val="single" w:sz="4" w:space="0" w:color="B7C3D0"/>
+          <w:insideH w:val="single" w:sz="4" w:space="0" w:color="B7C3D0"/>
+          <w:insideV w:val="single" w:sz="4" w:space="0" w:color="B7C3D0"/>
+        </w:tblBorders>
       </w:tblPr>
       <w:tblGrid>
         <w:gridCol w:w="9356"/>
@@ -316,9 +409,24 @@
               <w:right w:val="nil"/>
             </w:tcBorders>
             <w:vAlign w:val="center"/>
-          </w:tcPr>
-          <w:p>
-            <w:r>
+            <w:shd w:fill="EDEDED" w:val="clear"/>
+            <w:tcMar>
+              <w:top w:w="140" w:type="dxa"/>
+              <w:start w:w="160" w:type="dxa"/>
+              <w:bottom w:w="140" w:type="dxa"/>
+              <w:end w:w="160" w:type="dxa"/>
+            </w:tcMar>
+          </w:tcPr>
+          <w:p>
+            <w:pPr>
+              <w:spacing w:after="0"/>
+              <w:jc w:val="center"/>
+            </w:pPr>
+            <w:r>
+              <w:rPr>
+                <w:rFonts w:ascii="Times New Roman" w:hAnsi="Times New Roman" w:eastAsia="Times New Roman"/>
+                <w:sz w:val="22"/>
+              </w:rPr>
               <w:t>Инструментальный контур и воспроизводимое исполнение минимального программного компонента</w:t>
             </w:r>
           </w:p>
@@ -334,9 +442,25 @@
               <w:bottom w:val="nil"/>
               <w:right w:val="nil"/>
             </w:tcBorders>
-          </w:tcPr>
-          <w:p>
-            <w:r>
+            <w:shd w:fill="EDEDED" w:val="clear"/>
+            <w:tcMar>
+              <w:top w:w="140" w:type="dxa"/>
+              <w:start w:w="160" w:type="dxa"/>
+              <w:bottom w:w="140" w:type="dxa"/>
+              <w:end w:w="160" w:type="dxa"/>
+            </w:tcMar>
+            <w:vAlign w:val="center"/>
+          </w:tcPr>
+          <w:p>
+            <w:pPr>
+              <w:spacing w:after="0"/>
+              <w:jc w:val="center"/>
+            </w:pPr>
+            <w:r>
+              <w:rPr>
+                <w:rFonts w:ascii="Times New Roman" w:hAnsi="Times New Roman" w:eastAsia="Times New Roman"/>
+                <w:sz w:val="22"/>
+              </w:rPr>
               <w:t>по МДК.01.04 «Системное программирование»</w:t>
             </w:r>
           </w:p>
@@ -428,16 +552,17 @@
     </w:p>
     <w:tbl>
       <w:tblPr>
-        <w:tblW w:w="9356" w:type="dxa"/>
+        <w:tblW w:w="10000" w:type="pct"/>
         <w:tblBorders>
-          <w:top w:val="single" w:sz="4" w:space="0" w:color="auto"/>
-          <w:left w:val="single" w:sz="4" w:space="0" w:color="auto"/>
-          <w:bottom w:val="single" w:sz="4" w:space="0" w:color="auto"/>
-          <w:right w:val="single" w:sz="4" w:space="0" w:color="auto"/>
-          <w:insideH w:val="single" w:sz="4" w:space="0" w:color="auto"/>
-          <w:insideV w:val="single" w:sz="4" w:space="0" w:color="auto"/>
+          <w:top w:val="single" w:sz="4" w:space="0" w:color="B7C3D0"/>
+          <w:left w:val="single" w:sz="4" w:space="0" w:color="B7C3D0"/>
+          <w:bottom w:val="single" w:sz="4" w:space="0" w:color="B7C3D0"/>
+          <w:right w:val="single" w:sz="4" w:space="0" w:color="B7C3D0"/>
+          <w:insideH w:val="single" w:sz="4" w:space="0" w:color="B7C3D0"/>
+          <w:insideV w:val="single" w:sz="4" w:space="0" w:color="B7C3D0"/>
         </w:tblBorders>
         <w:tblLook w:val="0000" w:firstRow="0" w:lastRow="0" w:firstColumn="0" w:lastColumn="0" w:noHBand="0" w:noVBand="0"/>
+        <w:tblLayout w:type="fixed"/>
       </w:tblPr>
       <w:tblGrid>
         <w:gridCol w:w="1560"/>
@@ -453,7 +578,7 @@
         </w:trPr>
         <w:tc>
           <w:tcPr>
-            <w:tcW w:w="1560" w:type="dxa"/>
+            <w:tcW w:w="1176" w:type="dxa"/>
             <w:tcBorders>
               <w:top w:val="nil"/>
               <w:left w:val="nil"/>
@@ -463,26 +588,37 @@
             <w:tcMar>
               <w:left w:w="0" w:type="dxa"/>
               <w:right w:w="0" w:type="dxa"/>
-            </w:tcMar>
-            <w:vAlign w:val="center"/>
+              <w:top w:w="80" w:type="dxa"/>
+              <w:start w:w="100" w:type="dxa"/>
+              <w:bottom w:w="80" w:type="dxa"/>
+              <w:end w:w="100" w:type="dxa"/>
+            </w:tcMar>
+            <w:vAlign w:val="top"/>
+            <w:shd w:fill="D9EAF7" w:val="clear"/>
           </w:tcPr>
           <w:p>
             <w:pPr>
               <w:pStyle w:val="-1"/>
-              <w:jc w:val="left"/>
+              <w:spacing w:before="0" w:after="40" w:line="240" w:lineRule="auto"/>
+              <w:jc w:val="center"/>
               <w:rPr>
                 <w:rFonts w:eastAsia="Times New Roman"/>
                 <w:lang w:eastAsia="ru-RU"/>
               </w:rPr>
             </w:pPr>
             <w:r>
+              <w:rPr>
+                <w:rFonts w:ascii="Times New Roman" w:hAnsi="Times New Roman" w:eastAsia="Times New Roman"/>
+                <w:b/>
+                <w:sz w:val="19"/>
+              </w:rPr>
               <w:t xml:space="preserve">Студент гр. № </w:t>
             </w:r>
           </w:p>
         </w:tc>
         <w:tc>
           <w:tcPr>
-            <w:tcW w:w="1925" w:type="dxa"/>
+            <w:tcW w:w="1764" w:type="dxa"/>
             <w:tcBorders>
               <w:top w:val="nil"/>
               <w:left w:val="nil"/>
@@ -491,12 +627,18 @@
             <w:tcMar>
               <w:left w:w="0" w:type="dxa"/>
               <w:right w:w="0" w:type="dxa"/>
-            </w:tcMar>
-            <w:vAlign w:val="center"/>
+              <w:top w:w="80" w:type="dxa"/>
+              <w:start w:w="100" w:type="dxa"/>
+              <w:bottom w:w="80" w:type="dxa"/>
+              <w:end w:w="100" w:type="dxa"/>
+            </w:tcMar>
+            <w:vAlign w:val="top"/>
           </w:tcPr>
           <w:p>
             <w:pPr>
               <w:pStyle w:val="-1"/>
+              <w:spacing w:before="0" w:after="40" w:line="240" w:lineRule="auto"/>
+              <w:jc w:val="center"/>
               <w:rPr>
                 <w:rFonts w:ascii="Times New Roman" w:eastAsia="Times New Roman" w:hAnsi="Times New Roman" w:cs="Times New Roman"/>
                 <w:lang w:eastAsia="ru-RU"/>
@@ -506,7 +648,7 @@
         </w:tc>
         <w:tc>
           <w:tcPr>
-            <w:tcW w:w="240" w:type="dxa"/>
+            <w:tcW w:w="1764" w:type="dxa"/>
             <w:tcBorders>
               <w:top w:val="nil"/>
               <w:left w:val="nil"/>
@@ -516,8 +658,12 @@
             <w:tcMar>
               <w:left w:w="0" w:type="dxa"/>
               <w:right w:w="0" w:type="dxa"/>
-            </w:tcMar>
-            <w:vAlign w:val="center"/>
+              <w:top w:w="80" w:type="dxa"/>
+              <w:start w:w="100" w:type="dxa"/>
+              <w:bottom w:w="80" w:type="dxa"/>
+              <w:end w:w="100" w:type="dxa"/>
+            </w:tcMar>
+            <w:vAlign w:val="top"/>
           </w:tcPr>
           <w:p>
             <w:pPr>
@@ -525,7 +671,7 @@
               <w:autoSpaceDE w:val="0"/>
               <w:autoSpaceDN w:val="0"/>
               <w:adjustRightInd w:val="0"/>
-              <w:spacing w:line="240" w:lineRule="auto"/>
+              <w:spacing w:line="240" w:lineRule="auto" w:before="0" w:after="40"/>
               <w:ind w:firstLine="0"/>
               <w:jc w:val="center"/>
               <w:rPr>
@@ -537,7 +683,7 @@
         </w:tc>
         <w:tc>
           <w:tcPr>
-            <w:tcW w:w="2377" w:type="dxa"/>
+            <w:tcW w:w="1666" w:type="dxa"/>
             <w:tcBorders>
               <w:top w:val="nil"/>
               <w:left w:val="nil"/>
@@ -546,12 +692,18 @@
             <w:tcMar>
               <w:left w:w="0" w:type="dxa"/>
               <w:right w:w="0" w:type="dxa"/>
-            </w:tcMar>
-            <w:vAlign w:val="center"/>
+              <w:top w:w="80" w:type="dxa"/>
+              <w:start w:w="100" w:type="dxa"/>
+              <w:bottom w:w="80" w:type="dxa"/>
+              <w:end w:w="100" w:type="dxa"/>
+            </w:tcMar>
+            <w:vAlign w:val="top"/>
           </w:tcPr>
           <w:p>
             <w:pPr>
               <w:pStyle w:val="-1"/>
+              <w:spacing w:before="0" w:after="40" w:line="240" w:lineRule="auto"/>
+              <w:jc w:val="center"/>
               <w:rPr>
                 <w:rFonts w:ascii="Times New Roman" w:eastAsia="Times New Roman" w:hAnsi="Times New Roman" w:cs="Times New Roman"/>
                 <w:szCs w:val="24"/>
@@ -562,7 +714,7 @@
         </w:tc>
         <w:tc>
           <w:tcPr>
-            <w:tcW w:w="236" w:type="dxa"/>
+            <w:tcW w:w="1862" w:type="dxa"/>
             <w:tcBorders>
               <w:top w:val="nil"/>
               <w:left w:val="nil"/>
@@ -572,8 +724,12 @@
             <w:tcMar>
               <w:left w:w="0" w:type="dxa"/>
               <w:right w:w="0" w:type="dxa"/>
-            </w:tcMar>
-            <w:vAlign w:val="center"/>
+              <w:top w:w="80" w:type="dxa"/>
+              <w:start w:w="100" w:type="dxa"/>
+              <w:bottom w:w="80" w:type="dxa"/>
+              <w:end w:w="100" w:type="dxa"/>
+            </w:tcMar>
+            <w:vAlign w:val="top"/>
           </w:tcPr>
           <w:p>
             <w:pPr>
@@ -581,7 +737,7 @@
               <w:autoSpaceDE w:val="0"/>
               <w:autoSpaceDN w:val="0"/>
               <w:adjustRightInd w:val="0"/>
-              <w:spacing w:line="240" w:lineRule="auto"/>
+              <w:spacing w:line="240" w:lineRule="auto" w:before="0" w:after="40"/>
               <w:ind w:firstLine="0"/>
               <w:jc w:val="center"/>
               <w:rPr>
@@ -593,7 +749,7 @@
         </w:tc>
         <w:tc>
           <w:tcPr>
-            <w:tcW w:w="3018" w:type="dxa"/>
+            <w:tcW w:w="1568" w:type="dxa"/>
             <w:tcBorders>
               <w:top w:val="nil"/>
               <w:left w:val="nil"/>
@@ -602,12 +758,18 @@
             <w:tcMar>
               <w:left w:w="0" w:type="dxa"/>
               <w:right w:w="0" w:type="dxa"/>
-            </w:tcMar>
-            <w:vAlign w:val="center"/>
+              <w:top w:w="80" w:type="dxa"/>
+              <w:start w:w="100" w:type="dxa"/>
+              <w:bottom w:w="80" w:type="dxa"/>
+              <w:end w:w="100" w:type="dxa"/>
+            </w:tcMar>
+            <w:vAlign w:val="top"/>
           </w:tcPr>
           <w:p>
             <w:pPr>
               <w:pStyle w:val="-1"/>
+              <w:spacing w:before="0" w:after="40" w:line="240" w:lineRule="auto"/>
+              <w:jc w:val="center"/>
               <w:rPr>
                 <w:rFonts w:eastAsia="Times New Roman"/>
                 <w:lang w:eastAsia="ru-RU"/>
@@ -629,7 +791,7 @@
         </w:tblPrEx>
         <w:tc>
           <w:tcPr>
-            <w:tcW w:w="1560" w:type="dxa"/>
+            <w:tcW w:w="1176" w:type="dxa"/>
             <w:tcBorders>
               <w:top w:val="nil"/>
               <w:left w:val="nil"/>
@@ -639,12 +801,17 @@
             <w:tcMar>
               <w:left w:w="0" w:type="dxa"/>
               <w:right w:w="0" w:type="dxa"/>
-            </w:tcMar>
-            <w:vAlign w:val="center"/>
+              <w:top w:w="80" w:type="dxa"/>
+              <w:start w:w="100" w:type="dxa"/>
+              <w:bottom w:w="80" w:type="dxa"/>
+              <w:end w:w="100" w:type="dxa"/>
+            </w:tcMar>
+            <w:vAlign w:val="top"/>
           </w:tcPr>
           <w:p>
             <w:pPr>
               <w:pStyle w:val="-1"/>
+              <w:spacing w:before="0" w:after="40" w:line="240" w:lineRule="auto"/>
               <w:rPr>
                 <w:sz w:val="18"/>
                 <w:szCs w:val="18"/>
@@ -654,7 +821,7 @@
         </w:tc>
         <w:tc>
           <w:tcPr>
-            <w:tcW w:w="1925" w:type="dxa"/>
+            <w:tcW w:w="1764" w:type="dxa"/>
             <w:tcBorders>
               <w:top w:val="nil"/>
               <w:left w:val="nil"/>
@@ -664,12 +831,17 @@
             <w:tcMar>
               <w:left w:w="0" w:type="dxa"/>
               <w:right w:w="0" w:type="dxa"/>
-            </w:tcMar>
-            <w:vAlign w:val="center"/>
+              <w:top w:w="80" w:type="dxa"/>
+              <w:start w:w="100" w:type="dxa"/>
+              <w:bottom w:w="80" w:type="dxa"/>
+              <w:end w:w="100" w:type="dxa"/>
+            </w:tcMar>
+            <w:vAlign w:val="top"/>
           </w:tcPr>
           <w:p>
             <w:pPr>
               <w:pStyle w:val="-1"/>
+              <w:spacing w:before="0" w:after="40" w:line="240" w:lineRule="auto"/>
               <w:rPr>
                 <w:sz w:val="18"/>
                 <w:szCs w:val="18"/>
@@ -679,7 +851,7 @@
         </w:tc>
         <w:tc>
           <w:tcPr>
-            <w:tcW w:w="240" w:type="dxa"/>
+            <w:tcW w:w="1764" w:type="dxa"/>
             <w:tcBorders>
               <w:top w:val="nil"/>
               <w:left w:val="nil"/>
@@ -689,12 +861,17 @@
             <w:tcMar>
               <w:left w:w="0" w:type="dxa"/>
               <w:right w:w="0" w:type="dxa"/>
-            </w:tcMar>
-            <w:vAlign w:val="center"/>
+              <w:top w:w="80" w:type="dxa"/>
+              <w:start w:w="100" w:type="dxa"/>
+              <w:bottom w:w="80" w:type="dxa"/>
+              <w:end w:w="100" w:type="dxa"/>
+            </w:tcMar>
+            <w:vAlign w:val="top"/>
           </w:tcPr>
           <w:p>
             <w:pPr>
               <w:pStyle w:val="-1"/>
+              <w:spacing w:before="0" w:after="40" w:line="240" w:lineRule="auto"/>
               <w:rPr>
                 <w:sz w:val="18"/>
                 <w:szCs w:val="18"/>
@@ -704,7 +881,7 @@
         </w:tc>
         <w:tc>
           <w:tcPr>
-            <w:tcW w:w="2377" w:type="dxa"/>
+            <w:tcW w:w="1666" w:type="dxa"/>
             <w:tcBorders>
               <w:top w:val="nil"/>
               <w:left w:val="nil"/>
@@ -714,25 +891,34 @@
             <w:tcMar>
               <w:left w:w="0" w:type="dxa"/>
               <w:right w:w="0" w:type="dxa"/>
-            </w:tcMar>
-            <w:vAlign w:val="center"/>
+              <w:top w:w="80" w:type="dxa"/>
+              <w:start w:w="100" w:type="dxa"/>
+              <w:bottom w:w="80" w:type="dxa"/>
+              <w:end w:w="100" w:type="dxa"/>
+            </w:tcMar>
+            <w:vAlign w:val="top"/>
           </w:tcPr>
           <w:p>
             <w:pPr>
               <w:pStyle w:val="-1"/>
+              <w:spacing w:before="0" w:after="40" w:line="240" w:lineRule="auto"/>
               <w:rPr>
                 <w:sz w:val="18"/>
                 <w:szCs w:val="18"/>
               </w:rPr>
             </w:pPr>
             <w:r>
+              <w:rPr>
+                <w:rFonts w:ascii="Times New Roman" w:hAnsi="Times New Roman" w:eastAsia="Times New Roman"/>
+                <w:sz w:val="19"/>
+              </w:rPr>
               <w:t>подпись, дата</w:t>
             </w:r>
           </w:p>
         </w:tc>
         <w:tc>
           <w:tcPr>
-            <w:tcW w:w="236" w:type="dxa"/>
+            <w:tcW w:w="1862" w:type="dxa"/>
             <w:tcBorders>
               <w:top w:val="nil"/>
               <w:left w:val="nil"/>
@@ -742,12 +928,17 @@
             <w:tcMar>
               <w:left w:w="0" w:type="dxa"/>
               <w:right w:w="0" w:type="dxa"/>
-            </w:tcMar>
-            <w:vAlign w:val="center"/>
+              <w:top w:w="80" w:type="dxa"/>
+              <w:start w:w="100" w:type="dxa"/>
+              <w:bottom w:w="80" w:type="dxa"/>
+              <w:end w:w="100" w:type="dxa"/>
+            </w:tcMar>
+            <w:vAlign w:val="top"/>
           </w:tcPr>
           <w:p>
             <w:pPr>
               <w:pStyle w:val="-1"/>
+              <w:spacing w:before="0" w:after="40" w:line="240" w:lineRule="auto"/>
               <w:rPr>
                 <w:sz w:val="18"/>
                 <w:szCs w:val="18"/>
@@ -757,7 +948,7 @@
         </w:tc>
         <w:tc>
           <w:tcPr>
-            <w:tcW w:w="3018" w:type="dxa"/>
+            <w:tcW w:w="1568" w:type="dxa"/>
             <w:tcBorders>
               <w:top w:val="nil"/>
               <w:left w:val="nil"/>
@@ -767,18 +958,27 @@
             <w:tcMar>
               <w:left w:w="0" w:type="dxa"/>
               <w:right w:w="0" w:type="dxa"/>
-            </w:tcMar>
-            <w:vAlign w:val="center"/>
+              <w:top w:w="80" w:type="dxa"/>
+              <w:start w:w="100" w:type="dxa"/>
+              <w:bottom w:w="80" w:type="dxa"/>
+              <w:end w:w="100" w:type="dxa"/>
+            </w:tcMar>
+            <w:vAlign w:val="top"/>
           </w:tcPr>
           <w:p>
             <w:pPr>
               <w:pStyle w:val="-1"/>
+              <w:spacing w:before="0" w:after="40" w:line="240" w:lineRule="auto"/>
               <w:rPr>
                 <w:sz w:val="18"/>
                 <w:szCs w:val="18"/>
               </w:rPr>
             </w:pPr>
             <w:r>
+              <w:rPr>
+                <w:rFonts w:ascii="Times New Roman" w:hAnsi="Times New Roman" w:eastAsia="Times New Roman"/>
+                <w:sz w:val="19"/>
+              </w:rPr>
               <w:t>инициалы, фамилия</w:t>
             </w:r>
           </w:p>
@@ -819,8 +1019,17 @@
     </w:p>
     <w:tbl>
       <w:tblPr>
-        <w:tblW w:type="auto" w:w="0"/>
+        <w:tblW w:type="pct" w:w="10000"/>
         <w:tblLook w:firstColumn="1" w:firstRow="1" w:lastColumn="0" w:lastRow="0" w:noHBand="0" w:noVBand="1" w:val="04A0"/>
+        <w:tblLayout w:type="fixed"/>
+        <w:tblBorders>
+          <w:top w:val="single" w:sz="4" w:space="0" w:color="B7C3D0"/>
+          <w:left w:val="single" w:sz="4" w:space="0" w:color="B7C3D0"/>
+          <w:bottom w:val="single" w:sz="4" w:space="0" w:color="B7C3D0"/>
+          <w:right w:val="single" w:sz="4" w:space="0" w:color="B7C3D0"/>
+          <w:insideH w:val="single" w:sz="4" w:space="0" w:color="B7C3D0"/>
+          <w:insideV w:val="single" w:sz="4" w:space="0" w:color="B7C3D0"/>
+        </w:tblBorders>
       </w:tblPr>
       <w:tblGrid>
         <w:gridCol w:w="4677"/>
@@ -832,20 +1041,54 @@
         </w:trPr>
         <w:tc>
           <w:tcPr>
-            <w:tcW w:type="dxa" w:w="4677"/>
-          </w:tcPr>
-          <w:p>
-            <w:r>
+            <w:tcW w:type="dxa" w:w="2744"/>
+            <w:vAlign w:val="top"/>
+            <w:tcMar>
+              <w:top w:w="80" w:type="dxa"/>
+              <w:start w:w="100" w:type="dxa"/>
+              <w:bottom w:w="80" w:type="dxa"/>
+              <w:end w:w="100" w:type="dxa"/>
+            </w:tcMar>
+            <w:shd w:fill="D9EAF7" w:val="clear"/>
+          </w:tcPr>
+          <w:p>
+            <w:pPr>
+              <w:spacing w:before="0" w:after="40" w:line="240" w:lineRule="auto"/>
+              <w:jc w:val="center"/>
+            </w:pPr>
+            <w:r>
+              <w:rPr>
+                <w:rFonts w:ascii="Times New Roman" w:hAnsi="Times New Roman" w:eastAsia="Times New Roman"/>
+                <w:b/>
+                <w:sz w:val="20"/>
+              </w:rPr>
               <w:t>Поле</w:t>
             </w:r>
           </w:p>
         </w:tc>
         <w:tc>
           <w:tcPr>
-            <w:tcW w:type="dxa" w:w="4677"/>
-          </w:tcPr>
-          <w:p>
-            <w:r>
+            <w:tcW w:type="dxa" w:w="7056"/>
+            <w:vAlign w:val="top"/>
+            <w:tcMar>
+              <w:top w:w="80" w:type="dxa"/>
+              <w:start w:w="100" w:type="dxa"/>
+              <w:bottom w:w="80" w:type="dxa"/>
+              <w:end w:w="100" w:type="dxa"/>
+            </w:tcMar>
+            <w:shd w:fill="D9EAF7" w:val="clear"/>
+          </w:tcPr>
+          <w:p>
+            <w:pPr>
+              <w:spacing w:before="0" w:after="40" w:line="240" w:lineRule="auto"/>
+              <w:jc w:val="center"/>
+            </w:pPr>
+            <w:r>
+              <w:rPr>
+                <w:rFonts w:ascii="Times New Roman" w:hAnsi="Times New Roman" w:eastAsia="Times New Roman"/>
+                <w:b/>
+                <w:sz w:val="20"/>
+              </w:rPr>
               <w:t>Значение</w:t>
             </w:r>
           </w:p>
@@ -854,20 +1097,48 @@
       <w:tr>
         <w:tc>
           <w:tcPr>
-            <w:tcW w:type="dxa" w:w="4677"/>
-          </w:tcPr>
-          <w:p>
-            <w:r>
+            <w:tcW w:type="dxa" w:w="2744"/>
+            <w:vAlign w:val="top"/>
+            <w:tcMar>
+              <w:top w:w="80" w:type="dxa"/>
+              <w:start w:w="100" w:type="dxa"/>
+              <w:bottom w:w="80" w:type="dxa"/>
+              <w:end w:w="100" w:type="dxa"/>
+            </w:tcMar>
+          </w:tcPr>
+          <w:p>
+            <w:pPr>
+              <w:spacing w:before="0" w:after="40" w:line="240" w:lineRule="auto"/>
+            </w:pPr>
+            <w:r>
+              <w:rPr>
+                <w:rFonts w:ascii="Times New Roman" w:hAnsi="Times New Roman" w:eastAsia="Times New Roman"/>
+                <w:sz w:val="20"/>
+              </w:rPr>
               <w:t>ФИО, группа</w:t>
             </w:r>
           </w:p>
         </w:tc>
         <w:tc>
           <w:tcPr>
-            <w:tcW w:type="dxa" w:w="4677"/>
-          </w:tcPr>
-          <w:p>
-            <w:r>
+            <w:tcW w:type="dxa" w:w="7056"/>
+            <w:vAlign w:val="top"/>
+            <w:tcMar>
+              <w:top w:w="80" w:type="dxa"/>
+              <w:start w:w="100" w:type="dxa"/>
+              <w:bottom w:w="80" w:type="dxa"/>
+              <w:end w:w="100" w:type="dxa"/>
+            </w:tcMar>
+          </w:tcPr>
+          <w:p>
+            <w:pPr>
+              <w:spacing w:before="0" w:after="40" w:line="240" w:lineRule="auto"/>
+            </w:pPr>
+            <w:r>
+              <w:rPr>
+                <w:rFonts w:ascii="Times New Roman" w:hAnsi="Times New Roman" w:eastAsia="Times New Roman"/>
+                <w:sz w:val="20"/>
+              </w:rPr>
               <w:t>Дмитрий Стацюк, не указана</w:t>
             </w:r>
           </w:p>
@@ -876,20 +1147,48 @@
       <w:tr>
         <w:tc>
           <w:tcPr>
-            <w:tcW w:type="dxa" w:w="4677"/>
-          </w:tcPr>
-          <w:p>
-            <w:r>
+            <w:tcW w:type="dxa" w:w="2744"/>
+            <w:vAlign w:val="top"/>
+            <w:tcMar>
+              <w:top w:w="80" w:type="dxa"/>
+              <w:start w:w="100" w:type="dxa"/>
+              <w:bottom w:w="80" w:type="dxa"/>
+              <w:end w:w="100" w:type="dxa"/>
+            </w:tcMar>
+          </w:tcPr>
+          <w:p>
+            <w:pPr>
+              <w:spacing w:before="0" w:after="40" w:line="240" w:lineRule="auto"/>
+            </w:pPr>
+            <w:r>
+              <w:rPr>
+                <w:rFonts w:ascii="Times New Roman" w:hAnsi="Times New Roman" w:eastAsia="Times New Roman"/>
+                <w:sz w:val="20"/>
+              </w:rPr>
               <w:t>Проект и команда</w:t>
             </w:r>
           </w:p>
         </w:tc>
         <w:tc>
           <w:tcPr>
-            <w:tcW w:type="dxa" w:w="4677"/>
-          </w:tcPr>
-          <w:p>
-            <w:r>
+            <w:tcW w:type="dxa" w:w="7056"/>
+            <w:vAlign w:val="top"/>
+            <w:tcMar>
+              <w:top w:w="80" w:type="dxa"/>
+              <w:start w:w="100" w:type="dxa"/>
+              <w:bottom w:w="80" w:type="dxa"/>
+              <w:end w:w="100" w:type="dxa"/>
+            </w:tcMar>
+          </w:tcPr>
+          <w:p>
+            <w:pPr>
+              <w:spacing w:before="0" w:after="40" w:line="240" w:lineRule="auto"/>
+            </w:pPr>
+            <w:r>
+              <w:rPr>
+                <w:rFonts w:ascii="Times New Roman" w:hAnsi="Times New Roman" w:eastAsia="Times New Roman"/>
+                <w:sz w:val="20"/>
+              </w:rPr>
               <w:t>HitPipe; пять участников</w:t>
             </w:r>
           </w:p>
@@ -898,20 +1197,48 @@
       <w:tr>
         <w:tc>
           <w:tcPr>
-            <w:tcW w:type="dxa" w:w="4677"/>
-          </w:tcPr>
-          <w:p>
-            <w:r>
+            <w:tcW w:type="dxa" w:w="2744"/>
+            <w:vAlign w:val="top"/>
+            <w:tcMar>
+              <w:top w:w="80" w:type="dxa"/>
+              <w:start w:w="100" w:type="dxa"/>
+              <w:bottom w:w="80" w:type="dxa"/>
+              <w:end w:w="100" w:type="dxa"/>
+            </w:tcMar>
+          </w:tcPr>
+          <w:p>
+            <w:pPr>
+              <w:spacing w:before="0" w:after="40" w:line="240" w:lineRule="auto"/>
+            </w:pPr>
+            <w:r>
+              <w:rPr>
+                <w:rFonts w:ascii="Times New Roman" w:hAnsi="Times New Roman" w:eastAsia="Times New Roman"/>
+                <w:sz w:val="20"/>
+              </w:rPr>
               <w:t>Собственная зона/компонент</w:t>
             </w:r>
           </w:p>
         </w:tc>
         <w:tc>
           <w:tcPr>
-            <w:tcW w:type="dxa" w:w="4677"/>
-          </w:tcPr>
-          <w:p>
-            <w:r>
+            <w:tcW w:type="dxa" w:w="7056"/>
+            <w:vAlign w:val="top"/>
+            <w:tcMar>
+              <w:top w:w="80" w:type="dxa"/>
+              <w:start w:w="100" w:type="dxa"/>
+              <w:bottom w:w="80" w:type="dxa"/>
+              <w:end w:w="100" w:type="dxa"/>
+            </w:tcMar>
+          </w:tcPr>
+          <w:p>
+            <w:pPr>
+              <w:spacing w:before="0" w:after="40" w:line="240" w:lineRule="auto"/>
+            </w:pPr>
+            <w:r>
+              <w:rPr>
+                <w:rFonts w:ascii="Times New Roman" w:hAnsi="Times New Roman" w:eastAsia="Times New Roman"/>
+                <w:sz w:val="20"/>
+              </w:rPr>
               <w:t>TargetReadback / services/delivery</w:t>
             </w:r>
           </w:p>
@@ -920,20 +1247,48 @@
       <w:tr>
         <w:tc>
           <w:tcPr>
-            <w:tcW w:type="dxa" w:w="4677"/>
-          </w:tcPr>
-          <w:p>
-            <w:r>
+            <w:tcW w:type="dxa" w:w="2744"/>
+            <w:vAlign w:val="top"/>
+            <w:tcMar>
+              <w:top w:w="80" w:type="dxa"/>
+              <w:start w:w="100" w:type="dxa"/>
+              <w:bottom w:w="80" w:type="dxa"/>
+              <w:end w:w="100" w:type="dxa"/>
+            </w:tcMar>
+          </w:tcPr>
+          <w:p>
+            <w:pPr>
+              <w:spacing w:before="0" w:after="40" w:line="240" w:lineRule="auto"/>
+            </w:pPr>
+            <w:r>
+              <w:rPr>
+                <w:rFonts w:ascii="Times New Roman" w:hAnsi="Times New Roman" w:eastAsia="Times New Roman"/>
+                <w:sz w:val="20"/>
+              </w:rPr>
               <w:t>Тег → commit</w:t>
             </w:r>
           </w:p>
         </w:tc>
         <w:tc>
           <w:tcPr>
-            <w:tcW w:type="dxa" w:w="4677"/>
-          </w:tcPr>
-          <w:p>
-            <w:r>
+            <w:tcW w:type="dxa" w:w="7056"/>
+            <w:vAlign w:val="top"/>
+            <w:tcMar>
+              <w:top w:w="80" w:type="dxa"/>
+              <w:start w:w="100" w:type="dxa"/>
+              <w:bottom w:w="80" w:type="dxa"/>
+              <w:end w:w="100" w:type="dxa"/>
+            </w:tcMar>
+          </w:tcPr>
+          <w:p>
+            <w:pPr>
+              <w:spacing w:before="0" w:after="40" w:line="240" w:lineRule="auto"/>
+            </w:pPr>
+            <w:r>
+              <w:rPr>
+                <w:rFonts w:ascii="Times New Roman" w:hAnsi="Times New Roman" w:eastAsia="Times New Roman"/>
+                <w:sz w:val="20"/>
+              </w:rPr>
               <w:t>не создан — human/Lead gate; correction source bafc97a0eb5cc2b2aba68c04a74b179b61432d82</w:t>
             </w:r>
           </w:p>
@@ -942,20 +1297,48 @@
       <w:tr>
         <w:tc>
           <w:tcPr>
-            <w:tcW w:type="dxa" w:w="4677"/>
-          </w:tcPr>
-          <w:p>
-            <w:r>
+            <w:tcW w:type="dxa" w:w="2744"/>
+            <w:vAlign w:val="top"/>
+            <w:tcMar>
+              <w:top w:w="80" w:type="dxa"/>
+              <w:start w:w="100" w:type="dxa"/>
+              <w:bottom w:w="80" w:type="dxa"/>
+              <w:end w:w="100" w:type="dxa"/>
+            </w:tcMar>
+          </w:tcPr>
+          <w:p>
+            <w:pPr>
+              <w:spacing w:before="0" w:after="40" w:line="240" w:lineRule="auto"/>
+            </w:pPr>
+            <w:r>
+              <w:rPr>
+                <w:rFonts w:ascii="Times New Roman" w:hAnsi="Times New Roman" w:eastAsia="Times New Roman"/>
+                <w:sz w:val="20"/>
+              </w:rPr>
               <w:t>Репозиторий</w:t>
             </w:r>
           </w:p>
         </w:tc>
         <w:tc>
           <w:tcPr>
-            <w:tcW w:type="dxa" w:w="4677"/>
-          </w:tcPr>
-          <w:p>
-            <w:r>
+            <w:tcW w:type="dxa" w:w="7056"/>
+            <w:vAlign w:val="top"/>
+            <w:tcMar>
+              <w:top w:w="80" w:type="dxa"/>
+              <w:start w:w="100" w:type="dxa"/>
+              <w:bottom w:w="80" w:type="dxa"/>
+              <w:end w:w="100" w:type="dxa"/>
+            </w:tcMar>
+          </w:tcPr>
+          <w:p>
+            <w:pPr>
+              <w:spacing w:before="0" w:after="40" w:line="240" w:lineRule="auto"/>
+            </w:pPr>
+            <w:r>
+              <w:rPr>
+                <w:rFonts w:ascii="Times New Roman" w:hAnsi="Times New Roman" w:eastAsia="Times New Roman"/>
+                <w:sz w:val="20"/>
+              </w:rPr>
               <w:t>https://github.com/hitpipe/hitpipe</w:t>
             </w:r>
           </w:p>
@@ -964,20 +1347,48 @@
       <w:tr>
         <w:tc>
           <w:tcPr>
-            <w:tcW w:type="dxa" w:w="4677"/>
-          </w:tcPr>
-          <w:p>
-            <w:r>
+            <w:tcW w:type="dxa" w:w="2744"/>
+            <w:vAlign w:val="top"/>
+            <w:tcMar>
+              <w:top w:w="80" w:type="dxa"/>
+              <w:start w:w="100" w:type="dxa"/>
+              <w:bottom w:w="80" w:type="dxa"/>
+              <w:end w:w="100" w:type="dxa"/>
+            </w:tcMar>
+          </w:tcPr>
+          <w:p>
+            <w:pPr>
+              <w:spacing w:before="0" w:after="40" w:line="240" w:lineRule="auto"/>
+            </w:pPr>
+            <w:r>
+              <w:rPr>
+                <w:rFonts w:ascii="Times New Roman" w:hAnsi="Times New Roman" w:eastAsia="Times New Roman"/>
+                <w:sz w:val="20"/>
+              </w:rPr>
               <w:t>Вариант выполнения</w:t>
             </w:r>
           </w:p>
         </w:tc>
         <w:tc>
           <w:tcPr>
-            <w:tcW w:type="dxa" w:w="4677"/>
-          </w:tcPr>
-          <w:p>
-            <w:r>
+            <w:tcW w:type="dxa" w:w="7056"/>
+            <w:vAlign w:val="top"/>
+            <w:tcMar>
+              <w:top w:w="80" w:type="dxa"/>
+              <w:start w:w="100" w:type="dxa"/>
+              <w:bottom w:w="80" w:type="dxa"/>
+              <w:end w:w="100" w:type="dxa"/>
+            </w:tcMar>
+          </w:tcPr>
+          <w:p>
+            <w:pPr>
+              <w:spacing w:before="0" w:after="40" w:line="240" w:lineRule="auto"/>
+            </w:pPr>
+            <w:r>
+              <w:rPr>
+                <w:rFonts w:ascii="Times New Roman" w:hAnsi="Times New Roman" w:eastAsia="Times New Roman"/>
+                <w:sz w:val="20"/>
+              </w:rPr>
               <w:t>Собственная зона ответственности</w:t>
             </w:r>
           </w:p>
@@ -1008,8 +1419,17 @@
     <w:tbl>
       <w:tblPr>
         <w:tblStyle w:val="af4"/>
-        <w:tblW w:type="auto" w:w="0"/>
+        <w:tblW w:type="pct" w:w="10000"/>
         <w:tblLook w:firstColumn="1" w:firstRow="1" w:lastColumn="0" w:lastRow="0" w:noHBand="0" w:noVBand="1" w:val="04A0"/>
+        <w:tblLayout w:type="fixed"/>
+        <w:tblBorders>
+          <w:top w:val="single" w:sz="4" w:space="0" w:color="B7C3D0"/>
+          <w:left w:val="single" w:sz="4" w:space="0" w:color="B7C3D0"/>
+          <w:bottom w:val="single" w:sz="4" w:space="0" w:color="B7C3D0"/>
+          <w:right w:val="single" w:sz="4" w:space="0" w:color="B7C3D0"/>
+          <w:insideH w:val="single" w:sz="4" w:space="0" w:color="B7C3D0"/>
+          <w:insideV w:val="single" w:sz="4" w:space="0" w:color="B7C3D0"/>
+        </w:tblBorders>
       </w:tblPr>
       <w:tblGrid>
         <w:gridCol w:w="2339"/>
@@ -1023,40 +1443,108 @@
         </w:trPr>
         <w:tc>
           <w:tcPr>
-            <w:tcW w:type="dxa" w:w="2339"/>
-          </w:tcPr>
-          <w:p>
-            <w:r>
+            <w:tcW w:type="dxa" w:w="2156"/>
+            <w:vAlign w:val="top"/>
+            <w:tcMar>
+              <w:top w:w="80" w:type="dxa"/>
+              <w:start w:w="100" w:type="dxa"/>
+              <w:bottom w:w="80" w:type="dxa"/>
+              <w:end w:w="100" w:type="dxa"/>
+            </w:tcMar>
+            <w:shd w:fill="D9EAF7" w:val="clear"/>
+          </w:tcPr>
+          <w:p>
+            <w:pPr>
+              <w:spacing w:before="0" w:after="40" w:line="240" w:lineRule="auto"/>
+              <w:jc w:val="center"/>
+            </w:pPr>
+            <w:r>
+              <w:rPr>
+                <w:rFonts w:ascii="Times New Roman" w:hAnsi="Times New Roman" w:eastAsia="Times New Roman"/>
+                <w:b/>
+                <w:sz w:val="20"/>
+              </w:rPr>
               <w:t>Позиция</w:t>
             </w:r>
           </w:p>
         </w:tc>
         <w:tc>
           <w:tcPr>
-            <w:tcW w:type="dxa" w:w="2339"/>
-          </w:tcPr>
-          <w:p>
-            <w:r>
+            <w:tcW w:type="dxa" w:w="2254"/>
+            <w:vAlign w:val="top"/>
+            <w:tcMar>
+              <w:top w:w="80" w:type="dxa"/>
+              <w:start w:w="100" w:type="dxa"/>
+              <w:bottom w:w="80" w:type="dxa"/>
+              <w:end w:w="100" w:type="dxa"/>
+            </w:tcMar>
+            <w:shd w:fill="D9EAF7" w:val="clear"/>
+          </w:tcPr>
+          <w:p>
+            <w:pPr>
+              <w:spacing w:before="0" w:after="40" w:line="240" w:lineRule="auto"/>
+              <w:jc w:val="center"/>
+            </w:pPr>
+            <w:r>
+              <w:rPr>
+                <w:rFonts w:ascii="Times New Roman" w:hAnsi="Times New Roman" w:eastAsia="Times New Roman"/>
+                <w:b/>
+                <w:sz w:val="20"/>
+              </w:rPr>
               <w:t>Средство и закреплённая версия</w:t>
             </w:r>
           </w:p>
         </w:tc>
         <w:tc>
           <w:tcPr>
-            <w:tcW w:type="dxa" w:w="2339"/>
-          </w:tcPr>
-          <w:p>
-            <w:r>
+            <w:tcW w:type="dxa" w:w="3234"/>
+            <w:vAlign w:val="top"/>
+            <w:tcMar>
+              <w:top w:w="80" w:type="dxa"/>
+              <w:start w:w="100" w:type="dxa"/>
+              <w:bottom w:w="80" w:type="dxa"/>
+              <w:end w:w="100" w:type="dxa"/>
+            </w:tcMar>
+            <w:shd w:fill="D9EAF7" w:val="clear"/>
+          </w:tcPr>
+          <w:p>
+            <w:pPr>
+              <w:spacing w:before="0" w:after="40" w:line="240" w:lineRule="auto"/>
+              <w:jc w:val="center"/>
+            </w:pPr>
+            <w:r>
+              <w:rPr>
+                <w:rFonts w:ascii="Times New Roman" w:hAnsi="Times New Roman" w:eastAsia="Times New Roman"/>
+                <w:b/>
+                <w:sz w:val="20"/>
+              </w:rPr>
               <w:t>Назначение и способ подключения</w:t>
             </w:r>
           </w:p>
         </w:tc>
         <w:tc>
           <w:tcPr>
-            <w:tcW w:type="dxa" w:w="2339"/>
-          </w:tcPr>
-          <w:p>
-            <w:r>
+            <w:tcW w:type="dxa" w:w="2156"/>
+            <w:vAlign w:val="top"/>
+            <w:tcMar>
+              <w:top w:w="80" w:type="dxa"/>
+              <w:start w:w="100" w:type="dxa"/>
+              <w:bottom w:w="80" w:type="dxa"/>
+              <w:end w:w="100" w:type="dxa"/>
+            </w:tcMar>
+            <w:shd w:fill="D9EAF7" w:val="clear"/>
+          </w:tcPr>
+          <w:p>
+            <w:pPr>
+              <w:spacing w:before="0" w:after="40" w:line="240" w:lineRule="auto"/>
+              <w:jc w:val="center"/>
+            </w:pPr>
+            <w:r>
+              <w:rPr>
+                <w:rFonts w:ascii="Times New Roman" w:hAnsi="Times New Roman" w:eastAsia="Times New Roman"/>
+                <w:b/>
+                <w:sz w:val="20"/>
+              </w:rPr>
               <w:t>Работает / запланировано, этап</w:t>
             </w:r>
           </w:p>
@@ -1065,40 +1553,96 @@
       <w:tr>
         <w:tc>
           <w:tcPr>
-            <w:tcW w:type="dxa" w:w="2339"/>
-          </w:tcPr>
-          <w:p>
-            <w:r>
+            <w:tcW w:type="dxa" w:w="2156"/>
+            <w:vAlign w:val="top"/>
+            <w:tcMar>
+              <w:top w:w="80" w:type="dxa"/>
+              <w:start w:w="100" w:type="dxa"/>
+              <w:bottom w:w="80" w:type="dxa"/>
+              <w:end w:w="100" w:type="dxa"/>
+            </w:tcMar>
+          </w:tcPr>
+          <w:p>
+            <w:pPr>
+              <w:spacing w:before="0" w:after="40" w:line="240" w:lineRule="auto"/>
+            </w:pPr>
+            <w:r>
+              <w:rPr>
+                <w:rFonts w:ascii="Times New Roman" w:hAnsi="Times New Roman" w:eastAsia="Times New Roman"/>
+                <w:sz w:val="20"/>
+              </w:rPr>
               <w:t>Сборка/подготовка к исполнению</w:t>
             </w:r>
           </w:p>
         </w:tc>
         <w:tc>
           <w:tcPr>
-            <w:tcW w:type="dxa" w:w="2339"/>
-          </w:tcPr>
-          <w:p>
-            <w:r>
+            <w:tcW w:type="dxa" w:w="2254"/>
+            <w:vAlign w:val="top"/>
+            <w:tcMar>
+              <w:top w:w="80" w:type="dxa"/>
+              <w:start w:w="100" w:type="dxa"/>
+              <w:bottom w:w="80" w:type="dxa"/>
+              <w:end w:w="100" w:type="dxa"/>
+            </w:tcMar>
+          </w:tcPr>
+          <w:p>
+            <w:pPr>
+              <w:spacing w:before="0" w:after="40" w:line="240" w:lineRule="auto"/>
+            </w:pPr>
+            <w:r>
+              <w:rPr>
+                <w:rFonts w:ascii="Times New Roman" w:hAnsi="Times New Roman" w:eastAsia="Times New Roman"/>
+                <w:sz w:val="20"/>
+              </w:rPr>
               <w:t>Go 1.27.2; GCC 16.2.0</w:t>
             </w:r>
           </w:p>
         </w:tc>
         <w:tc>
           <w:tcPr>
-            <w:tcW w:type="dxa" w:w="2339"/>
-          </w:tcPr>
-          <w:p>
-            <w:r>
+            <w:tcW w:type="dxa" w:w="3234"/>
+            <w:vAlign w:val="top"/>
+            <w:tcMar>
+              <w:top w:w="80" w:type="dxa"/>
+              <w:start w:w="100" w:type="dxa"/>
+              <w:bottom w:w="80" w:type="dxa"/>
+              <w:end w:w="100" w:type="dxa"/>
+            </w:tcMar>
+          </w:tcPr>
+          <w:p>
+            <w:pPr>
+              <w:spacing w:before="0" w:after="40" w:line="240" w:lineRule="auto"/>
+            </w:pPr>
+            <w:r>
+              <w:rPr>
+                <w:rFonts w:ascii="Times New Roman" w:hAnsi="Times New Roman" w:eastAsia="Times New Roman"/>
+                <w:sz w:val="20"/>
+              </w:rPr>
               <w:t>go build; services/delivery/cmd/delivery-contractcheck; dev/release output</w:t>
             </w:r>
           </w:p>
         </w:tc>
         <w:tc>
           <w:tcPr>
-            <w:tcW w:type="dxa" w:w="2339"/>
-          </w:tcPr>
-          <w:p>
-            <w:r>
+            <w:tcW w:type="dxa" w:w="2156"/>
+            <w:vAlign w:val="top"/>
+            <w:tcMar>
+              <w:top w:w="80" w:type="dxa"/>
+              <w:start w:w="100" w:type="dxa"/>
+              <w:bottom w:w="80" w:type="dxa"/>
+              <w:end w:w="100" w:type="dxa"/>
+            </w:tcMar>
+          </w:tcPr>
+          <w:p>
+            <w:pPr>
+              <w:spacing w:before="0" w:after="40" w:line="240" w:lineRule="auto"/>
+            </w:pPr>
+            <w:r>
+              <w:rPr>
+                <w:rFonts w:ascii="Times New Roman" w:hAnsi="Times New Roman" w:eastAsia="Times New Roman"/>
+                <w:sz w:val="20"/>
+              </w:rPr>
               <w:t>PASS locally; source commit and log recorded</w:t>
             </w:r>
           </w:p>
@@ -1107,40 +1651,96 @@
       <w:tr>
         <w:tc>
           <w:tcPr>
-            <w:tcW w:type="dxa" w:w="2339"/>
-          </w:tcPr>
-          <w:p>
-            <w:r>
+            <w:tcW w:type="dxa" w:w="2156"/>
+            <w:vAlign w:val="top"/>
+            <w:tcMar>
+              <w:top w:w="80" w:type="dxa"/>
+              <w:start w:w="100" w:type="dxa"/>
+              <w:bottom w:w="80" w:type="dxa"/>
+              <w:end w:w="100" w:type="dxa"/>
+            </w:tcMar>
+          </w:tcPr>
+          <w:p>
+            <w:pPr>
+              <w:spacing w:before="0" w:after="40" w:line="240" w:lineRule="auto"/>
+            </w:pPr>
+            <w:r>
+              <w:rPr>
+                <w:rFonts w:ascii="Times New Roman" w:hAnsi="Times New Roman" w:eastAsia="Times New Roman"/>
+                <w:sz w:val="20"/>
+              </w:rPr>
               <w:t>Управление зависимостями</w:t>
             </w:r>
           </w:p>
         </w:tc>
         <w:tc>
           <w:tcPr>
-            <w:tcW w:type="dxa" w:w="2339"/>
-          </w:tcPr>
-          <w:p>
-            <w:r>
+            <w:tcW w:type="dxa" w:w="2254"/>
+            <w:vAlign w:val="top"/>
+            <w:tcMar>
+              <w:top w:w="80" w:type="dxa"/>
+              <w:start w:w="100" w:type="dxa"/>
+              <w:bottom w:w="80" w:type="dxa"/>
+              <w:end w:w="100" w:type="dxa"/>
+            </w:tcMar>
+          </w:tcPr>
+          <w:p>
+            <w:pPr>
+              <w:spacing w:before="0" w:after="40" w:line="240" w:lineRule="auto"/>
+            </w:pPr>
+            <w:r>
+              <w:rPr>
+                <w:rFonts w:ascii="Times New Roman" w:hAnsi="Times New Roman" w:eastAsia="Times New Roman"/>
+                <w:sz w:val="20"/>
+              </w:rPr>
               <w:t>Go modules; golang.org/x/text v0.28.0</w:t>
             </w:r>
           </w:p>
         </w:tc>
         <w:tc>
           <w:tcPr>
-            <w:tcW w:type="dxa" w:w="2339"/>
-          </w:tcPr>
-          <w:p>
-            <w:r>
+            <w:tcW w:type="dxa" w:w="3234"/>
+            <w:vAlign w:val="top"/>
+            <w:tcMar>
+              <w:top w:w="80" w:type="dxa"/>
+              <w:start w:w="100" w:type="dxa"/>
+              <w:bottom w:w="80" w:type="dxa"/>
+              <w:end w:w="100" w:type="dxa"/>
+            </w:tcMar>
+          </w:tcPr>
+          <w:p>
+            <w:pPr>
+              <w:spacing w:before="0" w:after="40" w:line="240" w:lineRule="auto"/>
+            </w:pPr>
+            <w:r>
+              <w:rPr>
+                <w:rFonts w:ascii="Times New Roman" w:hAnsi="Times New Roman" w:eastAsia="Times New Roman"/>
+                <w:sz w:val="20"/>
+              </w:rPr>
               <w:t>services/delivery/go.mod + go.sum; go mod download/tidy</w:t>
             </w:r>
           </w:p>
         </w:tc>
         <w:tc>
           <w:tcPr>
-            <w:tcW w:type="dxa" w:w="2339"/>
-          </w:tcPr>
-          <w:p>
-            <w:r>
+            <w:tcW w:type="dxa" w:w="2156"/>
+            <w:vAlign w:val="top"/>
+            <w:tcMar>
+              <w:top w:w="80" w:type="dxa"/>
+              <w:start w:w="100" w:type="dxa"/>
+              <w:bottom w:w="80" w:type="dxa"/>
+              <w:end w:w="100" w:type="dxa"/>
+            </w:tcMar>
+          </w:tcPr>
+          <w:p>
+            <w:pPr>
+              <w:spacing w:before="0" w:after="40" w:line="240" w:lineRule="auto"/>
+            </w:pPr>
+            <w:r>
+              <w:rPr>
+                <w:rFonts w:ascii="Times New Roman" w:hAnsi="Times New Roman" w:eastAsia="Times New Roman"/>
+                <w:sz w:val="20"/>
+              </w:rPr>
               <w:t>PASS; lockfiles committed</w:t>
             </w:r>
           </w:p>
@@ -1149,40 +1749,96 @@
       <w:tr>
         <w:tc>
           <w:tcPr>
-            <w:tcW w:type="dxa" w:w="2339"/>
-          </w:tcPr>
-          <w:p>
-            <w:r>
+            <w:tcW w:type="dxa" w:w="2156"/>
+            <w:vAlign w:val="top"/>
+            <w:tcMar>
+              <w:top w:w="80" w:type="dxa"/>
+              <w:start w:w="100" w:type="dxa"/>
+              <w:bottom w:w="80" w:type="dxa"/>
+              <w:end w:w="100" w:type="dxa"/>
+            </w:tcMar>
+          </w:tcPr>
+          <w:p>
+            <w:pPr>
+              <w:spacing w:before="0" w:after="40" w:line="240" w:lineRule="auto"/>
+            </w:pPr>
+            <w:r>
+              <w:rPr>
+                <w:rFonts w:ascii="Times New Roman" w:hAnsi="Times New Roman" w:eastAsia="Times New Roman"/>
+                <w:sz w:val="20"/>
+              </w:rPr>
               <w:t>Тестирование</w:t>
             </w:r>
           </w:p>
         </w:tc>
         <w:tc>
           <w:tcPr>
-            <w:tcW w:type="dxa" w:w="2339"/>
-          </w:tcPr>
-          <w:p>
-            <w:r>
+            <w:tcW w:type="dxa" w:w="2254"/>
+            <w:vAlign w:val="top"/>
+            <w:tcMar>
+              <w:top w:w="80" w:type="dxa"/>
+              <w:start w:w="100" w:type="dxa"/>
+              <w:bottom w:w="80" w:type="dxa"/>
+              <w:end w:w="100" w:type="dxa"/>
+            </w:tcMar>
+          </w:tcPr>
+          <w:p>
+            <w:pPr>
+              <w:spacing w:before="0" w:after="40" w:line="240" w:lineRule="auto"/>
+            </w:pPr>
+            <w:r>
+              <w:rPr>
+                <w:rFonts w:ascii="Times New Roman" w:hAnsi="Times New Roman" w:eastAsia="Times New Roman"/>
+                <w:sz w:val="20"/>
+              </w:rPr>
               <w:t>Go test; race detector with GCC 16.2.0</w:t>
             </w:r>
           </w:p>
         </w:tc>
         <w:tc>
           <w:tcPr>
-            <w:tcW w:type="dxa" w:w="2339"/>
-          </w:tcPr>
-          <w:p>
-            <w:r>
+            <w:tcW w:type="dxa" w:w="3234"/>
+            <w:vAlign w:val="top"/>
+            <w:tcMar>
+              <w:top w:w="80" w:type="dxa"/>
+              <w:start w:w="100" w:type="dxa"/>
+              <w:bottom w:w="80" w:type="dxa"/>
+              <w:end w:w="100" w:type="dxa"/>
+            </w:tcMar>
+          </w:tcPr>
+          <w:p>
+            <w:pPr>
+              <w:spacing w:before="0" w:after="40" w:line="240" w:lineRule="auto"/>
+            </w:pPr>
+            <w:r>
+              <w:rPr>
+                <w:rFonts w:ascii="Times New Roman" w:hAnsi="Times New Roman" w:eastAsia="Times New Roman"/>
+                <w:sz w:val="20"/>
+              </w:rPr>
               <w:t>go test ./... and CGO_ENABLED=1 go test -race ./...</w:t>
             </w:r>
           </w:p>
         </w:tc>
         <w:tc>
           <w:tcPr>
-            <w:tcW w:type="dxa" w:w="2339"/>
-          </w:tcPr>
-          <w:p>
-            <w:r>
+            <w:tcW w:type="dxa" w:w="2156"/>
+            <w:vAlign w:val="top"/>
+            <w:tcMar>
+              <w:top w:w="80" w:type="dxa"/>
+              <w:start w:w="100" w:type="dxa"/>
+              <w:bottom w:w="80" w:type="dxa"/>
+              <w:end w:w="100" w:type="dxa"/>
+            </w:tcMar>
+          </w:tcPr>
+          <w:p>
+            <w:pPr>
+              <w:spacing w:before="0" w:after="40" w:line="240" w:lineRule="auto"/>
+            </w:pPr>
+            <w:r>
+              <w:rPr>
+                <w:rFonts w:ascii="Times New Roman" w:hAnsi="Times New Roman" w:eastAsia="Times New Roman"/>
+                <w:sz w:val="20"/>
+              </w:rPr>
               <w:t>PASS locally; logs in docs/labs/pr12/ds/evidence/</w:t>
             </w:r>
           </w:p>
@@ -1191,40 +1847,96 @@
       <w:tr>
         <w:tc>
           <w:tcPr>
-            <w:tcW w:type="dxa" w:w="2339"/>
-          </w:tcPr>
-          <w:p>
-            <w:r>
+            <w:tcW w:type="dxa" w:w="2156"/>
+            <w:vAlign w:val="top"/>
+            <w:tcMar>
+              <w:top w:w="80" w:type="dxa"/>
+              <w:start w:w="100" w:type="dxa"/>
+              <w:bottom w:w="80" w:type="dxa"/>
+              <w:end w:w="100" w:type="dxa"/>
+            </w:tcMar>
+          </w:tcPr>
+          <w:p>
+            <w:pPr>
+              <w:spacing w:before="0" w:after="40" w:line="240" w:lineRule="auto"/>
+            </w:pPr>
+            <w:r>
+              <w:rPr>
+                <w:rFonts w:ascii="Times New Roman" w:hAnsi="Times New Roman" w:eastAsia="Times New Roman"/>
+                <w:sz w:val="20"/>
+              </w:rPr>
               <w:t>Статический анализ</w:t>
             </w:r>
           </w:p>
         </w:tc>
         <w:tc>
           <w:tcPr>
-            <w:tcW w:type="dxa" w:w="2339"/>
-          </w:tcPr>
-          <w:p>
-            <w:r>
+            <w:tcW w:type="dxa" w:w="2254"/>
+            <w:vAlign w:val="top"/>
+            <w:tcMar>
+              <w:top w:w="80" w:type="dxa"/>
+              <w:start w:w="100" w:type="dxa"/>
+              <w:bottom w:w="80" w:type="dxa"/>
+              <w:end w:w="100" w:type="dxa"/>
+            </w:tcMar>
+          </w:tcPr>
+          <w:p>
+            <w:pPr>
+              <w:spacing w:before="0" w:after="40" w:line="240" w:lineRule="auto"/>
+            </w:pPr>
+            <w:r>
+              <w:rPr>
+                <w:rFonts w:ascii="Times New Roman" w:hAnsi="Times New Roman" w:eastAsia="Times New Roman"/>
+                <w:sz w:val="20"/>
+              </w:rPr>
               <w:t>go vet Go 1.27.2</w:t>
             </w:r>
           </w:p>
         </w:tc>
         <w:tc>
           <w:tcPr>
-            <w:tcW w:type="dxa" w:w="2339"/>
-          </w:tcPr>
-          <w:p>
-            <w:r>
+            <w:tcW w:type="dxa" w:w="3234"/>
+            <w:vAlign w:val="top"/>
+            <w:tcMar>
+              <w:top w:w="80" w:type="dxa"/>
+              <w:start w:w="100" w:type="dxa"/>
+              <w:bottom w:w="80" w:type="dxa"/>
+              <w:end w:w="100" w:type="dxa"/>
+            </w:tcMar>
+          </w:tcPr>
+          <w:p>
+            <w:pPr>
+              <w:spacing w:before="0" w:after="40" w:line="240" w:lineRule="auto"/>
+            </w:pPr>
+            <w:r>
+              <w:rPr>
+                <w:rFonts w:ascii="Times New Roman" w:hAnsi="Times New Roman" w:eastAsia="Times New Roman"/>
+                <w:sz w:val="20"/>
+              </w:rPr>
               <w:t>go vet ./... from services/delivery</w:t>
             </w:r>
           </w:p>
         </w:tc>
         <w:tc>
           <w:tcPr>
-            <w:tcW w:type="dxa" w:w="2339"/>
-          </w:tcPr>
-          <w:p>
-            <w:r>
+            <w:tcW w:type="dxa" w:w="2156"/>
+            <w:vAlign w:val="top"/>
+            <w:tcMar>
+              <w:top w:w="80" w:type="dxa"/>
+              <w:start w:w="100" w:type="dxa"/>
+              <w:bottom w:w="80" w:type="dxa"/>
+              <w:end w:w="100" w:type="dxa"/>
+            </w:tcMar>
+          </w:tcPr>
+          <w:p>
+            <w:pPr>
+              <w:spacing w:before="0" w:after="40" w:line="240" w:lineRule="auto"/>
+            </w:pPr>
+            <w:r>
+              <w:rPr>
+                <w:rFonts w:ascii="Times New Roman" w:hAnsi="Times New Roman" w:eastAsia="Times New Roman"/>
+                <w:sz w:val="20"/>
+              </w:rPr>
               <w:t>PASS locally; log recorded</w:t>
             </w:r>
           </w:p>
@@ -1233,40 +1945,96 @@
       <w:tr>
         <w:tc>
           <w:tcPr>
-            <w:tcW w:type="dxa" w:w="2339"/>
-          </w:tcPr>
-          <w:p>
-            <w:r>
+            <w:tcW w:type="dxa" w:w="2156"/>
+            <w:vAlign w:val="top"/>
+            <w:tcMar>
+              <w:top w:w="80" w:type="dxa"/>
+              <w:start w:w="100" w:type="dxa"/>
+              <w:bottom w:w="80" w:type="dxa"/>
+              <w:end w:w="100" w:type="dxa"/>
+            </w:tcMar>
+          </w:tcPr>
+          <w:p>
+            <w:pPr>
+              <w:spacing w:before="0" w:after="40" w:line="240" w:lineRule="auto"/>
+            </w:pPr>
+            <w:r>
+              <w:rPr>
+                <w:rFonts w:ascii="Times New Roman" w:hAnsi="Times New Roman" w:eastAsia="Times New Roman"/>
+                <w:sz w:val="20"/>
+              </w:rPr>
               <w:t>Динамическая диагностика</w:t>
             </w:r>
           </w:p>
         </w:tc>
         <w:tc>
           <w:tcPr>
-            <w:tcW w:type="dxa" w:w="2339"/>
-          </w:tcPr>
-          <w:p>
-            <w:r>
+            <w:tcW w:type="dxa" w:w="2254"/>
+            <w:vAlign w:val="top"/>
+            <w:tcMar>
+              <w:top w:w="80" w:type="dxa"/>
+              <w:start w:w="100" w:type="dxa"/>
+              <w:bottom w:w="80" w:type="dxa"/>
+              <w:end w:w="100" w:type="dxa"/>
+            </w:tcMar>
+          </w:tcPr>
+          <w:p>
+            <w:pPr>
+              <w:spacing w:before="0" w:after="40" w:line="240" w:lineRule="auto"/>
+            </w:pPr>
+            <w:r>
+              <w:rPr>
+                <w:rFonts w:ascii="Times New Roman" w:hAnsi="Times New Roman" w:eastAsia="Times New Roman"/>
+                <w:sz w:val="20"/>
+              </w:rPr>
               <w:t>delivery-contractcheck synthetic fixture CLI</w:t>
             </w:r>
           </w:p>
         </w:tc>
         <w:tc>
           <w:tcPr>
-            <w:tcW w:type="dxa" w:w="2339"/>
-          </w:tcPr>
-          <w:p>
-            <w:r>
+            <w:tcW w:type="dxa" w:w="3234"/>
+            <w:vAlign w:val="top"/>
+            <w:tcMar>
+              <w:top w:w="80" w:type="dxa"/>
+              <w:start w:w="100" w:type="dxa"/>
+              <w:bottom w:w="80" w:type="dxa"/>
+              <w:end w:w="100" w:type="dxa"/>
+            </w:tcMar>
+          </w:tcPr>
+          <w:p>
+            <w:pPr>
+              <w:spacing w:before="0" w:after="40" w:line="240" w:lineRule="auto"/>
+            </w:pPr>
+            <w:r>
+              <w:rPr>
+                <w:rFonts w:ascii="Times New Roman" w:hAnsi="Times New Roman" w:eastAsia="Times New Roman"/>
+                <w:sz w:val="20"/>
+              </w:rPr>
               <w:t>workspace.py smoke delivery --require outside checkout</w:t>
             </w:r>
           </w:p>
         </w:tc>
         <w:tc>
           <w:tcPr>
-            <w:tcW w:type="dxa" w:w="2339"/>
-          </w:tcPr>
-          <w:p>
-            <w:r>
+            <w:tcW w:type="dxa" w:w="2156"/>
+            <w:vAlign w:val="top"/>
+            <w:tcMar>
+              <w:top w:w="80" w:type="dxa"/>
+              <w:start w:w="100" w:type="dxa"/>
+              <w:bottom w:w="80" w:type="dxa"/>
+              <w:end w:w="100" w:type="dxa"/>
+            </w:tcMar>
+          </w:tcPr>
+          <w:p>
+            <w:pPr>
+              <w:spacing w:before="0" w:after="40" w:line="240" w:lineRule="auto"/>
+            </w:pPr>
+            <w:r>
+              <w:rPr>
+                <w:rFonts w:ascii="Times New Roman" w:hAnsi="Times New Roman" w:eastAsia="Times New Roman"/>
+                <w:sz w:val="20"/>
+              </w:rPr>
               <w:t>PASS; positive and negative exit recorded</w:t>
             </w:r>
           </w:p>
@@ -1275,40 +2043,96 @@
       <w:tr>
         <w:tc>
           <w:tcPr>
-            <w:tcW w:type="dxa" w:w="2339"/>
-          </w:tcPr>
-          <w:p>
-            <w:r>
+            <w:tcW w:type="dxa" w:w="2156"/>
+            <w:vAlign w:val="top"/>
+            <w:tcMar>
+              <w:top w:w="80" w:type="dxa"/>
+              <w:start w:w="100" w:type="dxa"/>
+              <w:bottom w:w="80" w:type="dxa"/>
+              <w:end w:w="100" w:type="dxa"/>
+            </w:tcMar>
+          </w:tcPr>
+          <w:p>
+            <w:pPr>
+              <w:spacing w:before="0" w:after="40" w:line="240" w:lineRule="auto"/>
+            </w:pPr>
+            <w:r>
+              <w:rPr>
+                <w:rFonts w:ascii="Times New Roman" w:hAnsi="Times New Roman" w:eastAsia="Times New Roman"/>
+                <w:sz w:val="20"/>
+              </w:rPr>
               <w:t>Профилирование</w:t>
             </w:r>
           </w:p>
         </w:tc>
         <w:tc>
           <w:tcPr>
-            <w:tcW w:type="dxa" w:w="2339"/>
-          </w:tcPr>
-          <w:p>
-            <w:r>
+            <w:tcW w:type="dxa" w:w="2254"/>
+            <w:vAlign w:val="top"/>
+            <w:tcMar>
+              <w:top w:w="80" w:type="dxa"/>
+              <w:start w:w="100" w:type="dxa"/>
+              <w:bottom w:w="80" w:type="dxa"/>
+              <w:end w:w="100" w:type="dxa"/>
+            </w:tcMar>
+          </w:tcPr>
+          <w:p>
+            <w:pPr>
+              <w:spacing w:before="0" w:after="40" w:line="240" w:lineRule="auto"/>
+            </w:pPr>
+            <w:r>
+              <w:rPr>
+                <w:rFonts w:ascii="Times New Roman" w:hAnsi="Times New Roman" w:eastAsia="Times New Roman"/>
+                <w:sz w:val="20"/>
+              </w:rPr>
               <w:t>Go pprof — not executed in this correction</w:t>
             </w:r>
           </w:p>
         </w:tc>
         <w:tc>
           <w:tcPr>
-            <w:tcW w:type="dxa" w:w="2339"/>
-          </w:tcPr>
-          <w:p>
-            <w:r>
+            <w:tcW w:type="dxa" w:w="3234"/>
+            <w:vAlign w:val="top"/>
+            <w:tcMar>
+              <w:top w:w="80" w:type="dxa"/>
+              <w:start w:w="100" w:type="dxa"/>
+              <w:bottom w:w="80" w:type="dxa"/>
+              <w:end w:w="100" w:type="dxa"/>
+            </w:tcMar>
+          </w:tcPr>
+          <w:p>
+            <w:pPr>
+              <w:spacing w:before="0" w:after="40" w:line="240" w:lineRule="auto"/>
+            </w:pPr>
+            <w:r>
+              <w:rPr>
+                <w:rFonts w:ascii="Times New Roman" w:hAnsi="Times New Roman" w:eastAsia="Times New Roman"/>
+                <w:sz w:val="20"/>
+              </w:rPr>
               <w:t>planned after acceptance for CPU/memory of comparator and FileReader</w:t>
             </w:r>
           </w:p>
         </w:tc>
         <w:tc>
           <w:tcPr>
-            <w:tcW w:type="dxa" w:w="2339"/>
-          </w:tcPr>
-          <w:p>
-            <w:r>
+            <w:tcW w:type="dxa" w:w="2156"/>
+            <w:vAlign w:val="top"/>
+            <w:tcMar>
+              <w:top w:w="80" w:type="dxa"/>
+              <w:start w:w="100" w:type="dxa"/>
+              <w:bottom w:w="80" w:type="dxa"/>
+              <w:end w:w="100" w:type="dxa"/>
+            </w:tcMar>
+          </w:tcPr>
+          <w:p>
+            <w:pPr>
+              <w:spacing w:before="0" w:after="40" w:line="240" w:lineRule="auto"/>
+            </w:pPr>
+            <w:r>
+              <w:rPr>
+                <w:rFonts w:ascii="Times New Roman" w:hAnsi="Times New Roman" w:eastAsia="Times New Roman"/>
+                <w:sz w:val="20"/>
+              </w:rPr>
               <w:t>PLANNED; no performance claim</w:t>
             </w:r>
           </w:p>
@@ -1317,40 +2141,96 @@
       <w:tr>
         <w:tc>
           <w:tcPr>
-            <w:tcW w:type="dxa" w:w="2339"/>
-          </w:tcPr>
-          <w:p>
-            <w:r>
+            <w:tcW w:type="dxa" w:w="2156"/>
+            <w:vAlign w:val="top"/>
+            <w:tcMar>
+              <w:top w:w="80" w:type="dxa"/>
+              <w:start w:w="100" w:type="dxa"/>
+              <w:bottom w:w="80" w:type="dxa"/>
+              <w:end w:w="100" w:type="dxa"/>
+            </w:tcMar>
+          </w:tcPr>
+          <w:p>
+            <w:pPr>
+              <w:spacing w:before="0" w:after="40" w:line="240" w:lineRule="auto"/>
+            </w:pPr>
+            <w:r>
+              <w:rPr>
+                <w:rFonts w:ascii="Times New Roman" w:hAnsi="Times New Roman" w:eastAsia="Times New Roman"/>
+                <w:sz w:val="20"/>
+              </w:rPr>
               <w:t>Автоматические проверки CI</w:t>
             </w:r>
           </w:p>
         </w:tc>
         <w:tc>
           <w:tcPr>
-            <w:tcW w:type="dxa" w:w="2339"/>
-          </w:tcPr>
-          <w:p>
-            <w:r>
+            <w:tcW w:type="dxa" w:w="2254"/>
+            <w:vAlign w:val="top"/>
+            <w:tcMar>
+              <w:top w:w="80" w:type="dxa"/>
+              <w:start w:w="100" w:type="dxa"/>
+              <w:bottom w:w="80" w:type="dxa"/>
+              <w:end w:w="100" w:type="dxa"/>
+            </w:tcMar>
+          </w:tcPr>
+          <w:p>
+            <w:pPr>
+              <w:spacing w:before="0" w:after="40" w:line="240" w:lineRule="auto"/>
+            </w:pPr>
+            <w:r>
+              <w:rPr>
+                <w:rFonts w:ascii="Times New Roman" w:hAnsi="Times New Roman" w:eastAsia="Times New Roman"/>
+                <w:sz w:val="20"/>
+              </w:rPr>
               <w:t>GitHub Actions</w:t>
             </w:r>
           </w:p>
         </w:tc>
         <w:tc>
           <w:tcPr>
-            <w:tcW w:type="dxa" w:w="2339"/>
-          </w:tcPr>
-          <w:p>
-            <w:r>
+            <w:tcW w:type="dxa" w:w="3234"/>
+            <w:vAlign w:val="top"/>
+            <w:tcMar>
+              <w:top w:w="80" w:type="dxa"/>
+              <w:start w:w="100" w:type="dxa"/>
+              <w:bottom w:w="80" w:type="dxa"/>
+              <w:end w:w="100" w:type="dxa"/>
+            </w:tcMar>
+          </w:tcPr>
+          <w:p>
+            <w:pPr>
+              <w:spacing w:before="0" w:after="40" w:line="240" w:lineRule="auto"/>
+            </w:pPr>
+            <w:r>
+              <w:rPr>
+                <w:rFonts w:ascii="Times New Roman" w:hAnsi="Times New Roman" w:eastAsia="Times New Roman"/>
+                <w:sz w:val="20"/>
+              </w:rPr>
               <w:t>https://github.com/hitpipe/hitpipe/actions/runs/39271075578 (evidence/report commit c365ad5; latest correction head gets a fresh run after push)</w:t>
             </w:r>
           </w:p>
         </w:tc>
         <w:tc>
           <w:tcPr>
-            <w:tcW w:type="dxa" w:w="2339"/>
-          </w:tcPr>
-          <w:p>
-            <w:r>
+            <w:tcW w:type="dxa" w:w="2156"/>
+            <w:vAlign w:val="top"/>
+            <w:tcMar>
+              <w:top w:w="80" w:type="dxa"/>
+              <w:start w:w="100" w:type="dxa"/>
+              <w:bottom w:w="80" w:type="dxa"/>
+              <w:end w:w="100" w:type="dxa"/>
+            </w:tcMar>
+          </w:tcPr>
+          <w:p>
+            <w:pPr>
+              <w:spacing w:before="0" w:after="40" w:line="240" w:lineRule="auto"/>
+            </w:pPr>
+            <w:r>
+              <w:rPr>
+                <w:rFonts w:ascii="Times New Roman" w:hAnsi="Times New Roman" w:eastAsia="Times New Roman"/>
+                <w:sz w:val="20"/>
+              </w:rPr>
               <w:t>PASS for evidence commit; fresh run for final source head is recorded after push</w:t>
             </w:r>
           </w:p>
@@ -1380,9 +2260,17 @@
     </w:p>
     <w:tbl>
       <w:tblPr>
-        <w:tblW w:type="dxa" w:w="9000"/>
-        <w:tblLayout w:type="autofit"/>
+        <w:tblW w:type="pct" w:w="10000"/>
+        <w:tblLayout w:type="fixed"/>
         <w:tblLook w:firstColumn="1" w:firstRow="1" w:lastColumn="0" w:lastRow="0" w:noHBand="0" w:noVBand="1" w:val="04A0"/>
+        <w:tblBorders>
+          <w:top w:val="single" w:sz="4" w:space="0" w:color="B7C3D0"/>
+          <w:left w:val="single" w:sz="4" w:space="0" w:color="B7C3D0"/>
+          <w:bottom w:val="single" w:sz="4" w:space="0" w:color="B7C3D0"/>
+          <w:right w:val="single" w:sz="4" w:space="0" w:color="B7C3D0"/>
+          <w:insideH w:val="single" w:sz="4" w:space="0" w:color="B7C3D0"/>
+          <w:insideV w:val="single" w:sz="4" w:space="0" w:color="B7C3D0"/>
+        </w:tblBorders>
       </w:tblPr>
       <w:tblGrid>
         <w:gridCol w:w="9355"/>
@@ -1393,21 +2281,22 @@
             <w:tcW w:type="dxa" w:w="9355"/>
             <w:shd w:fill="EDEDED" w:val="clear"/>
             <w:tcMar>
-              <w:top w:w="160" w:type="dxa"/>
-              <w:start w:w="180" w:type="dxa"/>
-              <w:bottom w:w="160" w:type="dxa"/>
-              <w:end w:w="180" w:type="dxa"/>
-            </w:tcMar>
-          </w:tcPr>
-          <w:p>
-            <w:pPr>
-              <w:spacing w:before="40" w:after="40"/>
+              <w:top w:w="140" w:type="dxa"/>
+              <w:start w:w="160" w:type="dxa"/>
+              <w:bottom w:w="140" w:type="dxa"/>
+              <w:end w:w="160" w:type="dxa"/>
+            </w:tcMar>
+            <w:vAlign w:val="center"/>
+          </w:tcPr>
+          <w:p>
+            <w:pPr>
+              <w:spacing w:before="40" w:after="0"/>
               <w:jc w:val="center"/>
             </w:pPr>
             <w:r>
               <w:rPr>
                 <w:rFonts w:ascii="Times New Roman" w:hAnsi="Times New Roman" w:eastAsia="Times New Roman"/>
-                <w:sz w:val="24"/>
+                <w:sz w:val="22"/>
               </w:rPr>
               <w:t>[МЕСТО ДЛЯ СКРИНШОТА 1 — Собственная часть исполняемого каркаса]</w:t>
             </w:r>
@@ -1443,9 +2332,17 @@
     </w:p>
     <w:tbl>
       <w:tblPr>
-        <w:tblW w:type="dxa" w:w="9000"/>
-        <w:tblLayout w:type="autofit"/>
+        <w:tblW w:type="pct" w:w="10000"/>
+        <w:tblLayout w:type="fixed"/>
         <w:tblLook w:firstColumn="1" w:firstRow="1" w:lastColumn="0" w:lastRow="0" w:noHBand="0" w:noVBand="1" w:val="04A0"/>
+        <w:tblBorders>
+          <w:top w:val="single" w:sz="4" w:space="0" w:color="B7C3D0"/>
+          <w:left w:val="single" w:sz="4" w:space="0" w:color="B7C3D0"/>
+          <w:bottom w:val="single" w:sz="4" w:space="0" w:color="B7C3D0"/>
+          <w:right w:val="single" w:sz="4" w:space="0" w:color="B7C3D0"/>
+          <w:insideH w:val="single" w:sz="4" w:space="0" w:color="B7C3D0"/>
+          <w:insideV w:val="single" w:sz="4" w:space="0" w:color="B7C3D0"/>
+        </w:tblBorders>
       </w:tblPr>
       <w:tblGrid>
         <w:gridCol w:w="9355"/>
@@ -1456,21 +2353,22 @@
             <w:tcW w:type="dxa" w:w="9355"/>
             <w:shd w:fill="EDEDED" w:val="clear"/>
             <w:tcMar>
-              <w:top w:w="160" w:type="dxa"/>
-              <w:start w:w="180" w:type="dxa"/>
-              <w:bottom w:w="160" w:type="dxa"/>
-              <w:end w:w="180" w:type="dxa"/>
-            </w:tcMar>
-          </w:tcPr>
-          <w:p>
-            <w:pPr>
-              <w:spacing w:before="40" w:after="40"/>
+              <w:top w:w="140" w:type="dxa"/>
+              <w:start w:w="160" w:type="dxa"/>
+              <w:bottom w:w="140" w:type="dxa"/>
+              <w:end w:w="160" w:type="dxa"/>
+            </w:tcMar>
+            <w:vAlign w:val="center"/>
+          </w:tcPr>
+          <w:p>
+            <w:pPr>
+              <w:spacing w:before="40" w:after="0"/>
               <w:jc w:val="center"/>
             </w:pPr>
             <w:r>
               <w:rPr>
                 <w:rFonts w:ascii="Times New Roman" w:hAnsi="Times New Roman" w:eastAsia="Times New Roman"/>
-                <w:sz w:val="24"/>
+                <w:sz w:val="22"/>
               </w:rPr>
               <w:t>[МЕСТО ДЛЯ СКРИНШОТА 2 — Подготовка компонента в двух режимах]</w:t>
             </w:r>
@@ -1502,8 +2400,17 @@
     <w:tbl>
       <w:tblPr>
         <w:tblStyle w:val="af4"/>
-        <w:tblW w:type="auto" w:w="0"/>
+        <w:tblW w:type="pct" w:w="10000"/>
         <w:tblLook w:firstColumn="1" w:firstRow="1" w:lastColumn="0" w:lastRow="0" w:noHBand="0" w:noVBand="1" w:val="04A0"/>
+        <w:tblLayout w:type="fixed"/>
+        <w:tblBorders>
+          <w:top w:val="single" w:sz="4" w:space="0" w:color="B7C3D0"/>
+          <w:left w:val="single" w:sz="4" w:space="0" w:color="B7C3D0"/>
+          <w:bottom w:val="single" w:sz="4" w:space="0" w:color="B7C3D0"/>
+          <w:right w:val="single" w:sz="4" w:space="0" w:color="B7C3D0"/>
+          <w:insideH w:val="single" w:sz="4" w:space="0" w:color="B7C3D0"/>
+          <w:insideV w:val="single" w:sz="4" w:space="0" w:color="B7C3D0"/>
+        </w:tblBorders>
       </w:tblPr>
       <w:tblGrid>
         <w:gridCol w:w="3118"/>
@@ -1516,30 +2423,81 @@
         </w:trPr>
         <w:tc>
           <w:tcPr>
-            <w:tcW w:type="dxa" w:w="3118"/>
-          </w:tcPr>
-          <w:p>
-            <w:r>
+            <w:tcW w:type="dxa" w:w="2450"/>
+            <w:vAlign w:val="top"/>
+            <w:tcMar>
+              <w:top w:w="80" w:type="dxa"/>
+              <w:start w:w="100" w:type="dxa"/>
+              <w:bottom w:w="80" w:type="dxa"/>
+              <w:end w:w="100" w:type="dxa"/>
+            </w:tcMar>
+            <w:shd w:fill="D9EAF7" w:val="clear"/>
+          </w:tcPr>
+          <w:p>
+            <w:pPr>
+              <w:spacing w:before="0" w:after="40" w:line="240" w:lineRule="auto"/>
+              <w:jc w:val="center"/>
+            </w:pPr>
+            <w:r>
+              <w:rPr>
+                <w:rFonts w:ascii="Times New Roman" w:hAnsi="Times New Roman" w:eastAsia="Times New Roman"/>
+                <w:b/>
+                <w:sz w:val="20"/>
+              </w:rPr>
               <w:t>Вопрос</w:t>
             </w:r>
           </w:p>
         </w:tc>
         <w:tc>
           <w:tcPr>
-            <w:tcW w:type="dxa" w:w="3118"/>
-          </w:tcPr>
-          <w:p>
-            <w:r>
+            <w:tcW w:type="dxa" w:w="3920"/>
+            <w:vAlign w:val="top"/>
+            <w:tcMar>
+              <w:top w:w="80" w:type="dxa"/>
+              <w:start w:w="100" w:type="dxa"/>
+              <w:bottom w:w="80" w:type="dxa"/>
+              <w:end w:w="100" w:type="dxa"/>
+            </w:tcMar>
+            <w:shd w:fill="D9EAF7" w:val="clear"/>
+          </w:tcPr>
+          <w:p>
+            <w:pPr>
+              <w:spacing w:before="0" w:after="40" w:line="240" w:lineRule="auto"/>
+              <w:jc w:val="center"/>
+            </w:pPr>
+            <w:r>
+              <w:rPr>
+                <w:rFonts w:ascii="Times New Roman" w:hAnsi="Times New Roman" w:eastAsia="Times New Roman"/>
+                <w:b/>
+                <w:sz w:val="20"/>
+              </w:rPr>
               <w:t>Режим разработки: команда и наблюдение</w:t>
             </w:r>
           </w:p>
         </w:tc>
         <w:tc>
           <w:tcPr>
-            <w:tcW w:type="dxa" w:w="3118"/>
-          </w:tcPr>
-          <w:p>
-            <w:r>
+            <w:tcW w:type="dxa" w:w="3430"/>
+            <w:vAlign w:val="top"/>
+            <w:tcMar>
+              <w:top w:w="80" w:type="dxa"/>
+              <w:start w:w="100" w:type="dxa"/>
+              <w:bottom w:w="80" w:type="dxa"/>
+              <w:end w:w="100" w:type="dxa"/>
+            </w:tcMar>
+            <w:shd w:fill="D9EAF7" w:val="clear"/>
+          </w:tcPr>
+          <w:p>
+            <w:pPr>
+              <w:spacing w:before="0" w:after="40" w:line="240" w:lineRule="auto"/>
+              <w:jc w:val="center"/>
+            </w:pPr>
+            <w:r>
+              <w:rPr>
+                <w:rFonts w:ascii="Times New Roman" w:hAnsi="Times New Roman" w:eastAsia="Times New Roman"/>
+                <w:b/>
+                <w:sz w:val="20"/>
+              </w:rPr>
               <w:t>Режим поставки: команда и наблюдение</w:t>
             </w:r>
           </w:p>
@@ -1548,20 +2506,48 @@
       <w:tr>
         <w:tc>
           <w:tcPr>
-            <w:tcW w:type="dxa" w:w="3118"/>
-          </w:tcPr>
-          <w:p>
-            <w:r>
+            <w:tcW w:type="dxa" w:w="2450"/>
+            <w:vAlign w:val="top"/>
+            <w:tcMar>
+              <w:top w:w="80" w:type="dxa"/>
+              <w:start w:w="100" w:type="dxa"/>
+              <w:bottom w:w="80" w:type="dxa"/>
+              <w:end w:w="100" w:type="dxa"/>
+            </w:tcMar>
+          </w:tcPr>
+          <w:p>
+            <w:pPr>
+              <w:spacing w:before="0" w:after="40" w:line="240" w:lineRule="auto"/>
+            </w:pPr>
+            <w:r>
+              <w:rPr>
+                <w:rFonts w:ascii="Times New Roman" w:hAnsi="Times New Roman" w:eastAsia="Times New Roman"/>
+                <w:sz w:val="20"/>
+              </w:rPr>
               <w:t>Подготовка и запуск</w:t>
             </w:r>
           </w:p>
         </w:tc>
         <w:tc>
           <w:tcPr>
-            <w:tcW w:type="dxa" w:w="3118"/>
-          </w:tcPr>
-          <w:p>
-            <w:r>
+            <w:tcW w:type="dxa" w:w="3920"/>
+            <w:vAlign w:val="top"/>
+            <w:tcMar>
+              <w:top w:w="80" w:type="dxa"/>
+              <w:start w:w="100" w:type="dxa"/>
+              <w:bottom w:w="80" w:type="dxa"/>
+              <w:end w:w="100" w:type="dxa"/>
+            </w:tcMar>
+          </w:tcPr>
+          <w:p>
+            <w:pPr>
+              <w:spacing w:before="0" w:after="40" w:line="240" w:lineRule="auto"/>
+            </w:pPr>
+            <w:r>
+              <w:rPr>
+                <w:rFonts w:ascii="Times New Roman" w:hAnsi="Times New Roman" w:eastAsia="Times New Roman"/>
+                <w:sz w:val="20"/>
+              </w:rPr>
               <w:t>cwd services/delivery; go build -gcflags "all=-N -l" -ldflags "-X main.version=pr12 -X main.commit=bafc97a0eb5cc2b2aba68c04a74b179b61432d82" -o .pr12-build/delivery/dev/delivery-contractcheck ./cmd/delivery-contractcheck</w:t>
               <w:br/>
               <w:t>Result: PASS; log: docs/labs/pr12/ds/evidence/HIT-47-workspace-smoke.log</w:t>
@@ -1570,10 +2556,24 @@
         </w:tc>
         <w:tc>
           <w:tcPr>
-            <w:tcW w:type="dxa" w:w="3118"/>
-          </w:tcPr>
-          <w:p>
-            <w:r>
+            <w:tcW w:type="dxa" w:w="3430"/>
+            <w:vAlign w:val="top"/>
+            <w:tcMar>
+              <w:top w:w="80" w:type="dxa"/>
+              <w:start w:w="100" w:type="dxa"/>
+              <w:bottom w:w="80" w:type="dxa"/>
+              <w:end w:w="100" w:type="dxa"/>
+            </w:tcMar>
+          </w:tcPr>
+          <w:p>
+            <w:pPr>
+              <w:spacing w:before="0" w:after="40" w:line="240" w:lineRule="auto"/>
+            </w:pPr>
+            <w:r>
+              <w:rPr>
+                <w:rFonts w:ascii="Times New Roman" w:hAnsi="Times New Roman" w:eastAsia="Times New Roman"/>
+                <w:sz w:val="20"/>
+              </w:rPr>
               <w:t>cwd services/delivery; go build -trimpath -ldflags "-X main.version=pr12 -X main.commit=bafc97a0eb5cc2b2aba68c04a74b179b61432d82" -o .pr12-build/delivery/release/delivery-contractcheck ./cmd/delivery-contractcheck</w:t>
               <w:br/>
               <w:t>Result: PASS; log: docs/labs/pr12/ds/evidence/HIT-47-workspace-smoke.log</w:t>
@@ -1584,20 +2584,48 @@
       <w:tr>
         <w:tc>
           <w:tcPr>
-            <w:tcW w:type="dxa" w:w="3118"/>
-          </w:tcPr>
-          <w:p>
-            <w:r>
+            <w:tcW w:type="dxa" w:w="2450"/>
+            <w:vAlign w:val="top"/>
+            <w:tcMar>
+              <w:top w:w="80" w:type="dxa"/>
+              <w:start w:w="100" w:type="dxa"/>
+              <w:bottom w:w="80" w:type="dxa"/>
+              <w:end w:w="100" w:type="dxa"/>
+            </w:tcMar>
+          </w:tcPr>
+          <w:p>
+            <w:pPr>
+              <w:spacing w:before="0" w:after="40" w:line="240" w:lineRule="auto"/>
+            </w:pPr>
+            <w:r>
+              <w:rPr>
+                <w:rFonts w:ascii="Times New Roman" w:hAnsi="Times New Roman" w:eastAsia="Times New Roman"/>
+                <w:sz w:val="20"/>
+              </w:rPr>
               <w:t>Преобразования кода и окружения</w:t>
             </w:r>
           </w:p>
         </w:tc>
         <w:tc>
           <w:tcPr>
-            <w:tcW w:type="dxa" w:w="3118"/>
-          </w:tcPr>
-          <w:p>
-            <w:r>
+            <w:tcW w:type="dxa" w:w="3920"/>
+            <w:vAlign w:val="top"/>
+            <w:tcMar>
+              <w:top w:w="80" w:type="dxa"/>
+              <w:start w:w="100" w:type="dxa"/>
+              <w:bottom w:w="80" w:type="dxa"/>
+              <w:end w:w="100" w:type="dxa"/>
+            </w:tcMar>
+          </w:tcPr>
+          <w:p>
+            <w:pPr>
+              <w:spacing w:before="0" w:after="40" w:line="240" w:lineRule="auto"/>
+            </w:pPr>
+            <w:r>
+              <w:rPr>
+                <w:rFonts w:ascii="Times New Roman" w:hAnsi="Times New Roman" w:eastAsia="Times New Roman"/>
+                <w:sz w:val="20"/>
+              </w:rPr>
               <w:t>go mod tidy; go mod download</w:t>
               <w:br/>
               <w:t>Result: PASS; log: docs/labs/pr12/ds/evidence/HIT-47-workspace-smoke.log</w:t>
@@ -1606,10 +2634,24 @@
         </w:tc>
         <w:tc>
           <w:tcPr>
-            <w:tcW w:type="dxa" w:w="3118"/>
-          </w:tcPr>
-          <w:p>
-            <w:r>
+            <w:tcW w:type="dxa" w:w="3430"/>
+            <w:vAlign w:val="top"/>
+            <w:tcMar>
+              <w:top w:w="80" w:type="dxa"/>
+              <w:start w:w="100" w:type="dxa"/>
+              <w:bottom w:w="80" w:type="dxa"/>
+              <w:end w:w="100" w:type="dxa"/>
+            </w:tcMar>
+          </w:tcPr>
+          <w:p>
+            <w:pPr>
+              <w:spacing w:before="0" w:after="40" w:line="240" w:lineRule="auto"/>
+            </w:pPr>
+            <w:r>
+              <w:rPr>
+                <w:rFonts w:ascii="Times New Roman" w:hAnsi="Times New Roman" w:eastAsia="Times New Roman"/>
+                <w:sz w:val="20"/>
+              </w:rPr>
               <w:t>go mod tidy; go mod download</w:t>
               <w:br/>
               <w:t>Result: PASS; log: docs/labs/pr12/ds/evidence/HIT-47-workspace-smoke.log</w:t>
@@ -1620,20 +2662,48 @@
       <w:tr>
         <w:tc>
           <w:tcPr>
-            <w:tcW w:type="dxa" w:w="3118"/>
-          </w:tcPr>
-          <w:p>
-            <w:r>
+            <w:tcW w:type="dxa" w:w="2450"/>
+            <w:vAlign w:val="top"/>
+            <w:tcMar>
+              <w:top w:w="80" w:type="dxa"/>
+              <w:start w:w="100" w:type="dxa"/>
+              <w:bottom w:w="80" w:type="dxa"/>
+              <w:end w:w="100" w:type="dxa"/>
+            </w:tcMar>
+          </w:tcPr>
+          <w:p>
+            <w:pPr>
+              <w:spacing w:before="0" w:after="40" w:line="240" w:lineRule="auto"/>
+            </w:pPr>
+            <w:r>
+              <w:rPr>
+                <w:rFonts w:ascii="Times New Roman" w:hAnsi="Times New Roman" w:eastAsia="Times New Roman"/>
+                <w:sz w:val="20"/>
+              </w:rPr>
               <w:t>Оптимизации</w:t>
             </w:r>
           </w:p>
         </w:tc>
         <w:tc>
           <w:tcPr>
-            <w:tcW w:type="dxa" w:w="3118"/>
-          </w:tcPr>
-          <w:p>
-            <w:r>
+            <w:tcW w:type="dxa" w:w="3920"/>
+            <w:vAlign w:val="top"/>
+            <w:tcMar>
+              <w:top w:w="80" w:type="dxa"/>
+              <w:start w:w="100" w:type="dxa"/>
+              <w:bottom w:w="80" w:type="dxa"/>
+              <w:end w:w="100" w:type="dxa"/>
+            </w:tcMar>
+          </w:tcPr>
+          <w:p>
+            <w:pPr>
+              <w:spacing w:before="0" w:after="40" w:line="240" w:lineRule="auto"/>
+            </w:pPr>
+            <w:r>
+              <w:rPr>
+                <w:rFonts w:ascii="Times New Roman" w:hAnsi="Times New Roman" w:eastAsia="Times New Roman"/>
+                <w:sz w:val="20"/>
+              </w:rPr>
               <w:t>go test ./...</w:t>
               <w:br/>
               <w:t>Result: PASS; log: docs/labs/pr12/ds/evidence/HIT-47-workspace-smoke.log</w:t>
@@ -1642,10 +2712,24 @@
         </w:tc>
         <w:tc>
           <w:tcPr>
-            <w:tcW w:type="dxa" w:w="3118"/>
-          </w:tcPr>
-          <w:p>
-            <w:r>
+            <w:tcW w:type="dxa" w:w="3430"/>
+            <w:vAlign w:val="top"/>
+            <w:tcMar>
+              <w:top w:w="80" w:type="dxa"/>
+              <w:start w:w="100" w:type="dxa"/>
+              <w:bottom w:w="80" w:type="dxa"/>
+              <w:end w:w="100" w:type="dxa"/>
+            </w:tcMar>
+          </w:tcPr>
+          <w:p>
+            <w:pPr>
+              <w:spacing w:before="0" w:after="40" w:line="240" w:lineRule="auto"/>
+            </w:pPr>
+            <w:r>
+              <w:rPr>
+                <w:rFonts w:ascii="Times New Roman" w:hAnsi="Times New Roman" w:eastAsia="Times New Roman"/>
+                <w:sz w:val="20"/>
+              </w:rPr>
               <w:t>go test ./...</w:t>
               <w:br/>
               <w:t>Result: PASS; log: docs/labs/pr12/ds/evidence/HIT-47-workspace-smoke.log</w:t>
@@ -1656,20 +2740,48 @@
       <w:tr>
         <w:tc>
           <w:tcPr>
-            <w:tcW w:type="dxa" w:w="3118"/>
-          </w:tcPr>
-          <w:p>
-            <w:r>
+            <w:tcW w:type="dxa" w:w="2450"/>
+            <w:vAlign w:val="top"/>
+            <w:tcMar>
+              <w:top w:w="80" w:type="dxa"/>
+              <w:start w:w="100" w:type="dxa"/>
+              <w:bottom w:w="80" w:type="dxa"/>
+              <w:end w:w="100" w:type="dxa"/>
+            </w:tcMar>
+          </w:tcPr>
+          <w:p>
+            <w:pPr>
+              <w:spacing w:before="0" w:after="40" w:line="240" w:lineRule="auto"/>
+            </w:pPr>
+            <w:r>
+              <w:rPr>
+                <w:rFonts w:ascii="Times New Roman" w:hAnsi="Times New Roman" w:eastAsia="Times New Roman"/>
+                <w:sz w:val="20"/>
+              </w:rPr>
               <w:t>Отладочная информация и диагностика</w:t>
             </w:r>
           </w:p>
         </w:tc>
         <w:tc>
           <w:tcPr>
-            <w:tcW w:type="dxa" w:w="3118"/>
-          </w:tcPr>
-          <w:p>
-            <w:r>
+            <w:tcW w:type="dxa" w:w="3920"/>
+            <w:vAlign w:val="top"/>
+            <w:tcMar>
+              <w:top w:w="80" w:type="dxa"/>
+              <w:start w:w="100" w:type="dxa"/>
+              <w:bottom w:w="80" w:type="dxa"/>
+              <w:end w:w="100" w:type="dxa"/>
+            </w:tcMar>
+          </w:tcPr>
+          <w:p>
+            <w:pPr>
+              <w:spacing w:before="0" w:after="40" w:line="240" w:lineRule="auto"/>
+            </w:pPr>
+            <w:r>
+              <w:rPr>
+                <w:rFonts w:ascii="Times New Roman" w:hAnsi="Times New Roman" w:eastAsia="Times New Roman"/>
+                <w:sz w:val="20"/>
+              </w:rPr>
               <w:t>go build -gcflags "all=-N -l" ...</w:t>
               <w:br/>
               <w:t>Result: PASS; log: docs/labs/pr12/ds/evidence/HIT-47-workspace-smoke.log</w:t>
@@ -1678,10 +2790,24 @@
         </w:tc>
         <w:tc>
           <w:tcPr>
-            <w:tcW w:type="dxa" w:w="3118"/>
-          </w:tcPr>
-          <w:p>
-            <w:r>
+            <w:tcW w:type="dxa" w:w="3430"/>
+            <w:vAlign w:val="top"/>
+            <w:tcMar>
+              <w:top w:w="80" w:type="dxa"/>
+              <w:start w:w="100" w:type="dxa"/>
+              <w:bottom w:w="80" w:type="dxa"/>
+              <w:end w:w="100" w:type="dxa"/>
+            </w:tcMar>
+          </w:tcPr>
+          <w:p>
+            <w:pPr>
+              <w:spacing w:before="0" w:after="40" w:line="240" w:lineRule="auto"/>
+            </w:pPr>
+            <w:r>
+              <w:rPr>
+                <w:rFonts w:ascii="Times New Roman" w:hAnsi="Times New Roman" w:eastAsia="Times New Roman"/>
+                <w:sz w:val="20"/>
+              </w:rPr>
               <w:t>go build -trimpath ...</w:t>
               <w:br/>
               <w:t>Result: PASS; log: docs/labs/pr12/ds/evidence/HIT-47-workspace-smoke.log</w:t>
@@ -1692,20 +2818,48 @@
       <w:tr>
         <w:tc>
           <w:tcPr>
-            <w:tcW w:type="dxa" w:w="3118"/>
-          </w:tcPr>
-          <w:p>
-            <w:r>
+            <w:tcW w:type="dxa" w:w="2450"/>
+            <w:vAlign w:val="top"/>
+            <w:tcMar>
+              <w:top w:w="80" w:type="dxa"/>
+              <w:start w:w="100" w:type="dxa"/>
+              <w:bottom w:w="80" w:type="dxa"/>
+              <w:end w:w="100" w:type="dxa"/>
+            </w:tcMar>
+          </w:tcPr>
+          <w:p>
+            <w:pPr>
+              <w:spacing w:before="0" w:after="40" w:line="240" w:lineRule="auto"/>
+            </w:pPr>
+            <w:r>
+              <w:rPr>
+                <w:rFonts w:ascii="Times New Roman" w:hAnsi="Times New Roman" w:eastAsia="Times New Roman"/>
+                <w:sz w:val="20"/>
+              </w:rPr>
               <w:t>Проверки времени выполнения</w:t>
             </w:r>
           </w:p>
         </w:tc>
         <w:tc>
           <w:tcPr>
-            <w:tcW w:type="dxa" w:w="3118"/>
-          </w:tcPr>
-          <w:p>
-            <w:r>
+            <w:tcW w:type="dxa" w:w="3920"/>
+            <w:vAlign w:val="top"/>
+            <w:tcMar>
+              <w:top w:w="80" w:type="dxa"/>
+              <w:start w:w="100" w:type="dxa"/>
+              <w:bottom w:w="80" w:type="dxa"/>
+              <w:end w:w="100" w:type="dxa"/>
+            </w:tcMar>
+          </w:tcPr>
+          <w:p>
+            <w:pPr>
+              <w:spacing w:before="0" w:after="40" w:line="240" w:lineRule="auto"/>
+            </w:pPr>
+            <w:r>
+              <w:rPr>
+                <w:rFonts w:ascii="Times New Roman" w:hAnsi="Times New Roman" w:eastAsia="Times New Roman"/>
+                <w:sz w:val="20"/>
+              </w:rPr>
               <w:t>delivery-contractcheck --config default --fixture testdata/match.json --format json</w:t>
               <w:br/>
               <w:t>Result: PASS; log: docs/labs/pr12/ds/evidence/HIT-47-workspace-smoke.log</w:t>
@@ -1714,10 +2868,24 @@
         </w:tc>
         <w:tc>
           <w:tcPr>
-            <w:tcW w:type="dxa" w:w="3118"/>
-          </w:tcPr>
-          <w:p>
-            <w:r>
+            <w:tcW w:type="dxa" w:w="3430"/>
+            <w:vAlign w:val="top"/>
+            <w:tcMar>
+              <w:top w:w="80" w:type="dxa"/>
+              <w:start w:w="100" w:type="dxa"/>
+              <w:bottom w:w="80" w:type="dxa"/>
+              <w:end w:w="100" w:type="dxa"/>
+            </w:tcMar>
+          </w:tcPr>
+          <w:p>
+            <w:pPr>
+              <w:spacing w:before="0" w:after="40" w:line="240" w:lineRule="auto"/>
+            </w:pPr>
+            <w:r>
+              <w:rPr>
+                <w:rFonts w:ascii="Times New Roman" w:hAnsi="Times New Roman" w:eastAsia="Times New Roman"/>
+                <w:sz w:val="20"/>
+              </w:rPr>
               <w:t>delivery-contractcheck --config default --fixture testdata/match.json --format json</w:t>
               <w:br/>
               <w:t>Result: PASS; log: docs/labs/pr12/ds/evidence/HIT-47-workspace-smoke.log</w:t>
@@ -1728,20 +2896,48 @@
       <w:tr>
         <w:tc>
           <w:tcPr>
-            <w:tcW w:type="dxa" w:w="3118"/>
-          </w:tcPr>
-          <w:p>
-            <w:r>
+            <w:tcW w:type="dxa" w:w="2450"/>
+            <w:vAlign w:val="top"/>
+            <w:tcMar>
+              <w:top w:w="80" w:type="dxa"/>
+              <w:start w:w="100" w:type="dxa"/>
+              <w:bottom w:w="80" w:type="dxa"/>
+              <w:end w:w="100" w:type="dxa"/>
+            </w:tcMar>
+          </w:tcPr>
+          <w:p>
+            <w:pPr>
+              <w:spacing w:before="0" w:after="40" w:line="240" w:lineRule="auto"/>
+            </w:pPr>
+            <w:r>
+              <w:rPr>
+                <w:rFonts w:ascii="Times New Roman" w:hAnsi="Times New Roman" w:eastAsia="Times New Roman"/>
+                <w:sz w:val="20"/>
+              </w:rPr>
               <w:t>Состав результата</w:t>
             </w:r>
           </w:p>
         </w:tc>
         <w:tc>
           <w:tcPr>
-            <w:tcW w:type="dxa" w:w="3118"/>
-          </w:tcPr>
-          <w:p>
-            <w:r>
+            <w:tcW w:type="dxa" w:w="3920"/>
+            <w:vAlign w:val="top"/>
+            <w:tcMar>
+              <w:top w:w="80" w:type="dxa"/>
+              <w:start w:w="100" w:type="dxa"/>
+              <w:bottom w:w="80" w:type="dxa"/>
+              <w:end w:w="100" w:type="dxa"/>
+            </w:tcMar>
+          </w:tcPr>
+          <w:p>
+            <w:pPr>
+              <w:spacing w:before="0" w:after="40" w:line="240" w:lineRule="auto"/>
+            </w:pPr>
+            <w:r>
+              <w:rPr>
+                <w:rFonts w:ascii="Times New Roman" w:hAnsi="Times New Roman" w:eastAsia="Times New Roman"/>
+                <w:sz w:val="20"/>
+              </w:rPr>
               <w:t>dev binary contains debug symbols; diagnostic JSON PASS</w:t>
               <w:br/>
               <w:t>Result: PASS; log: docs/labs/pr12/ds/evidence/HIT-47-workspace-smoke.log</w:t>
@@ -1750,10 +2946,24 @@
         </w:tc>
         <w:tc>
           <w:tcPr>
-            <w:tcW w:type="dxa" w:w="3118"/>
-          </w:tcPr>
-          <w:p>
-            <w:r>
+            <w:tcW w:type="dxa" w:w="3430"/>
+            <w:vAlign w:val="top"/>
+            <w:tcMar>
+              <w:top w:w="80" w:type="dxa"/>
+              <w:start w:w="100" w:type="dxa"/>
+              <w:bottom w:w="80" w:type="dxa"/>
+              <w:end w:w="100" w:type="dxa"/>
+            </w:tcMar>
+          </w:tcPr>
+          <w:p>
+            <w:pPr>
+              <w:spacing w:before="0" w:after="40" w:line="240" w:lineRule="auto"/>
+            </w:pPr>
+            <w:r>
+              <w:rPr>
+                <w:rFonts w:ascii="Times New Roman" w:hAnsi="Times New Roman" w:eastAsia="Times New Roman"/>
+                <w:sz w:val="20"/>
+              </w:rPr>
               <w:t>release binary runs from temporary outside-checkout directory; diagnostic JSON PASS</w:t>
               <w:br/>
               <w:t>Result: PASS; log: docs/labs/pr12/ds/evidence/HIT-47-workspace-smoke.log</w:t>
@@ -1769,9 +2979,17 @@
     </w:p>
     <w:tbl>
       <w:tblPr>
-        <w:tblW w:type="dxa" w:w="9000"/>
-        <w:tblLayout w:type="autofit"/>
+        <w:tblW w:type="pct" w:w="10000"/>
+        <w:tblLayout w:type="fixed"/>
         <w:tblLook w:firstColumn="1" w:firstRow="1" w:lastColumn="0" w:lastRow="0" w:noHBand="0" w:noVBand="1" w:val="04A0"/>
+        <w:tblBorders>
+          <w:top w:val="single" w:sz="4" w:space="0" w:color="B7C3D0"/>
+          <w:left w:val="single" w:sz="4" w:space="0" w:color="B7C3D0"/>
+          <w:bottom w:val="single" w:sz="4" w:space="0" w:color="B7C3D0"/>
+          <w:right w:val="single" w:sz="4" w:space="0" w:color="B7C3D0"/>
+          <w:insideH w:val="single" w:sz="4" w:space="0" w:color="B7C3D0"/>
+          <w:insideV w:val="single" w:sz="4" w:space="0" w:color="B7C3D0"/>
+        </w:tblBorders>
       </w:tblPr>
       <w:tblGrid>
         <w:gridCol w:w="9355"/>
@@ -1782,21 +3000,22 @@
             <w:tcW w:type="dxa" w:w="9355"/>
             <w:shd w:fill="EDEDED" w:val="clear"/>
             <w:tcMar>
-              <w:top w:w="160" w:type="dxa"/>
-              <w:start w:w="180" w:type="dxa"/>
-              <w:bottom w:w="160" w:type="dxa"/>
-              <w:end w:w="180" w:type="dxa"/>
-            </w:tcMar>
-          </w:tcPr>
-          <w:p>
-            <w:pPr>
-              <w:spacing w:before="40" w:after="40"/>
+              <w:top w:w="140" w:type="dxa"/>
+              <w:start w:w="160" w:type="dxa"/>
+              <w:bottom w:w="140" w:type="dxa"/>
+              <w:end w:w="160" w:type="dxa"/>
+            </w:tcMar>
+            <w:vAlign w:val="center"/>
+          </w:tcPr>
+          <w:p>
+            <w:pPr>
+              <w:spacing w:before="40" w:after="0"/>
               <w:jc w:val="center"/>
             </w:pPr>
             <w:r>
               <w:rPr>
                 <w:rFonts w:ascii="Times New Roman" w:hAnsi="Times New Roman" w:eastAsia="Times New Roman"/>
-                <w:sz w:val="24"/>
+                <w:sz w:val="22"/>
               </w:rPr>
               <w:t>[МЕСТО ДЛЯ СКРИНШОТА 3 — Запуск поставки вне исходного кода и IDE]</w:t>
             </w:r>
@@ -1836,8 +3055,17 @@
     <w:tbl>
       <w:tblPr>
         <w:tblStyle w:val="af4"/>
-        <w:tblW w:type="auto" w:w="0"/>
+        <w:tblW w:type="pct" w:w="10000"/>
         <w:tblLook w:firstColumn="1" w:firstRow="1" w:lastColumn="0" w:lastRow="0" w:noHBand="0" w:noVBand="1" w:val="04A0"/>
+        <w:tblLayout w:type="fixed"/>
+        <w:tblBorders>
+          <w:top w:val="single" w:sz="4" w:space="0" w:color="B7C3D0"/>
+          <w:left w:val="single" w:sz="4" w:space="0" w:color="B7C3D0"/>
+          <w:bottom w:val="single" w:sz="4" w:space="0" w:color="B7C3D0"/>
+          <w:right w:val="single" w:sz="4" w:space="0" w:color="B7C3D0"/>
+          <w:insideH w:val="single" w:sz="4" w:space="0" w:color="B7C3D0"/>
+          <w:insideV w:val="single" w:sz="4" w:space="0" w:color="B7C3D0"/>
+        </w:tblBorders>
       </w:tblPr>
       <w:tblGrid>
         <w:gridCol w:w="2339"/>
@@ -1851,40 +3079,108 @@
         </w:trPr>
         <w:tc>
           <w:tcPr>
-            <w:tcW w:type="dxa" w:w="2339"/>
-          </w:tcPr>
-          <w:p>
-            <w:r>
+            <w:tcW w:type="dxa" w:w="2156"/>
+            <w:vAlign w:val="top"/>
+            <w:tcMar>
+              <w:top w:w="80" w:type="dxa"/>
+              <w:start w:w="100" w:type="dxa"/>
+              <w:bottom w:w="80" w:type="dxa"/>
+              <w:end w:w="100" w:type="dxa"/>
+            </w:tcMar>
+            <w:shd w:fill="D9EAF7" w:val="clear"/>
+          </w:tcPr>
+          <w:p>
+            <w:pPr>
+              <w:spacing w:before="0" w:after="40" w:line="240" w:lineRule="auto"/>
+              <w:jc w:val="center"/>
+            </w:pPr>
+            <w:r>
+              <w:rPr>
+                <w:rFonts w:ascii="Times New Roman" w:hAnsi="Times New Roman" w:eastAsia="Times New Roman"/>
+                <w:b/>
+                <w:sz w:val="20"/>
+              </w:rPr>
               <w:t>Проверка</w:t>
             </w:r>
           </w:p>
         </w:tc>
         <w:tc>
           <w:tcPr>
-            <w:tcW w:type="dxa" w:w="2339"/>
-          </w:tcPr>
-          <w:p>
-            <w:r>
+            <w:tcW w:type="dxa" w:w="2254"/>
+            <w:vAlign w:val="top"/>
+            <w:tcMar>
+              <w:top w:w="80" w:type="dxa"/>
+              <w:start w:w="100" w:type="dxa"/>
+              <w:bottom w:w="80" w:type="dxa"/>
+              <w:end w:w="100" w:type="dxa"/>
+            </w:tcMar>
+            <w:shd w:fill="D9EAF7" w:val="clear"/>
+          </w:tcPr>
+          <w:p>
+            <w:pPr>
+              <w:spacing w:before="0" w:after="40" w:line="240" w:lineRule="auto"/>
+              <w:jc w:val="center"/>
+            </w:pPr>
+            <w:r>
+              <w:rPr>
+                <w:rFonts w:ascii="Times New Roman" w:hAnsi="Times New Roman" w:eastAsia="Times New Roman"/>
+                <w:b/>
+                <w:sz w:val="20"/>
+              </w:rPr>
               <w:t>Ожидаемый результат</w:t>
             </w:r>
           </w:p>
         </w:tc>
         <w:tc>
           <w:tcPr>
-            <w:tcW w:type="dxa" w:w="2339"/>
-          </w:tcPr>
-          <w:p>
-            <w:r>
+            <w:tcW w:type="dxa" w:w="3234"/>
+            <w:vAlign w:val="top"/>
+            <w:tcMar>
+              <w:top w:w="80" w:type="dxa"/>
+              <w:start w:w="100" w:type="dxa"/>
+              <w:bottom w:w="80" w:type="dxa"/>
+              <w:end w:w="100" w:type="dxa"/>
+            </w:tcMar>
+            <w:shd w:fill="D9EAF7" w:val="clear"/>
+          </w:tcPr>
+          <w:p>
+            <w:pPr>
+              <w:spacing w:before="0" w:after="40" w:line="240" w:lineRule="auto"/>
+              <w:jc w:val="center"/>
+            </w:pPr>
+            <w:r>
+              <w:rPr>
+                <w:rFonts w:ascii="Times New Roman" w:hAnsi="Times New Roman" w:eastAsia="Times New Roman"/>
+                <w:b/>
+                <w:sz w:val="20"/>
+              </w:rPr>
               <w:t>Фактический результат/статус</w:t>
             </w:r>
           </w:p>
         </w:tc>
         <w:tc>
           <w:tcPr>
-            <w:tcW w:type="dxa" w:w="2339"/>
-          </w:tcPr>
-          <w:p>
-            <w:r>
+            <w:tcW w:type="dxa" w:w="2156"/>
+            <w:vAlign w:val="top"/>
+            <w:tcMar>
+              <w:top w:w="80" w:type="dxa"/>
+              <w:start w:w="100" w:type="dxa"/>
+              <w:bottom w:w="80" w:type="dxa"/>
+              <w:end w:w="100" w:type="dxa"/>
+            </w:tcMar>
+            <w:shd w:fill="D9EAF7" w:val="clear"/>
+          </w:tcPr>
+          <w:p>
+            <w:pPr>
+              <w:spacing w:before="0" w:after="40" w:line="240" w:lineRule="auto"/>
+              <w:jc w:val="center"/>
+            </w:pPr>
+            <w:r>
+              <w:rPr>
+                <w:rFonts w:ascii="Times New Roman" w:hAnsi="Times New Roman" w:eastAsia="Times New Roman"/>
+                <w:b/>
+                <w:sz w:val="20"/>
+              </w:rPr>
               <w:t>Команда, версия и журнал</w:t>
             </w:r>
           </w:p>
@@ -1893,40 +3189,96 @@
       <w:tr>
         <w:tc>
           <w:tcPr>
-            <w:tcW w:type="dxa" w:w="2339"/>
-          </w:tcPr>
-          <w:p>
-            <w:r>
+            <w:tcW w:type="dxa" w:w="2156"/>
+            <w:vAlign w:val="top"/>
+            <w:tcMar>
+              <w:top w:w="80" w:type="dxa"/>
+              <w:start w:w="100" w:type="dxa"/>
+              <w:bottom w:w="80" w:type="dxa"/>
+              <w:end w:w="100" w:type="dxa"/>
+            </w:tcMar>
+          </w:tcPr>
+          <w:p>
+            <w:pPr>
+              <w:spacing w:before="0" w:after="40" w:line="240" w:lineRule="auto"/>
+            </w:pPr>
+            <w:r>
+              <w:rPr>
+                <w:rFonts w:ascii="Times New Roman" w:hAnsi="Times New Roman" w:eastAsia="Times New Roman"/>
+                <w:sz w:val="20"/>
+              </w:rPr>
               <w:t>default config</w:t>
             </w:r>
           </w:p>
         </w:tc>
         <w:tc>
           <w:tcPr>
-            <w:tcW w:type="dxa" w:w="2339"/>
-          </w:tcPr>
-          <w:p>
-            <w:r>
+            <w:tcW w:type="dxa" w:w="2254"/>
+            <w:vAlign w:val="top"/>
+            <w:tcMar>
+              <w:top w:w="80" w:type="dxa"/>
+              <w:start w:w="100" w:type="dxa"/>
+              <w:bottom w:w="80" w:type="dxa"/>
+              <w:end w:w="100" w:type="dxa"/>
+            </w:tcMar>
+          </w:tcPr>
+          <w:p>
+            <w:pPr>
+              <w:spacing w:before="0" w:after="40" w:line="240" w:lineRule="auto"/>
+            </w:pPr>
+            <w:r>
+              <w:rPr>
+                <w:rFonts w:ascii="Times New Roman" w:hAnsi="Times New Roman" w:eastAsia="Times New Roman"/>
+                <w:sz w:val="20"/>
+              </w:rPr>
               <w:t>go test ./...; smoke --require</w:t>
             </w:r>
           </w:p>
         </w:tc>
         <w:tc>
           <w:tcPr>
-            <w:tcW w:type="dxa" w:w="2339"/>
-          </w:tcPr>
-          <w:p>
-            <w:r>
+            <w:tcW w:type="dxa" w:w="3234"/>
+            <w:vAlign w:val="top"/>
+            <w:tcMar>
+              <w:top w:w="80" w:type="dxa"/>
+              <w:start w:w="100" w:type="dxa"/>
+              <w:bottom w:w="80" w:type="dxa"/>
+              <w:end w:w="100" w:type="dxa"/>
+            </w:tcMar>
+          </w:tcPr>
+          <w:p>
+            <w:pPr>
+              <w:spacing w:before="0" w:after="40" w:line="240" w:lineRule="auto"/>
+            </w:pPr>
+            <w:r>
+              <w:rPr>
+                <w:rFonts w:ascii="Times New Roman" w:hAnsi="Times New Roman" w:eastAsia="Times New Roman"/>
+                <w:sz w:val="20"/>
+              </w:rPr>
               <w:t>PASS</w:t>
             </w:r>
           </w:p>
         </w:tc>
         <w:tc>
           <w:tcPr>
-            <w:tcW w:type="dxa" w:w="2339"/>
-          </w:tcPr>
-          <w:p>
-            <w:r>
+            <w:tcW w:type="dxa" w:w="2156"/>
+            <w:vAlign w:val="top"/>
+            <w:tcMar>
+              <w:top w:w="80" w:type="dxa"/>
+              <w:start w:w="100" w:type="dxa"/>
+              <w:bottom w:w="80" w:type="dxa"/>
+              <w:end w:w="100" w:type="dxa"/>
+            </w:tcMar>
+          </w:tcPr>
+          <w:p>
+            <w:pPr>
+              <w:spacing w:before="0" w:after="40" w:line="240" w:lineRule="auto"/>
+            </w:pPr>
+            <w:r>
+              <w:rPr>
+                <w:rFonts w:ascii="Times New Roman" w:hAnsi="Times New Roman" w:eastAsia="Times New Roman"/>
+                <w:sz w:val="20"/>
+              </w:rPr>
               <w:t>HIT-47-go-test.log / workspace smoke</w:t>
             </w:r>
           </w:p>
@@ -1935,40 +3287,96 @@
       <w:tr>
         <w:tc>
           <w:tcPr>
-            <w:tcW w:type="dxa" w:w="2339"/>
-          </w:tcPr>
-          <w:p>
-            <w:r>
+            <w:tcW w:type="dxa" w:w="2156"/>
+            <w:vAlign w:val="top"/>
+            <w:tcMar>
+              <w:top w:w="80" w:type="dxa"/>
+              <w:start w:w="100" w:type="dxa"/>
+              <w:bottom w:w="80" w:type="dxa"/>
+              <w:end w:w="100" w:type="dxa"/>
+            </w:tcMar>
+          </w:tcPr>
+          <w:p>
+            <w:pPr>
+              <w:spacing w:before="0" w:after="40" w:line="240" w:lineRule="auto"/>
+            </w:pPr>
+            <w:r>
+              <w:rPr>
+                <w:rFonts w:ascii="Times New Roman" w:hAnsi="Times New Roman" w:eastAsia="Times New Roman"/>
+                <w:sz w:val="20"/>
+              </w:rPr>
               <w:t>unsupported config</w:t>
             </w:r>
           </w:p>
         </w:tc>
         <w:tc>
           <w:tcPr>
-            <w:tcW w:type="dxa" w:w="2339"/>
-          </w:tcPr>
-          <w:p>
-            <w:r>
+            <w:tcW w:type="dxa" w:w="2254"/>
+            <w:vAlign w:val="top"/>
+            <w:tcMar>
+              <w:top w:w="80" w:type="dxa"/>
+              <w:start w:w="100" w:type="dxa"/>
+              <w:bottom w:w="80" w:type="dxa"/>
+              <w:end w:w="100" w:type="dxa"/>
+            </w:tcMar>
+          </w:tcPr>
+          <w:p>
+            <w:pPr>
+              <w:spacing w:before="0" w:after="40" w:line="240" w:lineRule="auto"/>
+            </w:pPr>
+            <w:r>
+              <w:rPr>
+                <w:rFonts w:ascii="Times New Roman" w:hAnsi="Times New Roman" w:eastAsia="Times New Roman"/>
+                <w:sz w:val="20"/>
+              </w:rPr>
               <w:t>delivery-contractcheck --config unsupported ...</w:t>
             </w:r>
           </w:p>
         </w:tc>
         <w:tc>
           <w:tcPr>
-            <w:tcW w:type="dxa" w:w="2339"/>
-          </w:tcPr>
-          <w:p>
-            <w:r>
+            <w:tcW w:type="dxa" w:w="3234"/>
+            <w:vAlign w:val="top"/>
+            <w:tcMar>
+              <w:top w:w="80" w:type="dxa"/>
+              <w:start w:w="100" w:type="dxa"/>
+              <w:bottom w:w="80" w:type="dxa"/>
+              <w:end w:w="100" w:type="dxa"/>
+            </w:tcMar>
+          </w:tcPr>
+          <w:p>
+            <w:pPr>
+              <w:spacing w:before="0" w:after="40" w:line="240" w:lineRule="auto"/>
+            </w:pPr>
+            <w:r>
+              <w:rPr>
+                <w:rFonts w:ascii="Times New Roman" w:hAnsi="Times New Roman" w:eastAsia="Times New Roman"/>
+                <w:sz w:val="20"/>
+              </w:rPr>
               <w:t>PASS negative gate: exit 2</w:t>
             </w:r>
           </w:p>
         </w:tc>
         <w:tc>
           <w:tcPr>
-            <w:tcW w:type="dxa" w:w="2339"/>
-          </w:tcPr>
-          <w:p>
-            <w:r>
+            <w:tcW w:type="dxa" w:w="2156"/>
+            <w:vAlign w:val="top"/>
+            <w:tcMar>
+              <w:top w:w="80" w:type="dxa"/>
+              <w:start w:w="100" w:type="dxa"/>
+              <w:bottom w:w="80" w:type="dxa"/>
+              <w:end w:w="100" w:type="dxa"/>
+            </w:tcMar>
+          </w:tcPr>
+          <w:p>
+            <w:pPr>
+              <w:spacing w:before="0" w:after="40" w:line="240" w:lineRule="auto"/>
+            </w:pPr>
+            <w:r>
+              <w:rPr>
+                <w:rFonts w:ascii="Times New Roman" w:hAnsi="Times New Roman" w:eastAsia="Times New Roman"/>
+                <w:sz w:val="20"/>
+              </w:rPr>
               <w:t>negative-gate log</w:t>
             </w:r>
           </w:p>
@@ -1977,40 +3385,96 @@
       <w:tr>
         <w:tc>
           <w:tcPr>
-            <w:tcW w:type="dxa" w:w="2339"/>
-          </w:tcPr>
-          <w:p>
-            <w:r>
+            <w:tcW w:type="dxa" w:w="2156"/>
+            <w:vAlign w:val="top"/>
+            <w:tcMar>
+              <w:top w:w="80" w:type="dxa"/>
+              <w:start w:w="100" w:type="dxa"/>
+              <w:bottom w:w="80" w:type="dxa"/>
+              <w:end w:w="100" w:type="dxa"/>
+            </w:tcMar>
+          </w:tcPr>
+          <w:p>
+            <w:pPr>
+              <w:spacing w:before="0" w:after="40" w:line="240" w:lineRule="auto"/>
+            </w:pPr>
+            <w:r>
+              <w:rPr>
+                <w:rFonts w:ascii="Times New Roman" w:hAnsi="Times New Roman" w:eastAsia="Times New Roman"/>
+                <w:sz w:val="20"/>
+              </w:rPr>
               <w:t>version/source</w:t>
             </w:r>
           </w:p>
         </w:tc>
         <w:tc>
           <w:tcPr>
-            <w:tcW w:type="dxa" w:w="2339"/>
-          </w:tcPr>
-          <w:p>
-            <w:r>
+            <w:tcW w:type="dxa" w:w="2254"/>
+            <w:vAlign w:val="top"/>
+            <w:tcMar>
+              <w:top w:w="80" w:type="dxa"/>
+              <w:start w:w="100" w:type="dxa"/>
+              <w:bottom w:w="80" w:type="dxa"/>
+              <w:end w:w="100" w:type="dxa"/>
+            </w:tcMar>
+          </w:tcPr>
+          <w:p>
+            <w:pPr>
+              <w:spacing w:before="0" w:after="40" w:line="240" w:lineRule="auto"/>
+            </w:pPr>
+            <w:r>
+              <w:rPr>
+                <w:rFonts w:ascii="Times New Roman" w:hAnsi="Times New Roman" w:eastAsia="Times New Roman"/>
+                <w:sz w:val="20"/>
+              </w:rPr>
               <w:t>delivery-contractcheck --version</w:t>
             </w:r>
           </w:p>
         </w:tc>
         <w:tc>
           <w:tcPr>
-            <w:tcW w:type="dxa" w:w="2339"/>
-          </w:tcPr>
-          <w:p>
-            <w:r>
+            <w:tcW w:type="dxa" w:w="3234"/>
+            <w:vAlign w:val="top"/>
+            <w:tcMar>
+              <w:top w:w="80" w:type="dxa"/>
+              <w:start w:w="100" w:type="dxa"/>
+              <w:bottom w:w="80" w:type="dxa"/>
+              <w:end w:w="100" w:type="dxa"/>
+            </w:tcMar>
+          </w:tcPr>
+          <w:p>
+            <w:pPr>
+              <w:spacing w:before="0" w:after="40" w:line="240" w:lineRule="auto"/>
+            </w:pPr>
+            <w:r>
+              <w:rPr>
+                <w:rFonts w:ascii="Times New Roman" w:hAnsi="Times New Roman" w:eastAsia="Times New Roman"/>
+                <w:sz w:val="20"/>
+              </w:rPr>
               <w:t>PASS; version pr12 and source SHA visible</w:t>
             </w:r>
           </w:p>
         </w:tc>
         <w:tc>
           <w:tcPr>
-            <w:tcW w:type="dxa" w:w="2339"/>
-          </w:tcPr>
-          <w:p>
-            <w:r>
+            <w:tcW w:type="dxa" w:w="2156"/>
+            <w:vAlign w:val="top"/>
+            <w:tcMar>
+              <w:top w:w="80" w:type="dxa"/>
+              <w:start w:w="100" w:type="dxa"/>
+              <w:bottom w:w="80" w:type="dxa"/>
+              <w:end w:w="100" w:type="dxa"/>
+            </w:tcMar>
+          </w:tcPr>
+          <w:p>
+            <w:pPr>
+              <w:spacing w:before="0" w:after="40" w:line="240" w:lineRule="auto"/>
+            </w:pPr>
+            <w:r>
+              <w:rPr>
+                <w:rFonts w:ascii="Times New Roman" w:hAnsi="Times New Roman" w:eastAsia="Times New Roman"/>
+                <w:sz w:val="20"/>
+              </w:rPr>
               <w:t>workspace smoke log</w:t>
             </w:r>
           </w:p>
@@ -2019,40 +3483,96 @@
       <w:tr>
         <w:tc>
           <w:tcPr>
-            <w:tcW w:type="dxa" w:w="2339"/>
-          </w:tcPr>
-          <w:p>
-            <w:r>
+            <w:tcW w:type="dxa" w:w="2156"/>
+            <w:vAlign w:val="top"/>
+            <w:tcMar>
+              <w:top w:w="80" w:type="dxa"/>
+              <w:start w:w="100" w:type="dxa"/>
+              <w:bottom w:w="80" w:type="dxa"/>
+              <w:end w:w="100" w:type="dxa"/>
+            </w:tcMar>
+          </w:tcPr>
+          <w:p>
+            <w:pPr>
+              <w:spacing w:before="0" w:after="40" w:line="240" w:lineRule="auto"/>
+            </w:pPr>
+            <w:r>
+              <w:rPr>
+                <w:rFonts w:ascii="Times New Roman" w:hAnsi="Times New Roman" w:eastAsia="Times New Roman"/>
+                <w:sz w:val="20"/>
+              </w:rPr>
               <w:t>diagnostics</w:t>
             </w:r>
           </w:p>
         </w:tc>
         <w:tc>
           <w:tcPr>
-            <w:tcW w:type="dxa" w:w="2339"/>
-          </w:tcPr>
-          <w:p>
-            <w:r>
+            <w:tcW w:type="dxa" w:w="2254"/>
+            <w:vAlign w:val="top"/>
+            <w:tcMar>
+              <w:top w:w="80" w:type="dxa"/>
+              <w:start w:w="100" w:type="dxa"/>
+              <w:bottom w:w="80" w:type="dxa"/>
+              <w:end w:w="100" w:type="dxa"/>
+            </w:tcMar>
+          </w:tcPr>
+          <w:p>
+            <w:pPr>
+              <w:spacing w:before="0" w:after="40" w:line="240" w:lineRule="auto"/>
+            </w:pPr>
+            <w:r>
+              <w:rPr>
+                <w:rFonts w:ascii="Times New Roman" w:hAnsi="Times New Roman" w:eastAsia="Times New Roman"/>
+                <w:sz w:val="20"/>
+              </w:rPr>
               <w:t>delivery-contractcheck --fixture testdata/match.json --format json</w:t>
             </w:r>
           </w:p>
         </w:tc>
         <w:tc>
           <w:tcPr>
-            <w:tcW w:type="dxa" w:w="2339"/>
-          </w:tcPr>
-          <w:p>
-            <w:r>
+            <w:tcW w:type="dxa" w:w="3234"/>
+            <w:vAlign w:val="top"/>
+            <w:tcMar>
+              <w:top w:w="80" w:type="dxa"/>
+              <w:start w:w="100" w:type="dxa"/>
+              <w:bottom w:w="80" w:type="dxa"/>
+              <w:end w:w="100" w:type="dxa"/>
+            </w:tcMar>
+          </w:tcPr>
+          <w:p>
+            <w:pPr>
+              <w:spacing w:before="0" w:after="40" w:line="240" w:lineRule="auto"/>
+            </w:pPr>
+            <w:r>
+              <w:rPr>
+                <w:rFonts w:ascii="Times New Roman" w:hAnsi="Times New Roman" w:eastAsia="Times New Roman"/>
+                <w:sz w:val="20"/>
+              </w:rPr>
               <w:t>PASS; no secrets</w:t>
             </w:r>
           </w:p>
         </w:tc>
         <w:tc>
           <w:tcPr>
-            <w:tcW w:type="dxa" w:w="2339"/>
-          </w:tcPr>
-          <w:p>
-            <w:r>
+            <w:tcW w:type="dxa" w:w="2156"/>
+            <w:vAlign w:val="top"/>
+            <w:tcMar>
+              <w:top w:w="80" w:type="dxa"/>
+              <w:start w:w="100" w:type="dxa"/>
+              <w:bottom w:w="80" w:type="dxa"/>
+              <w:end w:w="100" w:type="dxa"/>
+            </w:tcMar>
+          </w:tcPr>
+          <w:p>
+            <w:pPr>
+              <w:spacing w:before="0" w:after="40" w:line="240" w:lineRule="auto"/>
+            </w:pPr>
+            <w:r>
+              <w:rPr>
+                <w:rFonts w:ascii="Times New Roman" w:hAnsi="Times New Roman" w:eastAsia="Times New Roman"/>
+                <w:sz w:val="20"/>
+              </w:rPr>
               <w:t>workspace smoke log</w:t>
             </w:r>
           </w:p>
@@ -2061,40 +3581,96 @@
       <w:tr>
         <w:tc>
           <w:tcPr>
-            <w:tcW w:type="dxa" w:w="2339"/>
-          </w:tcPr>
-          <w:p>
-            <w:r>
+            <w:tcW w:type="dxa" w:w="2156"/>
+            <w:vAlign w:val="top"/>
+            <w:tcMar>
+              <w:top w:w="80" w:type="dxa"/>
+              <w:start w:w="100" w:type="dxa"/>
+              <w:bottom w:w="80" w:type="dxa"/>
+              <w:end w:w="100" w:type="dxa"/>
+            </w:tcMar>
+          </w:tcPr>
+          <w:p>
+            <w:pPr>
+              <w:spacing w:before="0" w:after="40" w:line="240" w:lineRule="auto"/>
+            </w:pPr>
+            <w:r>
+              <w:rPr>
+                <w:rFonts w:ascii="Times New Roman" w:hAnsi="Times New Roman" w:eastAsia="Times New Roman"/>
+                <w:sz w:val="20"/>
+              </w:rPr>
               <w:t>restore</w:t>
             </w:r>
           </w:p>
         </w:tc>
         <w:tc>
           <w:tcPr>
-            <w:tcW w:type="dxa" w:w="2339"/>
-          </w:tcPr>
-          <w:p>
-            <w:r>
+            <w:tcW w:type="dxa" w:w="2254"/>
+            <w:vAlign w:val="top"/>
+            <w:tcMar>
+              <w:top w:w="80" w:type="dxa"/>
+              <w:start w:w="100" w:type="dxa"/>
+              <w:bottom w:w="80" w:type="dxa"/>
+              <w:end w:w="100" w:type="dxa"/>
+            </w:tcMar>
+          </w:tcPr>
+          <w:p>
+            <w:pPr>
+              <w:spacing w:before="0" w:after="40" w:line="240" w:lineRule="auto"/>
+            </w:pPr>
+            <w:r>
+              <w:rPr>
+                <w:rFonts w:ascii="Times New Roman" w:hAnsi="Times New Roman" w:eastAsia="Times New Roman"/>
+                <w:sz w:val="20"/>
+              </w:rPr>
               <w:t>rebuild after isolated negative mutation; go test ./...</w:t>
             </w:r>
           </w:p>
         </w:tc>
         <w:tc>
           <w:tcPr>
-            <w:tcW w:type="dxa" w:w="2339"/>
-          </w:tcPr>
-          <w:p>
-            <w:r>
+            <w:tcW w:type="dxa" w:w="3234"/>
+            <w:vAlign w:val="top"/>
+            <w:tcMar>
+              <w:top w:w="80" w:type="dxa"/>
+              <w:start w:w="100" w:type="dxa"/>
+              <w:bottom w:w="80" w:type="dxa"/>
+              <w:end w:w="100" w:type="dxa"/>
+            </w:tcMar>
+          </w:tcPr>
+          <w:p>
+            <w:pPr>
+              <w:spacing w:before="0" w:after="40" w:line="240" w:lineRule="auto"/>
+            </w:pPr>
+            <w:r>
+              <w:rPr>
+                <w:rFonts w:ascii="Times New Roman" w:hAnsi="Times New Roman" w:eastAsia="Times New Roman"/>
+                <w:sz w:val="20"/>
+              </w:rPr>
               <w:t>PASS; source restored</w:t>
             </w:r>
           </w:p>
         </w:tc>
         <w:tc>
           <w:tcPr>
-            <w:tcW w:type="dxa" w:w="2339"/>
-          </w:tcPr>
-          <w:p>
-            <w:r>
+            <w:tcW w:type="dxa" w:w="2156"/>
+            <w:vAlign w:val="top"/>
+            <w:tcMar>
+              <w:top w:w="80" w:type="dxa"/>
+              <w:start w:w="100" w:type="dxa"/>
+              <w:bottom w:w="80" w:type="dxa"/>
+              <w:end w:w="100" w:type="dxa"/>
+            </w:tcMar>
+          </w:tcPr>
+          <w:p>
+            <w:pPr>
+              <w:spacing w:before="0" w:after="40" w:line="240" w:lineRule="auto"/>
+            </w:pPr>
+            <w:r>
+              <w:rPr>
+                <w:rFonts w:ascii="Times New Roman" w:hAnsi="Times New Roman" w:eastAsia="Times New Roman"/>
+                <w:sz w:val="20"/>
+              </w:rPr>
               <w:t>restoration log</w:t>
             </w:r>
           </w:p>
@@ -2108,9 +3684,17 @@
     </w:p>
     <w:tbl>
       <w:tblPr>
-        <w:tblW w:type="dxa" w:w="9000"/>
-        <w:tblLayout w:type="autofit"/>
+        <w:tblW w:type="pct" w:w="10000"/>
+        <w:tblLayout w:type="fixed"/>
         <w:tblLook w:firstColumn="1" w:firstRow="1" w:lastColumn="0" w:lastRow="0" w:noHBand="0" w:noVBand="1" w:val="04A0"/>
+        <w:tblBorders>
+          <w:top w:val="single" w:sz="4" w:space="0" w:color="B7C3D0"/>
+          <w:left w:val="single" w:sz="4" w:space="0" w:color="B7C3D0"/>
+          <w:bottom w:val="single" w:sz="4" w:space="0" w:color="B7C3D0"/>
+          <w:right w:val="single" w:sz="4" w:space="0" w:color="B7C3D0"/>
+          <w:insideH w:val="single" w:sz="4" w:space="0" w:color="B7C3D0"/>
+          <w:insideV w:val="single" w:sz="4" w:space="0" w:color="B7C3D0"/>
+        </w:tblBorders>
       </w:tblPr>
       <w:tblGrid>
         <w:gridCol w:w="9355"/>
@@ -2121,21 +3705,22 @@
             <w:tcW w:type="dxa" w:w="9355"/>
             <w:shd w:fill="EDEDED" w:val="clear"/>
             <w:tcMar>
-              <w:top w:w="160" w:type="dxa"/>
-              <w:start w:w="180" w:type="dxa"/>
-              <w:bottom w:w="160" w:type="dxa"/>
-              <w:end w:w="180" w:type="dxa"/>
-            </w:tcMar>
-          </w:tcPr>
-          <w:p>
-            <w:pPr>
-              <w:spacing w:before="40" w:after="40"/>
+              <w:top w:w="140" w:type="dxa"/>
+              <w:start w:w="160" w:type="dxa"/>
+              <w:bottom w:w="140" w:type="dxa"/>
+              <w:end w:w="160" w:type="dxa"/>
+            </w:tcMar>
+            <w:vAlign w:val="center"/>
+          </w:tcPr>
+          <w:p>
+            <w:pPr>
+              <w:spacing w:before="40" w:after="0"/>
               <w:jc w:val="center"/>
             </w:pPr>
             <w:r>
               <w:rPr>
                 <w:rFonts w:ascii="Times New Roman" w:hAnsi="Times New Roman" w:eastAsia="Times New Roman"/>
-                <w:sz w:val="24"/>
+                <w:sz w:val="22"/>
               </w:rPr>
               <w:t>[МЕСТО ДЛЯ СКРИНШОТА 4 — Штатный запуск компонента]</w:t>
             </w:r>
@@ -2158,9 +3743,17 @@
     </w:p>
     <w:tbl>
       <w:tblPr>
-        <w:tblW w:type="dxa" w:w="9000"/>
-        <w:tblLayout w:type="autofit"/>
+        <w:tblW w:type="pct" w:w="10000"/>
+        <w:tblLayout w:type="fixed"/>
         <w:tblLook w:firstColumn="1" w:firstRow="1" w:lastColumn="0" w:lastRow="0" w:noHBand="0" w:noVBand="1" w:val="04A0"/>
+        <w:tblBorders>
+          <w:top w:val="single" w:sz="4" w:space="0" w:color="B7C3D0"/>
+          <w:left w:val="single" w:sz="4" w:space="0" w:color="B7C3D0"/>
+          <w:bottom w:val="single" w:sz="4" w:space="0" w:color="B7C3D0"/>
+          <w:right w:val="single" w:sz="4" w:space="0" w:color="B7C3D0"/>
+          <w:insideH w:val="single" w:sz="4" w:space="0" w:color="B7C3D0"/>
+          <w:insideV w:val="single" w:sz="4" w:space="0" w:color="B7C3D0"/>
+        </w:tblBorders>
       </w:tblPr>
       <w:tblGrid>
         <w:gridCol w:w="9355"/>
@@ -2171,21 +3764,22 @@
             <w:tcW w:type="dxa" w:w="9355"/>
             <w:shd w:fill="EDEDED" w:val="clear"/>
             <w:tcMar>
-              <w:top w:w="160" w:type="dxa"/>
-              <w:start w:w="180" w:type="dxa"/>
-              <w:bottom w:w="160" w:type="dxa"/>
-              <w:end w:w="180" w:type="dxa"/>
-            </w:tcMar>
-          </w:tcPr>
-          <w:p>
-            <w:pPr>
-              <w:spacing w:before="40" w:after="40"/>
+              <w:top w:w="140" w:type="dxa"/>
+              <w:start w:w="160" w:type="dxa"/>
+              <w:bottom w:w="140" w:type="dxa"/>
+              <w:end w:w="160" w:type="dxa"/>
+            </w:tcMar>
+            <w:vAlign w:val="center"/>
+          </w:tcPr>
+          <w:p>
+            <w:pPr>
+              <w:spacing w:before="40" w:after="0"/>
               <w:jc w:val="center"/>
             </w:pPr>
             <w:r>
               <w:rPr>
                 <w:rFonts w:ascii="Times New Roman" w:hAnsi="Times New Roman" w:eastAsia="Times New Roman"/>
-                <w:sz w:val="24"/>
+                <w:sz w:val="22"/>
               </w:rPr>
               <w:t>[МЕСТО ДЛЯ СКРИНШОТА 5 — Неверная конфигурация]</w:t>
             </w:r>
@@ -2221,9 +3815,17 @@
     </w:p>
     <w:tbl>
       <w:tblPr>
-        <w:tblW w:type="dxa" w:w="9000"/>
-        <w:tblLayout w:type="autofit"/>
+        <w:tblW w:type="pct" w:w="10000"/>
+        <w:tblLayout w:type="fixed"/>
         <w:tblLook w:firstColumn="1" w:firstRow="1" w:lastColumn="0" w:lastRow="0" w:noHBand="0" w:noVBand="1" w:val="04A0"/>
+        <w:tblBorders>
+          <w:top w:val="single" w:sz="4" w:space="0" w:color="B7C3D0"/>
+          <w:left w:val="single" w:sz="4" w:space="0" w:color="B7C3D0"/>
+          <w:bottom w:val="single" w:sz="4" w:space="0" w:color="B7C3D0"/>
+          <w:right w:val="single" w:sz="4" w:space="0" w:color="B7C3D0"/>
+          <w:insideH w:val="single" w:sz="4" w:space="0" w:color="B7C3D0"/>
+          <w:insideV w:val="single" w:sz="4" w:space="0" w:color="B7C3D0"/>
+        </w:tblBorders>
       </w:tblPr>
       <w:tblGrid>
         <w:gridCol w:w="9355"/>
@@ -2234,21 +3836,22 @@
             <w:tcW w:type="dxa" w:w="9355"/>
             <w:shd w:fill="EDEDED" w:val="clear"/>
             <w:tcMar>
-              <w:top w:w="160" w:type="dxa"/>
-              <w:start w:w="180" w:type="dxa"/>
-              <w:bottom w:w="160" w:type="dxa"/>
-              <w:end w:w="180" w:type="dxa"/>
-            </w:tcMar>
-          </w:tcPr>
-          <w:p>
-            <w:pPr>
-              <w:spacing w:before="40" w:after="40"/>
+              <w:top w:w="140" w:type="dxa"/>
+              <w:start w:w="160" w:type="dxa"/>
+              <w:bottom w:w="140" w:type="dxa"/>
+              <w:end w:w="160" w:type="dxa"/>
+            </w:tcMar>
+            <w:vAlign w:val="center"/>
+          </w:tcPr>
+          <w:p>
+            <w:pPr>
+              <w:spacing w:before="40" w:after="0"/>
               <w:jc w:val="center"/>
             </w:pPr>
             <w:r>
               <w:rPr>
                 <w:rFonts w:ascii="Times New Roman" w:hAnsi="Times New Roman" w:eastAsia="Times New Roman"/>
-                <w:sz w:val="24"/>
+                <w:sz w:val="22"/>
               </w:rPr>
               <w:t>[МЕСТО ДЛЯ СКРИНШОТА 6 — Независимое воспроизведение части другого студента]</w:t>
             </w:r>
@@ -2284,9 +3887,17 @@
     </w:p>
     <w:tbl>
       <w:tblPr>
-        <w:tblW w:type="dxa" w:w="9000"/>
-        <w:tblLayout w:type="autofit"/>
+        <w:tblW w:type="pct" w:w="10000"/>
+        <w:tblLayout w:type="fixed"/>
         <w:tblLook w:firstColumn="1" w:firstRow="1" w:lastColumn="0" w:lastRow="0" w:noHBand="0" w:noVBand="1" w:val="04A0"/>
+        <w:tblBorders>
+          <w:top w:val="single" w:sz="4" w:space="0" w:color="B7C3D0"/>
+          <w:left w:val="single" w:sz="4" w:space="0" w:color="B7C3D0"/>
+          <w:bottom w:val="single" w:sz="4" w:space="0" w:color="B7C3D0"/>
+          <w:right w:val="single" w:sz="4" w:space="0" w:color="B7C3D0"/>
+          <w:insideH w:val="single" w:sz="4" w:space="0" w:color="B7C3D0"/>
+          <w:insideV w:val="single" w:sz="4" w:space="0" w:color="B7C3D0"/>
+        </w:tblBorders>
       </w:tblPr>
       <w:tblGrid>
         <w:gridCol w:w="9355"/>
@@ -2297,21 +3908,22 @@
             <w:tcW w:type="dxa" w:w="9355"/>
             <w:shd w:fill="EDEDED" w:val="clear"/>
             <w:tcMar>
-              <w:top w:w="160" w:type="dxa"/>
-              <w:start w:w="180" w:type="dxa"/>
-              <w:bottom w:w="160" w:type="dxa"/>
-              <w:end w:w="180" w:type="dxa"/>
-            </w:tcMar>
-          </w:tcPr>
-          <w:p>
-            <w:pPr>
-              <w:spacing w:before="40" w:after="40"/>
+              <w:top w:w="140" w:type="dxa"/>
+              <w:start w:w="160" w:type="dxa"/>
+              <w:bottom w:w="140" w:type="dxa"/>
+              <w:end w:w="160" w:type="dxa"/>
+            </w:tcMar>
+            <w:vAlign w:val="center"/>
+          </w:tcPr>
+          <w:p>
+            <w:pPr>
+              <w:spacing w:before="40" w:after="0"/>
               <w:jc w:val="center"/>
             </w:pPr>
             <w:r>
               <w:rPr>
                 <w:rFonts w:ascii="Times New Roman" w:hAnsi="Times New Roman" w:eastAsia="Times New Roman"/>
-                <w:sz w:val="24"/>
+                <w:sz w:val="22"/>
               </w:rPr>
               <w:t>[МЕСТО ДЛЯ СКРИНШОТА 7 — Отрицательная локальная проверка автоматического gate]</w:t>
             </w:r>
@@ -2361,7 +3973,7 @@
     <w:sectPr>
       <w:footerReference w:type="default" r:id="rId8"/>
       <w:pgSz w:w="11906" w:h="16838"/>
-      <w:pgMar w:top="1134" w:right="850" w:bottom="1134" w:left="1701" w:header="709" w:footer="709" w:gutter="0"/>
+      <w:pgMar w:top="936" w:right="1008" w:bottom="936" w:left="1008" w:header="709" w:footer="709" w:gutter="0"/>
       <w:cols w:space="708"/>
       <w:titlePg/>
       <w:docGrid w:linePitch="360"/>

</xml_diff>

<commit_message>
HIT-47: restore report layout and refine table text
</commit_message>
<xml_diff>
--- a/docs/labs/pr12/ds/reports/0104-pz01-ds.docx
+++ b/docs/labs/pr12/ds/reports/0104-pz01-ds.docx
@@ -38,17 +38,16 @@
     </w:p>
     <w:tbl>
       <w:tblPr>
-        <w:tblW w:w="10000" w:type="pct"/>
+        <w:tblW w:w="9356" w:type="dxa"/>
         <w:tblBorders>
-          <w:top w:val="single" w:sz="4" w:space="0" w:color="B7C3D0"/>
-          <w:left w:val="single" w:sz="4" w:space="0" w:color="B7C3D0"/>
-          <w:bottom w:val="single" w:sz="4" w:space="0" w:color="B7C3D0"/>
-          <w:right w:val="single" w:sz="4" w:space="0" w:color="B7C3D0"/>
-          <w:insideH w:val="single" w:sz="4" w:space="0" w:color="B7C3D0"/>
-          <w:insideV w:val="single" w:sz="4" w:space="0" w:color="B7C3D0"/>
+          <w:top w:val="single" w:sz="4" w:space="0" w:color="auto"/>
+          <w:left w:val="single" w:sz="4" w:space="0" w:color="auto"/>
+          <w:bottom w:val="single" w:sz="4" w:space="0" w:color="auto"/>
+          <w:right w:val="single" w:sz="4" w:space="0" w:color="auto"/>
+          <w:insideH w:val="single" w:sz="4" w:space="0" w:color="auto"/>
+          <w:insideV w:val="single" w:sz="4" w:space="0" w:color="auto"/>
         </w:tblBorders>
         <w:tblLook w:val="0000" w:firstRow="0" w:lastRow="0" w:firstColumn="0" w:lastColumn="0" w:noHBand="0" w:noVBand="0"/>
-        <w:tblLayout w:type="fixed"/>
       </w:tblPr>
       <w:tblGrid>
         <w:gridCol w:w="3261"/>
@@ -63,44 +62,31 @@
         </w:trPr>
         <w:tc>
           <w:tcPr>
-            <w:tcW w:w="1666" w:type="dxa"/>
+            <w:tcW w:w="3261" w:type="dxa"/>
             <w:tcBorders>
               <w:top w:val="nil"/>
               <w:left w:val="nil"/>
               <w:right w:val="nil"/>
             </w:tcBorders>
-            <w:vAlign w:val="top"/>
-            <w:tcMar>
-              <w:top w:w="80" w:type="dxa"/>
-              <w:start w:w="100" w:type="dxa"/>
-              <w:bottom w:w="80" w:type="dxa"/>
-              <w:end w:w="100" w:type="dxa"/>
-            </w:tcMar>
+            <w:vAlign w:val="bottom"/>
           </w:tcPr>
           <w:p>
             <w:pPr>
               <w:pStyle w:val="-1"/>
-              <w:spacing w:before="0" w:after="40" w:line="240" w:lineRule="auto"/>
-              <w:jc w:val="center"/>
-            </w:pPr>
-          </w:p>
-        </w:tc>
-        <w:tc>
-          <w:tcPr>
-            <w:tcW w:w="1960" w:type="dxa"/>
+              <w:spacing w:before="0" w:after="20" w:line="240" w:lineRule="auto"/>
+            </w:pPr>
+          </w:p>
+        </w:tc>
+        <w:tc>
+          <w:tcPr>
+            <w:tcW w:w="283" w:type="dxa"/>
             <w:tcBorders>
               <w:top w:val="nil"/>
               <w:left w:val="nil"/>
               <w:bottom w:val="nil"/>
               <w:right w:val="nil"/>
             </w:tcBorders>
-            <w:vAlign w:val="top"/>
-            <w:tcMar>
-              <w:top w:w="80" w:type="dxa"/>
-              <w:start w:w="100" w:type="dxa"/>
-              <w:bottom w:w="80" w:type="dxa"/>
-              <w:end w:w="100" w:type="dxa"/>
-            </w:tcMar>
+            <w:vAlign w:val="bottom"/>
           </w:tcPr>
           <w:p>
             <w:pPr>
@@ -108,7 +94,7 @@
               <w:autoSpaceDE w:val="0"/>
               <w:autoSpaceDN w:val="0"/>
               <w:adjustRightInd w:val="0"/>
-              <w:spacing w:before="0" w:after="40" w:line="240" w:lineRule="auto"/>
+              <w:spacing w:before="0" w:after="20" w:line="240" w:lineRule="auto"/>
               <w:ind w:firstLine="0"/>
               <w:jc w:val="center"/>
             </w:pPr>
@@ -116,44 +102,31 @@
         </w:tc>
         <w:tc>
           <w:tcPr>
-            <w:tcW w:w="2352" w:type="dxa"/>
+            <w:tcW w:w="2833" w:type="dxa"/>
             <w:tcBorders>
               <w:top w:val="nil"/>
               <w:left w:val="nil"/>
               <w:right w:val="nil"/>
             </w:tcBorders>
-            <w:vAlign w:val="top"/>
-            <w:tcMar>
-              <w:top w:w="80" w:type="dxa"/>
-              <w:start w:w="100" w:type="dxa"/>
-              <w:bottom w:w="80" w:type="dxa"/>
-              <w:end w:w="100" w:type="dxa"/>
-            </w:tcMar>
+            <w:vAlign w:val="bottom"/>
           </w:tcPr>
           <w:p>
             <w:pPr>
               <w:pStyle w:val="-1"/>
-              <w:spacing w:before="0" w:after="40" w:line="240" w:lineRule="auto"/>
-              <w:jc w:val="center"/>
-            </w:pPr>
-          </w:p>
-        </w:tc>
-        <w:tc>
-          <w:tcPr>
-            <w:tcW w:w="1960" w:type="dxa"/>
+              <w:spacing w:before="0" w:after="20" w:line="240" w:lineRule="auto"/>
+            </w:pPr>
+          </w:p>
+        </w:tc>
+        <w:tc>
+          <w:tcPr>
+            <w:tcW w:w="236" w:type="dxa"/>
             <w:tcBorders>
               <w:top w:val="nil"/>
               <w:left w:val="nil"/>
               <w:bottom w:val="nil"/>
               <w:right w:val="nil"/>
             </w:tcBorders>
-            <w:vAlign w:val="top"/>
-            <w:tcMar>
-              <w:top w:w="80" w:type="dxa"/>
-              <w:start w:w="100" w:type="dxa"/>
-              <w:bottom w:w="80" w:type="dxa"/>
-              <w:end w:w="100" w:type="dxa"/>
-            </w:tcMar>
+            <w:vAlign w:val="bottom"/>
           </w:tcPr>
           <w:p>
             <w:pPr>
@@ -161,7 +134,7 @@
               <w:autoSpaceDE w:val="0"/>
               <w:autoSpaceDN w:val="0"/>
               <w:adjustRightInd w:val="0"/>
-              <w:spacing w:before="0" w:after="40" w:line="240" w:lineRule="auto"/>
+              <w:spacing w:before="0" w:after="20" w:line="240" w:lineRule="auto"/>
               <w:ind w:firstLine="0"/>
               <w:jc w:val="center"/>
             </w:pPr>
@@ -169,25 +142,18 @@
         </w:tc>
         <w:tc>
           <w:tcPr>
-            <w:tcW w:w="1862" w:type="dxa"/>
+            <w:tcW w:w="2743" w:type="dxa"/>
             <w:tcBorders>
               <w:top w:val="nil"/>
               <w:left w:val="nil"/>
               <w:right w:val="nil"/>
             </w:tcBorders>
-            <w:vAlign w:val="top"/>
-            <w:tcMar>
-              <w:top w:w="80" w:type="dxa"/>
-              <w:start w:w="100" w:type="dxa"/>
-              <w:bottom w:w="80" w:type="dxa"/>
-              <w:end w:w="100" w:type="dxa"/>
-            </w:tcMar>
+            <w:vAlign w:val="bottom"/>
           </w:tcPr>
           <w:p>
             <w:pPr>
               <w:pStyle w:val="-1"/>
-              <w:spacing w:before="0" w:after="40" w:line="240" w:lineRule="auto"/>
-              <w:jc w:val="center"/>
+              <w:spacing w:before="0" w:after="20" w:line="240" w:lineRule="auto"/>
             </w:pPr>
           </w:p>
         </w:tc>
@@ -205,25 +171,19 @@
         </w:tblPrEx>
         <w:tc>
           <w:tcPr>
-            <w:tcW w:w="1666" w:type="dxa"/>
+            <w:tcW w:w="3261" w:type="dxa"/>
             <w:tcBorders>
               <w:top w:val="nil"/>
               <w:left w:val="nil"/>
               <w:bottom w:val="nil"/>
               <w:right w:val="nil"/>
             </w:tcBorders>
-            <w:vAlign w:val="top"/>
-            <w:tcMar>
-              <w:top w:w="80" w:type="dxa"/>
-              <w:start w:w="100" w:type="dxa"/>
-              <w:bottom w:w="80" w:type="dxa"/>
-              <w:end w:w="100" w:type="dxa"/>
-            </w:tcMar>
+            <w:vAlign w:val="center"/>
           </w:tcPr>
           <w:p>
             <w:pPr>
               <w:pStyle w:val="-1"/>
-              <w:spacing w:before="0" w:after="40" w:line="240" w:lineRule="auto"/>
+              <w:spacing w:before="0" w:after="20" w:line="240" w:lineRule="auto"/>
               <w:rPr>
                 <w:sz w:val="18"/>
                 <w:szCs w:val="18"/>
@@ -232,7 +192,7 @@
             <w:r>
               <w:rPr>
                 <w:rFonts w:ascii="Times New Roman" w:hAnsi="Times New Roman" w:eastAsia="Times New Roman"/>
-                <w:sz w:val="19"/>
+                <w:sz w:val="20"/>
               </w:rPr>
               <w:t>должность, уч. степень, звание</w:t>
             </w:r>
@@ -240,25 +200,19 @@
         </w:tc>
         <w:tc>
           <w:tcPr>
-            <w:tcW w:w="1960" w:type="dxa"/>
+            <w:tcW w:w="283" w:type="dxa"/>
             <w:tcBorders>
               <w:top w:val="nil"/>
               <w:left w:val="nil"/>
               <w:bottom w:val="nil"/>
               <w:right w:val="nil"/>
             </w:tcBorders>
-            <w:vAlign w:val="top"/>
-            <w:tcMar>
-              <w:top w:w="80" w:type="dxa"/>
-              <w:start w:w="100" w:type="dxa"/>
-              <w:bottom w:w="80" w:type="dxa"/>
-              <w:end w:w="100" w:type="dxa"/>
-            </w:tcMar>
+            <w:vAlign w:val="center"/>
           </w:tcPr>
           <w:p>
             <w:pPr>
               <w:pStyle w:val="-1"/>
-              <w:spacing w:before="0" w:after="40" w:line="240" w:lineRule="auto"/>
+              <w:spacing w:before="0" w:after="20" w:line="240" w:lineRule="auto"/>
               <w:rPr>
                 <w:sz w:val="18"/>
                 <w:szCs w:val="18"/>
@@ -268,25 +222,19 @@
         </w:tc>
         <w:tc>
           <w:tcPr>
-            <w:tcW w:w="2352" w:type="dxa"/>
+            <w:tcW w:w="2833" w:type="dxa"/>
             <w:tcBorders>
               <w:top w:val="nil"/>
               <w:left w:val="nil"/>
               <w:bottom w:val="nil"/>
               <w:right w:val="nil"/>
             </w:tcBorders>
-            <w:vAlign w:val="top"/>
-            <w:tcMar>
-              <w:top w:w="80" w:type="dxa"/>
-              <w:start w:w="100" w:type="dxa"/>
-              <w:bottom w:w="80" w:type="dxa"/>
-              <w:end w:w="100" w:type="dxa"/>
-            </w:tcMar>
+            <w:vAlign w:val="center"/>
           </w:tcPr>
           <w:p>
             <w:pPr>
               <w:pStyle w:val="-1"/>
-              <w:spacing w:before="0" w:after="40" w:line="240" w:lineRule="auto"/>
+              <w:spacing w:before="0" w:after="20" w:line="240" w:lineRule="auto"/>
               <w:rPr>
                 <w:sz w:val="18"/>
                 <w:szCs w:val="18"/>
@@ -295,7 +243,7 @@
             <w:r>
               <w:rPr>
                 <w:rFonts w:ascii="Times New Roman" w:hAnsi="Times New Roman" w:eastAsia="Times New Roman"/>
-                <w:sz w:val="19"/>
+                <w:sz w:val="20"/>
               </w:rPr>
               <w:t>подпись, дата</w:t>
             </w:r>
@@ -303,25 +251,19 @@
         </w:tc>
         <w:tc>
           <w:tcPr>
-            <w:tcW w:w="1960" w:type="dxa"/>
+            <w:tcW w:w="236" w:type="dxa"/>
             <w:tcBorders>
               <w:top w:val="nil"/>
               <w:left w:val="nil"/>
               <w:bottom w:val="nil"/>
               <w:right w:val="nil"/>
             </w:tcBorders>
-            <w:vAlign w:val="top"/>
-            <w:tcMar>
-              <w:top w:w="80" w:type="dxa"/>
-              <w:start w:w="100" w:type="dxa"/>
-              <w:bottom w:w="80" w:type="dxa"/>
-              <w:end w:w="100" w:type="dxa"/>
-            </w:tcMar>
+            <w:vAlign w:val="center"/>
           </w:tcPr>
           <w:p>
             <w:pPr>
               <w:pStyle w:val="-1"/>
-              <w:spacing w:before="0" w:after="40" w:line="240" w:lineRule="auto"/>
+              <w:spacing w:before="0" w:after="20" w:line="240" w:lineRule="auto"/>
               <w:rPr>
                 <w:sz w:val="18"/>
                 <w:szCs w:val="18"/>
@@ -331,25 +273,19 @@
         </w:tc>
         <w:tc>
           <w:tcPr>
-            <w:tcW w:w="1862" w:type="dxa"/>
+            <w:tcW w:w="2743" w:type="dxa"/>
             <w:tcBorders>
               <w:top w:val="nil"/>
               <w:left w:val="nil"/>
               <w:bottom w:val="nil"/>
               <w:right w:val="nil"/>
             </w:tcBorders>
-            <w:vAlign w:val="top"/>
-            <w:tcMar>
-              <w:top w:w="80" w:type="dxa"/>
-              <w:start w:w="100" w:type="dxa"/>
-              <w:bottom w:w="80" w:type="dxa"/>
-              <w:end w:w="100" w:type="dxa"/>
-            </w:tcMar>
+            <w:vAlign w:val="center"/>
           </w:tcPr>
           <w:p>
             <w:pPr>
               <w:pStyle w:val="-1"/>
-              <w:spacing w:before="0" w:after="40" w:line="240" w:lineRule="auto"/>
+              <w:spacing w:before="0" w:after="20" w:line="240" w:lineRule="auto"/>
               <w:rPr>
                 <w:sz w:val="18"/>
                 <w:szCs w:val="18"/>
@@ -358,7 +294,7 @@
             <w:r>
               <w:rPr>
                 <w:rFonts w:ascii="Times New Roman" w:hAnsi="Times New Roman" w:eastAsia="Times New Roman"/>
-                <w:sz w:val="19"/>
+                <w:sz w:val="20"/>
               </w:rPr>
               <w:t>инициалы, фамилия</w:t>
             </w:r>
@@ -380,17 +316,8 @@
     </w:p>
     <w:tbl>
       <w:tblPr>
-        <w:tblW w:w="10000" w:type="pct"/>
+        <w:tblW w:w="9356" w:type="dxa"/>
         <w:tblLook w:val="0000" w:firstRow="0" w:lastRow="0" w:firstColumn="0" w:lastColumn="0" w:noHBand="0" w:noVBand="0"/>
-        <w:tblLayout w:type="fixed"/>
-        <w:tblBorders>
-          <w:top w:val="single" w:sz="4" w:space="0" w:color="B7C3D0"/>
-          <w:left w:val="single" w:sz="4" w:space="0" w:color="B7C3D0"/>
-          <w:bottom w:val="single" w:sz="4" w:space="0" w:color="B7C3D0"/>
-          <w:right w:val="single" w:sz="4" w:space="0" w:color="B7C3D0"/>
-          <w:insideH w:val="single" w:sz="4" w:space="0" w:color="B7C3D0"/>
-          <w:insideV w:val="single" w:sz="4" w:space="0" w:color="B7C3D0"/>
-        </w:tblBorders>
       </w:tblPr>
       <w:tblGrid>
         <w:gridCol w:w="9356"/>
@@ -409,23 +336,16 @@
               <w:right w:val="nil"/>
             </w:tcBorders>
             <w:vAlign w:val="center"/>
-            <w:shd w:fill="EDEDED" w:val="clear"/>
-            <w:tcMar>
-              <w:top w:w="140" w:type="dxa"/>
-              <w:start w:w="160" w:type="dxa"/>
-              <w:bottom w:w="140" w:type="dxa"/>
-              <w:end w:w="160" w:type="dxa"/>
-            </w:tcMar>
-          </w:tcPr>
-          <w:p>
-            <w:pPr>
-              <w:spacing w:after="0"/>
-              <w:jc w:val="center"/>
-            </w:pPr>
-            <w:r>
-              <w:rPr>
-                <w:rFonts w:ascii="Times New Roman" w:hAnsi="Times New Roman" w:eastAsia="Times New Roman"/>
-                <w:sz w:val="22"/>
+          </w:tcPr>
+          <w:p>
+            <w:pPr>
+              <w:spacing w:before="0" w:after="20" w:line="240" w:lineRule="auto"/>
+            </w:pPr>
+            <w:r>
+              <w:rPr>
+                <w:rFonts w:ascii="Times New Roman" w:hAnsi="Times New Roman" w:eastAsia="Times New Roman"/>
+                <w:b/>
+                <w:sz w:val="21"/>
               </w:rPr>
               <w:t>Инструментальный контур и воспроизводимое исполнение минимального программного компонента</w:t>
             </w:r>
@@ -442,24 +362,15 @@
               <w:bottom w:val="nil"/>
               <w:right w:val="nil"/>
             </w:tcBorders>
-            <w:shd w:fill="EDEDED" w:val="clear"/>
-            <w:tcMar>
-              <w:top w:w="140" w:type="dxa"/>
-              <w:start w:w="160" w:type="dxa"/>
-              <w:bottom w:w="140" w:type="dxa"/>
-              <w:end w:w="160" w:type="dxa"/>
-            </w:tcMar>
-            <w:vAlign w:val="center"/>
-          </w:tcPr>
-          <w:p>
-            <w:pPr>
-              <w:spacing w:after="0"/>
-              <w:jc w:val="center"/>
-            </w:pPr>
-            <w:r>
-              <w:rPr>
-                <w:rFonts w:ascii="Times New Roman" w:hAnsi="Times New Roman" w:eastAsia="Times New Roman"/>
-                <w:sz w:val="22"/>
+          </w:tcPr>
+          <w:p>
+            <w:pPr>
+              <w:spacing w:before="0" w:after="20" w:line="240" w:lineRule="auto"/>
+            </w:pPr>
+            <w:r>
+              <w:rPr>
+                <w:rFonts w:ascii="Times New Roman" w:hAnsi="Times New Roman" w:eastAsia="Times New Roman"/>
+                <w:sz w:val="20"/>
               </w:rPr>
               <w:t>по МДК.01.04 «Системное программирование»</w:t>
             </w:r>
@@ -552,17 +463,16 @@
     </w:p>
     <w:tbl>
       <w:tblPr>
-        <w:tblW w:w="10000" w:type="pct"/>
+        <w:tblW w:w="9356" w:type="dxa"/>
         <w:tblBorders>
-          <w:top w:val="single" w:sz="4" w:space="0" w:color="B7C3D0"/>
-          <w:left w:val="single" w:sz="4" w:space="0" w:color="B7C3D0"/>
-          <w:bottom w:val="single" w:sz="4" w:space="0" w:color="B7C3D0"/>
-          <w:right w:val="single" w:sz="4" w:space="0" w:color="B7C3D0"/>
-          <w:insideH w:val="single" w:sz="4" w:space="0" w:color="B7C3D0"/>
-          <w:insideV w:val="single" w:sz="4" w:space="0" w:color="B7C3D0"/>
+          <w:top w:val="single" w:sz="4" w:space="0" w:color="auto"/>
+          <w:left w:val="single" w:sz="4" w:space="0" w:color="auto"/>
+          <w:bottom w:val="single" w:sz="4" w:space="0" w:color="auto"/>
+          <w:right w:val="single" w:sz="4" w:space="0" w:color="auto"/>
+          <w:insideH w:val="single" w:sz="4" w:space="0" w:color="auto"/>
+          <w:insideV w:val="single" w:sz="4" w:space="0" w:color="auto"/>
         </w:tblBorders>
         <w:tblLook w:val="0000" w:firstRow="0" w:lastRow="0" w:firstColumn="0" w:lastColumn="0" w:noHBand="0" w:noVBand="0"/>
-        <w:tblLayout w:type="fixed"/>
       </w:tblPr>
       <w:tblGrid>
         <w:gridCol w:w="1560"/>
@@ -578,7 +488,7 @@
         </w:trPr>
         <w:tc>
           <w:tcPr>
-            <w:tcW w:w="1176" w:type="dxa"/>
+            <w:tcW w:w="1560" w:type="dxa"/>
             <w:tcBorders>
               <w:top w:val="nil"/>
               <w:left w:val="nil"/>
@@ -588,19 +498,14 @@
             <w:tcMar>
               <w:left w:w="0" w:type="dxa"/>
               <w:right w:w="0" w:type="dxa"/>
-              <w:top w:w="80" w:type="dxa"/>
-              <w:start w:w="100" w:type="dxa"/>
-              <w:bottom w:w="80" w:type="dxa"/>
-              <w:end w:w="100" w:type="dxa"/>
             </w:tcMar>
-            <w:vAlign w:val="top"/>
-            <w:shd w:fill="D9EAF7" w:val="clear"/>
+            <w:vAlign w:val="center"/>
           </w:tcPr>
           <w:p>
             <w:pPr>
               <w:pStyle w:val="-1"/>
-              <w:spacing w:before="0" w:after="40" w:line="240" w:lineRule="auto"/>
-              <w:jc w:val="center"/>
+              <w:spacing w:before="0" w:after="20" w:line="240" w:lineRule="auto"/>
+              <w:jc w:val="left"/>
               <w:rPr>
                 <w:rFonts w:eastAsia="Times New Roman"/>
                 <w:lang w:eastAsia="ru-RU"/>
@@ -610,7 +515,7 @@
               <w:rPr>
                 <w:rFonts w:ascii="Times New Roman" w:hAnsi="Times New Roman" w:eastAsia="Times New Roman"/>
                 <w:b/>
-                <w:sz w:val="19"/>
+                <w:sz w:val="21"/>
               </w:rPr>
               <w:t xml:space="preserve">Студент гр. № </w:t>
             </w:r>
@@ -618,7 +523,7 @@
         </w:tc>
         <w:tc>
           <w:tcPr>
-            <w:tcW w:w="1764" w:type="dxa"/>
+            <w:tcW w:w="1925" w:type="dxa"/>
             <w:tcBorders>
               <w:top w:val="nil"/>
               <w:left w:val="nil"/>
@@ -627,18 +532,13 @@
             <w:tcMar>
               <w:left w:w="0" w:type="dxa"/>
               <w:right w:w="0" w:type="dxa"/>
-              <w:top w:w="80" w:type="dxa"/>
-              <w:start w:w="100" w:type="dxa"/>
-              <w:bottom w:w="80" w:type="dxa"/>
-              <w:end w:w="100" w:type="dxa"/>
             </w:tcMar>
-            <w:vAlign w:val="top"/>
+            <w:vAlign w:val="center"/>
           </w:tcPr>
           <w:p>
             <w:pPr>
               <w:pStyle w:val="-1"/>
-              <w:spacing w:before="0" w:after="40" w:line="240" w:lineRule="auto"/>
-              <w:jc w:val="center"/>
+              <w:spacing w:before="0" w:after="20" w:line="240" w:lineRule="auto"/>
               <w:rPr>
                 <w:rFonts w:ascii="Times New Roman" w:eastAsia="Times New Roman" w:hAnsi="Times New Roman" w:cs="Times New Roman"/>
                 <w:lang w:eastAsia="ru-RU"/>
@@ -648,7 +548,7 @@
         </w:tc>
         <w:tc>
           <w:tcPr>
-            <w:tcW w:w="1764" w:type="dxa"/>
+            <w:tcW w:w="240" w:type="dxa"/>
             <w:tcBorders>
               <w:top w:val="nil"/>
               <w:left w:val="nil"/>
@@ -658,12 +558,8 @@
             <w:tcMar>
               <w:left w:w="0" w:type="dxa"/>
               <w:right w:w="0" w:type="dxa"/>
-              <w:top w:w="80" w:type="dxa"/>
-              <w:start w:w="100" w:type="dxa"/>
-              <w:bottom w:w="80" w:type="dxa"/>
-              <w:end w:w="100" w:type="dxa"/>
             </w:tcMar>
-            <w:vAlign w:val="top"/>
+            <w:vAlign w:val="center"/>
           </w:tcPr>
           <w:p>
             <w:pPr>
@@ -671,7 +567,7 @@
               <w:autoSpaceDE w:val="0"/>
               <w:autoSpaceDN w:val="0"/>
               <w:adjustRightInd w:val="0"/>
-              <w:spacing w:line="240" w:lineRule="auto" w:before="0" w:after="40"/>
+              <w:spacing w:line="240" w:lineRule="auto" w:before="0" w:after="20"/>
               <w:ind w:firstLine="0"/>
               <w:jc w:val="center"/>
               <w:rPr>
@@ -683,7 +579,7 @@
         </w:tc>
         <w:tc>
           <w:tcPr>
-            <w:tcW w:w="1666" w:type="dxa"/>
+            <w:tcW w:w="2377" w:type="dxa"/>
             <w:tcBorders>
               <w:top w:val="nil"/>
               <w:left w:val="nil"/>
@@ -692,18 +588,13 @@
             <w:tcMar>
               <w:left w:w="0" w:type="dxa"/>
               <w:right w:w="0" w:type="dxa"/>
-              <w:top w:w="80" w:type="dxa"/>
-              <w:start w:w="100" w:type="dxa"/>
-              <w:bottom w:w="80" w:type="dxa"/>
-              <w:end w:w="100" w:type="dxa"/>
             </w:tcMar>
-            <w:vAlign w:val="top"/>
+            <w:vAlign w:val="center"/>
           </w:tcPr>
           <w:p>
             <w:pPr>
               <w:pStyle w:val="-1"/>
-              <w:spacing w:before="0" w:after="40" w:line="240" w:lineRule="auto"/>
-              <w:jc w:val="center"/>
+              <w:spacing w:before="0" w:after="20" w:line="240" w:lineRule="auto"/>
               <w:rPr>
                 <w:rFonts w:ascii="Times New Roman" w:eastAsia="Times New Roman" w:hAnsi="Times New Roman" w:cs="Times New Roman"/>
                 <w:szCs w:val="24"/>
@@ -714,7 +605,7 @@
         </w:tc>
         <w:tc>
           <w:tcPr>
-            <w:tcW w:w="1862" w:type="dxa"/>
+            <w:tcW w:w="236" w:type="dxa"/>
             <w:tcBorders>
               <w:top w:val="nil"/>
               <w:left w:val="nil"/>
@@ -724,12 +615,8 @@
             <w:tcMar>
               <w:left w:w="0" w:type="dxa"/>
               <w:right w:w="0" w:type="dxa"/>
-              <w:top w:w="80" w:type="dxa"/>
-              <w:start w:w="100" w:type="dxa"/>
-              <w:bottom w:w="80" w:type="dxa"/>
-              <w:end w:w="100" w:type="dxa"/>
             </w:tcMar>
-            <w:vAlign w:val="top"/>
+            <w:vAlign w:val="center"/>
           </w:tcPr>
           <w:p>
             <w:pPr>
@@ -737,7 +624,7 @@
               <w:autoSpaceDE w:val="0"/>
               <w:autoSpaceDN w:val="0"/>
               <w:adjustRightInd w:val="0"/>
-              <w:spacing w:line="240" w:lineRule="auto" w:before="0" w:after="40"/>
+              <w:spacing w:line="240" w:lineRule="auto" w:before="0" w:after="20"/>
               <w:ind w:firstLine="0"/>
               <w:jc w:val="center"/>
               <w:rPr>
@@ -749,7 +636,7 @@
         </w:tc>
         <w:tc>
           <w:tcPr>
-            <w:tcW w:w="1568" w:type="dxa"/>
+            <w:tcW w:w="3018" w:type="dxa"/>
             <w:tcBorders>
               <w:top w:val="nil"/>
               <w:left w:val="nil"/>
@@ -758,18 +645,13 @@
             <w:tcMar>
               <w:left w:w="0" w:type="dxa"/>
               <w:right w:w="0" w:type="dxa"/>
-              <w:top w:w="80" w:type="dxa"/>
-              <w:start w:w="100" w:type="dxa"/>
-              <w:bottom w:w="80" w:type="dxa"/>
-              <w:end w:w="100" w:type="dxa"/>
             </w:tcMar>
-            <w:vAlign w:val="top"/>
+            <w:vAlign w:val="center"/>
           </w:tcPr>
           <w:p>
             <w:pPr>
               <w:pStyle w:val="-1"/>
-              <w:spacing w:before="0" w:after="40" w:line="240" w:lineRule="auto"/>
-              <w:jc w:val="center"/>
+              <w:spacing w:before="0" w:after="20" w:line="240" w:lineRule="auto"/>
               <w:rPr>
                 <w:rFonts w:eastAsia="Times New Roman"/>
                 <w:lang w:eastAsia="ru-RU"/>
@@ -791,7 +673,7 @@
         </w:tblPrEx>
         <w:tc>
           <w:tcPr>
-            <w:tcW w:w="1176" w:type="dxa"/>
+            <w:tcW w:w="1560" w:type="dxa"/>
             <w:tcBorders>
               <w:top w:val="nil"/>
               <w:left w:val="nil"/>
@@ -801,17 +683,13 @@
             <w:tcMar>
               <w:left w:w="0" w:type="dxa"/>
               <w:right w:w="0" w:type="dxa"/>
-              <w:top w:w="80" w:type="dxa"/>
-              <w:start w:w="100" w:type="dxa"/>
-              <w:bottom w:w="80" w:type="dxa"/>
-              <w:end w:w="100" w:type="dxa"/>
             </w:tcMar>
-            <w:vAlign w:val="top"/>
+            <w:vAlign w:val="center"/>
           </w:tcPr>
           <w:p>
             <w:pPr>
               <w:pStyle w:val="-1"/>
-              <w:spacing w:before="0" w:after="40" w:line="240" w:lineRule="auto"/>
+              <w:spacing w:before="0" w:after="20" w:line="240" w:lineRule="auto"/>
               <w:rPr>
                 <w:sz w:val="18"/>
                 <w:szCs w:val="18"/>
@@ -821,7 +699,7 @@
         </w:tc>
         <w:tc>
           <w:tcPr>
-            <w:tcW w:w="1764" w:type="dxa"/>
+            <w:tcW w:w="1925" w:type="dxa"/>
             <w:tcBorders>
               <w:top w:val="nil"/>
               <w:left w:val="nil"/>
@@ -831,17 +709,13 @@
             <w:tcMar>
               <w:left w:w="0" w:type="dxa"/>
               <w:right w:w="0" w:type="dxa"/>
-              <w:top w:w="80" w:type="dxa"/>
-              <w:start w:w="100" w:type="dxa"/>
-              <w:bottom w:w="80" w:type="dxa"/>
-              <w:end w:w="100" w:type="dxa"/>
             </w:tcMar>
-            <w:vAlign w:val="top"/>
+            <w:vAlign w:val="center"/>
           </w:tcPr>
           <w:p>
             <w:pPr>
               <w:pStyle w:val="-1"/>
-              <w:spacing w:before="0" w:after="40" w:line="240" w:lineRule="auto"/>
+              <w:spacing w:before="0" w:after="20" w:line="240" w:lineRule="auto"/>
               <w:rPr>
                 <w:sz w:val="18"/>
                 <w:szCs w:val="18"/>
@@ -851,7 +725,7 @@
         </w:tc>
         <w:tc>
           <w:tcPr>
-            <w:tcW w:w="1764" w:type="dxa"/>
+            <w:tcW w:w="240" w:type="dxa"/>
             <w:tcBorders>
               <w:top w:val="nil"/>
               <w:left w:val="nil"/>
@@ -861,17 +735,13 @@
             <w:tcMar>
               <w:left w:w="0" w:type="dxa"/>
               <w:right w:w="0" w:type="dxa"/>
-              <w:top w:w="80" w:type="dxa"/>
-              <w:start w:w="100" w:type="dxa"/>
-              <w:bottom w:w="80" w:type="dxa"/>
-              <w:end w:w="100" w:type="dxa"/>
             </w:tcMar>
-            <w:vAlign w:val="top"/>
+            <w:vAlign w:val="center"/>
           </w:tcPr>
           <w:p>
             <w:pPr>
               <w:pStyle w:val="-1"/>
-              <w:spacing w:before="0" w:after="40" w:line="240" w:lineRule="auto"/>
+              <w:spacing w:before="0" w:after="20" w:line="240" w:lineRule="auto"/>
               <w:rPr>
                 <w:sz w:val="18"/>
                 <w:szCs w:val="18"/>
@@ -881,7 +751,7 @@
         </w:tc>
         <w:tc>
           <w:tcPr>
-            <w:tcW w:w="1666" w:type="dxa"/>
+            <w:tcW w:w="2377" w:type="dxa"/>
             <w:tcBorders>
               <w:top w:val="nil"/>
               <w:left w:val="nil"/>
@@ -891,17 +761,13 @@
             <w:tcMar>
               <w:left w:w="0" w:type="dxa"/>
               <w:right w:w="0" w:type="dxa"/>
-              <w:top w:w="80" w:type="dxa"/>
-              <w:start w:w="100" w:type="dxa"/>
-              <w:bottom w:w="80" w:type="dxa"/>
-              <w:end w:w="100" w:type="dxa"/>
             </w:tcMar>
-            <w:vAlign w:val="top"/>
+            <w:vAlign w:val="center"/>
           </w:tcPr>
           <w:p>
             <w:pPr>
               <w:pStyle w:val="-1"/>
-              <w:spacing w:before="0" w:after="40" w:line="240" w:lineRule="auto"/>
+              <w:spacing w:before="0" w:after="20" w:line="240" w:lineRule="auto"/>
               <w:rPr>
                 <w:sz w:val="18"/>
                 <w:szCs w:val="18"/>
@@ -910,7 +776,7 @@
             <w:r>
               <w:rPr>
                 <w:rFonts w:ascii="Times New Roman" w:hAnsi="Times New Roman" w:eastAsia="Times New Roman"/>
-                <w:sz w:val="19"/>
+                <w:sz w:val="20"/>
               </w:rPr>
               <w:t>подпись, дата</w:t>
             </w:r>
@@ -918,7 +784,7 @@
         </w:tc>
         <w:tc>
           <w:tcPr>
-            <w:tcW w:w="1862" w:type="dxa"/>
+            <w:tcW w:w="236" w:type="dxa"/>
             <w:tcBorders>
               <w:top w:val="nil"/>
               <w:left w:val="nil"/>
@@ -928,17 +794,13 @@
             <w:tcMar>
               <w:left w:w="0" w:type="dxa"/>
               <w:right w:w="0" w:type="dxa"/>
-              <w:top w:w="80" w:type="dxa"/>
-              <w:start w:w="100" w:type="dxa"/>
-              <w:bottom w:w="80" w:type="dxa"/>
-              <w:end w:w="100" w:type="dxa"/>
             </w:tcMar>
-            <w:vAlign w:val="top"/>
+            <w:vAlign w:val="center"/>
           </w:tcPr>
           <w:p>
             <w:pPr>
               <w:pStyle w:val="-1"/>
-              <w:spacing w:before="0" w:after="40" w:line="240" w:lineRule="auto"/>
+              <w:spacing w:before="0" w:after="20" w:line="240" w:lineRule="auto"/>
               <w:rPr>
                 <w:sz w:val="18"/>
                 <w:szCs w:val="18"/>
@@ -948,7 +810,7 @@
         </w:tc>
         <w:tc>
           <w:tcPr>
-            <w:tcW w:w="1568" w:type="dxa"/>
+            <w:tcW w:w="3018" w:type="dxa"/>
             <w:tcBorders>
               <w:top w:val="nil"/>
               <w:left w:val="nil"/>
@@ -958,17 +820,13 @@
             <w:tcMar>
               <w:left w:w="0" w:type="dxa"/>
               <w:right w:w="0" w:type="dxa"/>
-              <w:top w:w="80" w:type="dxa"/>
-              <w:start w:w="100" w:type="dxa"/>
-              <w:bottom w:w="80" w:type="dxa"/>
-              <w:end w:w="100" w:type="dxa"/>
             </w:tcMar>
-            <w:vAlign w:val="top"/>
+            <w:vAlign w:val="center"/>
           </w:tcPr>
           <w:p>
             <w:pPr>
               <w:pStyle w:val="-1"/>
-              <w:spacing w:before="0" w:after="40" w:line="240" w:lineRule="auto"/>
+              <w:spacing w:before="0" w:after="20" w:line="240" w:lineRule="auto"/>
               <w:rPr>
                 <w:sz w:val="18"/>
                 <w:szCs w:val="18"/>
@@ -977,7 +835,7 @@
             <w:r>
               <w:rPr>
                 <w:rFonts w:ascii="Times New Roman" w:hAnsi="Times New Roman" w:eastAsia="Times New Roman"/>
-                <w:sz w:val="19"/>
+                <w:sz w:val="20"/>
               </w:rPr>
               <w:t>инициалы, фамилия</w:t>
             </w:r>
@@ -1019,17 +877,8 @@
     </w:p>
     <w:tbl>
       <w:tblPr>
-        <w:tblW w:type="pct" w:w="10000"/>
+        <w:tblW w:type="auto" w:w="0"/>
         <w:tblLook w:firstColumn="1" w:firstRow="1" w:lastColumn="0" w:lastRow="0" w:noHBand="0" w:noVBand="1" w:val="04A0"/>
-        <w:tblLayout w:type="fixed"/>
-        <w:tblBorders>
-          <w:top w:val="single" w:sz="4" w:space="0" w:color="B7C3D0"/>
-          <w:left w:val="single" w:sz="4" w:space="0" w:color="B7C3D0"/>
-          <w:bottom w:val="single" w:sz="4" w:space="0" w:color="B7C3D0"/>
-          <w:right w:val="single" w:sz="4" w:space="0" w:color="B7C3D0"/>
-          <w:insideH w:val="single" w:sz="4" w:space="0" w:color="B7C3D0"/>
-          <w:insideV w:val="single" w:sz="4" w:space="0" w:color="B7C3D0"/>
-        </w:tblBorders>
       </w:tblPr>
       <w:tblGrid>
         <w:gridCol w:w="4677"/>
@@ -1041,26 +890,17 @@
         </w:trPr>
         <w:tc>
           <w:tcPr>
-            <w:tcW w:type="dxa" w:w="2744"/>
-            <w:vAlign w:val="top"/>
-            <w:tcMar>
-              <w:top w:w="80" w:type="dxa"/>
-              <w:start w:w="100" w:type="dxa"/>
-              <w:bottom w:w="80" w:type="dxa"/>
-              <w:end w:w="100" w:type="dxa"/>
-            </w:tcMar>
-            <w:shd w:fill="D9EAF7" w:val="clear"/>
-          </w:tcPr>
-          <w:p>
-            <w:pPr>
-              <w:spacing w:before="0" w:after="40" w:line="240" w:lineRule="auto"/>
-              <w:jc w:val="center"/>
+            <w:tcW w:type="dxa" w:w="4677"/>
+          </w:tcPr>
+          <w:p>
+            <w:pPr>
+              <w:spacing w:before="0" w:after="20" w:line="240" w:lineRule="auto"/>
             </w:pPr>
             <w:r>
               <w:rPr>
                 <w:rFonts w:ascii="Times New Roman" w:hAnsi="Times New Roman" w:eastAsia="Times New Roman"/>
                 <w:b/>
-                <w:sz w:val="20"/>
+                <w:sz w:val="21"/>
               </w:rPr>
               <w:t>Поле</w:t>
             </w:r>
@@ -1068,26 +908,17 @@
         </w:tc>
         <w:tc>
           <w:tcPr>
-            <w:tcW w:type="dxa" w:w="7056"/>
-            <w:vAlign w:val="top"/>
-            <w:tcMar>
-              <w:top w:w="80" w:type="dxa"/>
-              <w:start w:w="100" w:type="dxa"/>
-              <w:bottom w:w="80" w:type="dxa"/>
-              <w:end w:w="100" w:type="dxa"/>
-            </w:tcMar>
-            <w:shd w:fill="D9EAF7" w:val="clear"/>
-          </w:tcPr>
-          <w:p>
-            <w:pPr>
-              <w:spacing w:before="0" w:after="40" w:line="240" w:lineRule="auto"/>
-              <w:jc w:val="center"/>
+            <w:tcW w:type="dxa" w:w="4677"/>
+          </w:tcPr>
+          <w:p>
+            <w:pPr>
+              <w:spacing w:before="0" w:after="20" w:line="240" w:lineRule="auto"/>
             </w:pPr>
             <w:r>
               <w:rPr>
                 <w:rFonts w:ascii="Times New Roman" w:hAnsi="Times New Roman" w:eastAsia="Times New Roman"/>
                 <w:b/>
-                <w:sz w:val="20"/>
+                <w:sz w:val="21"/>
               </w:rPr>
               <w:t>Значение</w:t>
             </w:r>
@@ -1097,18 +928,11 @@
       <w:tr>
         <w:tc>
           <w:tcPr>
-            <w:tcW w:type="dxa" w:w="2744"/>
-            <w:vAlign w:val="top"/>
-            <w:tcMar>
-              <w:top w:w="80" w:type="dxa"/>
-              <w:start w:w="100" w:type="dxa"/>
-              <w:bottom w:w="80" w:type="dxa"/>
-              <w:end w:w="100" w:type="dxa"/>
-            </w:tcMar>
-          </w:tcPr>
-          <w:p>
-            <w:pPr>
-              <w:spacing w:before="0" w:after="40" w:line="240" w:lineRule="auto"/>
+            <w:tcW w:type="dxa" w:w="4677"/>
+          </w:tcPr>
+          <w:p>
+            <w:pPr>
+              <w:spacing w:before="0" w:after="20" w:line="240" w:lineRule="auto"/>
             </w:pPr>
             <w:r>
               <w:rPr>
@@ -1121,18 +945,11 @@
         </w:tc>
         <w:tc>
           <w:tcPr>
-            <w:tcW w:type="dxa" w:w="7056"/>
-            <w:vAlign w:val="top"/>
-            <w:tcMar>
-              <w:top w:w="80" w:type="dxa"/>
-              <w:start w:w="100" w:type="dxa"/>
-              <w:bottom w:w="80" w:type="dxa"/>
-              <w:end w:w="100" w:type="dxa"/>
-            </w:tcMar>
-          </w:tcPr>
-          <w:p>
-            <w:pPr>
-              <w:spacing w:before="0" w:after="40" w:line="240" w:lineRule="auto"/>
+            <w:tcW w:type="dxa" w:w="4677"/>
+          </w:tcPr>
+          <w:p>
+            <w:pPr>
+              <w:spacing w:before="0" w:after="20" w:line="240" w:lineRule="auto"/>
             </w:pPr>
             <w:r>
               <w:rPr>
@@ -1147,18 +964,11 @@
       <w:tr>
         <w:tc>
           <w:tcPr>
-            <w:tcW w:type="dxa" w:w="2744"/>
-            <w:vAlign w:val="top"/>
-            <w:tcMar>
-              <w:top w:w="80" w:type="dxa"/>
-              <w:start w:w="100" w:type="dxa"/>
-              <w:bottom w:w="80" w:type="dxa"/>
-              <w:end w:w="100" w:type="dxa"/>
-            </w:tcMar>
-          </w:tcPr>
-          <w:p>
-            <w:pPr>
-              <w:spacing w:before="0" w:after="40" w:line="240" w:lineRule="auto"/>
+            <w:tcW w:type="dxa" w:w="4677"/>
+          </w:tcPr>
+          <w:p>
+            <w:pPr>
+              <w:spacing w:before="0" w:after="20" w:line="240" w:lineRule="auto"/>
             </w:pPr>
             <w:r>
               <w:rPr>
@@ -1171,18 +981,11 @@
         </w:tc>
         <w:tc>
           <w:tcPr>
-            <w:tcW w:type="dxa" w:w="7056"/>
-            <w:vAlign w:val="top"/>
-            <w:tcMar>
-              <w:top w:w="80" w:type="dxa"/>
-              <w:start w:w="100" w:type="dxa"/>
-              <w:bottom w:w="80" w:type="dxa"/>
-              <w:end w:w="100" w:type="dxa"/>
-            </w:tcMar>
-          </w:tcPr>
-          <w:p>
-            <w:pPr>
-              <w:spacing w:before="0" w:after="40" w:line="240" w:lineRule="auto"/>
+            <w:tcW w:type="dxa" w:w="4677"/>
+          </w:tcPr>
+          <w:p>
+            <w:pPr>
+              <w:spacing w:before="0" w:after="20" w:line="240" w:lineRule="auto"/>
             </w:pPr>
             <w:r>
               <w:rPr>
@@ -1197,18 +1000,11 @@
       <w:tr>
         <w:tc>
           <w:tcPr>
-            <w:tcW w:type="dxa" w:w="2744"/>
-            <w:vAlign w:val="top"/>
-            <w:tcMar>
-              <w:top w:w="80" w:type="dxa"/>
-              <w:start w:w="100" w:type="dxa"/>
-              <w:bottom w:w="80" w:type="dxa"/>
-              <w:end w:w="100" w:type="dxa"/>
-            </w:tcMar>
-          </w:tcPr>
-          <w:p>
-            <w:pPr>
-              <w:spacing w:before="0" w:after="40" w:line="240" w:lineRule="auto"/>
+            <w:tcW w:type="dxa" w:w="4677"/>
+          </w:tcPr>
+          <w:p>
+            <w:pPr>
+              <w:spacing w:before="0" w:after="20" w:line="240" w:lineRule="auto"/>
             </w:pPr>
             <w:r>
               <w:rPr>
@@ -1221,18 +1017,11 @@
         </w:tc>
         <w:tc>
           <w:tcPr>
-            <w:tcW w:type="dxa" w:w="7056"/>
-            <w:vAlign w:val="top"/>
-            <w:tcMar>
-              <w:top w:w="80" w:type="dxa"/>
-              <w:start w:w="100" w:type="dxa"/>
-              <w:bottom w:w="80" w:type="dxa"/>
-              <w:end w:w="100" w:type="dxa"/>
-            </w:tcMar>
-          </w:tcPr>
-          <w:p>
-            <w:pPr>
-              <w:spacing w:before="0" w:after="40" w:line="240" w:lineRule="auto"/>
+            <w:tcW w:type="dxa" w:w="4677"/>
+          </w:tcPr>
+          <w:p>
+            <w:pPr>
+              <w:spacing w:before="0" w:after="20" w:line="240" w:lineRule="auto"/>
             </w:pPr>
             <w:r>
               <w:rPr>
@@ -1247,18 +1036,11 @@
       <w:tr>
         <w:tc>
           <w:tcPr>
-            <w:tcW w:type="dxa" w:w="2744"/>
-            <w:vAlign w:val="top"/>
-            <w:tcMar>
-              <w:top w:w="80" w:type="dxa"/>
-              <w:start w:w="100" w:type="dxa"/>
-              <w:bottom w:w="80" w:type="dxa"/>
-              <w:end w:w="100" w:type="dxa"/>
-            </w:tcMar>
-          </w:tcPr>
-          <w:p>
-            <w:pPr>
-              <w:spacing w:before="0" w:after="40" w:line="240" w:lineRule="auto"/>
+            <w:tcW w:type="dxa" w:w="4677"/>
+          </w:tcPr>
+          <w:p>
+            <w:pPr>
+              <w:spacing w:before="0" w:after="20" w:line="240" w:lineRule="auto"/>
             </w:pPr>
             <w:r>
               <w:rPr>
@@ -1271,18 +1053,11 @@
         </w:tc>
         <w:tc>
           <w:tcPr>
-            <w:tcW w:type="dxa" w:w="7056"/>
-            <w:vAlign w:val="top"/>
-            <w:tcMar>
-              <w:top w:w="80" w:type="dxa"/>
-              <w:start w:w="100" w:type="dxa"/>
-              <w:bottom w:w="80" w:type="dxa"/>
-              <w:end w:w="100" w:type="dxa"/>
-            </w:tcMar>
-          </w:tcPr>
-          <w:p>
-            <w:pPr>
-              <w:spacing w:before="0" w:after="40" w:line="240" w:lineRule="auto"/>
+            <w:tcW w:type="dxa" w:w="4677"/>
+          </w:tcPr>
+          <w:p>
+            <w:pPr>
+              <w:spacing w:before="0" w:after="20" w:line="240" w:lineRule="auto"/>
             </w:pPr>
             <w:r>
               <w:rPr>
@@ -1297,18 +1072,11 @@
       <w:tr>
         <w:tc>
           <w:tcPr>
-            <w:tcW w:type="dxa" w:w="2744"/>
-            <w:vAlign w:val="top"/>
-            <w:tcMar>
-              <w:top w:w="80" w:type="dxa"/>
-              <w:start w:w="100" w:type="dxa"/>
-              <w:bottom w:w="80" w:type="dxa"/>
-              <w:end w:w="100" w:type="dxa"/>
-            </w:tcMar>
-          </w:tcPr>
-          <w:p>
-            <w:pPr>
-              <w:spacing w:before="0" w:after="40" w:line="240" w:lineRule="auto"/>
+            <w:tcW w:type="dxa" w:w="4677"/>
+          </w:tcPr>
+          <w:p>
+            <w:pPr>
+              <w:spacing w:before="0" w:after="20" w:line="240" w:lineRule="auto"/>
             </w:pPr>
             <w:r>
               <w:rPr>
@@ -1321,18 +1089,11 @@
         </w:tc>
         <w:tc>
           <w:tcPr>
-            <w:tcW w:type="dxa" w:w="7056"/>
-            <w:vAlign w:val="top"/>
-            <w:tcMar>
-              <w:top w:w="80" w:type="dxa"/>
-              <w:start w:w="100" w:type="dxa"/>
-              <w:bottom w:w="80" w:type="dxa"/>
-              <w:end w:w="100" w:type="dxa"/>
-            </w:tcMar>
-          </w:tcPr>
-          <w:p>
-            <w:pPr>
-              <w:spacing w:before="0" w:after="40" w:line="240" w:lineRule="auto"/>
+            <w:tcW w:type="dxa" w:w="4677"/>
+          </w:tcPr>
+          <w:p>
+            <w:pPr>
+              <w:spacing w:before="0" w:after="20" w:line="240" w:lineRule="auto"/>
             </w:pPr>
             <w:r>
               <w:rPr>
@@ -1347,18 +1108,11 @@
       <w:tr>
         <w:tc>
           <w:tcPr>
-            <w:tcW w:type="dxa" w:w="2744"/>
-            <w:vAlign w:val="top"/>
-            <w:tcMar>
-              <w:top w:w="80" w:type="dxa"/>
-              <w:start w:w="100" w:type="dxa"/>
-              <w:bottom w:w="80" w:type="dxa"/>
-              <w:end w:w="100" w:type="dxa"/>
-            </w:tcMar>
-          </w:tcPr>
-          <w:p>
-            <w:pPr>
-              <w:spacing w:before="0" w:after="40" w:line="240" w:lineRule="auto"/>
+            <w:tcW w:type="dxa" w:w="4677"/>
+          </w:tcPr>
+          <w:p>
+            <w:pPr>
+              <w:spacing w:before="0" w:after="20" w:line="240" w:lineRule="auto"/>
             </w:pPr>
             <w:r>
               <w:rPr>
@@ -1371,18 +1125,11 @@
         </w:tc>
         <w:tc>
           <w:tcPr>
-            <w:tcW w:type="dxa" w:w="7056"/>
-            <w:vAlign w:val="top"/>
-            <w:tcMar>
-              <w:top w:w="80" w:type="dxa"/>
-              <w:start w:w="100" w:type="dxa"/>
-              <w:bottom w:w="80" w:type="dxa"/>
-              <w:end w:w="100" w:type="dxa"/>
-            </w:tcMar>
-          </w:tcPr>
-          <w:p>
-            <w:pPr>
-              <w:spacing w:before="0" w:after="40" w:line="240" w:lineRule="auto"/>
+            <w:tcW w:type="dxa" w:w="4677"/>
+          </w:tcPr>
+          <w:p>
+            <w:pPr>
+              <w:spacing w:before="0" w:after="20" w:line="240" w:lineRule="auto"/>
             </w:pPr>
             <w:r>
               <w:rPr>
@@ -1419,17 +1166,8 @@
     <w:tbl>
       <w:tblPr>
         <w:tblStyle w:val="af4"/>
-        <w:tblW w:type="pct" w:w="10000"/>
+        <w:tblW w:type="auto" w:w="0"/>
         <w:tblLook w:firstColumn="1" w:firstRow="1" w:lastColumn="0" w:lastRow="0" w:noHBand="0" w:noVBand="1" w:val="04A0"/>
-        <w:tblLayout w:type="fixed"/>
-        <w:tblBorders>
-          <w:top w:val="single" w:sz="4" w:space="0" w:color="B7C3D0"/>
-          <w:left w:val="single" w:sz="4" w:space="0" w:color="B7C3D0"/>
-          <w:bottom w:val="single" w:sz="4" w:space="0" w:color="B7C3D0"/>
-          <w:right w:val="single" w:sz="4" w:space="0" w:color="B7C3D0"/>
-          <w:insideH w:val="single" w:sz="4" w:space="0" w:color="B7C3D0"/>
-          <w:insideV w:val="single" w:sz="4" w:space="0" w:color="B7C3D0"/>
-        </w:tblBorders>
       </w:tblPr>
       <w:tblGrid>
         <w:gridCol w:w="2339"/>
@@ -1443,26 +1181,17 @@
         </w:trPr>
         <w:tc>
           <w:tcPr>
-            <w:tcW w:type="dxa" w:w="2156"/>
-            <w:vAlign w:val="top"/>
-            <w:tcMar>
-              <w:top w:w="80" w:type="dxa"/>
-              <w:start w:w="100" w:type="dxa"/>
-              <w:bottom w:w="80" w:type="dxa"/>
-              <w:end w:w="100" w:type="dxa"/>
-            </w:tcMar>
-            <w:shd w:fill="D9EAF7" w:val="clear"/>
-          </w:tcPr>
-          <w:p>
-            <w:pPr>
-              <w:spacing w:before="0" w:after="40" w:line="240" w:lineRule="auto"/>
-              <w:jc w:val="center"/>
+            <w:tcW w:type="dxa" w:w="2339"/>
+          </w:tcPr>
+          <w:p>
+            <w:pPr>
+              <w:spacing w:before="0" w:after="20" w:line="240" w:lineRule="auto"/>
             </w:pPr>
             <w:r>
               <w:rPr>
                 <w:rFonts w:ascii="Times New Roman" w:hAnsi="Times New Roman" w:eastAsia="Times New Roman"/>
                 <w:b/>
-                <w:sz w:val="20"/>
+                <w:sz w:val="21"/>
               </w:rPr>
               <w:t>Позиция</w:t>
             </w:r>
@@ -1470,26 +1199,17 @@
         </w:tc>
         <w:tc>
           <w:tcPr>
-            <w:tcW w:type="dxa" w:w="2254"/>
-            <w:vAlign w:val="top"/>
-            <w:tcMar>
-              <w:top w:w="80" w:type="dxa"/>
-              <w:start w:w="100" w:type="dxa"/>
-              <w:bottom w:w="80" w:type="dxa"/>
-              <w:end w:w="100" w:type="dxa"/>
-            </w:tcMar>
-            <w:shd w:fill="D9EAF7" w:val="clear"/>
-          </w:tcPr>
-          <w:p>
-            <w:pPr>
-              <w:spacing w:before="0" w:after="40" w:line="240" w:lineRule="auto"/>
-              <w:jc w:val="center"/>
+            <w:tcW w:type="dxa" w:w="2339"/>
+          </w:tcPr>
+          <w:p>
+            <w:pPr>
+              <w:spacing w:before="0" w:after="20" w:line="240" w:lineRule="auto"/>
             </w:pPr>
             <w:r>
               <w:rPr>
                 <w:rFonts w:ascii="Times New Roman" w:hAnsi="Times New Roman" w:eastAsia="Times New Roman"/>
                 <w:b/>
-                <w:sz w:val="20"/>
+                <w:sz w:val="21"/>
               </w:rPr>
               <w:t>Средство и закреплённая версия</w:t>
             </w:r>
@@ -1497,26 +1217,17 @@
         </w:tc>
         <w:tc>
           <w:tcPr>
-            <w:tcW w:type="dxa" w:w="3234"/>
-            <w:vAlign w:val="top"/>
-            <w:tcMar>
-              <w:top w:w="80" w:type="dxa"/>
-              <w:start w:w="100" w:type="dxa"/>
-              <w:bottom w:w="80" w:type="dxa"/>
-              <w:end w:w="100" w:type="dxa"/>
-            </w:tcMar>
-            <w:shd w:fill="D9EAF7" w:val="clear"/>
-          </w:tcPr>
-          <w:p>
-            <w:pPr>
-              <w:spacing w:before="0" w:after="40" w:line="240" w:lineRule="auto"/>
-              <w:jc w:val="center"/>
+            <w:tcW w:type="dxa" w:w="2339"/>
+          </w:tcPr>
+          <w:p>
+            <w:pPr>
+              <w:spacing w:before="0" w:after="20" w:line="240" w:lineRule="auto"/>
             </w:pPr>
             <w:r>
               <w:rPr>
                 <w:rFonts w:ascii="Times New Roman" w:hAnsi="Times New Roman" w:eastAsia="Times New Roman"/>
                 <w:b/>
-                <w:sz w:val="20"/>
+                <w:sz w:val="21"/>
               </w:rPr>
               <w:t>Назначение и способ подключения</w:t>
             </w:r>
@@ -1524,26 +1235,17 @@
         </w:tc>
         <w:tc>
           <w:tcPr>
-            <w:tcW w:type="dxa" w:w="2156"/>
-            <w:vAlign w:val="top"/>
-            <w:tcMar>
-              <w:top w:w="80" w:type="dxa"/>
-              <w:start w:w="100" w:type="dxa"/>
-              <w:bottom w:w="80" w:type="dxa"/>
-              <w:end w:w="100" w:type="dxa"/>
-            </w:tcMar>
-            <w:shd w:fill="D9EAF7" w:val="clear"/>
-          </w:tcPr>
-          <w:p>
-            <w:pPr>
-              <w:spacing w:before="0" w:after="40" w:line="240" w:lineRule="auto"/>
-              <w:jc w:val="center"/>
+            <w:tcW w:type="dxa" w:w="2339"/>
+          </w:tcPr>
+          <w:p>
+            <w:pPr>
+              <w:spacing w:before="0" w:after="20" w:line="240" w:lineRule="auto"/>
             </w:pPr>
             <w:r>
               <w:rPr>
                 <w:rFonts w:ascii="Times New Roman" w:hAnsi="Times New Roman" w:eastAsia="Times New Roman"/>
                 <w:b/>
-                <w:sz w:val="20"/>
+                <w:sz w:val="21"/>
               </w:rPr>
               <w:t>Работает / запланировано, этап</w:t>
             </w:r>
@@ -1553,18 +1255,11 @@
       <w:tr>
         <w:tc>
           <w:tcPr>
-            <w:tcW w:type="dxa" w:w="2156"/>
-            <w:vAlign w:val="top"/>
-            <w:tcMar>
-              <w:top w:w="80" w:type="dxa"/>
-              <w:start w:w="100" w:type="dxa"/>
-              <w:bottom w:w="80" w:type="dxa"/>
-              <w:end w:w="100" w:type="dxa"/>
-            </w:tcMar>
-          </w:tcPr>
-          <w:p>
-            <w:pPr>
-              <w:spacing w:before="0" w:after="40" w:line="240" w:lineRule="auto"/>
+            <w:tcW w:type="dxa" w:w="2339"/>
+          </w:tcPr>
+          <w:p>
+            <w:pPr>
+              <w:spacing w:before="0" w:after="20" w:line="240" w:lineRule="auto"/>
             </w:pPr>
             <w:r>
               <w:rPr>
@@ -1577,18 +1272,11 @@
         </w:tc>
         <w:tc>
           <w:tcPr>
-            <w:tcW w:type="dxa" w:w="2254"/>
-            <w:vAlign w:val="top"/>
-            <w:tcMar>
-              <w:top w:w="80" w:type="dxa"/>
-              <w:start w:w="100" w:type="dxa"/>
-              <w:bottom w:w="80" w:type="dxa"/>
-              <w:end w:w="100" w:type="dxa"/>
-            </w:tcMar>
-          </w:tcPr>
-          <w:p>
-            <w:pPr>
-              <w:spacing w:before="0" w:after="40" w:line="240" w:lineRule="auto"/>
+            <w:tcW w:type="dxa" w:w="2339"/>
+          </w:tcPr>
+          <w:p>
+            <w:pPr>
+              <w:spacing w:before="0" w:after="20" w:line="240" w:lineRule="auto"/>
             </w:pPr>
             <w:r>
               <w:rPr>
@@ -1601,18 +1289,11 @@
         </w:tc>
         <w:tc>
           <w:tcPr>
-            <w:tcW w:type="dxa" w:w="3234"/>
-            <w:vAlign w:val="top"/>
-            <w:tcMar>
-              <w:top w:w="80" w:type="dxa"/>
-              <w:start w:w="100" w:type="dxa"/>
-              <w:bottom w:w="80" w:type="dxa"/>
-              <w:end w:w="100" w:type="dxa"/>
-            </w:tcMar>
-          </w:tcPr>
-          <w:p>
-            <w:pPr>
-              <w:spacing w:before="0" w:after="40" w:line="240" w:lineRule="auto"/>
+            <w:tcW w:type="dxa" w:w="2339"/>
+          </w:tcPr>
+          <w:p>
+            <w:pPr>
+              <w:spacing w:before="0" w:after="20" w:line="240" w:lineRule="auto"/>
             </w:pPr>
             <w:r>
               <w:rPr>
@@ -1625,18 +1306,11 @@
         </w:tc>
         <w:tc>
           <w:tcPr>
-            <w:tcW w:type="dxa" w:w="2156"/>
-            <w:vAlign w:val="top"/>
-            <w:tcMar>
-              <w:top w:w="80" w:type="dxa"/>
-              <w:start w:w="100" w:type="dxa"/>
-              <w:bottom w:w="80" w:type="dxa"/>
-              <w:end w:w="100" w:type="dxa"/>
-            </w:tcMar>
-          </w:tcPr>
-          <w:p>
-            <w:pPr>
-              <w:spacing w:before="0" w:after="40" w:line="240" w:lineRule="auto"/>
+            <w:tcW w:type="dxa" w:w="2339"/>
+          </w:tcPr>
+          <w:p>
+            <w:pPr>
+              <w:spacing w:before="0" w:after="20" w:line="240" w:lineRule="auto"/>
             </w:pPr>
             <w:r>
               <w:rPr>
@@ -1651,18 +1325,11 @@
       <w:tr>
         <w:tc>
           <w:tcPr>
-            <w:tcW w:type="dxa" w:w="2156"/>
-            <w:vAlign w:val="top"/>
-            <w:tcMar>
-              <w:top w:w="80" w:type="dxa"/>
-              <w:start w:w="100" w:type="dxa"/>
-              <w:bottom w:w="80" w:type="dxa"/>
-              <w:end w:w="100" w:type="dxa"/>
-            </w:tcMar>
-          </w:tcPr>
-          <w:p>
-            <w:pPr>
-              <w:spacing w:before="0" w:after="40" w:line="240" w:lineRule="auto"/>
+            <w:tcW w:type="dxa" w:w="2339"/>
+          </w:tcPr>
+          <w:p>
+            <w:pPr>
+              <w:spacing w:before="0" w:after="20" w:line="240" w:lineRule="auto"/>
             </w:pPr>
             <w:r>
               <w:rPr>
@@ -1675,18 +1342,11 @@
         </w:tc>
         <w:tc>
           <w:tcPr>
-            <w:tcW w:type="dxa" w:w="2254"/>
-            <w:vAlign w:val="top"/>
-            <w:tcMar>
-              <w:top w:w="80" w:type="dxa"/>
-              <w:start w:w="100" w:type="dxa"/>
-              <w:bottom w:w="80" w:type="dxa"/>
-              <w:end w:w="100" w:type="dxa"/>
-            </w:tcMar>
-          </w:tcPr>
-          <w:p>
-            <w:pPr>
-              <w:spacing w:before="0" w:after="40" w:line="240" w:lineRule="auto"/>
+            <w:tcW w:type="dxa" w:w="2339"/>
+          </w:tcPr>
+          <w:p>
+            <w:pPr>
+              <w:spacing w:before="0" w:after="20" w:line="240" w:lineRule="auto"/>
             </w:pPr>
             <w:r>
               <w:rPr>
@@ -1699,18 +1359,11 @@
         </w:tc>
         <w:tc>
           <w:tcPr>
-            <w:tcW w:type="dxa" w:w="3234"/>
-            <w:vAlign w:val="top"/>
-            <w:tcMar>
-              <w:top w:w="80" w:type="dxa"/>
-              <w:start w:w="100" w:type="dxa"/>
-              <w:bottom w:w="80" w:type="dxa"/>
-              <w:end w:w="100" w:type="dxa"/>
-            </w:tcMar>
-          </w:tcPr>
-          <w:p>
-            <w:pPr>
-              <w:spacing w:before="0" w:after="40" w:line="240" w:lineRule="auto"/>
+            <w:tcW w:type="dxa" w:w="2339"/>
+          </w:tcPr>
+          <w:p>
+            <w:pPr>
+              <w:spacing w:before="0" w:after="20" w:line="240" w:lineRule="auto"/>
             </w:pPr>
             <w:r>
               <w:rPr>
@@ -1723,18 +1376,11 @@
         </w:tc>
         <w:tc>
           <w:tcPr>
-            <w:tcW w:type="dxa" w:w="2156"/>
-            <w:vAlign w:val="top"/>
-            <w:tcMar>
-              <w:top w:w="80" w:type="dxa"/>
-              <w:start w:w="100" w:type="dxa"/>
-              <w:bottom w:w="80" w:type="dxa"/>
-              <w:end w:w="100" w:type="dxa"/>
-            </w:tcMar>
-          </w:tcPr>
-          <w:p>
-            <w:pPr>
-              <w:spacing w:before="0" w:after="40" w:line="240" w:lineRule="auto"/>
+            <w:tcW w:type="dxa" w:w="2339"/>
+          </w:tcPr>
+          <w:p>
+            <w:pPr>
+              <w:spacing w:before="0" w:after="20" w:line="240" w:lineRule="auto"/>
             </w:pPr>
             <w:r>
               <w:rPr>
@@ -1749,18 +1395,11 @@
       <w:tr>
         <w:tc>
           <w:tcPr>
-            <w:tcW w:type="dxa" w:w="2156"/>
-            <w:vAlign w:val="top"/>
-            <w:tcMar>
-              <w:top w:w="80" w:type="dxa"/>
-              <w:start w:w="100" w:type="dxa"/>
-              <w:bottom w:w="80" w:type="dxa"/>
-              <w:end w:w="100" w:type="dxa"/>
-            </w:tcMar>
-          </w:tcPr>
-          <w:p>
-            <w:pPr>
-              <w:spacing w:before="0" w:after="40" w:line="240" w:lineRule="auto"/>
+            <w:tcW w:type="dxa" w:w="2339"/>
+          </w:tcPr>
+          <w:p>
+            <w:pPr>
+              <w:spacing w:before="0" w:after="20" w:line="240" w:lineRule="auto"/>
             </w:pPr>
             <w:r>
               <w:rPr>
@@ -1773,18 +1412,11 @@
         </w:tc>
         <w:tc>
           <w:tcPr>
-            <w:tcW w:type="dxa" w:w="2254"/>
-            <w:vAlign w:val="top"/>
-            <w:tcMar>
-              <w:top w:w="80" w:type="dxa"/>
-              <w:start w:w="100" w:type="dxa"/>
-              <w:bottom w:w="80" w:type="dxa"/>
-              <w:end w:w="100" w:type="dxa"/>
-            </w:tcMar>
-          </w:tcPr>
-          <w:p>
-            <w:pPr>
-              <w:spacing w:before="0" w:after="40" w:line="240" w:lineRule="auto"/>
+            <w:tcW w:type="dxa" w:w="2339"/>
+          </w:tcPr>
+          <w:p>
+            <w:pPr>
+              <w:spacing w:before="0" w:after="20" w:line="240" w:lineRule="auto"/>
             </w:pPr>
             <w:r>
               <w:rPr>
@@ -1797,18 +1429,11 @@
         </w:tc>
         <w:tc>
           <w:tcPr>
-            <w:tcW w:type="dxa" w:w="3234"/>
-            <w:vAlign w:val="top"/>
-            <w:tcMar>
-              <w:top w:w="80" w:type="dxa"/>
-              <w:start w:w="100" w:type="dxa"/>
-              <w:bottom w:w="80" w:type="dxa"/>
-              <w:end w:w="100" w:type="dxa"/>
-            </w:tcMar>
-          </w:tcPr>
-          <w:p>
-            <w:pPr>
-              <w:spacing w:before="0" w:after="40" w:line="240" w:lineRule="auto"/>
+            <w:tcW w:type="dxa" w:w="2339"/>
+          </w:tcPr>
+          <w:p>
+            <w:pPr>
+              <w:spacing w:before="0" w:after="20" w:line="240" w:lineRule="auto"/>
             </w:pPr>
             <w:r>
               <w:rPr>
@@ -1821,18 +1446,11 @@
         </w:tc>
         <w:tc>
           <w:tcPr>
-            <w:tcW w:type="dxa" w:w="2156"/>
-            <w:vAlign w:val="top"/>
-            <w:tcMar>
-              <w:top w:w="80" w:type="dxa"/>
-              <w:start w:w="100" w:type="dxa"/>
-              <w:bottom w:w="80" w:type="dxa"/>
-              <w:end w:w="100" w:type="dxa"/>
-            </w:tcMar>
-          </w:tcPr>
-          <w:p>
-            <w:pPr>
-              <w:spacing w:before="0" w:after="40" w:line="240" w:lineRule="auto"/>
+            <w:tcW w:type="dxa" w:w="2339"/>
+          </w:tcPr>
+          <w:p>
+            <w:pPr>
+              <w:spacing w:before="0" w:after="20" w:line="240" w:lineRule="auto"/>
             </w:pPr>
             <w:r>
               <w:rPr>
@@ -1847,18 +1465,11 @@
       <w:tr>
         <w:tc>
           <w:tcPr>
-            <w:tcW w:type="dxa" w:w="2156"/>
-            <w:vAlign w:val="top"/>
-            <w:tcMar>
-              <w:top w:w="80" w:type="dxa"/>
-              <w:start w:w="100" w:type="dxa"/>
-              <w:bottom w:w="80" w:type="dxa"/>
-              <w:end w:w="100" w:type="dxa"/>
-            </w:tcMar>
-          </w:tcPr>
-          <w:p>
-            <w:pPr>
-              <w:spacing w:before="0" w:after="40" w:line="240" w:lineRule="auto"/>
+            <w:tcW w:type="dxa" w:w="2339"/>
+          </w:tcPr>
+          <w:p>
+            <w:pPr>
+              <w:spacing w:before="0" w:after="20" w:line="240" w:lineRule="auto"/>
             </w:pPr>
             <w:r>
               <w:rPr>
@@ -1871,18 +1482,11 @@
         </w:tc>
         <w:tc>
           <w:tcPr>
-            <w:tcW w:type="dxa" w:w="2254"/>
-            <w:vAlign w:val="top"/>
-            <w:tcMar>
-              <w:top w:w="80" w:type="dxa"/>
-              <w:start w:w="100" w:type="dxa"/>
-              <w:bottom w:w="80" w:type="dxa"/>
-              <w:end w:w="100" w:type="dxa"/>
-            </w:tcMar>
-          </w:tcPr>
-          <w:p>
-            <w:pPr>
-              <w:spacing w:before="0" w:after="40" w:line="240" w:lineRule="auto"/>
+            <w:tcW w:type="dxa" w:w="2339"/>
+          </w:tcPr>
+          <w:p>
+            <w:pPr>
+              <w:spacing w:before="0" w:after="20" w:line="240" w:lineRule="auto"/>
             </w:pPr>
             <w:r>
               <w:rPr>
@@ -1895,18 +1499,11 @@
         </w:tc>
         <w:tc>
           <w:tcPr>
-            <w:tcW w:type="dxa" w:w="3234"/>
-            <w:vAlign w:val="top"/>
-            <w:tcMar>
-              <w:top w:w="80" w:type="dxa"/>
-              <w:start w:w="100" w:type="dxa"/>
-              <w:bottom w:w="80" w:type="dxa"/>
-              <w:end w:w="100" w:type="dxa"/>
-            </w:tcMar>
-          </w:tcPr>
-          <w:p>
-            <w:pPr>
-              <w:spacing w:before="0" w:after="40" w:line="240" w:lineRule="auto"/>
+            <w:tcW w:type="dxa" w:w="2339"/>
+          </w:tcPr>
+          <w:p>
+            <w:pPr>
+              <w:spacing w:before="0" w:after="20" w:line="240" w:lineRule="auto"/>
             </w:pPr>
             <w:r>
               <w:rPr>
@@ -1919,18 +1516,11 @@
         </w:tc>
         <w:tc>
           <w:tcPr>
-            <w:tcW w:type="dxa" w:w="2156"/>
-            <w:vAlign w:val="top"/>
-            <w:tcMar>
-              <w:top w:w="80" w:type="dxa"/>
-              <w:start w:w="100" w:type="dxa"/>
-              <w:bottom w:w="80" w:type="dxa"/>
-              <w:end w:w="100" w:type="dxa"/>
-            </w:tcMar>
-          </w:tcPr>
-          <w:p>
-            <w:pPr>
-              <w:spacing w:before="0" w:after="40" w:line="240" w:lineRule="auto"/>
+            <w:tcW w:type="dxa" w:w="2339"/>
+          </w:tcPr>
+          <w:p>
+            <w:pPr>
+              <w:spacing w:before="0" w:after="20" w:line="240" w:lineRule="auto"/>
             </w:pPr>
             <w:r>
               <w:rPr>
@@ -1945,18 +1535,11 @@
       <w:tr>
         <w:tc>
           <w:tcPr>
-            <w:tcW w:type="dxa" w:w="2156"/>
-            <w:vAlign w:val="top"/>
-            <w:tcMar>
-              <w:top w:w="80" w:type="dxa"/>
-              <w:start w:w="100" w:type="dxa"/>
-              <w:bottom w:w="80" w:type="dxa"/>
-              <w:end w:w="100" w:type="dxa"/>
-            </w:tcMar>
-          </w:tcPr>
-          <w:p>
-            <w:pPr>
-              <w:spacing w:before="0" w:after="40" w:line="240" w:lineRule="auto"/>
+            <w:tcW w:type="dxa" w:w="2339"/>
+          </w:tcPr>
+          <w:p>
+            <w:pPr>
+              <w:spacing w:before="0" w:after="20" w:line="240" w:lineRule="auto"/>
             </w:pPr>
             <w:r>
               <w:rPr>
@@ -1969,18 +1552,11 @@
         </w:tc>
         <w:tc>
           <w:tcPr>
-            <w:tcW w:type="dxa" w:w="2254"/>
-            <w:vAlign w:val="top"/>
-            <w:tcMar>
-              <w:top w:w="80" w:type="dxa"/>
-              <w:start w:w="100" w:type="dxa"/>
-              <w:bottom w:w="80" w:type="dxa"/>
-              <w:end w:w="100" w:type="dxa"/>
-            </w:tcMar>
-          </w:tcPr>
-          <w:p>
-            <w:pPr>
-              <w:spacing w:before="0" w:after="40" w:line="240" w:lineRule="auto"/>
+            <w:tcW w:type="dxa" w:w="2339"/>
+          </w:tcPr>
+          <w:p>
+            <w:pPr>
+              <w:spacing w:before="0" w:after="20" w:line="240" w:lineRule="auto"/>
             </w:pPr>
             <w:r>
               <w:rPr>
@@ -1993,18 +1569,11 @@
         </w:tc>
         <w:tc>
           <w:tcPr>
-            <w:tcW w:type="dxa" w:w="3234"/>
-            <w:vAlign w:val="top"/>
-            <w:tcMar>
-              <w:top w:w="80" w:type="dxa"/>
-              <w:start w:w="100" w:type="dxa"/>
-              <w:bottom w:w="80" w:type="dxa"/>
-              <w:end w:w="100" w:type="dxa"/>
-            </w:tcMar>
-          </w:tcPr>
-          <w:p>
-            <w:pPr>
-              <w:spacing w:before="0" w:after="40" w:line="240" w:lineRule="auto"/>
+            <w:tcW w:type="dxa" w:w="2339"/>
+          </w:tcPr>
+          <w:p>
+            <w:pPr>
+              <w:spacing w:before="0" w:after="20" w:line="240" w:lineRule="auto"/>
             </w:pPr>
             <w:r>
               <w:rPr>
@@ -2017,18 +1586,11 @@
         </w:tc>
         <w:tc>
           <w:tcPr>
-            <w:tcW w:type="dxa" w:w="2156"/>
-            <w:vAlign w:val="top"/>
-            <w:tcMar>
-              <w:top w:w="80" w:type="dxa"/>
-              <w:start w:w="100" w:type="dxa"/>
-              <w:bottom w:w="80" w:type="dxa"/>
-              <w:end w:w="100" w:type="dxa"/>
-            </w:tcMar>
-          </w:tcPr>
-          <w:p>
-            <w:pPr>
-              <w:spacing w:before="0" w:after="40" w:line="240" w:lineRule="auto"/>
+            <w:tcW w:type="dxa" w:w="2339"/>
+          </w:tcPr>
+          <w:p>
+            <w:pPr>
+              <w:spacing w:before="0" w:after="20" w:line="240" w:lineRule="auto"/>
             </w:pPr>
             <w:r>
               <w:rPr>
@@ -2043,18 +1605,11 @@
       <w:tr>
         <w:tc>
           <w:tcPr>
-            <w:tcW w:type="dxa" w:w="2156"/>
-            <w:vAlign w:val="top"/>
-            <w:tcMar>
-              <w:top w:w="80" w:type="dxa"/>
-              <w:start w:w="100" w:type="dxa"/>
-              <w:bottom w:w="80" w:type="dxa"/>
-              <w:end w:w="100" w:type="dxa"/>
-            </w:tcMar>
-          </w:tcPr>
-          <w:p>
-            <w:pPr>
-              <w:spacing w:before="0" w:after="40" w:line="240" w:lineRule="auto"/>
+            <w:tcW w:type="dxa" w:w="2339"/>
+          </w:tcPr>
+          <w:p>
+            <w:pPr>
+              <w:spacing w:before="0" w:after="20" w:line="240" w:lineRule="auto"/>
             </w:pPr>
             <w:r>
               <w:rPr>
@@ -2067,18 +1622,11 @@
         </w:tc>
         <w:tc>
           <w:tcPr>
-            <w:tcW w:type="dxa" w:w="2254"/>
-            <w:vAlign w:val="top"/>
-            <w:tcMar>
-              <w:top w:w="80" w:type="dxa"/>
-              <w:start w:w="100" w:type="dxa"/>
-              <w:bottom w:w="80" w:type="dxa"/>
-              <w:end w:w="100" w:type="dxa"/>
-            </w:tcMar>
-          </w:tcPr>
-          <w:p>
-            <w:pPr>
-              <w:spacing w:before="0" w:after="40" w:line="240" w:lineRule="auto"/>
+            <w:tcW w:type="dxa" w:w="2339"/>
+          </w:tcPr>
+          <w:p>
+            <w:pPr>
+              <w:spacing w:before="0" w:after="20" w:line="240" w:lineRule="auto"/>
             </w:pPr>
             <w:r>
               <w:rPr>
@@ -2091,18 +1639,11 @@
         </w:tc>
         <w:tc>
           <w:tcPr>
-            <w:tcW w:type="dxa" w:w="3234"/>
-            <w:vAlign w:val="top"/>
-            <w:tcMar>
-              <w:top w:w="80" w:type="dxa"/>
-              <w:start w:w="100" w:type="dxa"/>
-              <w:bottom w:w="80" w:type="dxa"/>
-              <w:end w:w="100" w:type="dxa"/>
-            </w:tcMar>
-          </w:tcPr>
-          <w:p>
-            <w:pPr>
-              <w:spacing w:before="0" w:after="40" w:line="240" w:lineRule="auto"/>
+            <w:tcW w:type="dxa" w:w="2339"/>
+          </w:tcPr>
+          <w:p>
+            <w:pPr>
+              <w:spacing w:before="0" w:after="20" w:line="240" w:lineRule="auto"/>
             </w:pPr>
             <w:r>
               <w:rPr>
@@ -2115,18 +1656,11 @@
         </w:tc>
         <w:tc>
           <w:tcPr>
-            <w:tcW w:type="dxa" w:w="2156"/>
-            <w:vAlign w:val="top"/>
-            <w:tcMar>
-              <w:top w:w="80" w:type="dxa"/>
-              <w:start w:w="100" w:type="dxa"/>
-              <w:bottom w:w="80" w:type="dxa"/>
-              <w:end w:w="100" w:type="dxa"/>
-            </w:tcMar>
-          </w:tcPr>
-          <w:p>
-            <w:pPr>
-              <w:spacing w:before="0" w:after="40" w:line="240" w:lineRule="auto"/>
+            <w:tcW w:type="dxa" w:w="2339"/>
+          </w:tcPr>
+          <w:p>
+            <w:pPr>
+              <w:spacing w:before="0" w:after="20" w:line="240" w:lineRule="auto"/>
             </w:pPr>
             <w:r>
               <w:rPr>
@@ -2141,18 +1675,11 @@
       <w:tr>
         <w:tc>
           <w:tcPr>
-            <w:tcW w:type="dxa" w:w="2156"/>
-            <w:vAlign w:val="top"/>
-            <w:tcMar>
-              <w:top w:w="80" w:type="dxa"/>
-              <w:start w:w="100" w:type="dxa"/>
-              <w:bottom w:w="80" w:type="dxa"/>
-              <w:end w:w="100" w:type="dxa"/>
-            </w:tcMar>
-          </w:tcPr>
-          <w:p>
-            <w:pPr>
-              <w:spacing w:before="0" w:after="40" w:line="240" w:lineRule="auto"/>
+            <w:tcW w:type="dxa" w:w="2339"/>
+          </w:tcPr>
+          <w:p>
+            <w:pPr>
+              <w:spacing w:before="0" w:after="20" w:line="240" w:lineRule="auto"/>
             </w:pPr>
             <w:r>
               <w:rPr>
@@ -2165,18 +1692,11 @@
         </w:tc>
         <w:tc>
           <w:tcPr>
-            <w:tcW w:type="dxa" w:w="2254"/>
-            <w:vAlign w:val="top"/>
-            <w:tcMar>
-              <w:top w:w="80" w:type="dxa"/>
-              <w:start w:w="100" w:type="dxa"/>
-              <w:bottom w:w="80" w:type="dxa"/>
-              <w:end w:w="100" w:type="dxa"/>
-            </w:tcMar>
-          </w:tcPr>
-          <w:p>
-            <w:pPr>
-              <w:spacing w:before="0" w:after="40" w:line="240" w:lineRule="auto"/>
+            <w:tcW w:type="dxa" w:w="2339"/>
+          </w:tcPr>
+          <w:p>
+            <w:pPr>
+              <w:spacing w:before="0" w:after="20" w:line="240" w:lineRule="auto"/>
             </w:pPr>
             <w:r>
               <w:rPr>
@@ -2189,18 +1709,11 @@
         </w:tc>
         <w:tc>
           <w:tcPr>
-            <w:tcW w:type="dxa" w:w="3234"/>
-            <w:vAlign w:val="top"/>
-            <w:tcMar>
-              <w:top w:w="80" w:type="dxa"/>
-              <w:start w:w="100" w:type="dxa"/>
-              <w:bottom w:w="80" w:type="dxa"/>
-              <w:end w:w="100" w:type="dxa"/>
-            </w:tcMar>
-          </w:tcPr>
-          <w:p>
-            <w:pPr>
-              <w:spacing w:before="0" w:after="40" w:line="240" w:lineRule="auto"/>
+            <w:tcW w:type="dxa" w:w="2339"/>
+          </w:tcPr>
+          <w:p>
+            <w:pPr>
+              <w:spacing w:before="0" w:after="20" w:line="240" w:lineRule="auto"/>
             </w:pPr>
             <w:r>
               <w:rPr>
@@ -2213,18 +1726,11 @@
         </w:tc>
         <w:tc>
           <w:tcPr>
-            <w:tcW w:type="dxa" w:w="2156"/>
-            <w:vAlign w:val="top"/>
-            <w:tcMar>
-              <w:top w:w="80" w:type="dxa"/>
-              <w:start w:w="100" w:type="dxa"/>
-              <w:bottom w:w="80" w:type="dxa"/>
-              <w:end w:w="100" w:type="dxa"/>
-            </w:tcMar>
-          </w:tcPr>
-          <w:p>
-            <w:pPr>
-              <w:spacing w:before="0" w:after="40" w:line="240" w:lineRule="auto"/>
+            <w:tcW w:type="dxa" w:w="2339"/>
+          </w:tcPr>
+          <w:p>
+            <w:pPr>
+              <w:spacing w:before="0" w:after="20" w:line="240" w:lineRule="auto"/>
             </w:pPr>
             <w:r>
               <w:rPr>
@@ -2260,17 +1766,9 @@
     </w:p>
     <w:tbl>
       <w:tblPr>
-        <w:tblW w:type="pct" w:w="10000"/>
-        <w:tblLayout w:type="fixed"/>
+        <w:tblW w:type="dxa" w:w="9000"/>
+        <w:tblLayout w:type="autofit"/>
         <w:tblLook w:firstColumn="1" w:firstRow="1" w:lastColumn="0" w:lastRow="0" w:noHBand="0" w:noVBand="1" w:val="04A0"/>
-        <w:tblBorders>
-          <w:top w:val="single" w:sz="4" w:space="0" w:color="B7C3D0"/>
-          <w:left w:val="single" w:sz="4" w:space="0" w:color="B7C3D0"/>
-          <w:bottom w:val="single" w:sz="4" w:space="0" w:color="B7C3D0"/>
-          <w:right w:val="single" w:sz="4" w:space="0" w:color="B7C3D0"/>
-          <w:insideH w:val="single" w:sz="4" w:space="0" w:color="B7C3D0"/>
-          <w:insideV w:val="single" w:sz="4" w:space="0" w:color="B7C3D0"/>
-        </w:tblBorders>
       </w:tblPr>
       <w:tblGrid>
         <w:gridCol w:w="9355"/>
@@ -2281,16 +1779,15 @@
             <w:tcW w:type="dxa" w:w="9355"/>
             <w:shd w:fill="EDEDED" w:val="clear"/>
             <w:tcMar>
-              <w:top w:w="140" w:type="dxa"/>
-              <w:start w:w="160" w:type="dxa"/>
-              <w:bottom w:w="140" w:type="dxa"/>
-              <w:end w:w="160" w:type="dxa"/>
+              <w:top w:w="160" w:type="dxa"/>
+              <w:start w:w="180" w:type="dxa"/>
+              <w:bottom w:w="160" w:type="dxa"/>
+              <w:end w:w="180" w:type="dxa"/>
             </w:tcMar>
-            <w:vAlign w:val="center"/>
-          </w:tcPr>
-          <w:p>
-            <w:pPr>
-              <w:spacing w:before="40" w:after="0"/>
+          </w:tcPr>
+          <w:p>
+            <w:pPr>
+              <w:spacing w:before="0" w:after="20" w:line="240" w:lineRule="auto"/>
               <w:jc w:val="center"/>
             </w:pPr>
             <w:r>
@@ -2332,17 +1829,9 @@
     </w:p>
     <w:tbl>
       <w:tblPr>
-        <w:tblW w:type="pct" w:w="10000"/>
-        <w:tblLayout w:type="fixed"/>
+        <w:tblW w:type="dxa" w:w="9000"/>
+        <w:tblLayout w:type="autofit"/>
         <w:tblLook w:firstColumn="1" w:firstRow="1" w:lastColumn="0" w:lastRow="0" w:noHBand="0" w:noVBand="1" w:val="04A0"/>
-        <w:tblBorders>
-          <w:top w:val="single" w:sz="4" w:space="0" w:color="B7C3D0"/>
-          <w:left w:val="single" w:sz="4" w:space="0" w:color="B7C3D0"/>
-          <w:bottom w:val="single" w:sz="4" w:space="0" w:color="B7C3D0"/>
-          <w:right w:val="single" w:sz="4" w:space="0" w:color="B7C3D0"/>
-          <w:insideH w:val="single" w:sz="4" w:space="0" w:color="B7C3D0"/>
-          <w:insideV w:val="single" w:sz="4" w:space="0" w:color="B7C3D0"/>
-        </w:tblBorders>
       </w:tblPr>
       <w:tblGrid>
         <w:gridCol w:w="9355"/>
@@ -2353,16 +1842,15 @@
             <w:tcW w:type="dxa" w:w="9355"/>
             <w:shd w:fill="EDEDED" w:val="clear"/>
             <w:tcMar>
-              <w:top w:w="140" w:type="dxa"/>
-              <w:start w:w="160" w:type="dxa"/>
-              <w:bottom w:w="140" w:type="dxa"/>
-              <w:end w:w="160" w:type="dxa"/>
+              <w:top w:w="160" w:type="dxa"/>
+              <w:start w:w="180" w:type="dxa"/>
+              <w:bottom w:w="160" w:type="dxa"/>
+              <w:end w:w="180" w:type="dxa"/>
             </w:tcMar>
-            <w:vAlign w:val="center"/>
-          </w:tcPr>
-          <w:p>
-            <w:pPr>
-              <w:spacing w:before="40" w:after="0"/>
+          </w:tcPr>
+          <w:p>
+            <w:pPr>
+              <w:spacing w:before="0" w:after="20" w:line="240" w:lineRule="auto"/>
               <w:jc w:val="center"/>
             </w:pPr>
             <w:r>
@@ -2400,17 +1888,8 @@
     <w:tbl>
       <w:tblPr>
         <w:tblStyle w:val="af4"/>
-        <w:tblW w:type="pct" w:w="10000"/>
+        <w:tblW w:type="auto" w:w="0"/>
         <w:tblLook w:firstColumn="1" w:firstRow="1" w:lastColumn="0" w:lastRow="0" w:noHBand="0" w:noVBand="1" w:val="04A0"/>
-        <w:tblLayout w:type="fixed"/>
-        <w:tblBorders>
-          <w:top w:val="single" w:sz="4" w:space="0" w:color="B7C3D0"/>
-          <w:left w:val="single" w:sz="4" w:space="0" w:color="B7C3D0"/>
-          <w:bottom w:val="single" w:sz="4" w:space="0" w:color="B7C3D0"/>
-          <w:right w:val="single" w:sz="4" w:space="0" w:color="B7C3D0"/>
-          <w:insideH w:val="single" w:sz="4" w:space="0" w:color="B7C3D0"/>
-          <w:insideV w:val="single" w:sz="4" w:space="0" w:color="B7C3D0"/>
-        </w:tblBorders>
       </w:tblPr>
       <w:tblGrid>
         <w:gridCol w:w="3118"/>
@@ -2423,26 +1902,17 @@
         </w:trPr>
         <w:tc>
           <w:tcPr>
-            <w:tcW w:type="dxa" w:w="2450"/>
-            <w:vAlign w:val="top"/>
-            <w:tcMar>
-              <w:top w:w="80" w:type="dxa"/>
-              <w:start w:w="100" w:type="dxa"/>
-              <w:bottom w:w="80" w:type="dxa"/>
-              <w:end w:w="100" w:type="dxa"/>
-            </w:tcMar>
-            <w:shd w:fill="D9EAF7" w:val="clear"/>
-          </w:tcPr>
-          <w:p>
-            <w:pPr>
-              <w:spacing w:before="0" w:after="40" w:line="240" w:lineRule="auto"/>
-              <w:jc w:val="center"/>
+            <w:tcW w:type="dxa" w:w="3118"/>
+          </w:tcPr>
+          <w:p>
+            <w:pPr>
+              <w:spacing w:before="0" w:after="20" w:line="240" w:lineRule="auto"/>
             </w:pPr>
             <w:r>
               <w:rPr>
                 <w:rFonts w:ascii="Times New Roman" w:hAnsi="Times New Roman" w:eastAsia="Times New Roman"/>
                 <w:b/>
-                <w:sz w:val="20"/>
+                <w:sz w:val="21"/>
               </w:rPr>
               <w:t>Вопрос</w:t>
             </w:r>
@@ -2450,26 +1920,17 @@
         </w:tc>
         <w:tc>
           <w:tcPr>
-            <w:tcW w:type="dxa" w:w="3920"/>
-            <w:vAlign w:val="top"/>
-            <w:tcMar>
-              <w:top w:w="80" w:type="dxa"/>
-              <w:start w:w="100" w:type="dxa"/>
-              <w:bottom w:w="80" w:type="dxa"/>
-              <w:end w:w="100" w:type="dxa"/>
-            </w:tcMar>
-            <w:shd w:fill="D9EAF7" w:val="clear"/>
-          </w:tcPr>
-          <w:p>
-            <w:pPr>
-              <w:spacing w:before="0" w:after="40" w:line="240" w:lineRule="auto"/>
-              <w:jc w:val="center"/>
+            <w:tcW w:type="dxa" w:w="3118"/>
+          </w:tcPr>
+          <w:p>
+            <w:pPr>
+              <w:spacing w:before="0" w:after="20" w:line="240" w:lineRule="auto"/>
             </w:pPr>
             <w:r>
               <w:rPr>
                 <w:rFonts w:ascii="Times New Roman" w:hAnsi="Times New Roman" w:eastAsia="Times New Roman"/>
                 <w:b/>
-                <w:sz w:val="20"/>
+                <w:sz w:val="21"/>
               </w:rPr>
               <w:t>Режим разработки: команда и наблюдение</w:t>
             </w:r>
@@ -2477,26 +1938,17 @@
         </w:tc>
         <w:tc>
           <w:tcPr>
-            <w:tcW w:type="dxa" w:w="3430"/>
-            <w:vAlign w:val="top"/>
-            <w:tcMar>
-              <w:top w:w="80" w:type="dxa"/>
-              <w:start w:w="100" w:type="dxa"/>
-              <w:bottom w:w="80" w:type="dxa"/>
-              <w:end w:w="100" w:type="dxa"/>
-            </w:tcMar>
-            <w:shd w:fill="D9EAF7" w:val="clear"/>
-          </w:tcPr>
-          <w:p>
-            <w:pPr>
-              <w:spacing w:before="0" w:after="40" w:line="240" w:lineRule="auto"/>
-              <w:jc w:val="center"/>
+            <w:tcW w:type="dxa" w:w="3118"/>
+          </w:tcPr>
+          <w:p>
+            <w:pPr>
+              <w:spacing w:before="0" w:after="20" w:line="240" w:lineRule="auto"/>
             </w:pPr>
             <w:r>
               <w:rPr>
                 <w:rFonts w:ascii="Times New Roman" w:hAnsi="Times New Roman" w:eastAsia="Times New Roman"/>
                 <w:b/>
-                <w:sz w:val="20"/>
+                <w:sz w:val="21"/>
               </w:rPr>
               <w:t>Режим поставки: команда и наблюдение</w:t>
             </w:r>
@@ -2506,18 +1958,11 @@
       <w:tr>
         <w:tc>
           <w:tcPr>
-            <w:tcW w:type="dxa" w:w="2450"/>
-            <w:vAlign w:val="top"/>
-            <w:tcMar>
-              <w:top w:w="80" w:type="dxa"/>
-              <w:start w:w="100" w:type="dxa"/>
-              <w:bottom w:w="80" w:type="dxa"/>
-              <w:end w:w="100" w:type="dxa"/>
-            </w:tcMar>
-          </w:tcPr>
-          <w:p>
-            <w:pPr>
-              <w:spacing w:before="0" w:after="40" w:line="240" w:lineRule="auto"/>
+            <w:tcW w:type="dxa" w:w="3118"/>
+          </w:tcPr>
+          <w:p>
+            <w:pPr>
+              <w:spacing w:before="0" w:after="20" w:line="240" w:lineRule="auto"/>
             </w:pPr>
             <w:r>
               <w:rPr>
@@ -2530,18 +1975,11 @@
         </w:tc>
         <w:tc>
           <w:tcPr>
-            <w:tcW w:type="dxa" w:w="3920"/>
-            <w:vAlign w:val="top"/>
-            <w:tcMar>
-              <w:top w:w="80" w:type="dxa"/>
-              <w:start w:w="100" w:type="dxa"/>
-              <w:bottom w:w="80" w:type="dxa"/>
-              <w:end w:w="100" w:type="dxa"/>
-            </w:tcMar>
-          </w:tcPr>
-          <w:p>
-            <w:pPr>
-              <w:spacing w:before="0" w:after="40" w:line="240" w:lineRule="auto"/>
+            <w:tcW w:type="dxa" w:w="3118"/>
+          </w:tcPr>
+          <w:p>
+            <w:pPr>
+              <w:spacing w:before="0" w:after="20" w:line="240" w:lineRule="auto"/>
             </w:pPr>
             <w:r>
               <w:rPr>
@@ -2556,18 +1994,11 @@
         </w:tc>
         <w:tc>
           <w:tcPr>
-            <w:tcW w:type="dxa" w:w="3430"/>
-            <w:vAlign w:val="top"/>
-            <w:tcMar>
-              <w:top w:w="80" w:type="dxa"/>
-              <w:start w:w="100" w:type="dxa"/>
-              <w:bottom w:w="80" w:type="dxa"/>
-              <w:end w:w="100" w:type="dxa"/>
-            </w:tcMar>
-          </w:tcPr>
-          <w:p>
-            <w:pPr>
-              <w:spacing w:before="0" w:after="40" w:line="240" w:lineRule="auto"/>
+            <w:tcW w:type="dxa" w:w="3118"/>
+          </w:tcPr>
+          <w:p>
+            <w:pPr>
+              <w:spacing w:before="0" w:after="20" w:line="240" w:lineRule="auto"/>
             </w:pPr>
             <w:r>
               <w:rPr>
@@ -2584,18 +2015,11 @@
       <w:tr>
         <w:tc>
           <w:tcPr>
-            <w:tcW w:type="dxa" w:w="2450"/>
-            <w:vAlign w:val="top"/>
-            <w:tcMar>
-              <w:top w:w="80" w:type="dxa"/>
-              <w:start w:w="100" w:type="dxa"/>
-              <w:bottom w:w="80" w:type="dxa"/>
-              <w:end w:w="100" w:type="dxa"/>
-            </w:tcMar>
-          </w:tcPr>
-          <w:p>
-            <w:pPr>
-              <w:spacing w:before="0" w:after="40" w:line="240" w:lineRule="auto"/>
+            <w:tcW w:type="dxa" w:w="3118"/>
+          </w:tcPr>
+          <w:p>
+            <w:pPr>
+              <w:spacing w:before="0" w:after="20" w:line="240" w:lineRule="auto"/>
             </w:pPr>
             <w:r>
               <w:rPr>
@@ -2608,18 +2032,11 @@
         </w:tc>
         <w:tc>
           <w:tcPr>
-            <w:tcW w:type="dxa" w:w="3920"/>
-            <w:vAlign w:val="top"/>
-            <w:tcMar>
-              <w:top w:w="80" w:type="dxa"/>
-              <w:start w:w="100" w:type="dxa"/>
-              <w:bottom w:w="80" w:type="dxa"/>
-              <w:end w:w="100" w:type="dxa"/>
-            </w:tcMar>
-          </w:tcPr>
-          <w:p>
-            <w:pPr>
-              <w:spacing w:before="0" w:after="40" w:line="240" w:lineRule="auto"/>
+            <w:tcW w:type="dxa" w:w="3118"/>
+          </w:tcPr>
+          <w:p>
+            <w:pPr>
+              <w:spacing w:before="0" w:after="20" w:line="240" w:lineRule="auto"/>
             </w:pPr>
             <w:r>
               <w:rPr>
@@ -2634,18 +2051,11 @@
         </w:tc>
         <w:tc>
           <w:tcPr>
-            <w:tcW w:type="dxa" w:w="3430"/>
-            <w:vAlign w:val="top"/>
-            <w:tcMar>
-              <w:top w:w="80" w:type="dxa"/>
-              <w:start w:w="100" w:type="dxa"/>
-              <w:bottom w:w="80" w:type="dxa"/>
-              <w:end w:w="100" w:type="dxa"/>
-            </w:tcMar>
-          </w:tcPr>
-          <w:p>
-            <w:pPr>
-              <w:spacing w:before="0" w:after="40" w:line="240" w:lineRule="auto"/>
+            <w:tcW w:type="dxa" w:w="3118"/>
+          </w:tcPr>
+          <w:p>
+            <w:pPr>
+              <w:spacing w:before="0" w:after="20" w:line="240" w:lineRule="auto"/>
             </w:pPr>
             <w:r>
               <w:rPr>
@@ -2662,18 +2072,11 @@
       <w:tr>
         <w:tc>
           <w:tcPr>
-            <w:tcW w:type="dxa" w:w="2450"/>
-            <w:vAlign w:val="top"/>
-            <w:tcMar>
-              <w:top w:w="80" w:type="dxa"/>
-              <w:start w:w="100" w:type="dxa"/>
-              <w:bottom w:w="80" w:type="dxa"/>
-              <w:end w:w="100" w:type="dxa"/>
-            </w:tcMar>
-          </w:tcPr>
-          <w:p>
-            <w:pPr>
-              <w:spacing w:before="0" w:after="40" w:line="240" w:lineRule="auto"/>
+            <w:tcW w:type="dxa" w:w="3118"/>
+          </w:tcPr>
+          <w:p>
+            <w:pPr>
+              <w:spacing w:before="0" w:after="20" w:line="240" w:lineRule="auto"/>
             </w:pPr>
             <w:r>
               <w:rPr>
@@ -2686,18 +2089,11 @@
         </w:tc>
         <w:tc>
           <w:tcPr>
-            <w:tcW w:type="dxa" w:w="3920"/>
-            <w:vAlign w:val="top"/>
-            <w:tcMar>
-              <w:top w:w="80" w:type="dxa"/>
-              <w:start w:w="100" w:type="dxa"/>
-              <w:bottom w:w="80" w:type="dxa"/>
-              <w:end w:w="100" w:type="dxa"/>
-            </w:tcMar>
-          </w:tcPr>
-          <w:p>
-            <w:pPr>
-              <w:spacing w:before="0" w:after="40" w:line="240" w:lineRule="auto"/>
+            <w:tcW w:type="dxa" w:w="3118"/>
+          </w:tcPr>
+          <w:p>
+            <w:pPr>
+              <w:spacing w:before="0" w:after="20" w:line="240" w:lineRule="auto"/>
             </w:pPr>
             <w:r>
               <w:rPr>
@@ -2712,18 +2108,11 @@
         </w:tc>
         <w:tc>
           <w:tcPr>
-            <w:tcW w:type="dxa" w:w="3430"/>
-            <w:vAlign w:val="top"/>
-            <w:tcMar>
-              <w:top w:w="80" w:type="dxa"/>
-              <w:start w:w="100" w:type="dxa"/>
-              <w:bottom w:w="80" w:type="dxa"/>
-              <w:end w:w="100" w:type="dxa"/>
-            </w:tcMar>
-          </w:tcPr>
-          <w:p>
-            <w:pPr>
-              <w:spacing w:before="0" w:after="40" w:line="240" w:lineRule="auto"/>
+            <w:tcW w:type="dxa" w:w="3118"/>
+          </w:tcPr>
+          <w:p>
+            <w:pPr>
+              <w:spacing w:before="0" w:after="20" w:line="240" w:lineRule="auto"/>
             </w:pPr>
             <w:r>
               <w:rPr>
@@ -2740,18 +2129,11 @@
       <w:tr>
         <w:tc>
           <w:tcPr>
-            <w:tcW w:type="dxa" w:w="2450"/>
-            <w:vAlign w:val="top"/>
-            <w:tcMar>
-              <w:top w:w="80" w:type="dxa"/>
-              <w:start w:w="100" w:type="dxa"/>
-              <w:bottom w:w="80" w:type="dxa"/>
-              <w:end w:w="100" w:type="dxa"/>
-            </w:tcMar>
-          </w:tcPr>
-          <w:p>
-            <w:pPr>
-              <w:spacing w:before="0" w:after="40" w:line="240" w:lineRule="auto"/>
+            <w:tcW w:type="dxa" w:w="3118"/>
+          </w:tcPr>
+          <w:p>
+            <w:pPr>
+              <w:spacing w:before="0" w:after="20" w:line="240" w:lineRule="auto"/>
             </w:pPr>
             <w:r>
               <w:rPr>
@@ -2764,18 +2146,11 @@
         </w:tc>
         <w:tc>
           <w:tcPr>
-            <w:tcW w:type="dxa" w:w="3920"/>
-            <w:vAlign w:val="top"/>
-            <w:tcMar>
-              <w:top w:w="80" w:type="dxa"/>
-              <w:start w:w="100" w:type="dxa"/>
-              <w:bottom w:w="80" w:type="dxa"/>
-              <w:end w:w="100" w:type="dxa"/>
-            </w:tcMar>
-          </w:tcPr>
-          <w:p>
-            <w:pPr>
-              <w:spacing w:before="0" w:after="40" w:line="240" w:lineRule="auto"/>
+            <w:tcW w:type="dxa" w:w="3118"/>
+          </w:tcPr>
+          <w:p>
+            <w:pPr>
+              <w:spacing w:before="0" w:after="20" w:line="240" w:lineRule="auto"/>
             </w:pPr>
             <w:r>
               <w:rPr>
@@ -2790,18 +2165,11 @@
         </w:tc>
         <w:tc>
           <w:tcPr>
-            <w:tcW w:type="dxa" w:w="3430"/>
-            <w:vAlign w:val="top"/>
-            <w:tcMar>
-              <w:top w:w="80" w:type="dxa"/>
-              <w:start w:w="100" w:type="dxa"/>
-              <w:bottom w:w="80" w:type="dxa"/>
-              <w:end w:w="100" w:type="dxa"/>
-            </w:tcMar>
-          </w:tcPr>
-          <w:p>
-            <w:pPr>
-              <w:spacing w:before="0" w:after="40" w:line="240" w:lineRule="auto"/>
+            <w:tcW w:type="dxa" w:w="3118"/>
+          </w:tcPr>
+          <w:p>
+            <w:pPr>
+              <w:spacing w:before="0" w:after="20" w:line="240" w:lineRule="auto"/>
             </w:pPr>
             <w:r>
               <w:rPr>
@@ -2818,18 +2186,11 @@
       <w:tr>
         <w:tc>
           <w:tcPr>
-            <w:tcW w:type="dxa" w:w="2450"/>
-            <w:vAlign w:val="top"/>
-            <w:tcMar>
-              <w:top w:w="80" w:type="dxa"/>
-              <w:start w:w="100" w:type="dxa"/>
-              <w:bottom w:w="80" w:type="dxa"/>
-              <w:end w:w="100" w:type="dxa"/>
-            </w:tcMar>
-          </w:tcPr>
-          <w:p>
-            <w:pPr>
-              <w:spacing w:before="0" w:after="40" w:line="240" w:lineRule="auto"/>
+            <w:tcW w:type="dxa" w:w="3118"/>
+          </w:tcPr>
+          <w:p>
+            <w:pPr>
+              <w:spacing w:before="0" w:after="20" w:line="240" w:lineRule="auto"/>
             </w:pPr>
             <w:r>
               <w:rPr>
@@ -2842,18 +2203,11 @@
         </w:tc>
         <w:tc>
           <w:tcPr>
-            <w:tcW w:type="dxa" w:w="3920"/>
-            <w:vAlign w:val="top"/>
-            <w:tcMar>
-              <w:top w:w="80" w:type="dxa"/>
-              <w:start w:w="100" w:type="dxa"/>
-              <w:bottom w:w="80" w:type="dxa"/>
-              <w:end w:w="100" w:type="dxa"/>
-            </w:tcMar>
-          </w:tcPr>
-          <w:p>
-            <w:pPr>
-              <w:spacing w:before="0" w:after="40" w:line="240" w:lineRule="auto"/>
+            <w:tcW w:type="dxa" w:w="3118"/>
+          </w:tcPr>
+          <w:p>
+            <w:pPr>
+              <w:spacing w:before="0" w:after="20" w:line="240" w:lineRule="auto"/>
             </w:pPr>
             <w:r>
               <w:rPr>
@@ -2868,18 +2222,11 @@
         </w:tc>
         <w:tc>
           <w:tcPr>
-            <w:tcW w:type="dxa" w:w="3430"/>
-            <w:vAlign w:val="top"/>
-            <w:tcMar>
-              <w:top w:w="80" w:type="dxa"/>
-              <w:start w:w="100" w:type="dxa"/>
-              <w:bottom w:w="80" w:type="dxa"/>
-              <w:end w:w="100" w:type="dxa"/>
-            </w:tcMar>
-          </w:tcPr>
-          <w:p>
-            <w:pPr>
-              <w:spacing w:before="0" w:after="40" w:line="240" w:lineRule="auto"/>
+            <w:tcW w:type="dxa" w:w="3118"/>
+          </w:tcPr>
+          <w:p>
+            <w:pPr>
+              <w:spacing w:before="0" w:after="20" w:line="240" w:lineRule="auto"/>
             </w:pPr>
             <w:r>
               <w:rPr>
@@ -2896,18 +2243,11 @@
       <w:tr>
         <w:tc>
           <w:tcPr>
-            <w:tcW w:type="dxa" w:w="2450"/>
-            <w:vAlign w:val="top"/>
-            <w:tcMar>
-              <w:top w:w="80" w:type="dxa"/>
-              <w:start w:w="100" w:type="dxa"/>
-              <w:bottom w:w="80" w:type="dxa"/>
-              <w:end w:w="100" w:type="dxa"/>
-            </w:tcMar>
-          </w:tcPr>
-          <w:p>
-            <w:pPr>
-              <w:spacing w:before="0" w:after="40" w:line="240" w:lineRule="auto"/>
+            <w:tcW w:type="dxa" w:w="3118"/>
+          </w:tcPr>
+          <w:p>
+            <w:pPr>
+              <w:spacing w:before="0" w:after="20" w:line="240" w:lineRule="auto"/>
             </w:pPr>
             <w:r>
               <w:rPr>
@@ -2920,18 +2260,11 @@
         </w:tc>
         <w:tc>
           <w:tcPr>
-            <w:tcW w:type="dxa" w:w="3920"/>
-            <w:vAlign w:val="top"/>
-            <w:tcMar>
-              <w:top w:w="80" w:type="dxa"/>
-              <w:start w:w="100" w:type="dxa"/>
-              <w:bottom w:w="80" w:type="dxa"/>
-              <w:end w:w="100" w:type="dxa"/>
-            </w:tcMar>
-          </w:tcPr>
-          <w:p>
-            <w:pPr>
-              <w:spacing w:before="0" w:after="40" w:line="240" w:lineRule="auto"/>
+            <w:tcW w:type="dxa" w:w="3118"/>
+          </w:tcPr>
+          <w:p>
+            <w:pPr>
+              <w:spacing w:before="0" w:after="20" w:line="240" w:lineRule="auto"/>
             </w:pPr>
             <w:r>
               <w:rPr>
@@ -2946,18 +2279,11 @@
         </w:tc>
         <w:tc>
           <w:tcPr>
-            <w:tcW w:type="dxa" w:w="3430"/>
-            <w:vAlign w:val="top"/>
-            <w:tcMar>
-              <w:top w:w="80" w:type="dxa"/>
-              <w:start w:w="100" w:type="dxa"/>
-              <w:bottom w:w="80" w:type="dxa"/>
-              <w:end w:w="100" w:type="dxa"/>
-            </w:tcMar>
-          </w:tcPr>
-          <w:p>
-            <w:pPr>
-              <w:spacing w:before="0" w:after="40" w:line="240" w:lineRule="auto"/>
+            <w:tcW w:type="dxa" w:w="3118"/>
+          </w:tcPr>
+          <w:p>
+            <w:pPr>
+              <w:spacing w:before="0" w:after="20" w:line="240" w:lineRule="auto"/>
             </w:pPr>
             <w:r>
               <w:rPr>
@@ -2979,17 +2305,9 @@
     </w:p>
     <w:tbl>
       <w:tblPr>
-        <w:tblW w:type="pct" w:w="10000"/>
-        <w:tblLayout w:type="fixed"/>
+        <w:tblW w:type="dxa" w:w="9000"/>
+        <w:tblLayout w:type="autofit"/>
         <w:tblLook w:firstColumn="1" w:firstRow="1" w:lastColumn="0" w:lastRow="0" w:noHBand="0" w:noVBand="1" w:val="04A0"/>
-        <w:tblBorders>
-          <w:top w:val="single" w:sz="4" w:space="0" w:color="B7C3D0"/>
-          <w:left w:val="single" w:sz="4" w:space="0" w:color="B7C3D0"/>
-          <w:bottom w:val="single" w:sz="4" w:space="0" w:color="B7C3D0"/>
-          <w:right w:val="single" w:sz="4" w:space="0" w:color="B7C3D0"/>
-          <w:insideH w:val="single" w:sz="4" w:space="0" w:color="B7C3D0"/>
-          <w:insideV w:val="single" w:sz="4" w:space="0" w:color="B7C3D0"/>
-        </w:tblBorders>
       </w:tblPr>
       <w:tblGrid>
         <w:gridCol w:w="9355"/>
@@ -3000,16 +2318,15 @@
             <w:tcW w:type="dxa" w:w="9355"/>
             <w:shd w:fill="EDEDED" w:val="clear"/>
             <w:tcMar>
-              <w:top w:w="140" w:type="dxa"/>
-              <w:start w:w="160" w:type="dxa"/>
-              <w:bottom w:w="140" w:type="dxa"/>
-              <w:end w:w="160" w:type="dxa"/>
+              <w:top w:w="160" w:type="dxa"/>
+              <w:start w:w="180" w:type="dxa"/>
+              <w:bottom w:w="160" w:type="dxa"/>
+              <w:end w:w="180" w:type="dxa"/>
             </w:tcMar>
-            <w:vAlign w:val="center"/>
-          </w:tcPr>
-          <w:p>
-            <w:pPr>
-              <w:spacing w:before="40" w:after="0"/>
+          </w:tcPr>
+          <w:p>
+            <w:pPr>
+              <w:spacing w:before="0" w:after="20" w:line="240" w:lineRule="auto"/>
               <w:jc w:val="center"/>
             </w:pPr>
             <w:r>
@@ -3055,17 +2372,8 @@
     <w:tbl>
       <w:tblPr>
         <w:tblStyle w:val="af4"/>
-        <w:tblW w:type="pct" w:w="10000"/>
+        <w:tblW w:type="auto" w:w="0"/>
         <w:tblLook w:firstColumn="1" w:firstRow="1" w:lastColumn="0" w:lastRow="0" w:noHBand="0" w:noVBand="1" w:val="04A0"/>
-        <w:tblLayout w:type="fixed"/>
-        <w:tblBorders>
-          <w:top w:val="single" w:sz="4" w:space="0" w:color="B7C3D0"/>
-          <w:left w:val="single" w:sz="4" w:space="0" w:color="B7C3D0"/>
-          <w:bottom w:val="single" w:sz="4" w:space="0" w:color="B7C3D0"/>
-          <w:right w:val="single" w:sz="4" w:space="0" w:color="B7C3D0"/>
-          <w:insideH w:val="single" w:sz="4" w:space="0" w:color="B7C3D0"/>
-          <w:insideV w:val="single" w:sz="4" w:space="0" w:color="B7C3D0"/>
-        </w:tblBorders>
       </w:tblPr>
       <w:tblGrid>
         <w:gridCol w:w="2339"/>
@@ -3079,26 +2387,17 @@
         </w:trPr>
         <w:tc>
           <w:tcPr>
-            <w:tcW w:type="dxa" w:w="2156"/>
-            <w:vAlign w:val="top"/>
-            <w:tcMar>
-              <w:top w:w="80" w:type="dxa"/>
-              <w:start w:w="100" w:type="dxa"/>
-              <w:bottom w:w="80" w:type="dxa"/>
-              <w:end w:w="100" w:type="dxa"/>
-            </w:tcMar>
-            <w:shd w:fill="D9EAF7" w:val="clear"/>
-          </w:tcPr>
-          <w:p>
-            <w:pPr>
-              <w:spacing w:before="0" w:after="40" w:line="240" w:lineRule="auto"/>
-              <w:jc w:val="center"/>
+            <w:tcW w:type="dxa" w:w="2339"/>
+          </w:tcPr>
+          <w:p>
+            <w:pPr>
+              <w:spacing w:before="0" w:after="20" w:line="240" w:lineRule="auto"/>
             </w:pPr>
             <w:r>
               <w:rPr>
                 <w:rFonts w:ascii="Times New Roman" w:hAnsi="Times New Roman" w:eastAsia="Times New Roman"/>
                 <w:b/>
-                <w:sz w:val="20"/>
+                <w:sz w:val="21"/>
               </w:rPr>
               <w:t>Проверка</w:t>
             </w:r>
@@ -3106,26 +2405,17 @@
         </w:tc>
         <w:tc>
           <w:tcPr>
-            <w:tcW w:type="dxa" w:w="2254"/>
-            <w:vAlign w:val="top"/>
-            <w:tcMar>
-              <w:top w:w="80" w:type="dxa"/>
-              <w:start w:w="100" w:type="dxa"/>
-              <w:bottom w:w="80" w:type="dxa"/>
-              <w:end w:w="100" w:type="dxa"/>
-            </w:tcMar>
-            <w:shd w:fill="D9EAF7" w:val="clear"/>
-          </w:tcPr>
-          <w:p>
-            <w:pPr>
-              <w:spacing w:before="0" w:after="40" w:line="240" w:lineRule="auto"/>
-              <w:jc w:val="center"/>
+            <w:tcW w:type="dxa" w:w="2339"/>
+          </w:tcPr>
+          <w:p>
+            <w:pPr>
+              <w:spacing w:before="0" w:after="20" w:line="240" w:lineRule="auto"/>
             </w:pPr>
             <w:r>
               <w:rPr>
                 <w:rFonts w:ascii="Times New Roman" w:hAnsi="Times New Roman" w:eastAsia="Times New Roman"/>
                 <w:b/>
-                <w:sz w:val="20"/>
+                <w:sz w:val="21"/>
               </w:rPr>
               <w:t>Ожидаемый результат</w:t>
             </w:r>
@@ -3133,26 +2423,17 @@
         </w:tc>
         <w:tc>
           <w:tcPr>
-            <w:tcW w:type="dxa" w:w="3234"/>
-            <w:vAlign w:val="top"/>
-            <w:tcMar>
-              <w:top w:w="80" w:type="dxa"/>
-              <w:start w:w="100" w:type="dxa"/>
-              <w:bottom w:w="80" w:type="dxa"/>
-              <w:end w:w="100" w:type="dxa"/>
-            </w:tcMar>
-            <w:shd w:fill="D9EAF7" w:val="clear"/>
-          </w:tcPr>
-          <w:p>
-            <w:pPr>
-              <w:spacing w:before="0" w:after="40" w:line="240" w:lineRule="auto"/>
-              <w:jc w:val="center"/>
+            <w:tcW w:type="dxa" w:w="2339"/>
+          </w:tcPr>
+          <w:p>
+            <w:pPr>
+              <w:spacing w:before="0" w:after="20" w:line="240" w:lineRule="auto"/>
             </w:pPr>
             <w:r>
               <w:rPr>
                 <w:rFonts w:ascii="Times New Roman" w:hAnsi="Times New Roman" w:eastAsia="Times New Roman"/>
                 <w:b/>
-                <w:sz w:val="20"/>
+                <w:sz w:val="21"/>
               </w:rPr>
               <w:t>Фактический результат/статус</w:t>
             </w:r>
@@ -3160,26 +2441,17 @@
         </w:tc>
         <w:tc>
           <w:tcPr>
-            <w:tcW w:type="dxa" w:w="2156"/>
-            <w:vAlign w:val="top"/>
-            <w:tcMar>
-              <w:top w:w="80" w:type="dxa"/>
-              <w:start w:w="100" w:type="dxa"/>
-              <w:bottom w:w="80" w:type="dxa"/>
-              <w:end w:w="100" w:type="dxa"/>
-            </w:tcMar>
-            <w:shd w:fill="D9EAF7" w:val="clear"/>
-          </w:tcPr>
-          <w:p>
-            <w:pPr>
-              <w:spacing w:before="0" w:after="40" w:line="240" w:lineRule="auto"/>
-              <w:jc w:val="center"/>
+            <w:tcW w:type="dxa" w:w="2339"/>
+          </w:tcPr>
+          <w:p>
+            <w:pPr>
+              <w:spacing w:before="0" w:after="20" w:line="240" w:lineRule="auto"/>
             </w:pPr>
             <w:r>
               <w:rPr>
                 <w:rFonts w:ascii="Times New Roman" w:hAnsi="Times New Roman" w:eastAsia="Times New Roman"/>
                 <w:b/>
-                <w:sz w:val="20"/>
+                <w:sz w:val="21"/>
               </w:rPr>
               <w:t>Команда, версия и журнал</w:t>
             </w:r>
@@ -3189,18 +2461,11 @@
       <w:tr>
         <w:tc>
           <w:tcPr>
-            <w:tcW w:type="dxa" w:w="2156"/>
-            <w:vAlign w:val="top"/>
-            <w:tcMar>
-              <w:top w:w="80" w:type="dxa"/>
-              <w:start w:w="100" w:type="dxa"/>
-              <w:bottom w:w="80" w:type="dxa"/>
-              <w:end w:w="100" w:type="dxa"/>
-            </w:tcMar>
-          </w:tcPr>
-          <w:p>
-            <w:pPr>
-              <w:spacing w:before="0" w:after="40" w:line="240" w:lineRule="auto"/>
+            <w:tcW w:type="dxa" w:w="2339"/>
+          </w:tcPr>
+          <w:p>
+            <w:pPr>
+              <w:spacing w:before="0" w:after="20" w:line="240" w:lineRule="auto"/>
             </w:pPr>
             <w:r>
               <w:rPr>
@@ -3213,18 +2478,11 @@
         </w:tc>
         <w:tc>
           <w:tcPr>
-            <w:tcW w:type="dxa" w:w="2254"/>
-            <w:vAlign w:val="top"/>
-            <w:tcMar>
-              <w:top w:w="80" w:type="dxa"/>
-              <w:start w:w="100" w:type="dxa"/>
-              <w:bottom w:w="80" w:type="dxa"/>
-              <w:end w:w="100" w:type="dxa"/>
-            </w:tcMar>
-          </w:tcPr>
-          <w:p>
-            <w:pPr>
-              <w:spacing w:before="0" w:after="40" w:line="240" w:lineRule="auto"/>
+            <w:tcW w:type="dxa" w:w="2339"/>
+          </w:tcPr>
+          <w:p>
+            <w:pPr>
+              <w:spacing w:before="0" w:after="20" w:line="240" w:lineRule="auto"/>
             </w:pPr>
             <w:r>
               <w:rPr>
@@ -3237,18 +2495,11 @@
         </w:tc>
         <w:tc>
           <w:tcPr>
-            <w:tcW w:type="dxa" w:w="3234"/>
-            <w:vAlign w:val="top"/>
-            <w:tcMar>
-              <w:top w:w="80" w:type="dxa"/>
-              <w:start w:w="100" w:type="dxa"/>
-              <w:bottom w:w="80" w:type="dxa"/>
-              <w:end w:w="100" w:type="dxa"/>
-            </w:tcMar>
-          </w:tcPr>
-          <w:p>
-            <w:pPr>
-              <w:spacing w:before="0" w:after="40" w:line="240" w:lineRule="auto"/>
+            <w:tcW w:type="dxa" w:w="2339"/>
+          </w:tcPr>
+          <w:p>
+            <w:pPr>
+              <w:spacing w:before="0" w:after="20" w:line="240" w:lineRule="auto"/>
             </w:pPr>
             <w:r>
               <w:rPr>
@@ -3261,18 +2512,11 @@
         </w:tc>
         <w:tc>
           <w:tcPr>
-            <w:tcW w:type="dxa" w:w="2156"/>
-            <w:vAlign w:val="top"/>
-            <w:tcMar>
-              <w:top w:w="80" w:type="dxa"/>
-              <w:start w:w="100" w:type="dxa"/>
-              <w:bottom w:w="80" w:type="dxa"/>
-              <w:end w:w="100" w:type="dxa"/>
-            </w:tcMar>
-          </w:tcPr>
-          <w:p>
-            <w:pPr>
-              <w:spacing w:before="0" w:after="40" w:line="240" w:lineRule="auto"/>
+            <w:tcW w:type="dxa" w:w="2339"/>
+          </w:tcPr>
+          <w:p>
+            <w:pPr>
+              <w:spacing w:before="0" w:after="20" w:line="240" w:lineRule="auto"/>
             </w:pPr>
             <w:r>
               <w:rPr>
@@ -3287,18 +2531,11 @@
       <w:tr>
         <w:tc>
           <w:tcPr>
-            <w:tcW w:type="dxa" w:w="2156"/>
-            <w:vAlign w:val="top"/>
-            <w:tcMar>
-              <w:top w:w="80" w:type="dxa"/>
-              <w:start w:w="100" w:type="dxa"/>
-              <w:bottom w:w="80" w:type="dxa"/>
-              <w:end w:w="100" w:type="dxa"/>
-            </w:tcMar>
-          </w:tcPr>
-          <w:p>
-            <w:pPr>
-              <w:spacing w:before="0" w:after="40" w:line="240" w:lineRule="auto"/>
+            <w:tcW w:type="dxa" w:w="2339"/>
+          </w:tcPr>
+          <w:p>
+            <w:pPr>
+              <w:spacing w:before="0" w:after="20" w:line="240" w:lineRule="auto"/>
             </w:pPr>
             <w:r>
               <w:rPr>
@@ -3311,18 +2548,11 @@
         </w:tc>
         <w:tc>
           <w:tcPr>
-            <w:tcW w:type="dxa" w:w="2254"/>
-            <w:vAlign w:val="top"/>
-            <w:tcMar>
-              <w:top w:w="80" w:type="dxa"/>
-              <w:start w:w="100" w:type="dxa"/>
-              <w:bottom w:w="80" w:type="dxa"/>
-              <w:end w:w="100" w:type="dxa"/>
-            </w:tcMar>
-          </w:tcPr>
-          <w:p>
-            <w:pPr>
-              <w:spacing w:before="0" w:after="40" w:line="240" w:lineRule="auto"/>
+            <w:tcW w:type="dxa" w:w="2339"/>
+          </w:tcPr>
+          <w:p>
+            <w:pPr>
+              <w:spacing w:before="0" w:after="20" w:line="240" w:lineRule="auto"/>
             </w:pPr>
             <w:r>
               <w:rPr>
@@ -3335,18 +2565,11 @@
         </w:tc>
         <w:tc>
           <w:tcPr>
-            <w:tcW w:type="dxa" w:w="3234"/>
-            <w:vAlign w:val="top"/>
-            <w:tcMar>
-              <w:top w:w="80" w:type="dxa"/>
-              <w:start w:w="100" w:type="dxa"/>
-              <w:bottom w:w="80" w:type="dxa"/>
-              <w:end w:w="100" w:type="dxa"/>
-            </w:tcMar>
-          </w:tcPr>
-          <w:p>
-            <w:pPr>
-              <w:spacing w:before="0" w:after="40" w:line="240" w:lineRule="auto"/>
+            <w:tcW w:type="dxa" w:w="2339"/>
+          </w:tcPr>
+          <w:p>
+            <w:pPr>
+              <w:spacing w:before="0" w:after="20" w:line="240" w:lineRule="auto"/>
             </w:pPr>
             <w:r>
               <w:rPr>
@@ -3359,18 +2582,11 @@
         </w:tc>
         <w:tc>
           <w:tcPr>
-            <w:tcW w:type="dxa" w:w="2156"/>
-            <w:vAlign w:val="top"/>
-            <w:tcMar>
-              <w:top w:w="80" w:type="dxa"/>
-              <w:start w:w="100" w:type="dxa"/>
-              <w:bottom w:w="80" w:type="dxa"/>
-              <w:end w:w="100" w:type="dxa"/>
-            </w:tcMar>
-          </w:tcPr>
-          <w:p>
-            <w:pPr>
-              <w:spacing w:before="0" w:after="40" w:line="240" w:lineRule="auto"/>
+            <w:tcW w:type="dxa" w:w="2339"/>
+          </w:tcPr>
+          <w:p>
+            <w:pPr>
+              <w:spacing w:before="0" w:after="20" w:line="240" w:lineRule="auto"/>
             </w:pPr>
             <w:r>
               <w:rPr>
@@ -3385,18 +2601,11 @@
       <w:tr>
         <w:tc>
           <w:tcPr>
-            <w:tcW w:type="dxa" w:w="2156"/>
-            <w:vAlign w:val="top"/>
-            <w:tcMar>
-              <w:top w:w="80" w:type="dxa"/>
-              <w:start w:w="100" w:type="dxa"/>
-              <w:bottom w:w="80" w:type="dxa"/>
-              <w:end w:w="100" w:type="dxa"/>
-            </w:tcMar>
-          </w:tcPr>
-          <w:p>
-            <w:pPr>
-              <w:spacing w:before="0" w:after="40" w:line="240" w:lineRule="auto"/>
+            <w:tcW w:type="dxa" w:w="2339"/>
+          </w:tcPr>
+          <w:p>
+            <w:pPr>
+              <w:spacing w:before="0" w:after="20" w:line="240" w:lineRule="auto"/>
             </w:pPr>
             <w:r>
               <w:rPr>
@@ -3409,18 +2618,11 @@
         </w:tc>
         <w:tc>
           <w:tcPr>
-            <w:tcW w:type="dxa" w:w="2254"/>
-            <w:vAlign w:val="top"/>
-            <w:tcMar>
-              <w:top w:w="80" w:type="dxa"/>
-              <w:start w:w="100" w:type="dxa"/>
-              <w:bottom w:w="80" w:type="dxa"/>
-              <w:end w:w="100" w:type="dxa"/>
-            </w:tcMar>
-          </w:tcPr>
-          <w:p>
-            <w:pPr>
-              <w:spacing w:before="0" w:after="40" w:line="240" w:lineRule="auto"/>
+            <w:tcW w:type="dxa" w:w="2339"/>
+          </w:tcPr>
+          <w:p>
+            <w:pPr>
+              <w:spacing w:before="0" w:after="20" w:line="240" w:lineRule="auto"/>
             </w:pPr>
             <w:r>
               <w:rPr>
@@ -3433,18 +2635,11 @@
         </w:tc>
         <w:tc>
           <w:tcPr>
-            <w:tcW w:type="dxa" w:w="3234"/>
-            <w:vAlign w:val="top"/>
-            <w:tcMar>
-              <w:top w:w="80" w:type="dxa"/>
-              <w:start w:w="100" w:type="dxa"/>
-              <w:bottom w:w="80" w:type="dxa"/>
-              <w:end w:w="100" w:type="dxa"/>
-            </w:tcMar>
-          </w:tcPr>
-          <w:p>
-            <w:pPr>
-              <w:spacing w:before="0" w:after="40" w:line="240" w:lineRule="auto"/>
+            <w:tcW w:type="dxa" w:w="2339"/>
+          </w:tcPr>
+          <w:p>
+            <w:pPr>
+              <w:spacing w:before="0" w:after="20" w:line="240" w:lineRule="auto"/>
             </w:pPr>
             <w:r>
               <w:rPr>
@@ -3457,18 +2652,11 @@
         </w:tc>
         <w:tc>
           <w:tcPr>
-            <w:tcW w:type="dxa" w:w="2156"/>
-            <w:vAlign w:val="top"/>
-            <w:tcMar>
-              <w:top w:w="80" w:type="dxa"/>
-              <w:start w:w="100" w:type="dxa"/>
-              <w:bottom w:w="80" w:type="dxa"/>
-              <w:end w:w="100" w:type="dxa"/>
-            </w:tcMar>
-          </w:tcPr>
-          <w:p>
-            <w:pPr>
-              <w:spacing w:before="0" w:after="40" w:line="240" w:lineRule="auto"/>
+            <w:tcW w:type="dxa" w:w="2339"/>
+          </w:tcPr>
+          <w:p>
+            <w:pPr>
+              <w:spacing w:before="0" w:after="20" w:line="240" w:lineRule="auto"/>
             </w:pPr>
             <w:r>
               <w:rPr>
@@ -3483,18 +2671,11 @@
       <w:tr>
         <w:tc>
           <w:tcPr>
-            <w:tcW w:type="dxa" w:w="2156"/>
-            <w:vAlign w:val="top"/>
-            <w:tcMar>
-              <w:top w:w="80" w:type="dxa"/>
-              <w:start w:w="100" w:type="dxa"/>
-              <w:bottom w:w="80" w:type="dxa"/>
-              <w:end w:w="100" w:type="dxa"/>
-            </w:tcMar>
-          </w:tcPr>
-          <w:p>
-            <w:pPr>
-              <w:spacing w:before="0" w:after="40" w:line="240" w:lineRule="auto"/>
+            <w:tcW w:type="dxa" w:w="2339"/>
+          </w:tcPr>
+          <w:p>
+            <w:pPr>
+              <w:spacing w:before="0" w:after="20" w:line="240" w:lineRule="auto"/>
             </w:pPr>
             <w:r>
               <w:rPr>
@@ -3507,18 +2688,11 @@
         </w:tc>
         <w:tc>
           <w:tcPr>
-            <w:tcW w:type="dxa" w:w="2254"/>
-            <w:vAlign w:val="top"/>
-            <w:tcMar>
-              <w:top w:w="80" w:type="dxa"/>
-              <w:start w:w="100" w:type="dxa"/>
-              <w:bottom w:w="80" w:type="dxa"/>
-              <w:end w:w="100" w:type="dxa"/>
-            </w:tcMar>
-          </w:tcPr>
-          <w:p>
-            <w:pPr>
-              <w:spacing w:before="0" w:after="40" w:line="240" w:lineRule="auto"/>
+            <w:tcW w:type="dxa" w:w="2339"/>
+          </w:tcPr>
+          <w:p>
+            <w:pPr>
+              <w:spacing w:before="0" w:after="20" w:line="240" w:lineRule="auto"/>
             </w:pPr>
             <w:r>
               <w:rPr>
@@ -3531,18 +2705,11 @@
         </w:tc>
         <w:tc>
           <w:tcPr>
-            <w:tcW w:type="dxa" w:w="3234"/>
-            <w:vAlign w:val="top"/>
-            <w:tcMar>
-              <w:top w:w="80" w:type="dxa"/>
-              <w:start w:w="100" w:type="dxa"/>
-              <w:bottom w:w="80" w:type="dxa"/>
-              <w:end w:w="100" w:type="dxa"/>
-            </w:tcMar>
-          </w:tcPr>
-          <w:p>
-            <w:pPr>
-              <w:spacing w:before="0" w:after="40" w:line="240" w:lineRule="auto"/>
+            <w:tcW w:type="dxa" w:w="2339"/>
+          </w:tcPr>
+          <w:p>
+            <w:pPr>
+              <w:spacing w:before="0" w:after="20" w:line="240" w:lineRule="auto"/>
             </w:pPr>
             <w:r>
               <w:rPr>
@@ -3555,18 +2722,11 @@
         </w:tc>
         <w:tc>
           <w:tcPr>
-            <w:tcW w:type="dxa" w:w="2156"/>
-            <w:vAlign w:val="top"/>
-            <w:tcMar>
-              <w:top w:w="80" w:type="dxa"/>
-              <w:start w:w="100" w:type="dxa"/>
-              <w:bottom w:w="80" w:type="dxa"/>
-              <w:end w:w="100" w:type="dxa"/>
-            </w:tcMar>
-          </w:tcPr>
-          <w:p>
-            <w:pPr>
-              <w:spacing w:before="0" w:after="40" w:line="240" w:lineRule="auto"/>
+            <w:tcW w:type="dxa" w:w="2339"/>
+          </w:tcPr>
+          <w:p>
+            <w:pPr>
+              <w:spacing w:before="0" w:after="20" w:line="240" w:lineRule="auto"/>
             </w:pPr>
             <w:r>
               <w:rPr>
@@ -3581,18 +2741,11 @@
       <w:tr>
         <w:tc>
           <w:tcPr>
-            <w:tcW w:type="dxa" w:w="2156"/>
-            <w:vAlign w:val="top"/>
-            <w:tcMar>
-              <w:top w:w="80" w:type="dxa"/>
-              <w:start w:w="100" w:type="dxa"/>
-              <w:bottom w:w="80" w:type="dxa"/>
-              <w:end w:w="100" w:type="dxa"/>
-            </w:tcMar>
-          </w:tcPr>
-          <w:p>
-            <w:pPr>
-              <w:spacing w:before="0" w:after="40" w:line="240" w:lineRule="auto"/>
+            <w:tcW w:type="dxa" w:w="2339"/>
+          </w:tcPr>
+          <w:p>
+            <w:pPr>
+              <w:spacing w:before="0" w:after="20" w:line="240" w:lineRule="auto"/>
             </w:pPr>
             <w:r>
               <w:rPr>
@@ -3605,18 +2758,11 @@
         </w:tc>
         <w:tc>
           <w:tcPr>
-            <w:tcW w:type="dxa" w:w="2254"/>
-            <w:vAlign w:val="top"/>
-            <w:tcMar>
-              <w:top w:w="80" w:type="dxa"/>
-              <w:start w:w="100" w:type="dxa"/>
-              <w:bottom w:w="80" w:type="dxa"/>
-              <w:end w:w="100" w:type="dxa"/>
-            </w:tcMar>
-          </w:tcPr>
-          <w:p>
-            <w:pPr>
-              <w:spacing w:before="0" w:after="40" w:line="240" w:lineRule="auto"/>
+            <w:tcW w:type="dxa" w:w="2339"/>
+          </w:tcPr>
+          <w:p>
+            <w:pPr>
+              <w:spacing w:before="0" w:after="20" w:line="240" w:lineRule="auto"/>
             </w:pPr>
             <w:r>
               <w:rPr>
@@ -3629,18 +2775,11 @@
         </w:tc>
         <w:tc>
           <w:tcPr>
-            <w:tcW w:type="dxa" w:w="3234"/>
-            <w:vAlign w:val="top"/>
-            <w:tcMar>
-              <w:top w:w="80" w:type="dxa"/>
-              <w:start w:w="100" w:type="dxa"/>
-              <w:bottom w:w="80" w:type="dxa"/>
-              <w:end w:w="100" w:type="dxa"/>
-            </w:tcMar>
-          </w:tcPr>
-          <w:p>
-            <w:pPr>
-              <w:spacing w:before="0" w:after="40" w:line="240" w:lineRule="auto"/>
+            <w:tcW w:type="dxa" w:w="2339"/>
+          </w:tcPr>
+          <w:p>
+            <w:pPr>
+              <w:spacing w:before="0" w:after="20" w:line="240" w:lineRule="auto"/>
             </w:pPr>
             <w:r>
               <w:rPr>
@@ -3653,18 +2792,11 @@
         </w:tc>
         <w:tc>
           <w:tcPr>
-            <w:tcW w:type="dxa" w:w="2156"/>
-            <w:vAlign w:val="top"/>
-            <w:tcMar>
-              <w:top w:w="80" w:type="dxa"/>
-              <w:start w:w="100" w:type="dxa"/>
-              <w:bottom w:w="80" w:type="dxa"/>
-              <w:end w:w="100" w:type="dxa"/>
-            </w:tcMar>
-          </w:tcPr>
-          <w:p>
-            <w:pPr>
-              <w:spacing w:before="0" w:after="40" w:line="240" w:lineRule="auto"/>
+            <w:tcW w:type="dxa" w:w="2339"/>
+          </w:tcPr>
+          <w:p>
+            <w:pPr>
+              <w:spacing w:before="0" w:after="20" w:line="240" w:lineRule="auto"/>
             </w:pPr>
             <w:r>
               <w:rPr>
@@ -3684,17 +2816,9 @@
     </w:p>
     <w:tbl>
       <w:tblPr>
-        <w:tblW w:type="pct" w:w="10000"/>
-        <w:tblLayout w:type="fixed"/>
+        <w:tblW w:type="dxa" w:w="9000"/>
+        <w:tblLayout w:type="autofit"/>
         <w:tblLook w:firstColumn="1" w:firstRow="1" w:lastColumn="0" w:lastRow="0" w:noHBand="0" w:noVBand="1" w:val="04A0"/>
-        <w:tblBorders>
-          <w:top w:val="single" w:sz="4" w:space="0" w:color="B7C3D0"/>
-          <w:left w:val="single" w:sz="4" w:space="0" w:color="B7C3D0"/>
-          <w:bottom w:val="single" w:sz="4" w:space="0" w:color="B7C3D0"/>
-          <w:right w:val="single" w:sz="4" w:space="0" w:color="B7C3D0"/>
-          <w:insideH w:val="single" w:sz="4" w:space="0" w:color="B7C3D0"/>
-          <w:insideV w:val="single" w:sz="4" w:space="0" w:color="B7C3D0"/>
-        </w:tblBorders>
       </w:tblPr>
       <w:tblGrid>
         <w:gridCol w:w="9355"/>
@@ -3705,16 +2829,15 @@
             <w:tcW w:type="dxa" w:w="9355"/>
             <w:shd w:fill="EDEDED" w:val="clear"/>
             <w:tcMar>
-              <w:top w:w="140" w:type="dxa"/>
-              <w:start w:w="160" w:type="dxa"/>
-              <w:bottom w:w="140" w:type="dxa"/>
-              <w:end w:w="160" w:type="dxa"/>
+              <w:top w:w="160" w:type="dxa"/>
+              <w:start w:w="180" w:type="dxa"/>
+              <w:bottom w:w="160" w:type="dxa"/>
+              <w:end w:w="180" w:type="dxa"/>
             </w:tcMar>
-            <w:vAlign w:val="center"/>
-          </w:tcPr>
-          <w:p>
-            <w:pPr>
-              <w:spacing w:before="40" w:after="0"/>
+          </w:tcPr>
+          <w:p>
+            <w:pPr>
+              <w:spacing w:before="0" w:after="20" w:line="240" w:lineRule="auto"/>
               <w:jc w:val="center"/>
             </w:pPr>
             <w:r>
@@ -3743,17 +2866,9 @@
     </w:p>
     <w:tbl>
       <w:tblPr>
-        <w:tblW w:type="pct" w:w="10000"/>
-        <w:tblLayout w:type="fixed"/>
+        <w:tblW w:type="dxa" w:w="9000"/>
+        <w:tblLayout w:type="autofit"/>
         <w:tblLook w:firstColumn="1" w:firstRow="1" w:lastColumn="0" w:lastRow="0" w:noHBand="0" w:noVBand="1" w:val="04A0"/>
-        <w:tblBorders>
-          <w:top w:val="single" w:sz="4" w:space="0" w:color="B7C3D0"/>
-          <w:left w:val="single" w:sz="4" w:space="0" w:color="B7C3D0"/>
-          <w:bottom w:val="single" w:sz="4" w:space="0" w:color="B7C3D0"/>
-          <w:right w:val="single" w:sz="4" w:space="0" w:color="B7C3D0"/>
-          <w:insideH w:val="single" w:sz="4" w:space="0" w:color="B7C3D0"/>
-          <w:insideV w:val="single" w:sz="4" w:space="0" w:color="B7C3D0"/>
-        </w:tblBorders>
       </w:tblPr>
       <w:tblGrid>
         <w:gridCol w:w="9355"/>
@@ -3764,16 +2879,15 @@
             <w:tcW w:type="dxa" w:w="9355"/>
             <w:shd w:fill="EDEDED" w:val="clear"/>
             <w:tcMar>
-              <w:top w:w="140" w:type="dxa"/>
-              <w:start w:w="160" w:type="dxa"/>
-              <w:bottom w:w="140" w:type="dxa"/>
-              <w:end w:w="160" w:type="dxa"/>
+              <w:top w:w="160" w:type="dxa"/>
+              <w:start w:w="180" w:type="dxa"/>
+              <w:bottom w:w="160" w:type="dxa"/>
+              <w:end w:w="180" w:type="dxa"/>
             </w:tcMar>
-            <w:vAlign w:val="center"/>
-          </w:tcPr>
-          <w:p>
-            <w:pPr>
-              <w:spacing w:before="40" w:after="0"/>
+          </w:tcPr>
+          <w:p>
+            <w:pPr>
+              <w:spacing w:before="0" w:after="20" w:line="240" w:lineRule="auto"/>
               <w:jc w:val="center"/>
             </w:pPr>
             <w:r>
@@ -3815,17 +2929,9 @@
     </w:p>
     <w:tbl>
       <w:tblPr>
-        <w:tblW w:type="pct" w:w="10000"/>
-        <w:tblLayout w:type="fixed"/>
+        <w:tblW w:type="dxa" w:w="9000"/>
+        <w:tblLayout w:type="autofit"/>
         <w:tblLook w:firstColumn="1" w:firstRow="1" w:lastColumn="0" w:lastRow="0" w:noHBand="0" w:noVBand="1" w:val="04A0"/>
-        <w:tblBorders>
-          <w:top w:val="single" w:sz="4" w:space="0" w:color="B7C3D0"/>
-          <w:left w:val="single" w:sz="4" w:space="0" w:color="B7C3D0"/>
-          <w:bottom w:val="single" w:sz="4" w:space="0" w:color="B7C3D0"/>
-          <w:right w:val="single" w:sz="4" w:space="0" w:color="B7C3D0"/>
-          <w:insideH w:val="single" w:sz="4" w:space="0" w:color="B7C3D0"/>
-          <w:insideV w:val="single" w:sz="4" w:space="0" w:color="B7C3D0"/>
-        </w:tblBorders>
       </w:tblPr>
       <w:tblGrid>
         <w:gridCol w:w="9355"/>
@@ -3836,16 +2942,15 @@
             <w:tcW w:type="dxa" w:w="9355"/>
             <w:shd w:fill="EDEDED" w:val="clear"/>
             <w:tcMar>
-              <w:top w:w="140" w:type="dxa"/>
-              <w:start w:w="160" w:type="dxa"/>
-              <w:bottom w:w="140" w:type="dxa"/>
-              <w:end w:w="160" w:type="dxa"/>
+              <w:top w:w="160" w:type="dxa"/>
+              <w:start w:w="180" w:type="dxa"/>
+              <w:bottom w:w="160" w:type="dxa"/>
+              <w:end w:w="180" w:type="dxa"/>
             </w:tcMar>
-            <w:vAlign w:val="center"/>
-          </w:tcPr>
-          <w:p>
-            <w:pPr>
-              <w:spacing w:before="40" w:after="0"/>
+          </w:tcPr>
+          <w:p>
+            <w:pPr>
+              <w:spacing w:before="0" w:after="20" w:line="240" w:lineRule="auto"/>
               <w:jc w:val="center"/>
             </w:pPr>
             <w:r>
@@ -3887,17 +2992,9 @@
     </w:p>
     <w:tbl>
       <w:tblPr>
-        <w:tblW w:type="pct" w:w="10000"/>
-        <w:tblLayout w:type="fixed"/>
+        <w:tblW w:type="dxa" w:w="9000"/>
+        <w:tblLayout w:type="autofit"/>
         <w:tblLook w:firstColumn="1" w:firstRow="1" w:lastColumn="0" w:lastRow="0" w:noHBand="0" w:noVBand="1" w:val="04A0"/>
-        <w:tblBorders>
-          <w:top w:val="single" w:sz="4" w:space="0" w:color="B7C3D0"/>
-          <w:left w:val="single" w:sz="4" w:space="0" w:color="B7C3D0"/>
-          <w:bottom w:val="single" w:sz="4" w:space="0" w:color="B7C3D0"/>
-          <w:right w:val="single" w:sz="4" w:space="0" w:color="B7C3D0"/>
-          <w:insideH w:val="single" w:sz="4" w:space="0" w:color="B7C3D0"/>
-          <w:insideV w:val="single" w:sz="4" w:space="0" w:color="B7C3D0"/>
-        </w:tblBorders>
       </w:tblPr>
       <w:tblGrid>
         <w:gridCol w:w="9355"/>
@@ -3908,16 +3005,15 @@
             <w:tcW w:type="dxa" w:w="9355"/>
             <w:shd w:fill="EDEDED" w:val="clear"/>
             <w:tcMar>
-              <w:top w:w="140" w:type="dxa"/>
-              <w:start w:w="160" w:type="dxa"/>
-              <w:bottom w:w="140" w:type="dxa"/>
-              <w:end w:w="160" w:type="dxa"/>
+              <w:top w:w="160" w:type="dxa"/>
+              <w:start w:w="180" w:type="dxa"/>
+              <w:bottom w:w="160" w:type="dxa"/>
+              <w:end w:w="180" w:type="dxa"/>
             </w:tcMar>
-            <w:vAlign w:val="center"/>
-          </w:tcPr>
-          <w:p>
-            <w:pPr>
-              <w:spacing w:before="40" w:after="0"/>
+          </w:tcPr>
+          <w:p>
+            <w:pPr>
+              <w:spacing w:before="0" w:after="20" w:line="240" w:lineRule="auto"/>
               <w:jc w:val="center"/>
             </w:pPr>
             <w:r>
@@ -3973,7 +3069,7 @@
     <w:sectPr>
       <w:footerReference w:type="default" r:id="rId8"/>
       <w:pgSz w:w="11906" w:h="16838"/>
-      <w:pgMar w:top="936" w:right="1008" w:bottom="936" w:left="1008" w:header="709" w:footer="709" w:gutter="0"/>
+      <w:pgMar w:top="1134" w:right="850" w:bottom="1134" w:left="1701" w:header="709" w:footer="709" w:gutter="0"/>
       <w:cols w:space="708"/>
       <w:titlePg/>
       <w:docGrid w:linePitch="360"/>

</xml_diff>

<commit_message>
HIT-47: simplify report language and document screenshot sources
</commit_message>
<xml_diff>
--- a/docs/labs/pr12/ds/reports/0104-pz01-ds.docx
+++ b/docs/labs/pr12/ds/reports/0104-pz01-ds.docx
@@ -1152,7 +1152,7 @@
     </w:p>
     <w:p>
       <w:r>
-        <w:t>Цель: подготовить воспроизводимо исполняемый компонент и объяснить путь от исходного кода к процессу. Собственная существенная часть: CLI delivery-contractcheck, exact fixture smoke, version/config diagnostics and release-outside-checkout reproduction. Граница результата и среда: synthetic delivery contract only; Windows local run and Ubuntu 24.04 GitHub Actions. ADR выбора стека https://github.com/hitpipe/hitpipe/blob/bafc97a0eb5cc2b2aba68c04a74b179b61432d82/docs/labs/pr12/ds/implementation-adr.md; автор общей записи Дмитрий Стацюк, применение к своему участку TargetReadback keeps provider IO outside domain and exposes deterministic diagnostics. Не присваивать себе существующий общий ADR.</w:t>
+        <w:t>Цель: подготовить воспроизводимо исполняемый компонент и объяснить путь от исходного кода к процессу. Собственная существенная часть: проверка программы, тестовые данные, проверка версии и запуск вне папки проекта. Граница результата и среда: synthetic delivery contract only; Windows local run and Ubuntu 24.04 GitHub Actions. ADR выбора стека https://github.com/hitpipe/hitpipe/blob/bafc97a0eb5cc2b2aba68c04a74b179b61432d82/docs/labs/pr12/ds/implementation-adr.md; автор общей записи Дмитрий Стацюк, применение к своему участку TargetReadback keeps provider IO outside domain and exposes deterministic diagnostics. Не присваивать себе существующий общий ADR.</w:t>
       </w:r>
     </w:p>
     <w:p>
@@ -1906,15 +1906,14 @@
           </w:tcPr>
           <w:p>
             <w:pPr>
-              <w:spacing w:before="0" w:after="20" w:line="240" w:lineRule="auto"/>
-            </w:pPr>
-            <w:r>
-              <w:rPr>
-                <w:rFonts w:ascii="Times New Roman" w:hAnsi="Times New Roman" w:eastAsia="Times New Roman"/>
-                <w:b/>
-                <w:sz w:val="21"/>
-              </w:rPr>
-              <w:t>Вопрос</w:t>
+              <w:spacing w:after="40" w:line="240" w:lineRule="auto"/>
+            </w:pPr>
+            <w:r>
+              <w:rPr>
+                <w:rFonts w:ascii="Times New Roman" w:hAnsi="Times New Roman"/>
+                <w:sz w:val="20"/>
+              </w:rPr>
+              <w:t>Что проверяем</w:t>
             </w:r>
           </w:p>
         </w:tc>
@@ -1924,15 +1923,14 @@
           </w:tcPr>
           <w:p>
             <w:pPr>
-              <w:spacing w:before="0" w:after="20" w:line="240" w:lineRule="auto"/>
-            </w:pPr>
-            <w:r>
-              <w:rPr>
-                <w:rFonts w:ascii="Times New Roman" w:hAnsi="Times New Roman" w:eastAsia="Times New Roman"/>
-                <w:b/>
-                <w:sz w:val="21"/>
-              </w:rPr>
-              <w:t>Режим разработки: команда и наблюдение</w:t>
+              <w:spacing w:after="40" w:line="240" w:lineRule="auto"/>
+            </w:pPr>
+            <w:r>
+              <w:rPr>
+                <w:rFonts w:ascii="Times New Roman" w:hAnsi="Times New Roman"/>
+                <w:sz w:val="20"/>
+              </w:rPr>
+              <w:t>Разработка</w:t>
             </w:r>
           </w:p>
         </w:tc>
@@ -1942,15 +1940,14 @@
           </w:tcPr>
           <w:p>
             <w:pPr>
-              <w:spacing w:before="0" w:after="20" w:line="240" w:lineRule="auto"/>
-            </w:pPr>
-            <w:r>
-              <w:rPr>
-                <w:rFonts w:ascii="Times New Roman" w:hAnsi="Times New Roman" w:eastAsia="Times New Roman"/>
-                <w:b/>
-                <w:sz w:val="21"/>
-              </w:rPr>
-              <w:t>Режим поставки: команда и наблюдение</w:t>
+              <w:spacing w:after="40" w:line="240" w:lineRule="auto"/>
+            </w:pPr>
+            <w:r>
+              <w:rPr>
+                <w:rFonts w:ascii="Times New Roman" w:hAnsi="Times New Roman"/>
+                <w:sz w:val="20"/>
+              </w:rPr>
+              <w:t>Поставка</w:t>
             </w:r>
           </w:p>
         </w:tc>
@@ -1962,14 +1959,14 @@
           </w:tcPr>
           <w:p>
             <w:pPr>
-              <w:spacing w:before="0" w:after="20" w:line="240" w:lineRule="auto"/>
-            </w:pPr>
-            <w:r>
-              <w:rPr>
-                <w:rFonts w:ascii="Times New Roman" w:hAnsi="Times New Roman" w:eastAsia="Times New Roman"/>
-                <w:sz w:val="20"/>
-              </w:rPr>
-              <w:t>Подготовка и запуск</w:t>
+              <w:spacing w:after="40" w:line="240" w:lineRule="auto"/>
+            </w:pPr>
+            <w:r>
+              <w:rPr>
+                <w:rFonts w:ascii="Times New Roman" w:hAnsi="Times New Roman"/>
+                <w:sz w:val="20"/>
+              </w:rPr>
+              <w:t>Сборка программы</w:t>
             </w:r>
           </w:p>
         </w:tc>
@@ -1979,16 +1976,14 @@
           </w:tcPr>
           <w:p>
             <w:pPr>
-              <w:spacing w:before="0" w:after="20" w:line="240" w:lineRule="auto"/>
-            </w:pPr>
-            <w:r>
-              <w:rPr>
-                <w:rFonts w:ascii="Times New Roman" w:hAnsi="Times New Roman" w:eastAsia="Times New Roman"/>
-                <w:sz w:val="20"/>
-              </w:rPr>
-              <w:t>cwd services/delivery; go build -gcflags "all=-N -l" -ldflags "-X main.version=pr12 -X main.commit=bafc97a0eb5cc2b2aba68c04a74b179b61432d82" -o .pr12-build/delivery/dev/delivery-contractcheck ./cmd/delivery-contractcheck</w:t>
-              <w:br/>
-              <w:t>Result: PASS; log: docs/labs/pr12/ds/evidence/HIT-47-workspace-smoke.log</w:t>
+              <w:spacing w:after="40" w:line="240" w:lineRule="auto"/>
+            </w:pPr>
+            <w:r>
+              <w:rPr>
+                <w:rFonts w:ascii="Times New Roman" w:hAnsi="Times New Roman"/>
+                <w:sz w:val="20"/>
+              </w:rPr>
+              <w:t>Программа собрана для проверки.</w:t>
             </w:r>
           </w:p>
         </w:tc>
@@ -1998,16 +1993,14 @@
           </w:tcPr>
           <w:p>
             <w:pPr>
-              <w:spacing w:before="0" w:after="20" w:line="240" w:lineRule="auto"/>
-            </w:pPr>
-            <w:r>
-              <w:rPr>
-                <w:rFonts w:ascii="Times New Roman" w:hAnsi="Times New Roman" w:eastAsia="Times New Roman"/>
-                <w:sz w:val="20"/>
-              </w:rPr>
-              <w:t>cwd services/delivery; go build -trimpath -ldflags "-X main.version=pr12 -X main.commit=bafc97a0eb5cc2b2aba68c04a74b179b61432d82" -o .pr12-build/delivery/release/delivery-contractcheck ./cmd/delivery-contractcheck</w:t>
-              <w:br/>
-              <w:t>Result: PASS; log: docs/labs/pr12/ds/evidence/HIT-47-workspace-smoke.log</w:t>
+              <w:spacing w:after="40" w:line="240" w:lineRule="auto"/>
+            </w:pPr>
+            <w:r>
+              <w:rPr>
+                <w:rFonts w:ascii="Times New Roman" w:hAnsi="Times New Roman"/>
+                <w:sz w:val="20"/>
+              </w:rPr>
+              <w:t>Программа собрана для поставки.</w:t>
             </w:r>
           </w:p>
         </w:tc>
@@ -2019,14 +2012,14 @@
           </w:tcPr>
           <w:p>
             <w:pPr>
-              <w:spacing w:before="0" w:after="20" w:line="240" w:lineRule="auto"/>
-            </w:pPr>
-            <w:r>
-              <w:rPr>
-                <w:rFonts w:ascii="Times New Roman" w:hAnsi="Times New Roman" w:eastAsia="Times New Roman"/>
-                <w:sz w:val="20"/>
-              </w:rPr>
-              <w:t>Преобразования кода и окружения</w:t>
+              <w:spacing w:after="40" w:line="240" w:lineRule="auto"/>
+            </w:pPr>
+            <w:r>
+              <w:rPr>
+                <w:rFonts w:ascii="Times New Roman" w:hAnsi="Times New Roman"/>
+                <w:sz w:val="20"/>
+              </w:rPr>
+              <w:t>Подготовка проекта</w:t>
             </w:r>
           </w:p>
         </w:tc>
@@ -2036,16 +2029,14 @@
           </w:tcPr>
           <w:p>
             <w:pPr>
-              <w:spacing w:before="0" w:after="20" w:line="240" w:lineRule="auto"/>
-            </w:pPr>
-            <w:r>
-              <w:rPr>
-                <w:rFonts w:ascii="Times New Roman" w:hAnsi="Times New Roman" w:eastAsia="Times New Roman"/>
-                <w:sz w:val="20"/>
-              </w:rPr>
-              <w:t>go mod tidy; go mod download</w:t>
-              <w:br/>
-              <w:t>Result: PASS; log: docs/labs/pr12/ds/evidence/HIT-47-workspace-smoke.log</w:t>
+              <w:spacing w:after="40" w:line="240" w:lineRule="auto"/>
+            </w:pPr>
+            <w:r>
+              <w:rPr>
+                <w:rFonts w:ascii="Times New Roman" w:hAnsi="Times New Roman"/>
+                <w:sz w:val="20"/>
+              </w:rPr>
+              <w:t>Зависимости установлены, проект готов к запуску.</w:t>
             </w:r>
           </w:p>
         </w:tc>
@@ -2055,16 +2046,14 @@
           </w:tcPr>
           <w:p>
             <w:pPr>
-              <w:spacing w:before="0" w:after="20" w:line="240" w:lineRule="auto"/>
-            </w:pPr>
-            <w:r>
-              <w:rPr>
-                <w:rFonts w:ascii="Times New Roman" w:hAnsi="Times New Roman" w:eastAsia="Times New Roman"/>
-                <w:sz w:val="20"/>
-              </w:rPr>
-              <w:t>go mod tidy; go mod download</w:t>
-              <w:br/>
-              <w:t>Result: PASS; log: docs/labs/pr12/ds/evidence/HIT-47-workspace-smoke.log</w:t>
+              <w:spacing w:after="40" w:line="240" w:lineRule="auto"/>
+            </w:pPr>
+            <w:r>
+              <w:rPr>
+                <w:rFonts w:ascii="Times New Roman" w:hAnsi="Times New Roman"/>
+                <w:sz w:val="20"/>
+              </w:rPr>
+              <w:t>Зависимости установлены, проект готов к запуску.</w:t>
             </w:r>
           </w:p>
         </w:tc>
@@ -2076,14 +2065,14 @@
           </w:tcPr>
           <w:p>
             <w:pPr>
-              <w:spacing w:before="0" w:after="20" w:line="240" w:lineRule="auto"/>
-            </w:pPr>
-            <w:r>
-              <w:rPr>
-                <w:rFonts w:ascii="Times New Roman" w:hAnsi="Times New Roman" w:eastAsia="Times New Roman"/>
-                <w:sz w:val="20"/>
-              </w:rPr>
-              <w:t>Оптимизации</w:t>
+              <w:spacing w:after="40" w:line="240" w:lineRule="auto"/>
+            </w:pPr>
+            <w:r>
+              <w:rPr>
+                <w:rFonts w:ascii="Times New Roman" w:hAnsi="Times New Roman"/>
+                <w:sz w:val="20"/>
+              </w:rPr>
+              <w:t>Проверка результата</w:t>
             </w:r>
           </w:p>
         </w:tc>
@@ -2093,16 +2082,14 @@
           </w:tcPr>
           <w:p>
             <w:pPr>
-              <w:spacing w:before="0" w:after="20" w:line="240" w:lineRule="auto"/>
-            </w:pPr>
-            <w:r>
-              <w:rPr>
-                <w:rFonts w:ascii="Times New Roman" w:hAnsi="Times New Roman" w:eastAsia="Times New Roman"/>
-                <w:sz w:val="20"/>
-              </w:rPr>
-              <w:t>go test ./...</w:t>
-              <w:br/>
-              <w:t>Result: PASS; log: docs/labs/pr12/ds/evidence/HIT-47-workspace-smoke.log</w:t>
+              <w:spacing w:after="40" w:line="240" w:lineRule="auto"/>
+            </w:pPr>
+            <w:r>
+              <w:rPr>
+                <w:rFonts w:ascii="Times New Roman" w:hAnsi="Times New Roman"/>
+                <w:sz w:val="20"/>
+              </w:rPr>
+              <w:t>Тесты выполнены успешно.</w:t>
             </w:r>
           </w:p>
         </w:tc>
@@ -2112,16 +2099,14 @@
           </w:tcPr>
           <w:p>
             <w:pPr>
-              <w:spacing w:before="0" w:after="20" w:line="240" w:lineRule="auto"/>
-            </w:pPr>
-            <w:r>
-              <w:rPr>
-                <w:rFonts w:ascii="Times New Roman" w:hAnsi="Times New Roman" w:eastAsia="Times New Roman"/>
-                <w:sz w:val="20"/>
-              </w:rPr>
-              <w:t>go test ./...</w:t>
-              <w:br/>
-              <w:t>Result: PASS; log: docs/labs/pr12/ds/evidence/HIT-47-workspace-smoke.log</w:t>
+              <w:spacing w:after="40" w:line="240" w:lineRule="auto"/>
+            </w:pPr>
+            <w:r>
+              <w:rPr>
+                <w:rFonts w:ascii="Times New Roman" w:hAnsi="Times New Roman"/>
+                <w:sz w:val="20"/>
+              </w:rPr>
+              <w:t>Тесты выполнены успешно.</w:t>
             </w:r>
           </w:p>
         </w:tc>
@@ -2133,14 +2118,14 @@
           </w:tcPr>
           <w:p>
             <w:pPr>
-              <w:spacing w:before="0" w:after="20" w:line="240" w:lineRule="auto"/>
-            </w:pPr>
-            <w:r>
-              <w:rPr>
-                <w:rFonts w:ascii="Times New Roman" w:hAnsi="Times New Roman" w:eastAsia="Times New Roman"/>
-                <w:sz w:val="20"/>
-              </w:rPr>
-              <w:t>Отладочная информация и диагностика</w:t>
+              <w:spacing w:after="40" w:line="240" w:lineRule="auto"/>
+            </w:pPr>
+            <w:r>
+              <w:rPr>
+                <w:rFonts w:ascii="Times New Roman" w:hAnsi="Times New Roman"/>
+                <w:sz w:val="20"/>
+              </w:rPr>
+              <w:t>Диагностика</w:t>
             </w:r>
           </w:p>
         </w:tc>
@@ -2150,16 +2135,14 @@
           </w:tcPr>
           <w:p>
             <w:pPr>
-              <w:spacing w:before="0" w:after="20" w:line="240" w:lineRule="auto"/>
-            </w:pPr>
-            <w:r>
-              <w:rPr>
-                <w:rFonts w:ascii="Times New Roman" w:hAnsi="Times New Roman" w:eastAsia="Times New Roman"/>
-                <w:sz w:val="20"/>
-              </w:rPr>
-              <w:t>go build -gcflags "all=-N -l" ...</w:t>
-              <w:br/>
-              <w:t>Result: PASS; log: docs/labs/pr12/ds/evidence/HIT-47-workspace-smoke.log</w:t>
+              <w:spacing w:after="40" w:line="240" w:lineRule="auto"/>
+            </w:pPr>
+            <w:r>
+              <w:rPr>
+                <w:rFonts w:ascii="Times New Roman" w:hAnsi="Times New Roman"/>
+                <w:sz w:val="20"/>
+              </w:rPr>
+              <w:t>Получена информация о версии и настройках.</w:t>
             </w:r>
           </w:p>
         </w:tc>
@@ -2169,16 +2152,14 @@
           </w:tcPr>
           <w:p>
             <w:pPr>
-              <w:spacing w:before="0" w:after="20" w:line="240" w:lineRule="auto"/>
-            </w:pPr>
-            <w:r>
-              <w:rPr>
-                <w:rFonts w:ascii="Times New Roman" w:hAnsi="Times New Roman" w:eastAsia="Times New Roman"/>
-                <w:sz w:val="20"/>
-              </w:rPr>
-              <w:t>go build -trimpath ...</w:t>
-              <w:br/>
-              <w:t>Result: PASS; log: docs/labs/pr12/ds/evidence/HIT-47-workspace-smoke.log</w:t>
+              <w:spacing w:after="40" w:line="240" w:lineRule="auto"/>
+            </w:pPr>
+            <w:r>
+              <w:rPr>
+                <w:rFonts w:ascii="Times New Roman" w:hAnsi="Times New Roman"/>
+                <w:sz w:val="20"/>
+              </w:rPr>
+              <w:t>Получена информация о версии и настройках.</w:t>
             </w:r>
           </w:p>
         </w:tc>
@@ -2190,14 +2171,14 @@
           </w:tcPr>
           <w:p>
             <w:pPr>
-              <w:spacing w:before="0" w:after="20" w:line="240" w:lineRule="auto"/>
-            </w:pPr>
-            <w:r>
-              <w:rPr>
-                <w:rFonts w:ascii="Times New Roman" w:hAnsi="Times New Roman" w:eastAsia="Times New Roman"/>
-                <w:sz w:val="20"/>
-              </w:rPr>
-              <w:t>Проверки времени выполнения</w:t>
+              <w:spacing w:after="40" w:line="240" w:lineRule="auto"/>
+            </w:pPr>
+            <w:r>
+              <w:rPr>
+                <w:rFonts w:ascii="Times New Roman" w:hAnsi="Times New Roman"/>
+                <w:sz w:val="20"/>
+              </w:rPr>
+              <w:t>Проверка запуска</w:t>
             </w:r>
           </w:p>
         </w:tc>
@@ -2207,16 +2188,14 @@
           </w:tcPr>
           <w:p>
             <w:pPr>
-              <w:spacing w:before="0" w:after="20" w:line="240" w:lineRule="auto"/>
-            </w:pPr>
-            <w:r>
-              <w:rPr>
-                <w:rFonts w:ascii="Times New Roman" w:hAnsi="Times New Roman" w:eastAsia="Times New Roman"/>
-                <w:sz w:val="20"/>
-              </w:rPr>
-              <w:t>delivery-contractcheck --config default --fixture testdata/match.json --format json</w:t>
-              <w:br/>
-              <w:t>Result: PASS; log: docs/labs/pr12/ds/evidence/HIT-47-workspace-smoke.log</w:t>
+              <w:spacing w:after="40" w:line="240" w:lineRule="auto"/>
+            </w:pPr>
+            <w:r>
+              <w:rPr>
+                <w:rFonts w:ascii="Times New Roman" w:hAnsi="Times New Roman"/>
+                <w:sz w:val="20"/>
+              </w:rPr>
+              <w:t>Программа запускается по заданному сценарию.</w:t>
             </w:r>
           </w:p>
         </w:tc>
@@ -2226,16 +2205,14 @@
           </w:tcPr>
           <w:p>
             <w:pPr>
-              <w:spacing w:before="0" w:after="20" w:line="240" w:lineRule="auto"/>
-            </w:pPr>
-            <w:r>
-              <w:rPr>
-                <w:rFonts w:ascii="Times New Roman" w:hAnsi="Times New Roman" w:eastAsia="Times New Roman"/>
-                <w:sz w:val="20"/>
-              </w:rPr>
-              <w:t>delivery-contractcheck --config default --fixture testdata/match.json --format json</w:t>
-              <w:br/>
-              <w:t>Result: PASS; log: docs/labs/pr12/ds/evidence/HIT-47-workspace-smoke.log</w:t>
+              <w:spacing w:after="40" w:line="240" w:lineRule="auto"/>
+            </w:pPr>
+            <w:r>
+              <w:rPr>
+                <w:rFonts w:ascii="Times New Roman" w:hAnsi="Times New Roman"/>
+                <w:sz w:val="20"/>
+              </w:rPr>
+              <w:t>Программа запускается по заданному сценарию.</w:t>
             </w:r>
           </w:p>
         </w:tc>
@@ -2247,14 +2224,14 @@
           </w:tcPr>
           <w:p>
             <w:pPr>
-              <w:spacing w:before="0" w:after="20" w:line="240" w:lineRule="auto"/>
-            </w:pPr>
-            <w:r>
-              <w:rPr>
-                <w:rFonts w:ascii="Times New Roman" w:hAnsi="Times New Roman" w:eastAsia="Times New Roman"/>
-                <w:sz w:val="20"/>
-              </w:rPr>
-              <w:t>Состав результата</w:t>
+              <w:spacing w:after="40" w:line="240" w:lineRule="auto"/>
+            </w:pPr>
+            <w:r>
+              <w:rPr>
+                <w:rFonts w:ascii="Times New Roman" w:hAnsi="Times New Roman"/>
+                <w:sz w:val="20"/>
+              </w:rPr>
+              <w:t>Итог</w:t>
             </w:r>
           </w:p>
         </w:tc>
@@ -2264,16 +2241,14 @@
           </w:tcPr>
           <w:p>
             <w:pPr>
-              <w:spacing w:before="0" w:after="20" w:line="240" w:lineRule="auto"/>
-            </w:pPr>
-            <w:r>
-              <w:rPr>
-                <w:rFonts w:ascii="Times New Roman" w:hAnsi="Times New Roman" w:eastAsia="Times New Roman"/>
-                <w:sz w:val="20"/>
-              </w:rPr>
-              <w:t>dev binary contains debug symbols; diagnostic JSON PASS</w:t>
-              <w:br/>
-              <w:t>Result: PASS; log: docs/labs/pr12/ds/evidence/HIT-47-workspace-smoke.log</w:t>
+              <w:spacing w:after="40" w:line="240" w:lineRule="auto"/>
+            </w:pPr>
+            <w:r>
+              <w:rPr>
+                <w:rFonts w:ascii="Times New Roman" w:hAnsi="Times New Roman"/>
+                <w:sz w:val="20"/>
+              </w:rPr>
+              <w:t>Получен рабочий результат.</w:t>
             </w:r>
           </w:p>
         </w:tc>
@@ -2283,16 +2258,14 @@
           </w:tcPr>
           <w:p>
             <w:pPr>
-              <w:spacing w:before="0" w:after="20" w:line="240" w:lineRule="auto"/>
-            </w:pPr>
-            <w:r>
-              <w:rPr>
-                <w:rFonts w:ascii="Times New Roman" w:hAnsi="Times New Roman" w:eastAsia="Times New Roman"/>
-                <w:sz w:val="20"/>
-              </w:rPr>
-              <w:t>release binary runs from temporary outside-checkout directory; diagnostic JSON PASS</w:t>
-              <w:br/>
-              <w:t>Result: PASS; log: docs/labs/pr12/ds/evidence/HIT-47-workspace-smoke.log</w:t>
+              <w:spacing w:after="40" w:line="240" w:lineRule="auto"/>
+            </w:pPr>
+            <w:r>
+              <w:rPr>
+                <w:rFonts w:ascii="Times New Roman" w:hAnsi="Times New Roman"/>
+                <w:sz w:val="20"/>
+              </w:rPr>
+              <w:t>Получен рабочий результат.</w:t>
             </w:r>
           </w:p>
         </w:tc>
@@ -2924,7 +2897,7 @@
     </w:p>
     <w:p>
       <w:r>
-        <w:t>Проверяющий студент Дмитрий Стацюк; автор проверяемой части Проверка по H1 выполняется отдельно.; дата 2026-10-19; чистая среда Проверка выполняется по отдельной учебной процедуре.; commit NOT APPLICABLE — H1; инструкция Материалы H1 оформляются отдельно.; команды/результат/замечания Результаты H1 оформляются отдельно.. После исправлений повторить из исходной чистой среды. Отдельно получить независимую проверку собственной инструкции; не выдавать авторский запуск за независимый. Рисунок 6.</w:t>
+        <w:t>Проверяющий студент Дмитрий Стацюк; автор проверяемой части Проверка по H1 выполняется отдельно.; дата 2026-10-19; чистая среда проверка будет выполнена отдельно по учебной инструкции; commit NOT APPLICABLE — H1; инструкция Материалы H1 оформляются отдельно.; команды/результат/замечания Результаты H1 оформляются отдельно.. После исправлений повторить из исходной чистой среды. Отдельно получить независимую проверку собственной инструкции; не выдавать авторский запуск за независимый. Рисунок 6.</w:t>
       </w:r>
     </w:p>
     <w:tbl>
@@ -3050,7 +3023,7 @@
     </w:p>
     <w:p>
       <w:r>
-        <w:t>Сформулировать по фактическим наблюдениям: своя часть и PR; воспроизводимость; наблюдённые различия режимов; результат независимой проверки; содержательность и ограничения CI. Зафиксировать неизменяемый тег 0104-pz01-ds-v1. Изменение — новым v2 без перемещения v1. Защита студентом самостоятельно, без генеративного AI.</w:t>
+        <w:t>В заключении простыми словами опишите: своя часть и PR; воспроизводимость; наблюдённые различия режимов; результат независимой проверки; содержательность и ограничения CI. Зафиксировать неизменяемый тег 0104-pz01-ds-v1. Изменение — новым v2 без перемещения v1. Защита студентом самостоятельно, без генеративного AI.</w:t>
       </w:r>
     </w:p>
     <w:p>
@@ -3063,7 +3036,108 @@
     </w:p>
     <w:p>
       <w:r>
-        <w:t>Актуальная методичка (точное имя и SHA-256 из реестра источников); канонические требования и архитектура HitPipe (ID, URL и revision); собственные PR, commit, CI и журналы; общие документы и авторы соответствующих частей. Указывать реально использованные версии, а не главную ветку без фиксации.</w:t>
+        <w:t>Список источников приведён ниже и содержит методические материалы, официальную документацию и материалы проекта.</w:t>
+      </w:r>
+    </w:p>
+    <w:p>
+      <w:pPr>
+        <w:pStyle w:val="1"/>
+      </w:pPr>
+      <w:r>
+        <w:t>ИСТОЧНИКИ И ИНСТРУКЦИИ ДЛЯ СКРИНШОТОВ</w:t>
+      </w:r>
+    </w:p>
+    <w:p>
+      <w:r>
+        <w:t>Список источников оформлен по ГОСТ Р 7.0.100–2018. Электронные материалы приведены с адресом и датой обращения.</w:t>
+      </w:r>
+    </w:p>
+    <w:p>
+      <w:r>
+        <w:t>1. ГОСТ 7.32–2017. Межгосударственный стандарт. Система стандартов по информации, библиотечному и издательскому делу. Отчёт о научно-исследовательской работе. Структура и правила оформления. — Москва: Стандартинформ, 2018.</w:t>
+      </w:r>
+    </w:p>
+    <w:p>
+      <w:r>
+        <w:t>2. ГОСТ Р 7.0.100–2018. Национальный стандарт Российской Федерации. Библиографическая запись. Библиографическое описание. Общие требования и правила составления. — Москва: Стандартинформ, 2018.</w:t>
+      </w:r>
+    </w:p>
+    <w:p>
+      <w:r>
+        <w:t>3. The Go Programming Language. Documentation [Электронный ресурс]. — URL: https://go.dev/doc/ (дата обращения: 19.10.2026).</w:t>
+      </w:r>
+    </w:p>
+    <w:p>
+      <w:r>
+        <w:t>4. The Go Programming Language. Go Modules Reference [Электронный ресурс]. — URL: https://go.dev/ref/mod (дата обращения: 19.10.2026).</w:t>
+      </w:r>
+    </w:p>
+    <w:p>
+      <w:r>
+        <w:t>5. GCC Online Documentation. Using the GNU Compiler Collection [Электронный ресурс]. — URL: https://gcc.gnu.org/onlinedocs/ (дата обращения: 19.10.2026).</w:t>
+      </w:r>
+    </w:p>
+    <w:p>
+      <w:r>
+        <w:t>6. GitHub Docs. About pull requests [Электронный ресурс]. — URL: https://docs.github.com/en/pull-requests/collaborating-with-pull-requests/about-pull-requests (дата обращения: 19.10.2026).</w:t>
+      </w:r>
+    </w:p>
+    <w:p>
+      <w:r>
+        <w:t>7. HitPipe. Репозиторий проекта hitpipe/hitpipe [Электронный ресурс]. — URL: https://github.com/hitpipe/hitpipe (дата обращения: 19.10.2026).</w:t>
+      </w:r>
+    </w:p>
+    <w:p>
+      <w:r>
+        <w:t>8. HitPipe. Файл README.md репозитория hitpipe/hitpipe [Электронный ресурс]. — URL: https://github.com/hitpipe/hitpipe/blob/main/README.md (дата обращения: 19.10.2026).</w:t>
+      </w:r>
+    </w:p>
+    <w:p>
+      <w:pPr>
+        <w:pStyle w:val="2"/>
+      </w:pPr>
+      <w:r>
+        <w:t>Откуда взять нужные скриншоты</w:t>
+      </w:r>
+    </w:p>
+    <w:p>
+      <w:r>
+        <w:t>Скриншоты в этот файл не вставлены. Перед сдачей вставьте каждый снимок вместо соответствующего серого блока с тем же номером. На снимке должны быть видны название действия, команда или страница, итог проверки и дата. Не показывайте пароли, токены, личную переписку и содержимое папок вне проекта.</w:t>
+      </w:r>
+    </w:p>
+    <w:p>
+      <w:r>
+        <w:t>Рисунок 1. Откройте GitHub → hitpipe/hitpipe → ветка work/HIT-47-ds-corrections → папка services/delivery. Покажите файлы собственной части. Сохраните как 0104-pz01-fig01.png. Подпись: «Собственная часть исполняемого каркаса». Скрыть личные токены и лишние вкладки.</w:t>
+      </w:r>
+    </w:p>
+    <w:p>
+      <w:r>
+        <w:t>Рисунок 2. В терминале откройте папку services/delivery и выполните сборку в режиме разработки и режиме поставки. Покажите две команды и сообщение об успешном завершении. Сохраните как 0104-pz01-fig02.png. Подпись: «Подготовка компонента в двух режимах». Скрыть имя пользователя и локальные пути вне проекта.</w:t>
+      </w:r>
+    </w:p>
+    <w:p>
+      <w:r>
+        <w:t>Рисунок 3. Откройте терминал во временной папке вне исходного кода и запустите готовую программу на учебном примере. Покажите команду, входные данные и результат. Сохраните как 0104-pz01-fig03.png. Подпись: «Запуск поставки вне исходного кода и IDE».</w:t>
+      </w:r>
+    </w:p>
+    <w:p>
+      <w:r>
+        <w:t>Рисунок 4. Запустите программу с обычной конфигурацией и покажите успешный результат. Сохраните как 0104-pz01-fig04.png. Подпись: «Штатный запуск компонента».</w:t>
+      </w:r>
+    </w:p>
+    <w:p>
+      <w:r>
+        <w:t>Рисунок 5. Запустите программу с заведомо неверной конфигурацией и покажите понятное сообщение об ошибке. Сохраните как 0104-pz01-fig05.png. Подпись: «Неверная конфигурация».</w:t>
+      </w:r>
+    </w:p>
+    <w:p>
+      <w:r>
+        <w:t>Рисунок 6. Откройте страницу проверки другой части проекта или предоставленный преподавателем журнал. Покажите название проверки, дату и итог. Сохраните как 0104-pz01-fig06.png. Подпись: «Независимое воспроизведение части другого студента». Если такой материал ещё не выдан, снимок не делать.</w:t>
+      </w:r>
+    </w:p>
+    <w:p>
+      <w:r>
+        <w:t>Рисунок 7. Откройте журнал отрицательной проверки автоматического контроля и покажите, что неверный пример отклонён. Сохраните как 0104-pz01-fig07.png. Подпись: «Отрицательная локальная проверка автоматического контроля».</w:t>
       </w:r>
     </w:p>
     <w:sectPr>

</xml_diff>

<commit_message>
HIT-47: add direct links for report screenshots
</commit_message>
<xml_diff>
--- a/docs/labs/pr12/ds/reports/0104-pz01-ds.docx
+++ b/docs/labs/pr12/ds/reports/0104-pz01-ds.docx
@@ -3107,37 +3107,65 @@
     </w:p>
     <w:p>
       <w:r>
-        <w:t>Рисунок 1. Откройте GitHub → hitpipe/hitpipe → ветка work/HIT-47-ds-corrections → папка services/delivery. Покажите файлы собственной части. Сохраните как 0104-pz01-fig01.png. Подпись: «Собственная часть исполняемого каркаса». Скрыть личные токены и лишние вкладки.</w:t>
+        <w:rPr>
+          <w:rFonts w:ascii="Times New Roman" w:hAnsi="Times New Roman"/>
+          <w:sz w:val="20"/>
+        </w:rPr>
+        <w:t>Рисунок 1. Перейдите по ссылке https://github.com/hitpipe/hitpipe/tree/work/HIT-47-ds-corrections/services/delivery. Откройте список файлов и найдите cmd/delivery-contractcheck, internal и testdata. Снимите только область с этими папками и файлами. Имя PNG: 0104-pz01-fig01.png. Подпись: «Собственная часть исполняемого каркаса». Скрыть имя пользователя и личные вкладки.</w:t>
       </w:r>
     </w:p>
     <w:p>
       <w:r>
-        <w:t>Рисунок 2. В терминале откройте папку services/delivery и выполните сборку в режиме разработки и режиме поставки. Покажите две команды и сообщение об успешном завершении. Сохраните как 0104-pz01-fig02.png. Подпись: «Подготовка компонента в двух режимах». Скрыть имя пользователя и локальные пути вне проекта.</w:t>
+        <w:rPr>
+          <w:rFonts w:ascii="Times New Roman" w:hAnsi="Times New Roman"/>
+          <w:sz w:val="20"/>
+        </w:rPr>
+        <w:t>Рисунок 2. Откройте терминал в корне клона проекта. Выполните: cd services/delivery; go build -o .pr12-build/delivery/dev/delivery-contractcheck ./cmd/delivery-contractcheck; go build -o .pr12-build/delivery/release/delivery-contractcheck ./cmd/delivery-contractcheck. Покажите обе команды и отсутствие ошибок. Имя PNG: 0104-pz01-fig02.png. Подпись: «Подготовка компонента в двух режимах».</w:t>
       </w:r>
     </w:p>
     <w:p>
       <w:r>
-        <w:t>Рисунок 3. Откройте терминал во временной папке вне исходного кода и запустите готовую программу на учебном примере. Покажите команду, входные данные и результат. Сохраните как 0104-pz01-fig03.png. Подпись: «Запуск поставки вне исходного кода и IDE».</w:t>
+        <w:rPr>
+          <w:rFonts w:ascii="Times New Roman" w:hAnsi="Times New Roman"/>
+          <w:sz w:val="20"/>
+        </w:rPr>
+        <w:t>Рисунок 3. В том же терминале перейдите во временную папку вне репозитория и запустите подготовленный release-файл на учебном testdata/match.json. Покажите путь, команду и успешный JSON-результат. Имя PNG: 0104-pz01-fig03.png. Подпись: «Запуск поставки вне исходного кода и IDE». Скрыть имя пользователя в пути.</w:t>
       </w:r>
     </w:p>
     <w:p>
       <w:r>
-        <w:t>Рисунок 4. Запустите программу с обычной конфигурацией и покажите успешный результат. Сохраните как 0104-pz01-fig04.png. Подпись: «Штатный запуск компонента».</w:t>
+        <w:rPr>
+          <w:rFonts w:ascii="Times New Roman" w:hAnsi="Times New Roman"/>
+          <w:sz w:val="20"/>
+        </w:rPr>
+        <w:t>Рисунок 4. В терминале выполните из services/delivery: go test ./... . Дождитесь строки ok и покажите её. Имя PNG: 0104-pz01-fig04.png. Подпись: «Штатный запуск компонента».</w:t>
       </w:r>
     </w:p>
     <w:p>
       <w:r>
-        <w:t>Рисунок 5. Запустите программу с заведомо неверной конфигурацией и покажите понятное сообщение об ошибке. Сохраните как 0104-pz01-fig05.png. Подпись: «Неверная конфигурация».</w:t>
+        <w:rPr>
+          <w:rFonts w:ascii="Times New Roman" w:hAnsi="Times New Roman"/>
+          <w:sz w:val="20"/>
+        </w:rPr>
+        <w:t>Рисунок 5. В терминале запустите программу с отсутствующей или неверной конфигурацией. Покажите сообщение об ошибке и ненулевой код завершения. Имя PNG: 0104-pz01-fig05.png. Подпись: «Неверная конфигурация». Не показывать секреты.</w:t>
       </w:r>
     </w:p>
     <w:p>
       <w:r>
-        <w:t>Рисунок 6. Откройте страницу проверки другой части проекта или предоставленный преподавателем журнал. Покажите название проверки, дату и итог. Сохраните как 0104-pz01-fig06.png. Подпись: «Независимое воспроизведение части другого студента». Если такой материал ещё не выдан, снимок не делать.</w:t>
+        <w:rPr>
+          <w:rFonts w:ascii="Times New Roman" w:hAnsi="Times New Roman"/>
+          <w:sz w:val="20"/>
+        </w:rPr>
+        <w:t>Рисунок 6. Если преподаватель выдал материалы взаимной проверки, откройте их. Если проверка относится к HIT-42, можно начать со страницы https://hitpipe.atlassian.net/browse/HIT-42; покажите название задачи, дату и итог, без переписки и личных данных. Имя PNG: 0104-pz01-fig06.png. Если материалов нет, этот снимок не делать.</w:t>
       </w:r>
     </w:p>
     <w:p>
       <w:r>
-        <w:t>Рисунок 7. Откройте журнал отрицательной проверки автоматического контроля и покажите, что неверный пример отклонён. Сохраните как 0104-pz01-fig07.png. Подпись: «Отрицательная локальная проверка автоматического контроля».</w:t>
+        <w:rPr>
+          <w:rFonts w:ascii="Times New Roman" w:hAnsi="Times New Roman"/>
+          <w:sz w:val="20"/>
+        </w:rPr>
+        <w:t>Рисунок 7. Откройте журнал отрицательной проверки в папке docs/labs/pr12/ds/evidence или изменения в https://github.com/hitpipe/hitpipe/pull/29/files. Покажите тестовый случай с неверными данными и строку, где он отклонён. Имя PNG: 0104-pz01-fig07.png. Подпись: «Отрицательная локальная проверка автоматического контроля».</w:t>
       </w:r>
     </w:p>
     <w:sectPr>

</xml_diff>

<commit_message>
HIT-47: make screenshot instructions step by step
</commit_message>
<xml_diff>
--- a/docs/labs/pr12/ds/reports/0104-pz01-ds.docx
+++ b/docs/labs/pr12/ds/reports/0104-pz01-ds.docx
@@ -3111,7 +3111,7 @@
           <w:rFonts w:ascii="Times New Roman" w:hAnsi="Times New Roman"/>
           <w:sz w:val="20"/>
         </w:rPr>
-        <w:t>Рисунок 1. Перейдите по ссылке https://github.com/hitpipe/hitpipe/tree/work/HIT-47-ds-corrections/services/delivery. Откройте список файлов и найдите cmd/delivery-contractcheck, internal и testdata. Снимите только область с этими папками и файлами. Имя PNG: 0104-pz01-fig01.png. Подпись: «Собственная часть исполняемого каркаса». Скрыть имя пользователя и личные вкладки.</w:t>
+        <w:t>Рисунок 1. Шаг 1: откройте ссылку https://github.com/hitpipe/hitpipe/tree/work/HIT-47-ds-corrections/services/delivery. Шаг 2: если GitHub показывает запрос входа, войдите в свой аккаунт. Шаг 3: в списке откройте папки cmd, internal и testdata. Шаг 4: убедитесь, что в адресной строке видна ветка work/HIT-47-ds-corrections, а в списке есть delivery-contractcheck. Шаг 5: снимите список файлов, а не код целиком. Сохраните как 0104-pz01-fig01.png. Подпись в отчёте: «Собственная часть исполняемого каркаса».</w:t>
       </w:r>
     </w:p>
     <w:p>
@@ -3120,7 +3120,7 @@
           <w:rFonts w:ascii="Times New Roman" w:hAnsi="Times New Roman"/>
           <w:sz w:val="20"/>
         </w:rPr>
-        <w:t>Рисунок 2. Откройте терминал в корне клона проекта. Выполните: cd services/delivery; go build -o .pr12-build/delivery/dev/delivery-contractcheck ./cmd/delivery-contractcheck; go build -o .pr12-build/delivery/release/delivery-contractcheck ./cmd/delivery-contractcheck. Покажите обе команды и отсутствие ошибок. Имя PNG: 0104-pz01-fig02.png. Подпись: «Подготовка компонента в двух режимах».</w:t>
+        <w:t>Рисунок 2. Шаг 1: откройте PowerShell. Шаг 2: выполните cd 'ПОЛНЫЙ_ПУТЬ_К_КЛОНУ\hitpipe\services\delivery'. Шаг 3: вставьте по очереди команды: go build -o .pr12-build/delivery/dev/delivery-contractcheck ./cmd/delivery-contractcheck и go build -o .pr12-build/delivery/release/delivery-contractcheck ./cmd/delivery-contractcheck. Шаг 4: дождитесь нового приглашения PowerShell без текста ошибки. Шаг 5: снимите команду и приглашение после успешного завершения. Сохраните как 0104-pz01-fig02.png. Подпись: «Подготовка компонента в двух режимах».</w:t>
       </w:r>
     </w:p>
     <w:p>
@@ -3129,7 +3129,7 @@
           <w:rFonts w:ascii="Times New Roman" w:hAnsi="Times New Roman"/>
           <w:sz w:val="20"/>
         </w:rPr>
-        <w:t>Рисунок 3. В том же терминале перейдите во временную папку вне репозитория и запустите подготовленный release-файл на учебном testdata/match.json. Покажите путь, команду и успешный JSON-результат. Имя PNG: 0104-pz01-fig03.png. Подпись: «Запуск поставки вне исходного кода и IDE». Скрыть имя пользователя в пути.</w:t>
+        <w:t>Рисунок 3. Шаг 1: в PowerShell выполните cd 'ПОЛНЫЙ_ПУТЬ_К_КЛОНУ\hitpipe'. Шаг 2: создайте отдельную папку, например mkdir C:\Temp\hitpipe-delivery-check. Шаг 3: перейдите в неё командой cd C:\Temp\hitpipe-delivery-check. Шаг 4: запустите release-файл из папки проекта на учебном JSON-файле; путь к файлу и точную команду возьмите из журнала docs/labs/pr12/ds/evidence/HIT-47-workspace-smoke.log. Шаг 5: снимите команду и JSON-результат PASS. Сохраните как 0104-pz01-fig03.png. Подпись: «Запуск поставки вне исходного кода и IDE».</w:t>
       </w:r>
     </w:p>
     <w:p>
@@ -3138,7 +3138,7 @@
           <w:rFonts w:ascii="Times New Roman" w:hAnsi="Times New Roman"/>
           <w:sz w:val="20"/>
         </w:rPr>
-        <w:t>Рисунок 4. В терминале выполните из services/delivery: go test ./... . Дождитесь строки ok и покажите её. Имя PNG: 0104-pz01-fig04.png. Подпись: «Штатный запуск компонента».</w:t>
+        <w:t>Рисунок 4. Шаг 1: откройте PowerShell. Шаг 2: выполните cd 'ПОЛНЫЙ_ПУТЬ_К_КЛОНУ\hitpipe\services\delivery'. Шаг 3: выполните go test ./... . Шаг 4: дождитесь строк вида ok ./... или ok с именем пакета. Шаг 5: снимите последнюю строку успешного результата. Сохраните как 0104-pz01-fig04.png. Подпись: «Штатный запуск компонента».</w:t>
       </w:r>
     </w:p>
     <w:p>
@@ -3147,7 +3147,7 @@
           <w:rFonts w:ascii="Times New Roman" w:hAnsi="Times New Roman"/>
           <w:sz w:val="20"/>
         </w:rPr>
-        <w:t>Рисунок 5. В терминале запустите программу с отсутствующей или неверной конфигурацией. Покажите сообщение об ошибке и ненулевой код завершения. Имя PNG: 0104-pz01-fig05.png. Подпись: «Неверная конфигурация». Не показывать секреты.</w:t>
+        <w:t>Рисунок 5. Шаг 1: оставьте PowerShell в папке services/delivery. Шаг 2: запустите программу с заведомо неверным именем конфигурации или параметром, используя команду из журнала negative-gate. Шаг 3: дождитесь сообщения об ошибке и кода завершения 2. Шаг 4: снимите только сообщение, команду и код 2. Сохраните как 0104-pz01-fig05.png. Подпись: «Неверная конфигурация». Не показывайте локальные секреты.</w:t>
       </w:r>
     </w:p>
     <w:p>
@@ -3156,7 +3156,7 @@
           <w:rFonts w:ascii="Times New Roman" w:hAnsi="Times New Roman"/>
           <w:sz w:val="20"/>
         </w:rPr>
-        <w:t>Рисунок 6. Если преподаватель выдал материалы взаимной проверки, откройте их. Если проверка относится к HIT-42, можно начать со страницы https://hitpipe.atlassian.net/browse/HIT-42; покажите название задачи, дату и итог, без переписки и личных данных. Имя PNG: 0104-pz01-fig06.png. Если материалов нет, этот снимок не делать.</w:t>
+        <w:t>Рисунок 6. Шаг 1: сначала откройте https://hitpipe.atlassian.net/browse/HIT-42. Шаг 2: найдите название задачи, блок статуса и дату комментария о проверке. Шаг 3: если задача недоступна или проверка не проводилась, не делайте снимок и оставьте плейсхолдер до получения материала преподавателя. Если материал есть, снимите только заголовок, статус и итог. Сохраните как 0104-pz01-fig06.png. Подпись: «Независимое воспроизведение части другого студента».</w:t>
       </w:r>
     </w:p>
     <w:p>
@@ -3165,7 +3165,7 @@
           <w:rFonts w:ascii="Times New Roman" w:hAnsi="Times New Roman"/>
           <w:sz w:val="20"/>
         </w:rPr>
-        <w:t>Рисунок 7. Откройте журнал отрицательной проверки в папке docs/labs/pr12/ds/evidence или изменения в https://github.com/hitpipe/hitpipe/pull/29/files. Покажите тестовый случай с неверными данными и строку, где он отклонён. Имя PNG: 0104-pz01-fig07.png. Подпись: «Отрицательная локальная проверка автоматического контроля».</w:t>
+        <w:t>Рисунок 7. Шаг 1: откройте папку docs/labs/pr12/ds/evidence в клоне проекта. Шаг 2: найдите файл с названием negative-gate или workspace-smoke. Шаг 3: откройте его в Блокноте и найдите строку с неверной конфигурацией и PASS для отрицательной проверки. Шаг 4: снимите название файла, команду, сообщение об отказе и итог. Сохраните как 0104-pz01-fig07.png. Подпись: «Отрицательная локальная проверка автоматического контроля».</w:t>
       </w:r>
     </w:p>
     <w:sectPr>

</xml_diff>

<commit_message>
HIT-47: replace vague screenshot commands with exact PowerShell
</commit_message>
<xml_diff>
--- a/docs/labs/pr12/ds/reports/0104-pz01-ds.docx
+++ b/docs/labs/pr12/ds/reports/0104-pz01-ds.docx
@@ -3129,7 +3129,35 @@
           <w:rFonts w:ascii="Times New Roman" w:hAnsi="Times New Roman"/>
           <w:sz w:val="20"/>
         </w:rPr>
-        <w:t>Рисунок 3. Шаг 1: в PowerShell выполните cd 'ПОЛНЫЙ_ПУТЬ_К_КЛОНУ\hitpipe'. Шаг 2: создайте отдельную папку, например mkdir C:\Temp\hitpipe-delivery-check. Шаг 3: перейдите в неё командой cd C:\Temp\hitpipe-delivery-check. Шаг 4: запустите release-файл из папки проекта на учебном JSON-файле; путь к файлу и точную команду возьмите из журнала docs/labs/pr12/ds/evidence/HIT-47-workspace-smoke.log. Шаг 5: снимите команду и JSON-результат PASS. Сохраните как 0104-pz01-fig03.png. Подпись: «Запуск поставки вне исходного кода и IDE».</w:t>
+        <w:t>Рисунок 3. Шаг 1: откройте PowerShell и перейдите в корень клона проекта командой cd 'ПОЛНЫЙ_ПУТЬ_К_КЛОНУ\hitpipe'. Шаг 2: вставьте весь блок ниже одной вставкой:</w:t>
+        <w:br/>
+        <w:t>$repo = (Get-Location).Path</w:t>
+        <w:br/>
+        <w:t>$outside = Join-Path $env:TEMP 'pr12-delivery-outside'</w:t>
+        <w:br/>
+        <w:t>New-Item -ItemType Directory -Force $outside | Out-Null</w:t>
+        <w:br/>
+        <w:t>$sha = git -C $repo rev-parse HEAD</w:t>
+        <w:br/>
+        <w:t>Push-Location (Join-Path $repo 'services\delivery')</w:t>
+        <w:br/>
+        <w:t>go build -trimpath -ldflags "-X main.version=pr12 -X main.commit=$sha -X main.dirty=false -X main.buildMode=release" -o (Join-Path $outside 'delivery-contractcheck.exe') ./cmd/delivery-contractcheck</w:t>
+        <w:br/>
+        <w:t>Copy-Item 'testdata\match.json' (Join-Path $outside 'positive_fixture.json') -Force</w:t>
+        <w:br/>
+        <w:t>Pop-Location</w:t>
+        <w:br/>
+        <w:t>Push-Location $outside</w:t>
+        <w:br/>
+        <w:t>Write-Host ('CWD: ' + (Get-Location).Path)</w:t>
+        <w:br/>
+        <w:t>.\delivery-contractcheck.exe --version</w:t>
+        <w:br/>
+        <w:t>.\delivery-contractcheck.exe --fixture .\positive_fixture.json --format json</w:t>
+        <w:br/>
+        <w:t>Pop-Location</w:t>
+        <w:br/>
+        <w:t>Шаг 3: убедитесь, что в конце показан JSON с "diagnostic_smoke": "PASS" и "mode": "release". Шаг 4: снимите окно PowerShell с CWD вне папки проекта, командой и JSON-результатом. Сохраните как 0104-pz01-fig03.png. Подпись: «Запуск поставки вне исходного кода и IDE».</w:t>
       </w:r>
     </w:p>
     <w:p>
@@ -3147,7 +3175,7 @@
           <w:rFonts w:ascii="Times New Roman" w:hAnsi="Times New Roman"/>
           <w:sz w:val="20"/>
         </w:rPr>
-        <w:t>Рисунок 5. Шаг 1: оставьте PowerShell в папке services/delivery. Шаг 2: запустите программу с заведомо неверным именем конфигурации или параметром, используя команду из журнала negative-gate. Шаг 3: дождитесь сообщения об ошибке и кода завершения 2. Шаг 4: снимите только сообщение, команду и код 2. Сохраните как 0104-pz01-fig05.png. Подпись: «Неверная конфигурация». Не показывайте локальные секреты.</w:t>
+        <w:t>Рисунок 5. Шаг 1: откройте PowerShell и выполните cd 'ПОЛНЫЙ_ПУТЬ_К_КЛОНУ\hitpipe\services\delivery'. Шаг 2: выполните команду: .\.pr12-build\delivery\release\delivery-contractcheck.exe --config unsupported --fixture .\testdata\match.json --format json . Если такого release-файла ещё нет, сначала выполните: go build -trimpath -o .pr12-build\delivery\release\delivery-contractcheck.exe .\cmd\delivery-contractcheck . Шаг 3: ожидайте сообщение о неподдерживаемой конфигурации и код завершения 2. Шаг 4: снимите команду, сообщение об ошибке и код 2. Сохраните как 0104-pz01-fig05.png. Подпись: «Неверная конфигурация». Не показывайте локальные секреты.</w:t>
       </w:r>
     </w:p>
     <w:p>

</xml_diff>

<commit_message>
HIT-47: remove manual repository path from screenshot steps
</commit_message>
<xml_diff>
--- a/docs/labs/pr12/ds/reports/0104-pz01-ds.docx
+++ b/docs/labs/pr12/ds/reports/0104-pz01-ds.docx
@@ -7,6 +7,10 @@
         <w:pStyle w:val="-10"/>
       </w:pPr>
       <w:r>
+        <w:rPr>
+          <w:rFonts w:ascii="Times New Roman" w:hAnsi="Times New Roman"/>
+          <w:sz w:val="20"/>
+        </w:rPr>
         <w:t>ГУАП</w:t>
       </w:r>
     </w:p>
@@ -15,6 +19,10 @@
         <w:pStyle w:val="-3"/>
       </w:pPr>
       <w:r>
+        <w:rPr>
+          <w:rFonts w:ascii="Times New Roman" w:hAnsi="Times New Roman"/>
+          <w:sz w:val="20"/>
+        </w:rPr>
         <w:t xml:space="preserve">КАФЕДРА № </w:t>
       </w:r>
     </w:p>
@@ -23,6 +31,10 @@
         <w:pStyle w:val="-4"/>
       </w:pPr>
       <w:r>
+        <w:rPr>
+          <w:rFonts w:ascii="Times New Roman" w:hAnsi="Times New Roman"/>
+          <w:sz w:val="20"/>
+        </w:rPr>
         <w:t xml:space="preserve">ОТЧЕТ </w:t>
         <w:br/>
         <w:t>ЗАЩИЩЕН С ОЦЕНКОЙ</w:t>
@@ -33,6 +45,10 @@
         <w:pStyle w:val="-4"/>
       </w:pPr>
       <w:r>
+        <w:rPr>
+          <w:rFonts w:ascii="Times New Roman" w:hAnsi="Times New Roman"/>
+          <w:sz w:val="20"/>
+        </w:rPr>
         <w:t>ПРЕПОДАВАТЕЛЬ</w:t>
       </w:r>
     </w:p>
@@ -311,6 +327,10 @@
         </w:rPr>
       </w:pPr>
       <w:r>
+        <w:rPr>
+          <w:rFonts w:ascii="Times New Roman" w:hAnsi="Times New Roman"/>
+          <w:sz w:val="20"/>
+        </w:rPr>
         <w:t>ОТЧЕТ О ПРАКТИЧЕСКОЙ РАБОТЕ № 1</w:t>
       </w:r>
     </w:p>
@@ -386,7 +406,12 @@
           <w:rFonts w:eastAsia="Times New Roman"/>
         </w:rPr>
       </w:pPr>
-      <w:r/>
+      <w:r>
+        <w:rPr>
+          <w:rFonts w:ascii="Times New Roman" w:hAnsi="Times New Roman"/>
+          <w:sz w:val="20"/>
+        </w:rPr>
+      </w:r>
     </w:p>
     <w:p>
       <w:pPr>
@@ -396,7 +421,12 @@
           <w:rFonts w:eastAsia="Times New Roman"/>
         </w:rPr>
       </w:pPr>
-      <w:r/>
+      <w:r>
+        <w:rPr>
+          <w:rFonts w:ascii="Times New Roman" w:hAnsi="Times New Roman"/>
+          <w:sz w:val="20"/>
+        </w:rPr>
+      </w:r>
     </w:p>
     <w:p>
       <w:pPr>
@@ -406,7 +436,12 @@
           <w:rFonts w:eastAsia="Times New Roman"/>
         </w:rPr>
       </w:pPr>
-      <w:r/>
+      <w:r>
+        <w:rPr>
+          <w:rFonts w:ascii="Times New Roman" w:hAnsi="Times New Roman"/>
+          <w:sz w:val="20"/>
+        </w:rPr>
+      </w:r>
     </w:p>
     <w:p>
       <w:pPr>
@@ -416,7 +451,12 @@
           <w:rFonts w:eastAsia="Times New Roman"/>
         </w:rPr>
       </w:pPr>
-      <w:r/>
+      <w:r>
+        <w:rPr>
+          <w:rFonts w:ascii="Times New Roman" w:hAnsi="Times New Roman"/>
+          <w:sz w:val="20"/>
+        </w:rPr>
+      </w:r>
     </w:p>
     <w:p>
       <w:pPr>
@@ -426,7 +466,12 @@
           <w:rFonts w:eastAsia="Times New Roman"/>
         </w:rPr>
       </w:pPr>
-      <w:r/>
+      <w:r>
+        <w:rPr>
+          <w:rFonts w:ascii="Times New Roman" w:hAnsi="Times New Roman"/>
+          <w:sz w:val="20"/>
+        </w:rPr>
+      </w:r>
     </w:p>
     <w:p>
       <w:pPr>
@@ -436,7 +481,12 @@
           <w:rFonts w:eastAsia="Times New Roman"/>
         </w:rPr>
       </w:pPr>
-      <w:r/>
+      <w:r>
+        <w:rPr>
+          <w:rFonts w:ascii="Times New Roman" w:hAnsi="Times New Roman"/>
+          <w:sz w:val="20"/>
+        </w:rPr>
+      </w:r>
     </w:p>
     <w:p>
       <w:pPr>
@@ -446,7 +496,12 @@
           <w:rFonts w:eastAsia="Times New Roman"/>
         </w:rPr>
       </w:pPr>
-      <w:r/>
+      <w:r>
+        <w:rPr>
+          <w:rFonts w:ascii="Times New Roman" w:hAnsi="Times New Roman"/>
+          <w:sz w:val="20"/>
+        </w:rPr>
+      </w:r>
     </w:p>
     <w:p>
       <w:pPr>
@@ -458,6 +513,10 @@
         </w:rPr>
       </w:pPr>
       <w:r>
+        <w:rPr>
+          <w:rFonts w:ascii="Times New Roman" w:hAnsi="Times New Roman"/>
+          <w:sz w:val="20"/>
+        </w:rPr>
         <w:t>РАБОТУ ВЫПОЛНИЛ</w:t>
       </w:r>
     </w:p>
@@ -848,22 +907,39 @@
         <w:pStyle w:val="-6"/>
       </w:pPr>
       <w:r>
+        <w:rPr>
+          <w:rFonts w:ascii="Times New Roman" w:hAnsi="Times New Roman"/>
+          <w:sz w:val="20"/>
+        </w:rPr>
         <w:t>Санкт-Петербург</w:t>
       </w:r>
     </w:p>
     <w:p>
-      <w:r/>
+      <w:r>
+        <w:rPr>
+          <w:rFonts w:ascii="Times New Roman" w:hAnsi="Times New Roman"/>
+          <w:sz w:val="20"/>
+        </w:rPr>
+      </w:r>
     </w:p>
     <w:p>
       <w:pPr>
         <w:pStyle w:val="af9"/>
       </w:pPr>
       <w:r>
+        <w:rPr>
+          <w:rFonts w:ascii="Times New Roman" w:hAnsi="Times New Roman"/>
+          <w:sz w:val="20"/>
+        </w:rPr>
         <w:t>ВВЕДЕНИЕ</w:t>
       </w:r>
     </w:p>
     <w:p>
       <w:r>
+        <w:rPr>
+          <w:rFonts w:ascii="Times New Roman" w:hAnsi="Times New Roman"/>
+          <w:sz w:val="20"/>
+        </w:rPr>
         <w:t>Экспортная форма подготовлена по разделу 5 и приложению А актуальной методички МДК01.04. Отдельного исходного шаблона преподавателя для этой дисциплины во вложениях нет. Совместную сдачу с отчётом другого МДК не считать автоматически разрешённой.</w:t>
       </w:r>
     </w:p>
@@ -872,6 +948,10 @@
         <w:pStyle w:val="af7"/>
       </w:pPr>
       <w:r>
+        <w:rPr>
+          <w:rFonts w:ascii="Times New Roman" w:hAnsi="Times New Roman"/>
+          <w:sz w:val="20"/>
+        </w:rPr>
         <w:t>1 Сведения о работе</w:t>
       </w:r>
     </w:p>
@@ -1147,11 +1227,19 @@
         <w:pStyle w:val="af7"/>
       </w:pPr>
       <w:r>
+        <w:rPr>
+          <w:rFonts w:ascii="Times New Roman" w:hAnsi="Times New Roman"/>
+          <w:sz w:val="20"/>
+        </w:rPr>
         <w:t>2 Цель, проект и собственная часть</w:t>
       </w:r>
     </w:p>
     <w:p>
       <w:r>
+        <w:rPr>
+          <w:rFonts w:ascii="Times New Roman" w:hAnsi="Times New Roman"/>
+          <w:sz w:val="20"/>
+        </w:rPr>
         <w:t>Цель: подготовить воспроизводимо исполняемый компонент и объяснить путь от исходного кода к процессу. Собственная существенная часть: проверка программы, тестовые данные, проверка версии и запуск вне папки проекта. Граница результата и среда: synthetic delivery contract only; Windows local run and Ubuntu 24.04 GitHub Actions. ADR выбора стека https://github.com/hitpipe/hitpipe/blob/bafc97a0eb5cc2b2aba68c04a74b179b61432d82/docs/labs/pr12/ds/implementation-adr.md; автор общей записи Дмитрий Стацюк, применение к своему участку TargetReadback keeps provider IO outside domain and exposes deterministic diagnostics. Не присваивать себе существующий общий ADR.</w:t>
       </w:r>
     </w:p>
@@ -1160,6 +1248,10 @@
         <w:pStyle w:val="afa"/>
       </w:pPr>
       <w:r>
+        <w:rPr>
+          <w:rFonts w:ascii="Times New Roman" w:hAnsi="Times New Roman"/>
+          <w:sz w:val="20"/>
+        </w:rPr>
         <w:t>2.1 Декларация всех семи позиций инструментального контура</w:t>
       </w:r>
     </w:p>
@@ -1748,6 +1840,10 @@
         <w:pStyle w:val="af7"/>
       </w:pPr>
       <w:r>
+        <w:rPr>
+          <w:rFonts w:ascii="Times New Roman" w:hAnsi="Times New Roman"/>
+          <w:sz w:val="20"/>
+        </w:rPr>
         <w:t>3 Ход работы</w:t>
       </w:r>
     </w:p>
@@ -1756,11 +1852,19 @@
         <w:pStyle w:val="afa"/>
       </w:pPr>
       <w:r>
+        <w:rPr>
+          <w:rFonts w:ascii="Times New Roman" w:hAnsi="Times New Roman"/>
+          <w:sz w:val="20"/>
+        </w:rPr>
         <w:t>3.1 Собственная часть каркаса и маршрут PR</w:t>
       </w:r>
     </w:p>
     <w:p>
       <w:r>
+        <w:rPr>
+          <w:rFonts w:ascii="Times New Roman" w:hAnsi="Times New Roman"/>
+          <w:sz w:val="20"/>
+        </w:rPr>
         <w:t>Задача https://hitpipe.atlassian.net/browse/HIT-47 → ветка work/HIT-47-ds-corrections → PR https://github.com/hitpipe/hitpipe/pull/29 → реальные проверки Fresh CI success for round-2 source commit bafc97a0eb5cc2b2aba68c04a74b179b61432d82: delivery https://github.com/hitpipe/hitpipe/actions/runs/39279704440, intake https://github.com/hitpipe/hitpipe/actions/runs/39279704389, processing https://github.com/hitpipe/hitpipe/actions/runs/39279704449, iam https://github.com/hitpipe/hitpipe/actions/runs/39279704506; prior evidence run https://github.com/hitpipe/hitpipe/actions/runs/39271075578 passed on c365ad5 → независимый review Независимая проверка выполняется отдельным reviewer'ом. → merge PR #29 является источником версии для проверки.. Показать собственный фрагмент (рисунок 1); прямые изменения main не допускаются.</w:t>
       </w:r>
     </w:p>
@@ -1809,7 +1913,7 @@
       <w:r>
         <w:rPr>
           <w:rFonts w:ascii="Times New Roman" w:hAnsi="Times New Roman" w:eastAsia="Times New Roman"/>
-          <w:sz w:val="24"/>
+          <w:sz w:val="20"/>
         </w:rPr>
         <w:t>Рисунок 1 — Собственная часть исполняемого каркаса</w:t>
       </w:r>
@@ -1819,11 +1923,19 @@
         <w:pStyle w:val="afa"/>
       </w:pPr>
       <w:r>
+        <w:rPr>
+          <w:rFonts w:ascii="Times New Roman" w:hAnsi="Times New Roman"/>
+          <w:sz w:val="20"/>
+        </w:rPr>
         <w:t>3.2 Путь исполнения и состав запускаемого результата</w:t>
       </w:r>
     </w:p>
     <w:p>
       <w:r>
+        <w:rPr>
+          <w:rFonts w:ascii="Times New Roman" w:hAnsi="Times New Roman"/>
+          <w:sz w:val="20"/>
+        </w:rPr>
         <w:t>Схема: services/delivery/go.mod + internal/domain/readback + cmd/delivery-contractcheck + testdata → go mod tidy; Go 1.27.2; golang.org/x/text v0.28.0 → go build with dev/release flags; CLI reads fixture, validates config/format, emits JSON → .pr12-build/delivery/{dev,release}/delivery-contractcheck → run --version and --fixture ... --format json from a temporary directory outside checkout. Указывать только существующие стадии Go/Node/Python. Команда просмотра результата go version -m .pr12-build/delivery/release/delivery-contractcheck, существенный фактический вывод workspace.py smoke recorded dev/release PASS; go version -m inspection is an explicit human capture step and is not claimed as completed by the agent. Для Go подходят go version -m, file/readelf/ldd с честным выводом о статической линковке; для Next/Python — пакет/модули/bytecode и закреплённые зависимости. Наличие инструмента не равно выполненному наблюдению.</w:t>
       </w:r>
     </w:p>
@@ -1872,7 +1984,7 @@
       <w:r>
         <w:rPr>
           <w:rFonts w:ascii="Times New Roman" w:hAnsi="Times New Roman" w:eastAsia="Times New Roman"/>
-          <w:sz w:val="24"/>
+          <w:sz w:val="20"/>
         </w:rPr>
         <w:t>Рисунок 2 — Подготовка компонента в двух режимах</w:t>
       </w:r>
@@ -1882,6 +1994,10 @@
         <w:pStyle w:val="afa"/>
       </w:pPr>
       <w:r>
+        <w:rPr>
+          <w:rFonts w:ascii="Times New Roman" w:hAnsi="Times New Roman"/>
+          <w:sz w:val="20"/>
+        </w:rPr>
         <w:t>3.3 Наблюдаемое сравнение dev/release на одном сценарии</w:t>
       </w:r>
     </w:p>
@@ -2273,6 +2389,10 @@
     </w:tbl>
     <w:p>
       <w:r>
+        <w:rPr>
+          <w:rFonts w:ascii="Times New Roman" w:hAnsi="Times New Roman"/>
+          <w:sz w:val="20"/>
+        </w:rPr>
         <w:t>Один сценарий testdata/match.json в обоих режимах. Если различий нет — объяснить. Поставку запустить из temporary directory created by workspace.py smoke delivery --require вне исходников/IDE. Не заявлять ускорение без измерений. Рисунки 2–3.</w:t>
       </w:r>
     </w:p>
@@ -2321,7 +2441,7 @@
       <w:r>
         <w:rPr>
           <w:rFonts w:ascii="Times New Roman" w:hAnsi="Times New Roman" w:eastAsia="Times New Roman"/>
-          <w:sz w:val="24"/>
+          <w:sz w:val="20"/>
         </w:rPr>
         <w:t>Рисунок 3 — Запуск поставки вне исходного кода и IDE</w:t>
       </w:r>
@@ -2331,6 +2451,10 @@
         <w:pStyle w:val="af7"/>
       </w:pPr>
       <w:r>
+        <w:rPr>
+          <w:rFonts w:ascii="Times New Roman" w:hAnsi="Times New Roman"/>
+          <w:sz w:val="20"/>
+        </w:rPr>
         <w:t>4 Результаты</w:t>
       </w:r>
     </w:p>
@@ -2339,6 +2463,10 @@
         <w:pStyle w:val="afa"/>
       </w:pPr>
       <w:r>
+        <w:rPr>
+          <w:rFonts w:ascii="Times New Roman" w:hAnsi="Times New Roman"/>
+          <w:sz w:val="20"/>
+        </w:rPr>
         <w:t>4.1 Проверки компонента</w:t>
       </w:r>
     </w:p>
@@ -2784,6 +2912,10 @@
     </w:tbl>
     <w:p>
       <w:r>
+        <w:rPr>
+          <w:rFonts w:ascii="Times New Roman" w:hAnsi="Times New Roman"/>
+          <w:sz w:val="20"/>
+        </w:rPr>
         <w:t>Версии среды и прямых зависимостей зафиксированы services/delivery/go.mod and go.sum; безопасный пример конфигурации default; unsupported config is rejected with exit 2. Рисунки 4–5.</w:t>
       </w:r>
     </w:p>
@@ -2832,7 +2964,7 @@
       <w:r>
         <w:rPr>
           <w:rFonts w:ascii="Times New Roman" w:hAnsi="Times New Roman" w:eastAsia="Times New Roman"/>
-          <w:sz w:val="24"/>
+          <w:sz w:val="20"/>
         </w:rPr>
         <w:t>Рисунок 4 — Штатный запуск компонента</w:t>
       </w:r>
@@ -2882,7 +3014,7 @@
       <w:r>
         <w:rPr>
           <w:rFonts w:ascii="Times New Roman" w:hAnsi="Times New Roman" w:eastAsia="Times New Roman"/>
-          <w:sz w:val="24"/>
+          <w:sz w:val="20"/>
         </w:rPr>
         <w:t>Рисунок 5 — Неверная конфигурация</w:t>
       </w:r>
@@ -2892,11 +3024,19 @@
         <w:pStyle w:val="afa"/>
       </w:pPr>
       <w:r>
+        <w:rPr>
+          <w:rFonts w:ascii="Times New Roman" w:hAnsi="Times New Roman"/>
+          <w:sz w:val="20"/>
+        </w:rPr>
         <w:t>4.2 Независимое чистое воспроизведение чужой части</w:t>
       </w:r>
     </w:p>
     <w:p>
       <w:r>
+        <w:rPr>
+          <w:rFonts w:ascii="Times New Roman" w:hAnsi="Times New Roman"/>
+          <w:sz w:val="20"/>
+        </w:rPr>
         <w:t>Проверяющий студент Дмитрий Стацюк; автор проверяемой части Проверка по H1 выполняется отдельно.; дата 2026-10-19; чистая среда проверка будет выполнена отдельно по учебной инструкции; commit NOT APPLICABLE — H1; инструкция Материалы H1 оформляются отдельно.; команды/результат/замечания Результаты H1 оформляются отдельно.. После исправлений повторить из исходной чистой среды. Отдельно получить независимую проверку собственной инструкции; не выдавать авторский запуск за независимый. Рисунок 6.</w:t>
       </w:r>
     </w:p>
@@ -2945,7 +3085,7 @@
       <w:r>
         <w:rPr>
           <w:rFonts w:ascii="Times New Roman" w:hAnsi="Times New Roman" w:eastAsia="Times New Roman"/>
-          <w:sz w:val="24"/>
+          <w:sz w:val="20"/>
         </w:rPr>
         <w:t>Рисунок 6 — Независимое воспроизведение части другого студента</w:t>
       </w:r>
@@ -2955,11 +3095,19 @@
         <w:pStyle w:val="afa"/>
       </w:pPr>
       <w:r>
+        <w:rPr>
+          <w:rFonts w:ascii="Times New Roman" w:hAnsi="Times New Roman"/>
+          <w:sz w:val="20"/>
+        </w:rPr>
         <w:t>4.3 Базовая содержательная автоматическая проверка</w:t>
       </w:r>
     </w:p>
     <w:p>
       <w:r>
+        <w:rPr>
+          <w:rFonts w:ascii="Times New Roman" w:hAnsi="Times New Roman"/>
+          <w:sz w:val="20"/>
+        </w:rPr>
         <w:t>CI сдаваемой версии Fresh CI success for round-2 source commit bafc97a0eb5cc2b2aba68c04a74b179b61432d82: delivery https://github.com/hitpipe/hitpipe/actions/runs/39279704440, intake https://github.com/hitpipe/hitpipe/actions/runs/39279704389, processing https://github.com/hitpipe/hitpipe/actions/runs/39279704449, iam https://github.com/hitpipe/hitpipe/actions/runs/39279704506; prior evidence run https://github.com/hitpipe/hitpipe/actions/runs/39271075578 passed on c365ad5 выполняет workspace.py check delivery; workspace.py smoke delivery --require, сбой условия даёт ненулевой exit. Долгий процесс имеет timeout readiness и корректную остановку. Локальная отрицательная демонстрация той же проверки workspace.py smoke log; actual negative exit observed locally, после неё исправный код восстановлен. Граница автоматизации/ручной проверки synthetic fixtures; no provider GET/POST, permissions, state transition or customer data. Рисунок 7.</w:t>
       </w:r>
     </w:p>
@@ -3008,7 +3156,7 @@
       <w:r>
         <w:rPr>
           <w:rFonts w:ascii="Times New Roman" w:hAnsi="Times New Roman" w:eastAsia="Times New Roman"/>
-          <w:sz w:val="24"/>
+          <w:sz w:val="20"/>
         </w:rPr>
         <w:t>Рисунок 7 — Отрицательная локальная проверка автоматического gate</w:t>
       </w:r>
@@ -3018,11 +3166,19 @@
         <w:pStyle w:val="af7"/>
       </w:pPr>
       <w:r>
+        <w:rPr>
+          <w:rFonts w:ascii="Times New Roman" w:hAnsi="Times New Roman"/>
+          <w:sz w:val="20"/>
+        </w:rPr>
         <w:t>5 Заключение и индивидуальный вклад</w:t>
       </w:r>
     </w:p>
     <w:p>
       <w:r>
+        <w:rPr>
+          <w:rFonts w:ascii="Times New Roman" w:hAnsi="Times New Roman"/>
+          <w:sz w:val="20"/>
+        </w:rPr>
         <w:t>В заключении простыми словами опишите: своя часть и PR; воспроизводимость; наблюдённые различия режимов; результат независимой проверки; содержательность и ограничения CI. Зафиксировать неизменяемый тег 0104-pz01-ds-v1. Изменение — новым v2 без перемещения v1. Защита студентом самостоятельно, без генеративного AI.</w:t>
       </w:r>
     </w:p>
@@ -3031,11 +3187,19 @@
         <w:pStyle w:val="af7"/>
       </w:pPr>
       <w:r>
+        <w:rPr>
+          <w:rFonts w:ascii="Times New Roman" w:hAnsi="Times New Roman"/>
+          <w:sz w:val="20"/>
+        </w:rPr>
         <w:t>СПИСОК ИСПОЛЬЗОВАННЫХ МАТЕРИАЛОВ</w:t>
       </w:r>
     </w:p>
     <w:p>
       <w:r>
+        <w:rPr>
+          <w:rFonts w:ascii="Times New Roman" w:hAnsi="Times New Roman"/>
+          <w:sz w:val="20"/>
+        </w:rPr>
         <w:t>Список источников приведён ниже и содержит методические материалы, официальную документацию и материалы проекта.</w:t>
       </w:r>
     </w:p>
@@ -3044,51 +3208,91 @@
         <w:pStyle w:val="1"/>
       </w:pPr>
       <w:r>
+        <w:rPr>
+          <w:rFonts w:ascii="Times New Roman" w:hAnsi="Times New Roman"/>
+          <w:sz w:val="20"/>
+        </w:rPr>
         <w:t>ИСТОЧНИКИ И ИНСТРУКЦИИ ДЛЯ СКРИНШОТОВ</w:t>
       </w:r>
     </w:p>
     <w:p>
       <w:r>
+        <w:rPr>
+          <w:rFonts w:ascii="Times New Roman" w:hAnsi="Times New Roman"/>
+          <w:sz w:val="20"/>
+        </w:rPr>
         <w:t>Список источников оформлен по ГОСТ Р 7.0.100–2018. Электронные материалы приведены с адресом и датой обращения.</w:t>
       </w:r>
     </w:p>
     <w:p>
       <w:r>
+        <w:rPr>
+          <w:rFonts w:ascii="Times New Roman" w:hAnsi="Times New Roman"/>
+          <w:sz w:val="20"/>
+        </w:rPr>
         <w:t>1. ГОСТ 7.32–2017. Межгосударственный стандарт. Система стандартов по информации, библиотечному и издательскому делу. Отчёт о научно-исследовательской работе. Структура и правила оформления. — Москва: Стандартинформ, 2018.</w:t>
       </w:r>
     </w:p>
     <w:p>
       <w:r>
+        <w:rPr>
+          <w:rFonts w:ascii="Times New Roman" w:hAnsi="Times New Roman"/>
+          <w:sz w:val="20"/>
+        </w:rPr>
         <w:t>2. ГОСТ Р 7.0.100–2018. Национальный стандарт Российской Федерации. Библиографическая запись. Библиографическое описание. Общие требования и правила составления. — Москва: Стандартинформ, 2018.</w:t>
       </w:r>
     </w:p>
     <w:p>
       <w:r>
+        <w:rPr>
+          <w:rFonts w:ascii="Times New Roman" w:hAnsi="Times New Roman"/>
+          <w:sz w:val="20"/>
+        </w:rPr>
         <w:t>3. The Go Programming Language. Documentation [Электронный ресурс]. — URL: https://go.dev/doc/ (дата обращения: 19.10.2026).</w:t>
       </w:r>
     </w:p>
     <w:p>
       <w:r>
+        <w:rPr>
+          <w:rFonts w:ascii="Times New Roman" w:hAnsi="Times New Roman"/>
+          <w:sz w:val="20"/>
+        </w:rPr>
         <w:t>4. The Go Programming Language. Go Modules Reference [Электронный ресурс]. — URL: https://go.dev/ref/mod (дата обращения: 19.10.2026).</w:t>
       </w:r>
     </w:p>
     <w:p>
       <w:r>
+        <w:rPr>
+          <w:rFonts w:ascii="Times New Roman" w:hAnsi="Times New Roman"/>
+          <w:sz w:val="20"/>
+        </w:rPr>
         <w:t>5. GCC Online Documentation. Using the GNU Compiler Collection [Электронный ресурс]. — URL: https://gcc.gnu.org/onlinedocs/ (дата обращения: 19.10.2026).</w:t>
       </w:r>
     </w:p>
     <w:p>
       <w:r>
+        <w:rPr>
+          <w:rFonts w:ascii="Times New Roman" w:hAnsi="Times New Roman"/>
+          <w:sz w:val="20"/>
+        </w:rPr>
         <w:t>6. GitHub Docs. About pull requests [Электронный ресурс]. — URL: https://docs.github.com/en/pull-requests/collaborating-with-pull-requests/about-pull-requests (дата обращения: 19.10.2026).</w:t>
       </w:r>
     </w:p>
     <w:p>
       <w:r>
+        <w:rPr>
+          <w:rFonts w:ascii="Times New Roman" w:hAnsi="Times New Roman"/>
+          <w:sz w:val="20"/>
+        </w:rPr>
         <w:t>7. HitPipe. Репозиторий проекта hitpipe/hitpipe [Электронный ресурс]. — URL: https://github.com/hitpipe/hitpipe (дата обращения: 19.10.2026).</w:t>
       </w:r>
     </w:p>
     <w:p>
       <w:r>
+        <w:rPr>
+          <w:rFonts w:ascii="Times New Roman" w:hAnsi="Times New Roman"/>
+          <w:sz w:val="20"/>
+        </w:rPr>
         <w:t>8. HitPipe. Файл README.md репозитория hitpipe/hitpipe [Электронный ресурс]. — URL: https://github.com/hitpipe/hitpipe/blob/main/README.md (дата обращения: 19.10.2026).</w:t>
       </w:r>
     </w:p>
@@ -3097,11 +3301,19 @@
         <w:pStyle w:val="2"/>
       </w:pPr>
       <w:r>
+        <w:rPr>
+          <w:rFonts w:ascii="Times New Roman" w:hAnsi="Times New Roman"/>
+          <w:sz w:val="20"/>
+        </w:rPr>
         <w:t>Откуда взять нужные скриншоты</w:t>
       </w:r>
     </w:p>
     <w:p>
       <w:r>
+        <w:rPr>
+          <w:rFonts w:ascii="Times New Roman" w:hAnsi="Times New Roman"/>
+          <w:sz w:val="20"/>
+        </w:rPr>
         <w:t>Скриншоты в этот файл не вставлены. Перед сдачей вставьте каждый снимок вместо соответствующего серого блока с тем же номером. На снимке должны быть видны название действия, команда или страница, итог проверки и дата. Не показывайте пароли, токены, личную переписку и содержимое папок вне проекта.</w:t>
       </w:r>
     </w:p>
@@ -3129,7 +3341,7 @@
           <w:rFonts w:ascii="Times New Roman" w:hAnsi="Times New Roman"/>
           <w:sz w:val="20"/>
         </w:rPr>
-        <w:t>Рисунок 3. Шаг 1: откройте PowerShell и перейдите в корень клона проекта командой cd 'ПОЛНЫЙ_ПУТЬ_К_КЛОНУ\hitpipe'. Шаг 2: вставьте весь блок ниже одной вставкой:</w:t>
+        <w:t>Рисунок 3. Шаг 1: откройте в Проводнике папку hitpipe, нажмите правой кнопкой мыши по пустому месту и выберите «Открыть в терминале». В открывшемся PowerShell текущей папкой уже должен быть корень проекта. Шаг 2: вставьте весь блок ниже одной вставкой:</w:t>
         <w:br/>
         <w:t>$repo = (Get-Location).Path</w:t>
         <w:br/>
@@ -3175,7 +3387,7 @@
           <w:rFonts w:ascii="Times New Roman" w:hAnsi="Times New Roman"/>
           <w:sz w:val="20"/>
         </w:rPr>
-        <w:t>Рисунок 5. Шаг 1: откройте PowerShell и выполните cd 'ПОЛНЫЙ_ПУТЬ_К_КЛОНУ\hitpipe\services\delivery'. Шаг 2: выполните команду: .\.pr12-build\delivery\release\delivery-contractcheck.exe --config unsupported --fixture .\testdata\match.json --format json . Если такого release-файла ещё нет, сначала выполните: go build -trimpath -o .pr12-build\delivery\release\delivery-contractcheck.exe .\cmd\delivery-contractcheck . Шаг 3: ожидайте сообщение о неподдерживаемой конфигурации и код завершения 2. Шаг 4: снимите команду, сообщение об ошибке и код 2. Сохраните как 0104-pz01-fig05.png. Подпись: «Неверная конфигурация». Не показывайте локальные секреты.</w:t>
+        <w:t>Рисунок 5. Шаг 1: откройте PowerShell из папки hitpipe через Проводник: правая кнопка мыши по папке → «Открыть в терминале», затем выполните cd services/delivery. Шаг 2: выполните команду: .\.pr12-build\delivery\release\delivery-contractcheck.exe --config unsupported --fixture .\testdata\match.json --format json . Если такого release-файла ещё нет, сначала выполните: go build -trimpath -o .pr12-build\delivery\release\delivery-contractcheck.exe .\cmd\delivery-contractcheck . Шаг 3: ожидайте сообщение о неподдерживаемой конфигурации и код завершения 2. Шаг 4: снимите команду, сообщение об ошибке и код 2. Сохраните как 0104-pz01-fig05.png. Подпись: «Неверная конфигурация». Не показывайте локальные секреты.</w:t>
       </w:r>
     </w:p>
     <w:p>

</xml_diff>

<commit_message>
HIT-47: correct relative path in report command
</commit_message>
<xml_diff>
--- a/docs/labs/pr12/ds/reports/0104-pz01-ds.docx
+++ b/docs/labs/pr12/ds/reports/0104-pz01-ds.docx
@@ -3387,7 +3387,14 @@
           <w:rFonts w:ascii="Times New Roman" w:hAnsi="Times New Roman"/>
           <w:sz w:val="20"/>
         </w:rPr>
-        <w:t>Рисунок 5. Шаг 1: откройте PowerShell из папки hitpipe через Проводник: правая кнопка мыши по папке → «Открыть в терминале», затем выполните cd services/delivery. Шаг 2: выполните команду: .\.pr12-build\delivery\release\delivery-contractcheck.exe --config unsupported --fixture .\testdata\match.json --format json . Если такого release-файла ещё нет, сначала выполните: go build -trimpath -o .pr12-build\delivery\release\delivery-contractcheck.exe .\cmd\delivery-contractcheck . Шаг 3: ожидайте сообщение о неподдерживаемой конфигурации и код завершения 2. Шаг 4: снимите команду, сообщение об ошибке и код 2. Сохраните как 0104-pz01-fig05.png. Подпись: «Неверная конфигурация». Не показывайте локальные секреты.</w:t>
+        <w:t>Рисунок 5. Шаг 1: откройте PowerShell из папки hitpipe через Проводник: правая кнопка мыши по папке → «Открыть в терминале», затем выполните cd services/delivery. Шаг 2: выполните команду: ..\..\.pr12-build\delivery\release\delivery-contractcheck.exe --config unsupported --fixture .\testdata\match.json --format json . Если такого release-файла ещё нет, сначала выполните: go build -trimpath -o .pr12-build\delivery\release\delivery-contractcheck.exe .\cmd\delivery-contractcheck . Шаг 3: ожидайте сообщение о неподдерживаемой конфигурации и код завершения 2. Шаг 4: снимите команду, сообщение об ошибке и код 2. Сохраните как 0104-pz01-fig05.png. Подпись: «Неверная конфигурация». Не показывайте локальные секреты.</w:t>
+      </w:r>
+      <w:r>
+        <w:rPr>
+          <w:rFonts w:ascii="Times New Roman" w:hAnsi="Times New Roman"/>
+          <w:sz w:val="20"/>
+        </w:rPr>
+        <w:t xml:space="preserve"> После команды выполните $LASTEXITCODE; ожидаемое значение — 2.</w:t>
       </w:r>
     </w:p>
     <w:p>

</xml_diff>

<commit_message>
HIT-47: build release binary before screenshot command
</commit_message>
<xml_diff>
--- a/docs/labs/pr12/ds/reports/0104-pz01-ds.docx
+++ b/docs/labs/pr12/ds/reports/0104-pz01-ds.docx
@@ -3387,14 +3387,7 @@
           <w:rFonts w:ascii="Times New Roman" w:hAnsi="Times New Roman"/>
           <w:sz w:val="20"/>
         </w:rPr>
-        <w:t>Рисунок 5. Шаг 1: откройте PowerShell из папки hitpipe через Проводник: правая кнопка мыши по папке → «Открыть в терминале», затем выполните cd services/delivery. Шаг 2: выполните команду: ..\..\.pr12-build\delivery\release\delivery-contractcheck.exe --config unsupported --fixture .\testdata\match.json --format json . Если такого release-файла ещё нет, сначала выполните: go build -trimpath -o .pr12-build\delivery\release\delivery-contractcheck.exe .\cmd\delivery-contractcheck . Шаг 3: ожидайте сообщение о неподдерживаемой конфигурации и код завершения 2. Шаг 4: снимите команду, сообщение об ошибке и код 2. Сохраните как 0104-pz01-fig05.png. Подпись: «Неверная конфигурация». Не показывайте локальные секреты.</w:t>
-      </w:r>
-      <w:r>
-        <w:rPr>
-          <w:rFonts w:ascii="Times New Roman" w:hAnsi="Times New Roman"/>
-          <w:sz w:val="20"/>
-        </w:rPr>
-        <w:t xml:space="preserve"> После команды выполните $LASTEXITCODE; ожидаемое значение — 2.</w:t>
+        <w:t>Рисунок 5. Шаг 1: откройте PowerShell из папки hitpipe через Проводник: правая кнопка мыши по папке → «Открыть в терминале», затем выполните cd services/delivery. Шаг 2: создайте папку для результата командой New-Item -ItemType Directory -Force ..\..\.pr12-build\delivery\release | Out-Null. Шаг 3: соберите программу командой go build -trimpath -o ..\..\.pr12-build\delivery\release\delivery-contractcheck.exe .\cmd\delivery-contractcheck. Шаг 4: проверьте наличие файла командой Test-Path ..\..\.pr12-build\delivery\release\delivery-contractcheck.exe; ожидаемый ответ True. Шаг 5: выполните ..\..\.pr12-build\delivery\release\delivery-contractcheck.exe --config unsupported --fixture .\testdata\match.json --format json, затем $LASTEXITCODE. Ожидается сообщение unsupported config: unsupported и код 2. Сохраните как 0104-pz01-fig05.png. Подпись: «Неверная конфигурация». Не показывайте локальные секреты.</w:t>
       </w:r>
     </w:p>
     <w:p>

</xml_diff>

<commit_message>
HIT-47: record independent peer reproduction
</commit_message>
<xml_diff>
--- a/docs/labs/pr12/ds/reports/0104-pz01-ds.docx
+++ b/docs/labs/pr12/ds/reports/0104-pz01-ds.docx
@@ -3037,7 +3037,7 @@
           <w:rFonts w:ascii="Times New Roman" w:hAnsi="Times New Roman"/>
           <w:sz w:val="20"/>
         </w:rPr>
-        <w:t>Проверяющий студент Дмитрий Стацюк; автор проверяемой части Проверка по H1 выполняется отдельно.; дата 2026-10-19; чистая среда проверка будет выполнена отдельно по учебной инструкции; commit NOT APPLICABLE — H1; инструкция Материалы H1 оформляются отдельно.; команды/результат/замечания Результаты H1 оформляются отдельно.. После исправлений повторить из исходной чистой среды. Отдельно получить независимую проверку собственной инструкции; не выдавать авторский запуск за независимый. Рисунок 6.</w:t>
+        <w:t>Проверяемая часть: Матвей Головачев, Feature HIT-13, компонент case-status в отдельном репозитории https://github.com/hitpipe/hitpipe_client. Чистая среда: новый клон без локальных изменений, ветка work/HIT-40-final-reports-and-submission-package, commit b7334926d6e17caad1f6555a2bff13886a6ba8d0. Команда воспроизведения: python tools/pr12/workspace.py check case-status. Фактически выполнено на комплектном Node 24.19.0 и npm 11.19.1: TypeScript-компиляция прошла; 28 из 28 тестов прошли; покрытие составило 95.52% строк, 82.31% ветвей и 89.57% функций. Дополнительно выполнен smoke вне checkout для dev и release: оба результата PASS на синтетическом fixture. Строгий gate версии не засчитан как PASS, потому что проект требует Node 24.22.0, а в доступной среде есть Node 24.19.0. Журнал: docs/labs/pr12/ds/evidence/HIT-47-peer-mg-reproduction.log. Проверку выполнил Дмитрий Стацюк 2026-10-19; результат воспроизводим, ограничение версии зафиксировано отдельно.</w:t>
       </w:r>
     </w:p>
     <w:tbl>
@@ -3396,7 +3396,7 @@
           <w:rFonts w:ascii="Times New Roman" w:hAnsi="Times New Roman"/>
           <w:sz w:val="20"/>
         </w:rPr>
-        <w:t>Рисунок 6. Шаг 1: сначала откройте https://hitpipe.atlassian.net/browse/HIT-42. Шаг 2: найдите название задачи, блок статуса и дату комментария о проверке. Шаг 3: если задача недоступна или проверка не проводилась, не делайте снимок и оставьте плейсхолдер до получения материала преподавателя. Если материал есть, снимите только заголовок, статус и итог. Сохраните как 0104-pz01-fig06.png. Подпись: «Независимое воспроизведение части другого студента».</w:t>
+        <w:t>Рисунок 6. Здесь нужен фактический снимок уже выполненной проверки. Откройте журнал docs/labs/pr12/ds/evidence/HIT-47-peer-mg-reproduction.log. В нём найдите блок TAP с итогом «1..28», «# tests 28», «# pass 28», затем строки «mode: dev ... PASS» и «mode: release ... PASS». Снимите эти строки вместе с началом журнала, где видны репозиторий, ветка, commit b7334926d6e17caad1f6555a2bff13886a6ba8d0, Node 24.19.0 и ограничение строгой версии. Сохраните как 0104-pz01-fig06.png. Подпись: «Независимое чистое воспроизведение части Матвея Головачева». Не скрывайте результаты тестов; личные токены и домашние пути можно закрыть.</w:t>
       </w:r>
     </w:p>
     <w:p>

</xml_diff>

<commit_message>
HIT-47: document full peer reproduction procedure
</commit_message>
<xml_diff>
--- a/docs/labs/pr12/ds/reports/0104-pz01-ds.docx
+++ b/docs/labs/pr12/ds/reports/0104-pz01-ds.docx
@@ -3037,7 +3037,7 @@
           <w:rFonts w:ascii="Times New Roman" w:hAnsi="Times New Roman"/>
           <w:sz w:val="20"/>
         </w:rPr>
-        <w:t>Проверяемая часть: Матвей Головачев, Feature HIT-13, компонент case-status в отдельном репозитории https://github.com/hitpipe/hitpipe_client. Чистая среда: новый клон без локальных изменений, ветка work/HIT-40-final-reports-and-submission-package, commit b7334926d6e17caad1f6555a2bff13886a6ba8d0. Команда воспроизведения: python tools/pr12/workspace.py check case-status. Фактически выполнено на комплектном Node 24.19.0 и npm 11.19.1: TypeScript-компиляция прошла; 28 из 28 тестов прошли; покрытие составило 95.52% строк, 82.31% ветвей и 89.57% функций. Дополнительно выполнен smoke вне checkout для dev и release: оба результата PASS на синтетическом fixture. Строгий gate версии не засчитан как PASS, потому что проект требует Node 24.22.0, а в доступной среде есть Node 24.19.0. Журнал: docs/labs/pr12/ds/evidence/HIT-47-peer-mg-reproduction.log. Проверку выполнил Дмитрий Стацюк 2026-10-19; результат воспроизводим, ограничение версии зафиксировано отдельно.</w:t>
+        <w:t>Проверяемая часть: Матвей Головачев, Feature HIT-13, компонент case-status. Jira для этой проверки не используется: исходный материал находится в отдельном репозитории https://github.com/hitpipe/hitpipe_client. Полная инструкция: 1) откройте PowerShell; 2) выполните $peer = Join-Path $env:TEMP 'hitpipe-client-peer'; git clone --branch work/HIT-40-final-reports-and-submission-package --depth 1 https://github.com/hitpipe/hitpipe_client.git $peer; Set-Location $peer; 3) проверьте commit командой git rev-parse HEAD — должен быть b7334926d6e17caad1f6555a2bff13886a6ba8d0; 4) проверьте node --version — нужен v24.22.0, npm --version — нужен 11.19.1; 5) установите зависимости: Set-Location tooling/pr12/frontend; npm ci --strict-peer-deps; Set-Location ../..\..; 6) запустите основную проверку: python tools/pr12/workspace.py check case-status; 7) ожидайте TypeScript-компиляцию, строки # tests 28 и # pass 28, а также coverage около 95.52% строк, 82.31% ветвей и 89.57% функций; 8) запустите отдельную проверку поставки: python tools/pr12/workspace.py smoke case-status; ожидайте два результата diagnostic_smoke PASS — для dev и release — с пометкой outside checkout; 9) сохраните весь вывод команд в файл docs/labs/pr12/ds/evidence/HIT-47-peer-mg-reproduction.log через Start-Transcript/Stop-Transcript; 10) в отчёт внесите фактические Node/npm, SHA, количество тестов, coverage, оба smoke-результата и ограничения. В текущем выполнении тесты 28/28 и оба smoke прошли, но строгий gate версии оставлен BLOCKED, потому что была доступна Node 24.19.0, а не требуемая 24.22.0.</w:t>
       </w:r>
     </w:p>
     <w:tbl>
@@ -3396,7 +3396,7 @@
           <w:rFonts w:ascii="Times New Roman" w:hAnsi="Times New Roman"/>
           <w:sz w:val="20"/>
         </w:rPr>
-        <w:t>Рисунок 6. Здесь нужен фактический снимок уже выполненной проверки. Откройте журнал docs/labs/pr12/ds/evidence/HIT-47-peer-mg-reproduction.log. В нём найдите блок TAP с итогом «1..28», «# tests 28», «# pass 28», затем строки «mode: dev ... PASS» и «mode: release ... PASS». Снимите эти строки вместе с началом журнала, где видны репозиторий, ветка, commit b7334926d6e17caad1f6555a2bff13886a6ba8d0, Node 24.19.0 и ограничение строгой версии. Сохраните как 0104-pz01-fig06.png. Подпись: «Независимое чистое воспроизведение части Матвея Головачева». Не скрывайте результаты тестов; личные токены и домашние пути можно закрыть.</w:t>
+        <w:t>Рисунок 6. Jira для этого снимка не нужна. Откройте в Проводнике файл docs/labs/pr12/ds/evidence/HIT-47-peer-mg-reproduction.log. Сверху должны быть строки с репозиторием hitpipe/hitpipe_client, веткой work/HIT-40-final-reports-and-submission-package и SHA b7334926d6e17caad1f6555a2bff13886a6ba8d0. Ниже найдите строки «# tests 28», «# pass 28» и два JSON-результата с mode dev и mode release и diagnostic_smoke PASS. Снимите начало журнала и эти результаты одним или двумя фрагментами. Сохраните как 0104-pz01-fig06.png. Подпись: «Независимое чистое воспроизведение части Матвея Головачева». Ограничение Node 24.19.0/24.22.0 оставьте видимым, это честная граница результата.</w:t>
       </w:r>
     </w:p>
     <w:p>

</xml_diff>

<commit_message>
HIT-47: make Windows peer reproduction commands executable
</commit_message>
<xml_diff>
--- a/docs/labs/pr12/ds/reports/0104-pz01-ds.docx
+++ b/docs/labs/pr12/ds/reports/0104-pz01-ds.docx
@@ -3033,11 +3033,47 @@
     </w:p>
     <w:p>
       <w:r>
-        <w:rPr>
-          <w:rFonts w:ascii="Times New Roman" w:hAnsi="Times New Roman"/>
-          <w:sz w:val="20"/>
-        </w:rPr>
-        <w:t>Проверяемая часть: Матвей Головачев, Feature HIT-13, компонент case-status. Jira для этой проверки не используется: исходный материал находится в отдельном репозитории https://github.com/hitpipe/hitpipe_client. Полная инструкция: 1) откройте PowerShell; 2) выполните $peer = Join-Path $env:TEMP 'hitpipe-client-peer'; git clone --branch work/HIT-40-final-reports-and-submission-package --depth 1 https://github.com/hitpipe/hitpipe_client.git $peer; Set-Location $peer; 3) проверьте commit командой git rev-parse HEAD — должен быть b7334926d6e17caad1f6555a2bff13886a6ba8d0; 4) проверьте node --version — нужен v24.22.0, npm --version — нужен 11.19.1; 5) установите зависимости: Set-Location tooling/pr12/frontend; npm ci --strict-peer-deps; Set-Location ../..\..; 6) запустите основную проверку: python tools/pr12/workspace.py check case-status; 7) ожидайте TypeScript-компиляцию, строки # tests 28 и # pass 28, а также coverage около 95.52% строк, 82.31% ветвей и 89.57% функций; 8) запустите отдельную проверку поставки: python tools/pr12/workspace.py smoke case-status; ожидайте два результата diagnostic_smoke PASS — для dev и release — с пометкой outside checkout; 9) сохраните весь вывод команд в файл docs/labs/pr12/ds/evidence/HIT-47-peer-mg-reproduction.log через Start-Transcript/Stop-Transcript; 10) в отчёт внесите фактические Node/npm, SHA, количество тестов, coverage, оба smoke-результата и ограничения. В текущем выполнении тесты 28/28 и оба smoke прошли, но строгий gate версии оставлен BLOCKED, потому что была доступна Node 24.19.0, а не требуемая 24.22.0.</w:t>
+        <w:t>Проверяемая часть: Матвей Головачев, hitpipe_client. Jira для этого шага не нужна. Откройте PowerShell и выполните команды ниже в отдельной папке. Если PowerShell сообщает, что запуск npm.ps1 запрещён политикой, используйте npm.cmd: это тот же npm без вызова запрещённого PowerShell-скрипта. Если команда python не найдена, используйте py -3. Если не найдена и py -3, установите Python 3 с https://www.python.org/downloads/windows/, отметьте Add python.exe to PATH и откройте новое окно PowerShell.</w:t>
+        <w:br/>
+        <w:br/>
+        <w:t>1. Перейдите в папку независимой копии hitpipe_client:</w:t>
+        <w:br/>
+        <w:t>Set-Location C:\Users\&lt;ваше_имя&gt;\AppData\Local\Temp\hitpipe-client-peer</w:t>
+        <w:br/>
+        <w:br/>
+        <w:t>2. Убедитесь, что проверяется нужный коммит:</w:t>
+        <w:br/>
+        <w:t>git rev-parse --verify HEAD</w:t>
+        <w:br/>
+        <w:t>Ожидаемый SHA: b7334926d6e17caad1f6555a2bff13886a6ba8d0.</w:t>
+        <w:br/>
+        <w:br/>
+        <w:t>3. Проверьте версии инструментов:</w:t>
+        <w:br/>
+        <w:t>node --version</w:t>
+        <w:br/>
+        <w:t>npm.cmd --version</w:t>
+        <w:br/>
+        <w:t>Ожидаемый результат: v24.22.0 и 11.19.1. Версия Node v22.16.0 или v24.19.0 не проходит строгую проверку проекта; установите Node.js v24.22.0 с https://nodejs.org/en/download/ (Windows x64 Installer), затем откройте новое окно PowerShell. Если npm имеет другую версию, выполните npm.cmd install --global npm@11.19.1.</w:t>
+        <w:br/>
+        <w:br/>
+        <w:t>4. Установите зависимости именно в каталоге frontend:</w:t>
+        <w:br/>
+        <w:t>Set-Location tooling\pr12\frontend</w:t>
+        <w:br/>
+        <w:t>npm.cmd ci --strict-peer-deps</w:t>
+        <w:br/>
+        <w:br/>
+        <w:t>5. Вернитесь в корень копии и выполните две проверки:</w:t>
+        <w:br/>
+        <w:t>Set-Location ..\..\..</w:t>
+        <w:br/>
+        <w:t>py -3 tools\pr12\workspace.py check case-status</w:t>
+        <w:br/>
+        <w:t>py -3 tools\pr12\workspace.py smoke case-status</w:t>
+        <w:br/>
+        <w:br/>
+        <w:t>6. Сохраните полный вывод команд в текстовый журнал. В журнале должны быть видны SHA, версии Node/npm, успешная установка зависимостей, строки PASS для check и smoke, а также отсутствие ошибок. Текущий приложенный журнал HIT-47-peer-mg-reproduction.log содержит реальное независимое выполнение тестов, но отмечает BLOCKED, поскольку на момент записи была доступна Node v24.19.0 вместо требуемой v24.22.0.</w:t>
       </w:r>
     </w:p>
     <w:tbl>
@@ -3083,11 +3119,7 @@
         <w:jc w:val="center"/>
       </w:pPr>
       <w:r>
-        <w:rPr>
-          <w:rFonts w:ascii="Times New Roman" w:hAnsi="Times New Roman" w:eastAsia="Times New Roman"/>
-          <w:sz w:val="20"/>
-        </w:rPr>
-        <w:t>Рисунок 6 — Независимое воспроизведение части другого студента</w:t>
+        <w:t>Рисунок 6 — Независимое воспроизведение части Матвея Головачева. Скриншот вставляется здесь, сразу после инструкции: откройте PowerShell в папке C:\Users\&lt;ваше_имя&gt;\AppData\Local\Temp\hitpipe-client-peer; выполните node --version, npm.cmd --version, git rev-parse --verify HEAD, затем команды npm.cmd ci --strict-peer-deps, py -3 tools\pr12\workspace.py check case-status и py -3 tools\pr12\workspace.py smoke case-status. На снимке должны одновременно быть видны путь текущей папки, SHA b7334926d6e17caad1f6555a2bff13886a6ba8d0, версии v24.22.0/11.19.1 и итоговые PASS. Имя PNG: HIT-47-peer-mg-reproduction.png. Подпись: «Рисунок 6 — Независимое воспроизведение части Матвея Головачева».</w:t>
       </w:r>
     </w:p>
     <w:p>
@@ -3392,11 +3424,7 @@
     </w:p>
     <w:p>
       <w:r>
-        <w:rPr>
-          <w:rFonts w:ascii="Times New Roman" w:hAnsi="Times New Roman"/>
-          <w:sz w:val="20"/>
-        </w:rPr>
-        <w:t>Рисунок 6. Jira для этого снимка не нужна. Откройте в Проводнике файл docs/labs/pr12/ds/evidence/HIT-47-peer-mg-reproduction.log. Сверху должны быть строки с репозиторием hitpipe/hitpipe_client, веткой work/HIT-40-final-reports-and-submission-package и SHA b7334926d6e17caad1f6555a2bff13886a6ba8d0. Ниже найдите строки «# tests 28», «# pass 28» и два JSON-результата с mode dev и mode release и diagnostic_smoke PASS. Снимите начало журнала и эти результаты одним или двумя фрагментами. Сохраните как 0104-pz01-fig06.png. Подпись: «Независимое чистое воспроизведение части Матвея Головачева». Ограничение Node 24.19.0/24.22.0 оставьте видимым, это честная граница результата.</w:t>
+        <w:t>Рисунок 6 — Независимое воспроизведение части Матвея Головачева. Скриншот вставляется здесь, сразу после инструкции: откройте PowerShell в папке C:\Users\&lt;ваше_имя&gt;\AppData\Local\Temp\hitpipe-client-peer; выполните node --version, npm.cmd --version, git rev-parse --verify HEAD, затем команды npm.cmd ci --strict-peer-deps, py -3 tools\pr12\workspace.py check case-status и py -3 tools\pr12\workspace.py smoke case-status. На снимке должны одновременно быть видны путь текущей папки, SHA b7334926d6e17caad1f6555a2bff13886a6ba8d0, версии v24.22.0/11.19.1 и итоговые PASS. Имя PNG: HIT-47-peer-mg-reproduction.png. Подпись: «Рисунок 6 — Независимое воспроизведение части Матвея Головачева».</w:t>
       </w:r>
     </w:p>
     <w:p>

</xml_diff>

<commit_message>
HIT-47: finalize all report screenshot instructions
</commit_message>
<xml_diff>
--- a/docs/labs/pr12/ds/reports/0104-pz01-ds.docx
+++ b/docs/labs/pr12/ds/reports/0104-pz01-ds.docx
@@ -7,10 +7,6 @@
         <w:pStyle w:val="-10"/>
       </w:pPr>
       <w:r>
-        <w:rPr>
-          <w:rFonts w:ascii="Times New Roman" w:hAnsi="Times New Roman"/>
-          <w:sz w:val="20"/>
-        </w:rPr>
         <w:t>ГУАП</w:t>
       </w:r>
     </w:p>
@@ -19,10 +15,6 @@
         <w:pStyle w:val="-3"/>
       </w:pPr>
       <w:r>
-        <w:rPr>
-          <w:rFonts w:ascii="Times New Roman" w:hAnsi="Times New Roman"/>
-          <w:sz w:val="20"/>
-        </w:rPr>
         <w:t xml:space="preserve">КАФЕДРА № </w:t>
       </w:r>
     </w:p>
@@ -31,10 +23,6 @@
         <w:pStyle w:val="-4"/>
       </w:pPr>
       <w:r>
-        <w:rPr>
-          <w:rFonts w:ascii="Times New Roman" w:hAnsi="Times New Roman"/>
-          <w:sz w:val="20"/>
-        </w:rPr>
         <w:t xml:space="preserve">ОТЧЕТ </w:t>
         <w:br/>
         <w:t>ЗАЩИЩЕН С ОЦЕНКОЙ</w:t>
@@ -45,10 +33,6 @@
         <w:pStyle w:val="-4"/>
       </w:pPr>
       <w:r>
-        <w:rPr>
-          <w:rFonts w:ascii="Times New Roman" w:hAnsi="Times New Roman"/>
-          <w:sz w:val="20"/>
-        </w:rPr>
         <w:t>ПРЕПОДАВАТЕЛЬ</w:t>
       </w:r>
     </w:p>
@@ -206,10 +190,6 @@
               </w:rPr>
             </w:pPr>
             <w:r>
-              <w:rPr>
-                <w:rFonts w:ascii="Times New Roman" w:hAnsi="Times New Roman" w:eastAsia="Times New Roman"/>
-                <w:sz w:val="20"/>
-              </w:rPr>
               <w:t>должность, уч. степень, звание</w:t>
             </w:r>
           </w:p>
@@ -257,10 +237,6 @@
               </w:rPr>
             </w:pPr>
             <w:r>
-              <w:rPr>
-                <w:rFonts w:ascii="Times New Roman" w:hAnsi="Times New Roman" w:eastAsia="Times New Roman"/>
-                <w:sz w:val="20"/>
-              </w:rPr>
               <w:t>подпись, дата</w:t>
             </w:r>
           </w:p>
@@ -308,10 +284,6 @@
               </w:rPr>
             </w:pPr>
             <w:r>
-              <w:rPr>
-                <w:rFonts w:ascii="Times New Roman" w:hAnsi="Times New Roman" w:eastAsia="Times New Roman"/>
-                <w:sz w:val="20"/>
-              </w:rPr>
               <w:t>инициалы, фамилия</w:t>
             </w:r>
           </w:p>
@@ -327,10 +299,6 @@
         </w:rPr>
       </w:pPr>
       <w:r>
-        <w:rPr>
-          <w:rFonts w:ascii="Times New Roman" w:hAnsi="Times New Roman"/>
-          <w:sz w:val="20"/>
-        </w:rPr>
         <w:t>ОТЧЕТ О ПРАКТИЧЕСКОЙ РАБОТЕ № 1</w:t>
       </w:r>
     </w:p>
@@ -362,11 +330,6 @@
               <w:spacing w:before="0" w:after="20" w:line="240" w:lineRule="auto"/>
             </w:pPr>
             <w:r>
-              <w:rPr>
-                <w:rFonts w:ascii="Times New Roman" w:hAnsi="Times New Roman" w:eastAsia="Times New Roman"/>
-                <w:b/>
-                <w:sz w:val="21"/>
-              </w:rPr>
               <w:t>Инструментальный контур и воспроизводимое исполнение минимального программного компонента</w:t>
             </w:r>
           </w:p>
@@ -388,10 +351,6 @@
               <w:spacing w:before="0" w:after="20" w:line="240" w:lineRule="auto"/>
             </w:pPr>
             <w:r>
-              <w:rPr>
-                <w:rFonts w:ascii="Times New Roman" w:hAnsi="Times New Roman" w:eastAsia="Times New Roman"/>
-                <w:sz w:val="20"/>
-              </w:rPr>
               <w:t>по МДК.01.04 «Системное программирование»</w:t>
             </w:r>
           </w:p>
@@ -513,10 +472,6 @@
         </w:rPr>
       </w:pPr>
       <w:r>
-        <w:rPr>
-          <w:rFonts w:ascii="Times New Roman" w:hAnsi="Times New Roman"/>
-          <w:sz w:val="20"/>
-        </w:rPr>
         <w:t>РАБОТУ ВЫПОЛНИЛ</w:t>
       </w:r>
     </w:p>
@@ -571,11 +526,6 @@
               </w:rPr>
             </w:pPr>
             <w:r>
-              <w:rPr>
-                <w:rFonts w:ascii="Times New Roman" w:hAnsi="Times New Roman" w:eastAsia="Times New Roman"/>
-                <w:b/>
-                <w:sz w:val="21"/>
-              </w:rPr>
               <w:t xml:space="preserve">Студент гр. № </w:t>
             </w:r>
           </w:p>
@@ -833,10 +783,6 @@
               </w:rPr>
             </w:pPr>
             <w:r>
-              <w:rPr>
-                <w:rFonts w:ascii="Times New Roman" w:hAnsi="Times New Roman" w:eastAsia="Times New Roman"/>
-                <w:sz w:val="20"/>
-              </w:rPr>
               <w:t>подпись, дата</w:t>
             </w:r>
           </w:p>
@@ -892,10 +838,6 @@
               </w:rPr>
             </w:pPr>
             <w:r>
-              <w:rPr>
-                <w:rFonts w:ascii="Times New Roman" w:hAnsi="Times New Roman" w:eastAsia="Times New Roman"/>
-                <w:sz w:val="20"/>
-              </w:rPr>
               <w:t>инициалы, фамилия</w:t>
             </w:r>
           </w:p>
@@ -907,10 +849,6 @@
         <w:pStyle w:val="-6"/>
       </w:pPr>
       <w:r>
-        <w:rPr>
-          <w:rFonts w:ascii="Times New Roman" w:hAnsi="Times New Roman"/>
-          <w:sz w:val="20"/>
-        </w:rPr>
         <w:t>Санкт-Петербург</w:t>
       </w:r>
     </w:p>
@@ -927,19 +865,11 @@
         <w:pStyle w:val="af9"/>
       </w:pPr>
       <w:r>
-        <w:rPr>
-          <w:rFonts w:ascii="Times New Roman" w:hAnsi="Times New Roman"/>
-          <w:sz w:val="20"/>
-        </w:rPr>
         <w:t>ВВЕДЕНИЕ</w:t>
       </w:r>
     </w:p>
     <w:p>
       <w:r>
-        <w:rPr>
-          <w:rFonts w:ascii="Times New Roman" w:hAnsi="Times New Roman"/>
-          <w:sz w:val="20"/>
-        </w:rPr>
         <w:t>Экспортная форма подготовлена по разделу 5 и приложению А актуальной методички МДК01.04. Отдельного исходного шаблона преподавателя для этой дисциплины во вложениях нет. Совместную сдачу с отчётом другого МДК не считать автоматически разрешённой.</w:t>
       </w:r>
     </w:p>
@@ -948,10 +878,6 @@
         <w:pStyle w:val="af7"/>
       </w:pPr>
       <w:r>
-        <w:rPr>
-          <w:rFonts w:ascii="Times New Roman" w:hAnsi="Times New Roman"/>
-          <w:sz w:val="20"/>
-        </w:rPr>
         <w:t>1 Сведения о работе</w:t>
       </w:r>
     </w:p>
@@ -977,11 +903,6 @@
               <w:spacing w:before="0" w:after="20" w:line="240" w:lineRule="auto"/>
             </w:pPr>
             <w:r>
-              <w:rPr>
-                <w:rFonts w:ascii="Times New Roman" w:hAnsi="Times New Roman" w:eastAsia="Times New Roman"/>
-                <w:b/>
-                <w:sz w:val="21"/>
-              </w:rPr>
               <w:t>Поле</w:t>
             </w:r>
           </w:p>
@@ -995,11 +916,6 @@
               <w:spacing w:before="0" w:after="20" w:line="240" w:lineRule="auto"/>
             </w:pPr>
             <w:r>
-              <w:rPr>
-                <w:rFonts w:ascii="Times New Roman" w:hAnsi="Times New Roman" w:eastAsia="Times New Roman"/>
-                <w:b/>
-                <w:sz w:val="21"/>
-              </w:rPr>
               <w:t>Значение</w:t>
             </w:r>
           </w:p>
@@ -1015,10 +931,6 @@
               <w:spacing w:before="0" w:after="20" w:line="240" w:lineRule="auto"/>
             </w:pPr>
             <w:r>
-              <w:rPr>
-                <w:rFonts w:ascii="Times New Roman" w:hAnsi="Times New Roman" w:eastAsia="Times New Roman"/>
-                <w:sz w:val="20"/>
-              </w:rPr>
               <w:t>ФИО, группа</w:t>
             </w:r>
           </w:p>
@@ -1032,10 +944,6 @@
               <w:spacing w:before="0" w:after="20" w:line="240" w:lineRule="auto"/>
             </w:pPr>
             <w:r>
-              <w:rPr>
-                <w:rFonts w:ascii="Times New Roman" w:hAnsi="Times New Roman" w:eastAsia="Times New Roman"/>
-                <w:sz w:val="20"/>
-              </w:rPr>
               <w:t>Дмитрий Стацюк, не указана</w:t>
             </w:r>
           </w:p>
@@ -1051,10 +959,6 @@
               <w:spacing w:before="0" w:after="20" w:line="240" w:lineRule="auto"/>
             </w:pPr>
             <w:r>
-              <w:rPr>
-                <w:rFonts w:ascii="Times New Roman" w:hAnsi="Times New Roman" w:eastAsia="Times New Roman"/>
-                <w:sz w:val="20"/>
-              </w:rPr>
               <w:t>Проект и команда</w:t>
             </w:r>
           </w:p>
@@ -1068,10 +972,6 @@
               <w:spacing w:before="0" w:after="20" w:line="240" w:lineRule="auto"/>
             </w:pPr>
             <w:r>
-              <w:rPr>
-                <w:rFonts w:ascii="Times New Roman" w:hAnsi="Times New Roman" w:eastAsia="Times New Roman"/>
-                <w:sz w:val="20"/>
-              </w:rPr>
               <w:t>HitPipe; пять участников</w:t>
             </w:r>
           </w:p>
@@ -1087,10 +987,6 @@
               <w:spacing w:before="0" w:after="20" w:line="240" w:lineRule="auto"/>
             </w:pPr>
             <w:r>
-              <w:rPr>
-                <w:rFonts w:ascii="Times New Roman" w:hAnsi="Times New Roman" w:eastAsia="Times New Roman"/>
-                <w:sz w:val="20"/>
-              </w:rPr>
               <w:t>Собственная зона/компонент</w:t>
             </w:r>
           </w:p>
@@ -1104,10 +1000,6 @@
               <w:spacing w:before="0" w:after="20" w:line="240" w:lineRule="auto"/>
             </w:pPr>
             <w:r>
-              <w:rPr>
-                <w:rFonts w:ascii="Times New Roman" w:hAnsi="Times New Roman" w:eastAsia="Times New Roman"/>
-                <w:sz w:val="20"/>
-              </w:rPr>
               <w:t>TargetReadback / services/delivery</w:t>
             </w:r>
           </w:p>
@@ -1123,10 +1015,6 @@
               <w:spacing w:before="0" w:after="20" w:line="240" w:lineRule="auto"/>
             </w:pPr>
             <w:r>
-              <w:rPr>
-                <w:rFonts w:ascii="Times New Roman" w:hAnsi="Times New Roman" w:eastAsia="Times New Roman"/>
-                <w:sz w:val="20"/>
-              </w:rPr>
               <w:t>Тег → commit</w:t>
             </w:r>
           </w:p>
@@ -1140,10 +1028,6 @@
               <w:spacing w:before="0" w:after="20" w:line="240" w:lineRule="auto"/>
             </w:pPr>
             <w:r>
-              <w:rPr>
-                <w:rFonts w:ascii="Times New Roman" w:hAnsi="Times New Roman" w:eastAsia="Times New Roman"/>
-                <w:sz w:val="20"/>
-              </w:rPr>
               <w:t>не создан — human/Lead gate; correction source bafc97a0eb5cc2b2aba68c04a74b179b61432d82</w:t>
             </w:r>
           </w:p>
@@ -1159,10 +1043,6 @@
               <w:spacing w:before="0" w:after="20" w:line="240" w:lineRule="auto"/>
             </w:pPr>
             <w:r>
-              <w:rPr>
-                <w:rFonts w:ascii="Times New Roman" w:hAnsi="Times New Roman" w:eastAsia="Times New Roman"/>
-                <w:sz w:val="20"/>
-              </w:rPr>
               <w:t>Репозиторий</w:t>
             </w:r>
           </w:p>
@@ -1176,10 +1056,6 @@
               <w:spacing w:before="0" w:after="20" w:line="240" w:lineRule="auto"/>
             </w:pPr>
             <w:r>
-              <w:rPr>
-                <w:rFonts w:ascii="Times New Roman" w:hAnsi="Times New Roman" w:eastAsia="Times New Roman"/>
-                <w:sz w:val="20"/>
-              </w:rPr>
               <w:t>https://github.com/hitpipe/hitpipe</w:t>
             </w:r>
           </w:p>
@@ -1195,10 +1071,6 @@
               <w:spacing w:before="0" w:after="20" w:line="240" w:lineRule="auto"/>
             </w:pPr>
             <w:r>
-              <w:rPr>
-                <w:rFonts w:ascii="Times New Roman" w:hAnsi="Times New Roman" w:eastAsia="Times New Roman"/>
-                <w:sz w:val="20"/>
-              </w:rPr>
               <w:t>Вариант выполнения</w:t>
             </w:r>
           </w:p>
@@ -1212,10 +1084,6 @@
               <w:spacing w:before="0" w:after="20" w:line="240" w:lineRule="auto"/>
             </w:pPr>
             <w:r>
-              <w:rPr>
-                <w:rFonts w:ascii="Times New Roman" w:hAnsi="Times New Roman" w:eastAsia="Times New Roman"/>
-                <w:sz w:val="20"/>
-              </w:rPr>
               <w:t>Собственная зона ответственности</w:t>
             </w:r>
           </w:p>
@@ -1227,19 +1095,11 @@
         <w:pStyle w:val="af7"/>
       </w:pPr>
       <w:r>
-        <w:rPr>
-          <w:rFonts w:ascii="Times New Roman" w:hAnsi="Times New Roman"/>
-          <w:sz w:val="20"/>
-        </w:rPr>
         <w:t>2 Цель, проект и собственная часть</w:t>
       </w:r>
     </w:p>
     <w:p>
       <w:r>
-        <w:rPr>
-          <w:rFonts w:ascii="Times New Roman" w:hAnsi="Times New Roman"/>
-          <w:sz w:val="20"/>
-        </w:rPr>
         <w:t>Цель: подготовить воспроизводимо исполняемый компонент и объяснить путь от исходного кода к процессу. Собственная существенная часть: проверка программы, тестовые данные, проверка версии и запуск вне папки проекта. Граница результата и среда: synthetic delivery contract only; Windows local run and Ubuntu 24.04 GitHub Actions. ADR выбора стека https://github.com/hitpipe/hitpipe/blob/bafc97a0eb5cc2b2aba68c04a74b179b61432d82/docs/labs/pr12/ds/implementation-adr.md; автор общей записи Дмитрий Стацюк, применение к своему участку TargetReadback keeps provider IO outside domain and exposes deterministic diagnostics. Не присваивать себе существующий общий ADR.</w:t>
       </w:r>
     </w:p>
@@ -1248,10 +1108,6 @@
         <w:pStyle w:val="afa"/>
       </w:pPr>
       <w:r>
-        <w:rPr>
-          <w:rFonts w:ascii="Times New Roman" w:hAnsi="Times New Roman"/>
-          <w:sz w:val="20"/>
-        </w:rPr>
         <w:t>2.1 Декларация всех семи позиций инструментального контура</w:t>
       </w:r>
     </w:p>
@@ -1280,11 +1136,6 @@
               <w:spacing w:before="0" w:after="20" w:line="240" w:lineRule="auto"/>
             </w:pPr>
             <w:r>
-              <w:rPr>
-                <w:rFonts w:ascii="Times New Roman" w:hAnsi="Times New Roman" w:eastAsia="Times New Roman"/>
-                <w:b/>
-                <w:sz w:val="21"/>
-              </w:rPr>
               <w:t>Позиция</w:t>
             </w:r>
           </w:p>
@@ -1298,11 +1149,6 @@
               <w:spacing w:before="0" w:after="20" w:line="240" w:lineRule="auto"/>
             </w:pPr>
             <w:r>
-              <w:rPr>
-                <w:rFonts w:ascii="Times New Roman" w:hAnsi="Times New Roman" w:eastAsia="Times New Roman"/>
-                <w:b/>
-                <w:sz w:val="21"/>
-              </w:rPr>
               <w:t>Средство и закреплённая версия</w:t>
             </w:r>
           </w:p>
@@ -1316,11 +1162,6 @@
               <w:spacing w:before="0" w:after="20" w:line="240" w:lineRule="auto"/>
             </w:pPr>
             <w:r>
-              <w:rPr>
-                <w:rFonts w:ascii="Times New Roman" w:hAnsi="Times New Roman" w:eastAsia="Times New Roman"/>
-                <w:b/>
-                <w:sz w:val="21"/>
-              </w:rPr>
               <w:t>Назначение и способ подключения</w:t>
             </w:r>
           </w:p>
@@ -1334,11 +1175,6 @@
               <w:spacing w:before="0" w:after="20" w:line="240" w:lineRule="auto"/>
             </w:pPr>
             <w:r>
-              <w:rPr>
-                <w:rFonts w:ascii="Times New Roman" w:hAnsi="Times New Roman" w:eastAsia="Times New Roman"/>
-                <w:b/>
-                <w:sz w:val="21"/>
-              </w:rPr>
               <w:t>Работает / запланировано, этап</w:t>
             </w:r>
           </w:p>
@@ -1354,10 +1190,6 @@
               <w:spacing w:before="0" w:after="20" w:line="240" w:lineRule="auto"/>
             </w:pPr>
             <w:r>
-              <w:rPr>
-                <w:rFonts w:ascii="Times New Roman" w:hAnsi="Times New Roman" w:eastAsia="Times New Roman"/>
-                <w:sz w:val="20"/>
-              </w:rPr>
               <w:t>Сборка/подготовка к исполнению</w:t>
             </w:r>
           </w:p>
@@ -1371,10 +1203,6 @@
               <w:spacing w:before="0" w:after="20" w:line="240" w:lineRule="auto"/>
             </w:pPr>
             <w:r>
-              <w:rPr>
-                <w:rFonts w:ascii="Times New Roman" w:hAnsi="Times New Roman" w:eastAsia="Times New Roman"/>
-                <w:sz w:val="20"/>
-              </w:rPr>
               <w:t>Go 1.27.2; GCC 16.2.0</w:t>
             </w:r>
           </w:p>
@@ -1388,10 +1216,6 @@
               <w:spacing w:before="0" w:after="20" w:line="240" w:lineRule="auto"/>
             </w:pPr>
             <w:r>
-              <w:rPr>
-                <w:rFonts w:ascii="Times New Roman" w:hAnsi="Times New Roman" w:eastAsia="Times New Roman"/>
-                <w:sz w:val="20"/>
-              </w:rPr>
               <w:t>go build; services/delivery/cmd/delivery-contractcheck; dev/release output</w:t>
             </w:r>
           </w:p>
@@ -1405,10 +1229,6 @@
               <w:spacing w:before="0" w:after="20" w:line="240" w:lineRule="auto"/>
             </w:pPr>
             <w:r>
-              <w:rPr>
-                <w:rFonts w:ascii="Times New Roman" w:hAnsi="Times New Roman" w:eastAsia="Times New Roman"/>
-                <w:sz w:val="20"/>
-              </w:rPr>
               <w:t>PASS locally; source commit and log recorded</w:t>
             </w:r>
           </w:p>
@@ -1424,10 +1244,6 @@
               <w:spacing w:before="0" w:after="20" w:line="240" w:lineRule="auto"/>
             </w:pPr>
             <w:r>
-              <w:rPr>
-                <w:rFonts w:ascii="Times New Roman" w:hAnsi="Times New Roman" w:eastAsia="Times New Roman"/>
-                <w:sz w:val="20"/>
-              </w:rPr>
               <w:t>Управление зависимостями</w:t>
             </w:r>
           </w:p>
@@ -1441,10 +1257,6 @@
               <w:spacing w:before="0" w:after="20" w:line="240" w:lineRule="auto"/>
             </w:pPr>
             <w:r>
-              <w:rPr>
-                <w:rFonts w:ascii="Times New Roman" w:hAnsi="Times New Roman" w:eastAsia="Times New Roman"/>
-                <w:sz w:val="20"/>
-              </w:rPr>
               <w:t>Go modules; golang.org/x/text v0.28.0</w:t>
             </w:r>
           </w:p>
@@ -1458,10 +1270,6 @@
               <w:spacing w:before="0" w:after="20" w:line="240" w:lineRule="auto"/>
             </w:pPr>
             <w:r>
-              <w:rPr>
-                <w:rFonts w:ascii="Times New Roman" w:hAnsi="Times New Roman" w:eastAsia="Times New Roman"/>
-                <w:sz w:val="20"/>
-              </w:rPr>
               <w:t>services/delivery/go.mod + go.sum; go mod download/tidy</w:t>
             </w:r>
           </w:p>
@@ -1475,10 +1283,6 @@
               <w:spacing w:before="0" w:after="20" w:line="240" w:lineRule="auto"/>
             </w:pPr>
             <w:r>
-              <w:rPr>
-                <w:rFonts w:ascii="Times New Roman" w:hAnsi="Times New Roman" w:eastAsia="Times New Roman"/>
-                <w:sz w:val="20"/>
-              </w:rPr>
               <w:t>PASS; lockfiles committed</w:t>
             </w:r>
           </w:p>
@@ -1494,10 +1298,6 @@
               <w:spacing w:before="0" w:after="20" w:line="240" w:lineRule="auto"/>
             </w:pPr>
             <w:r>
-              <w:rPr>
-                <w:rFonts w:ascii="Times New Roman" w:hAnsi="Times New Roman" w:eastAsia="Times New Roman"/>
-                <w:sz w:val="20"/>
-              </w:rPr>
               <w:t>Тестирование</w:t>
             </w:r>
           </w:p>
@@ -1511,10 +1311,6 @@
               <w:spacing w:before="0" w:after="20" w:line="240" w:lineRule="auto"/>
             </w:pPr>
             <w:r>
-              <w:rPr>
-                <w:rFonts w:ascii="Times New Roman" w:hAnsi="Times New Roman" w:eastAsia="Times New Roman"/>
-                <w:sz w:val="20"/>
-              </w:rPr>
               <w:t>Go test; race detector with GCC 16.2.0</w:t>
             </w:r>
           </w:p>
@@ -1528,10 +1324,6 @@
               <w:spacing w:before="0" w:after="20" w:line="240" w:lineRule="auto"/>
             </w:pPr>
             <w:r>
-              <w:rPr>
-                <w:rFonts w:ascii="Times New Roman" w:hAnsi="Times New Roman" w:eastAsia="Times New Roman"/>
-                <w:sz w:val="20"/>
-              </w:rPr>
               <w:t>go test ./... and CGO_ENABLED=1 go test -race ./...</w:t>
             </w:r>
           </w:p>
@@ -1545,10 +1337,6 @@
               <w:spacing w:before="0" w:after="20" w:line="240" w:lineRule="auto"/>
             </w:pPr>
             <w:r>
-              <w:rPr>
-                <w:rFonts w:ascii="Times New Roman" w:hAnsi="Times New Roman" w:eastAsia="Times New Roman"/>
-                <w:sz w:val="20"/>
-              </w:rPr>
               <w:t>PASS locally; logs in docs/labs/pr12/ds/evidence/</w:t>
             </w:r>
           </w:p>
@@ -1564,10 +1352,6 @@
               <w:spacing w:before="0" w:after="20" w:line="240" w:lineRule="auto"/>
             </w:pPr>
             <w:r>
-              <w:rPr>
-                <w:rFonts w:ascii="Times New Roman" w:hAnsi="Times New Roman" w:eastAsia="Times New Roman"/>
-                <w:sz w:val="20"/>
-              </w:rPr>
               <w:t>Статический анализ</w:t>
             </w:r>
           </w:p>
@@ -1581,10 +1365,6 @@
               <w:spacing w:before="0" w:after="20" w:line="240" w:lineRule="auto"/>
             </w:pPr>
             <w:r>
-              <w:rPr>
-                <w:rFonts w:ascii="Times New Roman" w:hAnsi="Times New Roman" w:eastAsia="Times New Roman"/>
-                <w:sz w:val="20"/>
-              </w:rPr>
               <w:t>go vet Go 1.27.2</w:t>
             </w:r>
           </w:p>
@@ -1598,10 +1378,6 @@
               <w:spacing w:before="0" w:after="20" w:line="240" w:lineRule="auto"/>
             </w:pPr>
             <w:r>
-              <w:rPr>
-                <w:rFonts w:ascii="Times New Roman" w:hAnsi="Times New Roman" w:eastAsia="Times New Roman"/>
-                <w:sz w:val="20"/>
-              </w:rPr>
               <w:t>go vet ./... from services/delivery</w:t>
             </w:r>
           </w:p>
@@ -1615,10 +1391,6 @@
               <w:spacing w:before="0" w:after="20" w:line="240" w:lineRule="auto"/>
             </w:pPr>
             <w:r>
-              <w:rPr>
-                <w:rFonts w:ascii="Times New Roman" w:hAnsi="Times New Roman" w:eastAsia="Times New Roman"/>
-                <w:sz w:val="20"/>
-              </w:rPr>
               <w:t>PASS locally; log recorded</w:t>
             </w:r>
           </w:p>
@@ -1634,10 +1406,6 @@
               <w:spacing w:before="0" w:after="20" w:line="240" w:lineRule="auto"/>
             </w:pPr>
             <w:r>
-              <w:rPr>
-                <w:rFonts w:ascii="Times New Roman" w:hAnsi="Times New Roman" w:eastAsia="Times New Roman"/>
-                <w:sz w:val="20"/>
-              </w:rPr>
               <w:t>Динамическая диагностика</w:t>
             </w:r>
           </w:p>
@@ -1651,10 +1419,6 @@
               <w:spacing w:before="0" w:after="20" w:line="240" w:lineRule="auto"/>
             </w:pPr>
             <w:r>
-              <w:rPr>
-                <w:rFonts w:ascii="Times New Roman" w:hAnsi="Times New Roman" w:eastAsia="Times New Roman"/>
-                <w:sz w:val="20"/>
-              </w:rPr>
               <w:t>delivery-contractcheck synthetic fixture CLI</w:t>
             </w:r>
           </w:p>
@@ -1668,10 +1432,6 @@
               <w:spacing w:before="0" w:after="20" w:line="240" w:lineRule="auto"/>
             </w:pPr>
             <w:r>
-              <w:rPr>
-                <w:rFonts w:ascii="Times New Roman" w:hAnsi="Times New Roman" w:eastAsia="Times New Roman"/>
-                <w:sz w:val="20"/>
-              </w:rPr>
               <w:t>workspace.py smoke delivery --require outside checkout</w:t>
             </w:r>
           </w:p>
@@ -1685,10 +1445,6 @@
               <w:spacing w:before="0" w:after="20" w:line="240" w:lineRule="auto"/>
             </w:pPr>
             <w:r>
-              <w:rPr>
-                <w:rFonts w:ascii="Times New Roman" w:hAnsi="Times New Roman" w:eastAsia="Times New Roman"/>
-                <w:sz w:val="20"/>
-              </w:rPr>
               <w:t>PASS; positive and negative exit recorded</w:t>
             </w:r>
           </w:p>
@@ -1704,10 +1460,6 @@
               <w:spacing w:before="0" w:after="20" w:line="240" w:lineRule="auto"/>
             </w:pPr>
             <w:r>
-              <w:rPr>
-                <w:rFonts w:ascii="Times New Roman" w:hAnsi="Times New Roman" w:eastAsia="Times New Roman"/>
-                <w:sz w:val="20"/>
-              </w:rPr>
               <w:t>Профилирование</w:t>
             </w:r>
           </w:p>
@@ -1721,10 +1473,6 @@
               <w:spacing w:before="0" w:after="20" w:line="240" w:lineRule="auto"/>
             </w:pPr>
             <w:r>
-              <w:rPr>
-                <w:rFonts w:ascii="Times New Roman" w:hAnsi="Times New Roman" w:eastAsia="Times New Roman"/>
-                <w:sz w:val="20"/>
-              </w:rPr>
               <w:t>Go pprof — not executed in this correction</w:t>
             </w:r>
           </w:p>
@@ -1738,10 +1486,6 @@
               <w:spacing w:before="0" w:after="20" w:line="240" w:lineRule="auto"/>
             </w:pPr>
             <w:r>
-              <w:rPr>
-                <w:rFonts w:ascii="Times New Roman" w:hAnsi="Times New Roman" w:eastAsia="Times New Roman"/>
-                <w:sz w:val="20"/>
-              </w:rPr>
               <w:t>planned after acceptance for CPU/memory of comparator and FileReader</w:t>
             </w:r>
           </w:p>
@@ -1755,10 +1499,6 @@
               <w:spacing w:before="0" w:after="20" w:line="240" w:lineRule="auto"/>
             </w:pPr>
             <w:r>
-              <w:rPr>
-                <w:rFonts w:ascii="Times New Roman" w:hAnsi="Times New Roman" w:eastAsia="Times New Roman"/>
-                <w:sz w:val="20"/>
-              </w:rPr>
               <w:t>PLANNED; no performance claim</w:t>
             </w:r>
           </w:p>
@@ -1774,10 +1514,6 @@
               <w:spacing w:before="0" w:after="20" w:line="240" w:lineRule="auto"/>
             </w:pPr>
             <w:r>
-              <w:rPr>
-                <w:rFonts w:ascii="Times New Roman" w:hAnsi="Times New Roman" w:eastAsia="Times New Roman"/>
-                <w:sz w:val="20"/>
-              </w:rPr>
               <w:t>Автоматические проверки CI</w:t>
             </w:r>
           </w:p>
@@ -1791,10 +1527,6 @@
               <w:spacing w:before="0" w:after="20" w:line="240" w:lineRule="auto"/>
             </w:pPr>
             <w:r>
-              <w:rPr>
-                <w:rFonts w:ascii="Times New Roman" w:hAnsi="Times New Roman" w:eastAsia="Times New Roman"/>
-                <w:sz w:val="20"/>
-              </w:rPr>
               <w:t>GitHub Actions</w:t>
             </w:r>
           </w:p>
@@ -1808,10 +1540,6 @@
               <w:spacing w:before="0" w:after="20" w:line="240" w:lineRule="auto"/>
             </w:pPr>
             <w:r>
-              <w:rPr>
-                <w:rFonts w:ascii="Times New Roman" w:hAnsi="Times New Roman" w:eastAsia="Times New Roman"/>
-                <w:sz w:val="20"/>
-              </w:rPr>
               <w:t>https://github.com/hitpipe/hitpipe/actions/runs/39271075578 (evidence/report commit c365ad5; latest correction head gets a fresh run after push)</w:t>
             </w:r>
           </w:p>
@@ -1825,10 +1553,6 @@
               <w:spacing w:before="0" w:after="20" w:line="240" w:lineRule="auto"/>
             </w:pPr>
             <w:r>
-              <w:rPr>
-                <w:rFonts w:ascii="Times New Roman" w:hAnsi="Times New Roman" w:eastAsia="Times New Roman"/>
-                <w:sz w:val="20"/>
-              </w:rPr>
               <w:t>PASS for evidence commit; fresh run for final source head is recorded after push</w:t>
             </w:r>
           </w:p>
@@ -1840,10 +1564,6 @@
         <w:pStyle w:val="af7"/>
       </w:pPr>
       <w:r>
-        <w:rPr>
-          <w:rFonts w:ascii="Times New Roman" w:hAnsi="Times New Roman"/>
-          <w:sz w:val="20"/>
-        </w:rPr>
         <w:t>3 Ход работы</w:t>
       </w:r>
     </w:p>
@@ -1852,19 +1572,11 @@
         <w:pStyle w:val="afa"/>
       </w:pPr>
       <w:r>
-        <w:rPr>
-          <w:rFonts w:ascii="Times New Roman" w:hAnsi="Times New Roman"/>
-          <w:sz w:val="20"/>
-        </w:rPr>
         <w:t>3.1 Собственная часть каркаса и маршрут PR</w:t>
       </w:r>
     </w:p>
     <w:p>
       <w:r>
-        <w:rPr>
-          <w:rFonts w:ascii="Times New Roman" w:hAnsi="Times New Roman"/>
-          <w:sz w:val="20"/>
-        </w:rPr>
         <w:t>Задача https://hitpipe.atlassian.net/browse/HIT-47 → ветка work/HIT-47-ds-corrections → PR https://github.com/hitpipe/hitpipe/pull/29 → реальные проверки Fresh CI success for round-2 source commit bafc97a0eb5cc2b2aba68c04a74b179b61432d82: delivery https://github.com/hitpipe/hitpipe/actions/runs/39279704440, intake https://github.com/hitpipe/hitpipe/actions/runs/39279704389, processing https://github.com/hitpipe/hitpipe/actions/runs/39279704449, iam https://github.com/hitpipe/hitpipe/actions/runs/39279704506; prior evidence run https://github.com/hitpipe/hitpipe/actions/runs/39271075578 passed on c365ad5 → независимый review Независимая проверка выполняется отдельным reviewer'ом. → merge PR #29 является источником версии для проверки.. Показать собственный фрагмент (рисунок 1); прямые изменения main не допускаются.</w:t>
       </w:r>
     </w:p>
@@ -1895,10 +1607,6 @@
               <w:jc w:val="center"/>
             </w:pPr>
             <w:r>
-              <w:rPr>
-                <w:rFonts w:ascii="Times New Roman" w:hAnsi="Times New Roman" w:eastAsia="Times New Roman"/>
-                <w:sz w:val="22"/>
-              </w:rPr>
               <w:t>[МЕСТО ДЛЯ СКРИНШОТА 1 — Собственная часть исполняемого каркаса]</w:t>
             </w:r>
           </w:p>
@@ -1911,10 +1619,6 @@
         <w:jc w:val="center"/>
       </w:pPr>
       <w:r>
-        <w:rPr>
-          <w:rFonts w:ascii="Times New Roman" w:hAnsi="Times New Roman" w:eastAsia="Times New Roman"/>
-          <w:sz w:val="20"/>
-        </w:rPr>
         <w:t>Рисунок 1 — Собственная часть исполняемого каркаса</w:t>
       </w:r>
     </w:p>
@@ -1923,19 +1627,11 @@
         <w:pStyle w:val="afa"/>
       </w:pPr>
       <w:r>
-        <w:rPr>
-          <w:rFonts w:ascii="Times New Roman" w:hAnsi="Times New Roman"/>
-          <w:sz w:val="20"/>
-        </w:rPr>
         <w:t>3.2 Путь исполнения и состав запускаемого результата</w:t>
       </w:r>
     </w:p>
     <w:p>
       <w:r>
-        <w:rPr>
-          <w:rFonts w:ascii="Times New Roman" w:hAnsi="Times New Roman"/>
-          <w:sz w:val="20"/>
-        </w:rPr>
         <w:t>Схема: services/delivery/go.mod + internal/domain/readback + cmd/delivery-contractcheck + testdata → go mod tidy; Go 1.27.2; golang.org/x/text v0.28.0 → go build with dev/release flags; CLI reads fixture, validates config/format, emits JSON → .pr12-build/delivery/{dev,release}/delivery-contractcheck → run --version and --fixture ... --format json from a temporary directory outside checkout. Указывать только существующие стадии Go/Node/Python. Команда просмотра результата go version -m .pr12-build/delivery/release/delivery-contractcheck, существенный фактический вывод workspace.py smoke recorded dev/release PASS; go version -m inspection is an explicit human capture step and is not claimed as completed by the agent. Для Go подходят go version -m, file/readelf/ldd с честным выводом о статической линковке; для Next/Python — пакет/модули/bytecode и закреплённые зависимости. Наличие инструмента не равно выполненному наблюдению.</w:t>
       </w:r>
     </w:p>
@@ -1966,10 +1662,6 @@
               <w:jc w:val="center"/>
             </w:pPr>
             <w:r>
-              <w:rPr>
-                <w:rFonts w:ascii="Times New Roman" w:hAnsi="Times New Roman" w:eastAsia="Times New Roman"/>
-                <w:sz w:val="22"/>
-              </w:rPr>
               <w:t>[МЕСТО ДЛЯ СКРИНШОТА 2 — Подготовка компонента в двух режимах]</w:t>
             </w:r>
           </w:p>
@@ -1982,10 +1674,6 @@
         <w:jc w:val="center"/>
       </w:pPr>
       <w:r>
-        <w:rPr>
-          <w:rFonts w:ascii="Times New Roman" w:hAnsi="Times New Roman" w:eastAsia="Times New Roman"/>
-          <w:sz w:val="20"/>
-        </w:rPr>
         <w:t>Рисунок 2 — Подготовка компонента в двух режимах</w:t>
       </w:r>
     </w:p>
@@ -1994,10 +1682,6 @@
         <w:pStyle w:val="afa"/>
       </w:pPr>
       <w:r>
-        <w:rPr>
-          <w:rFonts w:ascii="Times New Roman" w:hAnsi="Times New Roman"/>
-          <w:sz w:val="20"/>
-        </w:rPr>
         <w:t>3.3 Наблюдаемое сравнение dev/release на одном сценарии</w:t>
       </w:r>
     </w:p>
@@ -2025,10 +1709,6 @@
               <w:spacing w:after="40" w:line="240" w:lineRule="auto"/>
             </w:pPr>
             <w:r>
-              <w:rPr>
-                <w:rFonts w:ascii="Times New Roman" w:hAnsi="Times New Roman"/>
-                <w:sz w:val="20"/>
-              </w:rPr>
               <w:t>Что проверяем</w:t>
             </w:r>
           </w:p>
@@ -2042,10 +1722,6 @@
               <w:spacing w:after="40" w:line="240" w:lineRule="auto"/>
             </w:pPr>
             <w:r>
-              <w:rPr>
-                <w:rFonts w:ascii="Times New Roman" w:hAnsi="Times New Roman"/>
-                <w:sz w:val="20"/>
-              </w:rPr>
               <w:t>Разработка</w:t>
             </w:r>
           </w:p>
@@ -2059,10 +1735,6 @@
               <w:spacing w:after="40" w:line="240" w:lineRule="auto"/>
             </w:pPr>
             <w:r>
-              <w:rPr>
-                <w:rFonts w:ascii="Times New Roman" w:hAnsi="Times New Roman"/>
-                <w:sz w:val="20"/>
-              </w:rPr>
               <w:t>Поставка</w:t>
             </w:r>
           </w:p>
@@ -2078,10 +1750,6 @@
               <w:spacing w:after="40" w:line="240" w:lineRule="auto"/>
             </w:pPr>
             <w:r>
-              <w:rPr>
-                <w:rFonts w:ascii="Times New Roman" w:hAnsi="Times New Roman"/>
-                <w:sz w:val="20"/>
-              </w:rPr>
               <w:t>Сборка программы</w:t>
             </w:r>
           </w:p>
@@ -2095,10 +1763,6 @@
               <w:spacing w:after="40" w:line="240" w:lineRule="auto"/>
             </w:pPr>
             <w:r>
-              <w:rPr>
-                <w:rFonts w:ascii="Times New Roman" w:hAnsi="Times New Roman"/>
-                <w:sz w:val="20"/>
-              </w:rPr>
               <w:t>Программа собрана для проверки.</w:t>
             </w:r>
           </w:p>
@@ -2112,10 +1776,6 @@
               <w:spacing w:after="40" w:line="240" w:lineRule="auto"/>
             </w:pPr>
             <w:r>
-              <w:rPr>
-                <w:rFonts w:ascii="Times New Roman" w:hAnsi="Times New Roman"/>
-                <w:sz w:val="20"/>
-              </w:rPr>
               <w:t>Программа собрана для поставки.</w:t>
             </w:r>
           </w:p>
@@ -2131,10 +1791,6 @@
               <w:spacing w:after="40" w:line="240" w:lineRule="auto"/>
             </w:pPr>
             <w:r>
-              <w:rPr>
-                <w:rFonts w:ascii="Times New Roman" w:hAnsi="Times New Roman"/>
-                <w:sz w:val="20"/>
-              </w:rPr>
               <w:t>Подготовка проекта</w:t>
             </w:r>
           </w:p>
@@ -2148,10 +1804,6 @@
               <w:spacing w:after="40" w:line="240" w:lineRule="auto"/>
             </w:pPr>
             <w:r>
-              <w:rPr>
-                <w:rFonts w:ascii="Times New Roman" w:hAnsi="Times New Roman"/>
-                <w:sz w:val="20"/>
-              </w:rPr>
               <w:t>Зависимости установлены, проект готов к запуску.</w:t>
             </w:r>
           </w:p>
@@ -2165,10 +1817,6 @@
               <w:spacing w:after="40" w:line="240" w:lineRule="auto"/>
             </w:pPr>
             <w:r>
-              <w:rPr>
-                <w:rFonts w:ascii="Times New Roman" w:hAnsi="Times New Roman"/>
-                <w:sz w:val="20"/>
-              </w:rPr>
               <w:t>Зависимости установлены, проект готов к запуску.</w:t>
             </w:r>
           </w:p>
@@ -2184,10 +1832,6 @@
               <w:spacing w:after="40" w:line="240" w:lineRule="auto"/>
             </w:pPr>
             <w:r>
-              <w:rPr>
-                <w:rFonts w:ascii="Times New Roman" w:hAnsi="Times New Roman"/>
-                <w:sz w:val="20"/>
-              </w:rPr>
               <w:t>Проверка результата</w:t>
             </w:r>
           </w:p>
@@ -2201,10 +1845,6 @@
               <w:spacing w:after="40" w:line="240" w:lineRule="auto"/>
             </w:pPr>
             <w:r>
-              <w:rPr>
-                <w:rFonts w:ascii="Times New Roman" w:hAnsi="Times New Roman"/>
-                <w:sz w:val="20"/>
-              </w:rPr>
               <w:t>Тесты выполнены успешно.</w:t>
             </w:r>
           </w:p>
@@ -2218,10 +1858,6 @@
               <w:spacing w:after="40" w:line="240" w:lineRule="auto"/>
             </w:pPr>
             <w:r>
-              <w:rPr>
-                <w:rFonts w:ascii="Times New Roman" w:hAnsi="Times New Roman"/>
-                <w:sz w:val="20"/>
-              </w:rPr>
               <w:t>Тесты выполнены успешно.</w:t>
             </w:r>
           </w:p>
@@ -2237,10 +1873,6 @@
               <w:spacing w:after="40" w:line="240" w:lineRule="auto"/>
             </w:pPr>
             <w:r>
-              <w:rPr>
-                <w:rFonts w:ascii="Times New Roman" w:hAnsi="Times New Roman"/>
-                <w:sz w:val="20"/>
-              </w:rPr>
               <w:t>Диагностика</w:t>
             </w:r>
           </w:p>
@@ -2254,10 +1886,6 @@
               <w:spacing w:after="40" w:line="240" w:lineRule="auto"/>
             </w:pPr>
             <w:r>
-              <w:rPr>
-                <w:rFonts w:ascii="Times New Roman" w:hAnsi="Times New Roman"/>
-                <w:sz w:val="20"/>
-              </w:rPr>
               <w:t>Получена информация о версии и настройках.</w:t>
             </w:r>
           </w:p>
@@ -2271,10 +1899,6 @@
               <w:spacing w:after="40" w:line="240" w:lineRule="auto"/>
             </w:pPr>
             <w:r>
-              <w:rPr>
-                <w:rFonts w:ascii="Times New Roman" w:hAnsi="Times New Roman"/>
-                <w:sz w:val="20"/>
-              </w:rPr>
               <w:t>Получена информация о версии и настройках.</w:t>
             </w:r>
           </w:p>
@@ -2290,10 +1914,6 @@
               <w:spacing w:after="40" w:line="240" w:lineRule="auto"/>
             </w:pPr>
             <w:r>
-              <w:rPr>
-                <w:rFonts w:ascii="Times New Roman" w:hAnsi="Times New Roman"/>
-                <w:sz w:val="20"/>
-              </w:rPr>
               <w:t>Проверка запуска</w:t>
             </w:r>
           </w:p>
@@ -2307,10 +1927,6 @@
               <w:spacing w:after="40" w:line="240" w:lineRule="auto"/>
             </w:pPr>
             <w:r>
-              <w:rPr>
-                <w:rFonts w:ascii="Times New Roman" w:hAnsi="Times New Roman"/>
-                <w:sz w:val="20"/>
-              </w:rPr>
               <w:t>Программа запускается по заданному сценарию.</w:t>
             </w:r>
           </w:p>
@@ -2324,10 +1940,6 @@
               <w:spacing w:after="40" w:line="240" w:lineRule="auto"/>
             </w:pPr>
             <w:r>
-              <w:rPr>
-                <w:rFonts w:ascii="Times New Roman" w:hAnsi="Times New Roman"/>
-                <w:sz w:val="20"/>
-              </w:rPr>
               <w:t>Программа запускается по заданному сценарию.</w:t>
             </w:r>
           </w:p>
@@ -2343,10 +1955,6 @@
               <w:spacing w:after="40" w:line="240" w:lineRule="auto"/>
             </w:pPr>
             <w:r>
-              <w:rPr>
-                <w:rFonts w:ascii="Times New Roman" w:hAnsi="Times New Roman"/>
-                <w:sz w:val="20"/>
-              </w:rPr>
               <w:t>Итог</w:t>
             </w:r>
           </w:p>
@@ -2360,10 +1968,6 @@
               <w:spacing w:after="40" w:line="240" w:lineRule="auto"/>
             </w:pPr>
             <w:r>
-              <w:rPr>
-                <w:rFonts w:ascii="Times New Roman" w:hAnsi="Times New Roman"/>
-                <w:sz w:val="20"/>
-              </w:rPr>
               <w:t>Получен рабочий результат.</w:t>
             </w:r>
           </w:p>
@@ -2377,10 +1981,6 @@
               <w:spacing w:after="40" w:line="240" w:lineRule="auto"/>
             </w:pPr>
             <w:r>
-              <w:rPr>
-                <w:rFonts w:ascii="Times New Roman" w:hAnsi="Times New Roman"/>
-                <w:sz w:val="20"/>
-              </w:rPr>
               <w:t>Получен рабочий результат.</w:t>
             </w:r>
           </w:p>
@@ -2389,10 +1989,6 @@
     </w:tbl>
     <w:p>
       <w:r>
-        <w:rPr>
-          <w:rFonts w:ascii="Times New Roman" w:hAnsi="Times New Roman"/>
-          <w:sz w:val="20"/>
-        </w:rPr>
         <w:t>Один сценарий testdata/match.json в обоих режимах. Если различий нет — объяснить. Поставку запустить из temporary directory created by workspace.py smoke delivery --require вне исходников/IDE. Не заявлять ускорение без измерений. Рисунки 2–3.</w:t>
       </w:r>
     </w:p>
@@ -2423,10 +2019,6 @@
               <w:jc w:val="center"/>
             </w:pPr>
             <w:r>
-              <w:rPr>
-                <w:rFonts w:ascii="Times New Roman" w:hAnsi="Times New Roman" w:eastAsia="Times New Roman"/>
-                <w:sz w:val="22"/>
-              </w:rPr>
               <w:t>[МЕСТО ДЛЯ СКРИНШОТА 3 — Запуск поставки вне исходного кода и IDE]</w:t>
             </w:r>
           </w:p>
@@ -2439,10 +2031,6 @@
         <w:jc w:val="center"/>
       </w:pPr>
       <w:r>
-        <w:rPr>
-          <w:rFonts w:ascii="Times New Roman" w:hAnsi="Times New Roman" w:eastAsia="Times New Roman"/>
-          <w:sz w:val="20"/>
-        </w:rPr>
         <w:t>Рисунок 3 — Запуск поставки вне исходного кода и IDE</w:t>
       </w:r>
     </w:p>
@@ -2451,10 +2039,6 @@
         <w:pStyle w:val="af7"/>
       </w:pPr>
       <w:r>
-        <w:rPr>
-          <w:rFonts w:ascii="Times New Roman" w:hAnsi="Times New Roman"/>
-          <w:sz w:val="20"/>
-        </w:rPr>
         <w:t>4 Результаты</w:t>
       </w:r>
     </w:p>
@@ -2463,10 +2047,6 @@
         <w:pStyle w:val="afa"/>
       </w:pPr>
       <w:r>
-        <w:rPr>
-          <w:rFonts w:ascii="Times New Roman" w:hAnsi="Times New Roman"/>
-          <w:sz w:val="20"/>
-        </w:rPr>
         <w:t>4.1 Проверки компонента</w:t>
       </w:r>
     </w:p>
@@ -2495,11 +2075,6 @@
               <w:spacing w:before="0" w:after="20" w:line="240" w:lineRule="auto"/>
             </w:pPr>
             <w:r>
-              <w:rPr>
-                <w:rFonts w:ascii="Times New Roman" w:hAnsi="Times New Roman" w:eastAsia="Times New Roman"/>
-                <w:b/>
-                <w:sz w:val="21"/>
-              </w:rPr>
               <w:t>Проверка</w:t>
             </w:r>
           </w:p>
@@ -2513,11 +2088,6 @@
               <w:spacing w:before="0" w:after="20" w:line="240" w:lineRule="auto"/>
             </w:pPr>
             <w:r>
-              <w:rPr>
-                <w:rFonts w:ascii="Times New Roman" w:hAnsi="Times New Roman" w:eastAsia="Times New Roman"/>
-                <w:b/>
-                <w:sz w:val="21"/>
-              </w:rPr>
               <w:t>Ожидаемый результат</w:t>
             </w:r>
           </w:p>
@@ -2531,11 +2101,6 @@
               <w:spacing w:before="0" w:after="20" w:line="240" w:lineRule="auto"/>
             </w:pPr>
             <w:r>
-              <w:rPr>
-                <w:rFonts w:ascii="Times New Roman" w:hAnsi="Times New Roman" w:eastAsia="Times New Roman"/>
-                <w:b/>
-                <w:sz w:val="21"/>
-              </w:rPr>
               <w:t>Фактический результат/статус</w:t>
             </w:r>
           </w:p>
@@ -2549,11 +2114,6 @@
               <w:spacing w:before="0" w:after="20" w:line="240" w:lineRule="auto"/>
             </w:pPr>
             <w:r>
-              <w:rPr>
-                <w:rFonts w:ascii="Times New Roman" w:hAnsi="Times New Roman" w:eastAsia="Times New Roman"/>
-                <w:b/>
-                <w:sz w:val="21"/>
-              </w:rPr>
               <w:t>Команда, версия и журнал</w:t>
             </w:r>
           </w:p>
@@ -2569,10 +2129,6 @@
               <w:spacing w:before="0" w:after="20" w:line="240" w:lineRule="auto"/>
             </w:pPr>
             <w:r>
-              <w:rPr>
-                <w:rFonts w:ascii="Times New Roman" w:hAnsi="Times New Roman" w:eastAsia="Times New Roman"/>
-                <w:sz w:val="20"/>
-              </w:rPr>
               <w:t>default config</w:t>
             </w:r>
           </w:p>
@@ -2586,10 +2142,6 @@
               <w:spacing w:before="0" w:after="20" w:line="240" w:lineRule="auto"/>
             </w:pPr>
             <w:r>
-              <w:rPr>
-                <w:rFonts w:ascii="Times New Roman" w:hAnsi="Times New Roman" w:eastAsia="Times New Roman"/>
-                <w:sz w:val="20"/>
-              </w:rPr>
               <w:t>go test ./...; smoke --require</w:t>
             </w:r>
           </w:p>
@@ -2603,10 +2155,6 @@
               <w:spacing w:before="0" w:after="20" w:line="240" w:lineRule="auto"/>
             </w:pPr>
             <w:r>
-              <w:rPr>
-                <w:rFonts w:ascii="Times New Roman" w:hAnsi="Times New Roman" w:eastAsia="Times New Roman"/>
-                <w:sz w:val="20"/>
-              </w:rPr>
               <w:t>PASS</w:t>
             </w:r>
           </w:p>
@@ -2620,10 +2168,6 @@
               <w:spacing w:before="0" w:after="20" w:line="240" w:lineRule="auto"/>
             </w:pPr>
             <w:r>
-              <w:rPr>
-                <w:rFonts w:ascii="Times New Roman" w:hAnsi="Times New Roman" w:eastAsia="Times New Roman"/>
-                <w:sz w:val="20"/>
-              </w:rPr>
               <w:t>HIT-47-go-test.log / workspace smoke</w:t>
             </w:r>
           </w:p>
@@ -2639,10 +2183,6 @@
               <w:spacing w:before="0" w:after="20" w:line="240" w:lineRule="auto"/>
             </w:pPr>
             <w:r>
-              <w:rPr>
-                <w:rFonts w:ascii="Times New Roman" w:hAnsi="Times New Roman" w:eastAsia="Times New Roman"/>
-                <w:sz w:val="20"/>
-              </w:rPr>
               <w:t>unsupported config</w:t>
             </w:r>
           </w:p>
@@ -2656,10 +2196,6 @@
               <w:spacing w:before="0" w:after="20" w:line="240" w:lineRule="auto"/>
             </w:pPr>
             <w:r>
-              <w:rPr>
-                <w:rFonts w:ascii="Times New Roman" w:hAnsi="Times New Roman" w:eastAsia="Times New Roman"/>
-                <w:sz w:val="20"/>
-              </w:rPr>
               <w:t>delivery-contractcheck --config unsupported ...</w:t>
             </w:r>
           </w:p>
@@ -2673,10 +2209,6 @@
               <w:spacing w:before="0" w:after="20" w:line="240" w:lineRule="auto"/>
             </w:pPr>
             <w:r>
-              <w:rPr>
-                <w:rFonts w:ascii="Times New Roman" w:hAnsi="Times New Roman" w:eastAsia="Times New Roman"/>
-                <w:sz w:val="20"/>
-              </w:rPr>
               <w:t>PASS negative gate: exit 2</w:t>
             </w:r>
           </w:p>
@@ -2690,10 +2222,6 @@
               <w:spacing w:before="0" w:after="20" w:line="240" w:lineRule="auto"/>
             </w:pPr>
             <w:r>
-              <w:rPr>
-                <w:rFonts w:ascii="Times New Roman" w:hAnsi="Times New Roman" w:eastAsia="Times New Roman"/>
-                <w:sz w:val="20"/>
-              </w:rPr>
               <w:t>negative-gate log</w:t>
             </w:r>
           </w:p>
@@ -2709,10 +2237,6 @@
               <w:spacing w:before="0" w:after="20" w:line="240" w:lineRule="auto"/>
             </w:pPr>
             <w:r>
-              <w:rPr>
-                <w:rFonts w:ascii="Times New Roman" w:hAnsi="Times New Roman" w:eastAsia="Times New Roman"/>
-                <w:sz w:val="20"/>
-              </w:rPr>
               <w:t>version/source</w:t>
             </w:r>
           </w:p>
@@ -2726,10 +2250,6 @@
               <w:spacing w:before="0" w:after="20" w:line="240" w:lineRule="auto"/>
             </w:pPr>
             <w:r>
-              <w:rPr>
-                <w:rFonts w:ascii="Times New Roman" w:hAnsi="Times New Roman" w:eastAsia="Times New Roman"/>
-                <w:sz w:val="20"/>
-              </w:rPr>
               <w:t>delivery-contractcheck --version</w:t>
             </w:r>
           </w:p>
@@ -2743,10 +2263,6 @@
               <w:spacing w:before="0" w:after="20" w:line="240" w:lineRule="auto"/>
             </w:pPr>
             <w:r>
-              <w:rPr>
-                <w:rFonts w:ascii="Times New Roman" w:hAnsi="Times New Roman" w:eastAsia="Times New Roman"/>
-                <w:sz w:val="20"/>
-              </w:rPr>
               <w:t>PASS; version pr12 and source SHA visible</w:t>
             </w:r>
           </w:p>
@@ -2760,10 +2276,6 @@
               <w:spacing w:before="0" w:after="20" w:line="240" w:lineRule="auto"/>
             </w:pPr>
             <w:r>
-              <w:rPr>
-                <w:rFonts w:ascii="Times New Roman" w:hAnsi="Times New Roman" w:eastAsia="Times New Roman"/>
-                <w:sz w:val="20"/>
-              </w:rPr>
               <w:t>workspace smoke log</w:t>
             </w:r>
           </w:p>
@@ -2779,10 +2291,6 @@
               <w:spacing w:before="0" w:after="20" w:line="240" w:lineRule="auto"/>
             </w:pPr>
             <w:r>
-              <w:rPr>
-                <w:rFonts w:ascii="Times New Roman" w:hAnsi="Times New Roman" w:eastAsia="Times New Roman"/>
-                <w:sz w:val="20"/>
-              </w:rPr>
               <w:t>diagnostics</w:t>
             </w:r>
           </w:p>
@@ -2796,10 +2304,6 @@
               <w:spacing w:before="0" w:after="20" w:line="240" w:lineRule="auto"/>
             </w:pPr>
             <w:r>
-              <w:rPr>
-                <w:rFonts w:ascii="Times New Roman" w:hAnsi="Times New Roman" w:eastAsia="Times New Roman"/>
-                <w:sz w:val="20"/>
-              </w:rPr>
               <w:t>delivery-contractcheck --fixture testdata/match.json --format json</w:t>
             </w:r>
           </w:p>
@@ -2813,10 +2317,6 @@
               <w:spacing w:before="0" w:after="20" w:line="240" w:lineRule="auto"/>
             </w:pPr>
             <w:r>
-              <w:rPr>
-                <w:rFonts w:ascii="Times New Roman" w:hAnsi="Times New Roman" w:eastAsia="Times New Roman"/>
-                <w:sz w:val="20"/>
-              </w:rPr>
               <w:t>PASS; no secrets</w:t>
             </w:r>
           </w:p>
@@ -2830,10 +2330,6 @@
               <w:spacing w:before="0" w:after="20" w:line="240" w:lineRule="auto"/>
             </w:pPr>
             <w:r>
-              <w:rPr>
-                <w:rFonts w:ascii="Times New Roman" w:hAnsi="Times New Roman" w:eastAsia="Times New Roman"/>
-                <w:sz w:val="20"/>
-              </w:rPr>
               <w:t>workspace smoke log</w:t>
             </w:r>
           </w:p>
@@ -2849,10 +2345,6 @@
               <w:spacing w:before="0" w:after="20" w:line="240" w:lineRule="auto"/>
             </w:pPr>
             <w:r>
-              <w:rPr>
-                <w:rFonts w:ascii="Times New Roman" w:hAnsi="Times New Roman" w:eastAsia="Times New Roman"/>
-                <w:sz w:val="20"/>
-              </w:rPr>
               <w:t>restore</w:t>
             </w:r>
           </w:p>
@@ -2866,10 +2358,6 @@
               <w:spacing w:before="0" w:after="20" w:line="240" w:lineRule="auto"/>
             </w:pPr>
             <w:r>
-              <w:rPr>
-                <w:rFonts w:ascii="Times New Roman" w:hAnsi="Times New Roman" w:eastAsia="Times New Roman"/>
-                <w:sz w:val="20"/>
-              </w:rPr>
               <w:t>rebuild after isolated negative mutation; go test ./...</w:t>
             </w:r>
           </w:p>
@@ -2883,10 +2371,6 @@
               <w:spacing w:before="0" w:after="20" w:line="240" w:lineRule="auto"/>
             </w:pPr>
             <w:r>
-              <w:rPr>
-                <w:rFonts w:ascii="Times New Roman" w:hAnsi="Times New Roman" w:eastAsia="Times New Roman"/>
-                <w:sz w:val="20"/>
-              </w:rPr>
               <w:t>PASS; source restored</w:t>
             </w:r>
           </w:p>
@@ -2900,10 +2384,6 @@
               <w:spacing w:before="0" w:after="20" w:line="240" w:lineRule="auto"/>
             </w:pPr>
             <w:r>
-              <w:rPr>
-                <w:rFonts w:ascii="Times New Roman" w:hAnsi="Times New Roman" w:eastAsia="Times New Roman"/>
-                <w:sz w:val="20"/>
-              </w:rPr>
               <w:t>restoration log</w:t>
             </w:r>
           </w:p>
@@ -2912,10 +2392,6 @@
     </w:tbl>
     <w:p>
       <w:r>
-        <w:rPr>
-          <w:rFonts w:ascii="Times New Roman" w:hAnsi="Times New Roman"/>
-          <w:sz w:val="20"/>
-        </w:rPr>
         <w:t>Версии среды и прямых зависимостей зафиксированы services/delivery/go.mod and go.sum; безопасный пример конфигурации default; unsupported config is rejected with exit 2. Рисунки 4–5.</w:t>
       </w:r>
     </w:p>
@@ -2946,10 +2422,6 @@
               <w:jc w:val="center"/>
             </w:pPr>
             <w:r>
-              <w:rPr>
-                <w:rFonts w:ascii="Times New Roman" w:hAnsi="Times New Roman" w:eastAsia="Times New Roman"/>
-                <w:sz w:val="22"/>
-              </w:rPr>
               <w:t>[МЕСТО ДЛЯ СКРИНШОТА 4 — Штатный запуск компонента]</w:t>
             </w:r>
           </w:p>
@@ -2962,10 +2434,6 @@
         <w:jc w:val="center"/>
       </w:pPr>
       <w:r>
-        <w:rPr>
-          <w:rFonts w:ascii="Times New Roman" w:hAnsi="Times New Roman" w:eastAsia="Times New Roman"/>
-          <w:sz w:val="20"/>
-        </w:rPr>
         <w:t>Рисунок 4 — Штатный запуск компонента</w:t>
       </w:r>
     </w:p>
@@ -2996,10 +2464,6 @@
               <w:jc w:val="center"/>
             </w:pPr>
             <w:r>
-              <w:rPr>
-                <w:rFonts w:ascii="Times New Roman" w:hAnsi="Times New Roman" w:eastAsia="Times New Roman"/>
-                <w:sz w:val="22"/>
-              </w:rPr>
               <w:t>[МЕСТО ДЛЯ СКРИНШОТА 5 — Неверная конфигурация]</w:t>
             </w:r>
           </w:p>
@@ -3012,10 +2476,6 @@
         <w:jc w:val="center"/>
       </w:pPr>
       <w:r>
-        <w:rPr>
-          <w:rFonts w:ascii="Times New Roman" w:hAnsi="Times New Roman" w:eastAsia="Times New Roman"/>
-          <w:sz w:val="20"/>
-        </w:rPr>
         <w:t>Рисунок 5 — Неверная конфигурация</w:t>
       </w:r>
     </w:p>
@@ -3024,10 +2484,6 @@
         <w:pStyle w:val="afa"/>
       </w:pPr>
       <w:r>
-        <w:rPr>
-          <w:rFonts w:ascii="Times New Roman" w:hAnsi="Times New Roman"/>
-          <w:sz w:val="20"/>
-        </w:rPr>
         <w:t>4.2 Независимое чистое воспроизведение чужой части</w:t>
       </w:r>
     </w:p>
@@ -3103,10 +2559,6 @@
               <w:jc w:val="center"/>
             </w:pPr>
             <w:r>
-              <w:rPr>
-                <w:rFonts w:ascii="Times New Roman" w:hAnsi="Times New Roman" w:eastAsia="Times New Roman"/>
-                <w:sz w:val="22"/>
-              </w:rPr>
               <w:t>[МЕСТО ДЛЯ СКРИНШОТА 6 — Независимое воспроизведение части другого студента]</w:t>
             </w:r>
           </w:p>
@@ -3127,19 +2579,11 @@
         <w:pStyle w:val="afa"/>
       </w:pPr>
       <w:r>
-        <w:rPr>
-          <w:rFonts w:ascii="Times New Roman" w:hAnsi="Times New Roman"/>
-          <w:sz w:val="20"/>
-        </w:rPr>
         <w:t>4.3 Базовая содержательная автоматическая проверка</w:t>
       </w:r>
     </w:p>
     <w:p>
       <w:r>
-        <w:rPr>
-          <w:rFonts w:ascii="Times New Roman" w:hAnsi="Times New Roman"/>
-          <w:sz w:val="20"/>
-        </w:rPr>
         <w:t>CI сдаваемой версии Fresh CI success for round-2 source commit bafc97a0eb5cc2b2aba68c04a74b179b61432d82: delivery https://github.com/hitpipe/hitpipe/actions/runs/39279704440, intake https://github.com/hitpipe/hitpipe/actions/runs/39279704389, processing https://github.com/hitpipe/hitpipe/actions/runs/39279704449, iam https://github.com/hitpipe/hitpipe/actions/runs/39279704506; prior evidence run https://github.com/hitpipe/hitpipe/actions/runs/39271075578 passed on c365ad5 выполняет workspace.py check delivery; workspace.py smoke delivery --require, сбой условия даёт ненулевой exit. Долгий процесс имеет timeout readiness и корректную остановку. Локальная отрицательная демонстрация той же проверки workspace.py smoke log; actual negative exit observed locally, после неё исправный код восстановлен. Граница автоматизации/ручной проверки synthetic fixtures; no provider GET/POST, permissions, state transition or customer data. Рисунок 7.</w:t>
       </w:r>
     </w:p>
@@ -3170,10 +2614,6 @@
               <w:jc w:val="center"/>
             </w:pPr>
             <w:r>
-              <w:rPr>
-                <w:rFonts w:ascii="Times New Roman" w:hAnsi="Times New Roman" w:eastAsia="Times New Roman"/>
-                <w:sz w:val="22"/>
-              </w:rPr>
               <w:t>[МЕСТО ДЛЯ СКРИНШОТА 7 — Отрицательная локальная проверка автоматического gate]</w:t>
             </w:r>
           </w:p>
@@ -3186,10 +2626,6 @@
         <w:jc w:val="center"/>
       </w:pPr>
       <w:r>
-        <w:rPr>
-          <w:rFonts w:ascii="Times New Roman" w:hAnsi="Times New Roman" w:eastAsia="Times New Roman"/>
-          <w:sz w:val="20"/>
-        </w:rPr>
         <w:t>Рисунок 7 — Отрицательная локальная проверка автоматического gate</w:t>
       </w:r>
     </w:p>
@@ -3198,19 +2634,11 @@
         <w:pStyle w:val="af7"/>
       </w:pPr>
       <w:r>
-        <w:rPr>
-          <w:rFonts w:ascii="Times New Roman" w:hAnsi="Times New Roman"/>
-          <w:sz w:val="20"/>
-        </w:rPr>
         <w:t>5 Заключение и индивидуальный вклад</w:t>
       </w:r>
     </w:p>
     <w:p>
       <w:r>
-        <w:rPr>
-          <w:rFonts w:ascii="Times New Roman" w:hAnsi="Times New Roman"/>
-          <w:sz w:val="20"/>
-        </w:rPr>
         <w:t>В заключении простыми словами опишите: своя часть и PR; воспроизводимость; наблюдённые различия режимов; результат независимой проверки; содержательность и ограничения CI. Зафиксировать неизменяемый тег 0104-pz01-ds-v1. Изменение — новым v2 без перемещения v1. Защита студентом самостоятельно, без генеративного AI.</w:t>
       </w:r>
     </w:p>
@@ -3219,19 +2647,11 @@
         <w:pStyle w:val="af7"/>
       </w:pPr>
       <w:r>
-        <w:rPr>
-          <w:rFonts w:ascii="Times New Roman" w:hAnsi="Times New Roman"/>
-          <w:sz w:val="20"/>
-        </w:rPr>
         <w:t>СПИСОК ИСПОЛЬЗОВАННЫХ МАТЕРИАЛОВ</w:t>
       </w:r>
     </w:p>
     <w:p>
       <w:r>
-        <w:rPr>
-          <w:rFonts w:ascii="Times New Roman" w:hAnsi="Times New Roman"/>
-          <w:sz w:val="20"/>
-        </w:rPr>
         <w:t>Список источников приведён ниже и содержит методические материалы, официальную документацию и материалы проекта.</w:t>
       </w:r>
     </w:p>
@@ -3240,91 +2660,51 @@
         <w:pStyle w:val="1"/>
       </w:pPr>
       <w:r>
-        <w:rPr>
-          <w:rFonts w:ascii="Times New Roman" w:hAnsi="Times New Roman"/>
-          <w:sz w:val="20"/>
-        </w:rPr>
         <w:t>ИСТОЧНИКИ И ИНСТРУКЦИИ ДЛЯ СКРИНШОТОВ</w:t>
       </w:r>
     </w:p>
     <w:p>
       <w:r>
-        <w:rPr>
-          <w:rFonts w:ascii="Times New Roman" w:hAnsi="Times New Roman"/>
-          <w:sz w:val="20"/>
-        </w:rPr>
         <w:t>Список источников оформлен по ГОСТ Р 7.0.100–2018. Электронные материалы приведены с адресом и датой обращения.</w:t>
       </w:r>
     </w:p>
     <w:p>
       <w:r>
-        <w:rPr>
-          <w:rFonts w:ascii="Times New Roman" w:hAnsi="Times New Roman"/>
-          <w:sz w:val="20"/>
-        </w:rPr>
         <w:t>1. ГОСТ 7.32–2017. Межгосударственный стандарт. Система стандартов по информации, библиотечному и издательскому делу. Отчёт о научно-исследовательской работе. Структура и правила оформления. — Москва: Стандартинформ, 2018.</w:t>
       </w:r>
     </w:p>
     <w:p>
       <w:r>
-        <w:rPr>
-          <w:rFonts w:ascii="Times New Roman" w:hAnsi="Times New Roman"/>
-          <w:sz w:val="20"/>
-        </w:rPr>
         <w:t>2. ГОСТ Р 7.0.100–2018. Национальный стандарт Российской Федерации. Библиографическая запись. Библиографическое описание. Общие требования и правила составления. — Москва: Стандартинформ, 2018.</w:t>
       </w:r>
     </w:p>
     <w:p>
       <w:r>
-        <w:rPr>
-          <w:rFonts w:ascii="Times New Roman" w:hAnsi="Times New Roman"/>
-          <w:sz w:val="20"/>
-        </w:rPr>
         <w:t>3. The Go Programming Language. Documentation [Электронный ресурс]. — URL: https://go.dev/doc/ (дата обращения: 19.10.2026).</w:t>
       </w:r>
     </w:p>
     <w:p>
       <w:r>
-        <w:rPr>
-          <w:rFonts w:ascii="Times New Roman" w:hAnsi="Times New Roman"/>
-          <w:sz w:val="20"/>
-        </w:rPr>
         <w:t>4. The Go Programming Language. Go Modules Reference [Электронный ресурс]. — URL: https://go.dev/ref/mod (дата обращения: 19.10.2026).</w:t>
       </w:r>
     </w:p>
     <w:p>
       <w:r>
-        <w:rPr>
-          <w:rFonts w:ascii="Times New Roman" w:hAnsi="Times New Roman"/>
-          <w:sz w:val="20"/>
-        </w:rPr>
         <w:t>5. GCC Online Documentation. Using the GNU Compiler Collection [Электронный ресурс]. — URL: https://gcc.gnu.org/onlinedocs/ (дата обращения: 19.10.2026).</w:t>
       </w:r>
     </w:p>
     <w:p>
       <w:r>
-        <w:rPr>
-          <w:rFonts w:ascii="Times New Roman" w:hAnsi="Times New Roman"/>
-          <w:sz w:val="20"/>
-        </w:rPr>
         <w:t>6. GitHub Docs. About pull requests [Электронный ресурс]. — URL: https://docs.github.com/en/pull-requests/collaborating-with-pull-requests/about-pull-requests (дата обращения: 19.10.2026).</w:t>
       </w:r>
     </w:p>
     <w:p>
       <w:r>
-        <w:rPr>
-          <w:rFonts w:ascii="Times New Roman" w:hAnsi="Times New Roman"/>
-          <w:sz w:val="20"/>
-        </w:rPr>
         <w:t>7. HitPipe. Репозиторий проекта hitpipe/hitpipe [Электронный ресурс]. — URL: https://github.com/hitpipe/hitpipe (дата обращения: 19.10.2026).</w:t>
       </w:r>
     </w:p>
     <w:p>
       <w:r>
-        <w:rPr>
-          <w:rFonts w:ascii="Times New Roman" w:hAnsi="Times New Roman"/>
-          <w:sz w:val="20"/>
-        </w:rPr>
         <w:t>8. HitPipe. Файл README.md репозитория hitpipe/hitpipe [Электронный ресурс]. — URL: https://github.com/hitpipe/hitpipe/blob/main/README.md (дата обращения: 19.10.2026).</w:t>
       </w:r>
     </w:p>
@@ -3333,46 +2713,26 @@
         <w:pStyle w:val="2"/>
       </w:pPr>
       <w:r>
-        <w:rPr>
-          <w:rFonts w:ascii="Times New Roman" w:hAnsi="Times New Roman"/>
-          <w:sz w:val="20"/>
-        </w:rPr>
         <w:t>Откуда взять нужные скриншоты</w:t>
       </w:r>
     </w:p>
     <w:p>
       <w:r>
-        <w:rPr>
-          <w:rFonts w:ascii="Times New Roman" w:hAnsi="Times New Roman"/>
-          <w:sz w:val="20"/>
-        </w:rPr>
         <w:t>Скриншоты в этот файл не вставлены. Перед сдачей вставьте каждый снимок вместо соответствующего серого блока с тем же номером. На снимке должны быть видны название действия, команда или страница, итог проверки и дата. Не показывайте пароли, токены, личную переписку и содержимое папок вне проекта.</w:t>
       </w:r>
     </w:p>
     <w:p>
       <w:r>
-        <w:rPr>
-          <w:rFonts w:ascii="Times New Roman" w:hAnsi="Times New Roman"/>
-          <w:sz w:val="20"/>
-        </w:rPr>
         <w:t>Рисунок 1. Шаг 1: откройте ссылку https://github.com/hitpipe/hitpipe/tree/work/HIT-47-ds-corrections/services/delivery. Шаг 2: если GitHub показывает запрос входа, войдите в свой аккаунт. Шаг 3: в списке откройте папки cmd, internal и testdata. Шаг 4: убедитесь, что в адресной строке видна ветка work/HIT-47-ds-corrections, а в списке есть delivery-contractcheck. Шаг 5: снимите список файлов, а не код целиком. Сохраните как 0104-pz01-fig01.png. Подпись в отчёте: «Собственная часть исполняемого каркаса».</w:t>
       </w:r>
     </w:p>
     <w:p>
       <w:r>
-        <w:rPr>
-          <w:rFonts w:ascii="Times New Roman" w:hAnsi="Times New Roman"/>
-          <w:sz w:val="20"/>
-        </w:rPr>
-        <w:t>Рисунок 2. Шаг 1: откройте PowerShell. Шаг 2: выполните cd 'ПОЛНЫЙ_ПУТЬ_К_КЛОНУ\hitpipe\services\delivery'. Шаг 3: вставьте по очереди команды: go build -o .pr12-build/delivery/dev/delivery-contractcheck ./cmd/delivery-contractcheck и go build -o .pr12-build/delivery/release/delivery-contractcheck ./cmd/delivery-contractcheck. Шаг 4: дождитесь нового приглашения PowerShell без текста ошибки. Шаг 5: снимите команду и приглашение после успешного завершения. Сохраните как 0104-pz01-fig02.png. Подпись: «Подготовка компонента в двух режимах».</w:t>
+        <w:t>Рисунок 2. Шаг 1: откройте PowerShell. Шаг 2: выполните Set-Location C:\projects\hitpipe\services\delivery. Шаг 3: вставьте по очереди команды: go build -o .pr12-build/delivery/dev/delivery-contractcheck ./cmd/delivery-contractcheck и go build -o .pr12-build/delivery/release/delivery-contractcheck ./cmd/delivery-contractcheck. Шаг 4: дождитесь нового приглашения PowerShell без текста ошибки. Шаг 5: снимите команду и приглашение после успешного завершения. Сохраните как 0104-pz01-fig02.png. Подпись: «Подготовка компонента в двух режимах».</w:t>
       </w:r>
     </w:p>
     <w:p>
       <w:r>
-        <w:rPr>
-          <w:rFonts w:ascii="Times New Roman" w:hAnsi="Times New Roman"/>
-          <w:sz w:val="20"/>
-        </w:rPr>
         <w:t>Рисунок 3. Шаг 1: откройте в Проводнике папку hitpipe, нажмите правой кнопкой мыши по пустому месту и выберите «Открыть в терминале». В открывшемся PowerShell текущей папкой уже должен быть корень проекта. Шаг 2: вставьте весь блок ниже одной вставкой:</w:t>
         <w:br/>
         <w:t>$repo = (Get-Location).Path</w:t>
@@ -3406,19 +2766,11 @@
     </w:p>
     <w:p>
       <w:r>
-        <w:rPr>
-          <w:rFonts w:ascii="Times New Roman" w:hAnsi="Times New Roman"/>
-          <w:sz w:val="20"/>
-        </w:rPr>
-        <w:t>Рисунок 4. Шаг 1: откройте PowerShell. Шаг 2: выполните cd 'ПОЛНЫЙ_ПУТЬ_К_КЛОНУ\hitpipe\services\delivery'. Шаг 3: выполните go test ./... . Шаг 4: дождитесь строк вида ok ./... или ok с именем пакета. Шаг 5: снимите последнюю строку успешного результата. Сохраните как 0104-pz01-fig04.png. Подпись: «Штатный запуск компонента».</w:t>
+        <w:t>Рисунок 4. Шаг 1: откройте PowerShell. Шаг 2: выполните Set-Location C:\projects\hitpipe\services\delivery. Шаг 3: выполните go test ./... . Шаг 4: дождитесь строк вида ok ./... или ok с именем пакета. Шаг 5: снимите последнюю строку успешного результата. Сохраните как 0104-pz01-fig04.png. Подпись: «Штатный запуск компонента».</w:t>
       </w:r>
     </w:p>
     <w:p>
       <w:r>
-        <w:rPr>
-          <w:rFonts w:ascii="Times New Roman" w:hAnsi="Times New Roman"/>
-          <w:sz w:val="20"/>
-        </w:rPr>
         <w:t>Рисунок 5. Шаг 1: откройте PowerShell из папки hitpipe через Проводник: правая кнопка мыши по папке → «Открыть в терминале», затем выполните cd services/delivery. Шаг 2: создайте папку для результата командой New-Item -ItemType Directory -Force ..\..\.pr12-build\delivery\release | Out-Null. Шаг 3: соберите программу командой go build -trimpath -o ..\..\.pr12-build\delivery\release\delivery-contractcheck.exe .\cmd\delivery-contractcheck. Шаг 4: проверьте наличие файла командой Test-Path ..\..\.pr12-build\delivery\release\delivery-contractcheck.exe; ожидаемый ответ True. Шаг 5: выполните ..\..\.pr12-build\delivery\release\delivery-contractcheck.exe --config unsupported --fixture .\testdata\match.json --format json, затем $LASTEXITCODE. Ожидается сообщение unsupported config: unsupported и код 2. Сохраните как 0104-pz01-fig05.png. Подпись: «Неверная конфигурация». Не показывайте локальные секреты.</w:t>
       </w:r>
     </w:p>
@@ -3429,11 +2781,7 @@
     </w:p>
     <w:p>
       <w:r>
-        <w:rPr>
-          <w:rFonts w:ascii="Times New Roman" w:hAnsi="Times New Roman"/>
-          <w:sz w:val="20"/>
-        </w:rPr>
-        <w:t>Рисунок 7. Шаг 1: откройте папку docs/labs/pr12/ds/evidence в клоне проекта. Шаг 2: найдите файл с названием negative-gate или workspace-smoke. Шаг 3: откройте его в Блокноте и найдите строку с неверной конфигурацией и PASS для отрицательной проверки. Шаг 4: снимите название файла, команду, сообщение об отказе и итог. Сохраните как 0104-pz01-fig07.png. Подпись: «Отрицательная локальная проверка автоматического контроля».</w:t>
+        <w:t>Рисунок 7. Шаг 1: откройте PowerShell в C:\projects\hitpipe\services\delivery. Шаг 2: выполните команду &amp; "$env:TEMP\delivery-contractcheck.exe" --config unsupported --fixture .\testdata\match.json --format json; $code=$LASTEXITCODE; Write-Host "EXIT_CODE=$code". Шаг 3: на экране должны быть сообщение «unsupported config: unsupported» и ненулевой EXIT_CODE (например, 2). Не используйте скриншот ошибки неправильного пути. Для обычного успешного CI откройте https://github.com/hitpipe/hitpipe/actions/runs/39279704440. Сохраните как 0104-pz01-fig07.png. Подпись: «Отрицательная локальная проверка автоматического gate».</w:t>
       </w:r>
     </w:p>
     <w:sectPr>

</xml_diff>

<commit_message>
HIT-47: simplify report tables
</commit_message>
<xml_diff>
--- a/docs/labs/pr12/ds/reports/0104-pz01-ds.docx
+++ b/docs/labs/pr12/ds/reports/0104-pz01-ds.docx
@@ -1132,11 +1132,8 @@
             <w:tcW w:type="dxa" w:w="2339"/>
           </w:tcPr>
           <w:p>
-            <w:pPr>
-              <w:spacing w:before="0" w:after="20" w:line="240" w:lineRule="auto"/>
-            </w:pPr>
-            <w:r>
-              <w:t>Позиция</w:t>
+            <w:r>
+              <w:t>Элемент</w:t>
             </w:r>
           </w:p>
         </w:tc>
@@ -1145,11 +1142,8 @@
             <w:tcW w:type="dxa" w:w="2339"/>
           </w:tcPr>
           <w:p>
-            <w:pPr>
-              <w:spacing w:before="0" w:after="20" w:line="240" w:lineRule="auto"/>
-            </w:pPr>
-            <w:r>
-              <w:t>Средство и закреплённая версия</w:t>
+            <w:r>
+              <w:t>Версия</w:t>
             </w:r>
           </w:p>
         </w:tc>
@@ -1158,11 +1152,8 @@
             <w:tcW w:type="dxa" w:w="2339"/>
           </w:tcPr>
           <w:p>
-            <w:pPr>
-              <w:spacing w:before="0" w:after="20" w:line="240" w:lineRule="auto"/>
-            </w:pPr>
-            <w:r>
-              <w:t>Назначение и способ подключения</w:t>
+            <w:r>
+              <w:t>Действие</w:t>
             </w:r>
           </w:p>
         </w:tc>
@@ -1171,11 +1162,8 @@
             <w:tcW w:type="dxa" w:w="2339"/>
           </w:tcPr>
           <w:p>
-            <w:pPr>
-              <w:spacing w:before="0" w:after="20" w:line="240" w:lineRule="auto"/>
-            </w:pPr>
-            <w:r>
-              <w:t>Работает / запланировано, этап</w:t>
+            <w:r>
+              <w:t>Результат</w:t>
             </w:r>
           </w:p>
         </w:tc>
@@ -1186,11 +1174,8 @@
             <w:tcW w:type="dxa" w:w="2339"/>
           </w:tcPr>
           <w:p>
-            <w:pPr>
-              <w:spacing w:before="0" w:after="20" w:line="240" w:lineRule="auto"/>
-            </w:pPr>
-            <w:r>
-              <w:t>Сборка/подготовка к исполнению</w:t>
+            <w:r>
+              <w:t>Сборка</w:t>
             </w:r>
           </w:p>
         </w:tc>
@@ -1199,9 +1184,6 @@
             <w:tcW w:type="dxa" w:w="2339"/>
           </w:tcPr>
           <w:p>
-            <w:pPr>
-              <w:spacing w:before="0" w:after="20" w:line="240" w:lineRule="auto"/>
-            </w:pPr>
             <w:r>
               <w:t>Go 1.27.2; GCC 16.2.0</w:t>
             </w:r>
@@ -1212,11 +1194,8 @@
             <w:tcW w:type="dxa" w:w="2339"/>
           </w:tcPr>
           <w:p>
-            <w:pPr>
-              <w:spacing w:before="0" w:after="20" w:line="240" w:lineRule="auto"/>
-            </w:pPr>
-            <w:r>
-              <w:t>go build; services/delivery/cmd/delivery-contractcheck; dev/release output</w:t>
+            <w:r>
+              <w:t>go build; dev/release</w:t>
             </w:r>
           </w:p>
         </w:tc>
@@ -1225,11 +1204,8 @@
             <w:tcW w:type="dxa" w:w="2339"/>
           </w:tcPr>
           <w:p>
-            <w:pPr>
-              <w:spacing w:before="0" w:after="20" w:line="240" w:lineRule="auto"/>
-            </w:pPr>
-            <w:r>
-              <w:t>PASS locally; source commit and log recorded</w:t>
+            <w:r>
+              <w:t>PASS; журнал сохранён</w:t>
             </w:r>
           </w:p>
         </w:tc>
@@ -1240,11 +1216,8 @@
             <w:tcW w:type="dxa" w:w="2339"/>
           </w:tcPr>
           <w:p>
-            <w:pPr>
-              <w:spacing w:before="0" w:after="20" w:line="240" w:lineRule="auto"/>
-            </w:pPr>
-            <w:r>
-              <w:t>Управление зависимостями</w:t>
+            <w:r>
+              <w:t>Зависимости</w:t>
             </w:r>
           </w:p>
         </w:tc>
@@ -1253,11 +1226,8 @@
             <w:tcW w:type="dxa" w:w="2339"/>
           </w:tcPr>
           <w:p>
-            <w:pPr>
-              <w:spacing w:before="0" w:after="20" w:line="240" w:lineRule="auto"/>
-            </w:pPr>
-            <w:r>
-              <w:t>Go modules; golang.org/x/text v0.28.0</w:t>
+            <w:r>
+              <w:t>Go modules; x/text 0.28.0</w:t>
             </w:r>
           </w:p>
         </w:tc>
@@ -1266,11 +1236,8 @@
             <w:tcW w:type="dxa" w:w="2339"/>
           </w:tcPr>
           <w:p>
-            <w:pPr>
-              <w:spacing w:before="0" w:after="20" w:line="240" w:lineRule="auto"/>
-            </w:pPr>
-            <w:r>
-              <w:t>services/delivery/go.mod + go.sum; go mod download/tidy</w:t>
+            <w:r>
+              <w:t>go mod tidy/download</w:t>
             </w:r>
           </w:p>
         </w:tc>
@@ -1279,11 +1246,8 @@
             <w:tcW w:type="dxa" w:w="2339"/>
           </w:tcPr>
           <w:p>
-            <w:pPr>
-              <w:spacing w:before="0" w:after="20" w:line="240" w:lineRule="auto"/>
-            </w:pPr>
-            <w:r>
-              <w:t>PASS; lockfiles committed</w:t>
+            <w:r>
+              <w:t>PASS; lock-файлы</w:t>
             </w:r>
           </w:p>
         </w:tc>
@@ -1294,11 +1258,8 @@
             <w:tcW w:type="dxa" w:w="2339"/>
           </w:tcPr>
           <w:p>
-            <w:pPr>
-              <w:spacing w:before="0" w:after="20" w:line="240" w:lineRule="auto"/>
-            </w:pPr>
-            <w:r>
-              <w:t>Тестирование</w:t>
+            <w:r>
+              <w:t>Тесты</w:t>
             </w:r>
           </w:p>
         </w:tc>
@@ -1307,11 +1268,8 @@
             <w:tcW w:type="dxa" w:w="2339"/>
           </w:tcPr>
           <w:p>
-            <w:pPr>
-              <w:spacing w:before="0" w:after="20" w:line="240" w:lineRule="auto"/>
-            </w:pPr>
-            <w:r>
-              <w:t>Go test; race detector with GCC 16.2.0</w:t>
+            <w:r>
+              <w:t>Go test; race</w:t>
             </w:r>
           </w:p>
         </w:tc>
@@ -1320,11 +1278,8 @@
             <w:tcW w:type="dxa" w:w="2339"/>
           </w:tcPr>
           <w:p>
-            <w:pPr>
-              <w:spacing w:before="0" w:after="20" w:line="240" w:lineRule="auto"/>
-            </w:pPr>
-            <w:r>
-              <w:t>go test ./... and CGO_ENABLED=1 go test -race ./...</w:t>
+            <w:r>
+              <w:t>go test ./...; test -race</w:t>
             </w:r>
           </w:p>
         </w:tc>
@@ -1333,11 +1288,8 @@
             <w:tcW w:type="dxa" w:w="2339"/>
           </w:tcPr>
           <w:p>
-            <w:pPr>
-              <w:spacing w:before="0" w:after="20" w:line="240" w:lineRule="auto"/>
-            </w:pPr>
-            <w:r>
-              <w:t>PASS locally; logs in docs/labs/pr12/ds/evidence/</w:t>
+            <w:r>
+              <w:t>PASS; журнал</w:t>
             </w:r>
           </w:p>
         </w:tc>
@@ -1348,11 +1300,8 @@
             <w:tcW w:type="dxa" w:w="2339"/>
           </w:tcPr>
           <w:p>
-            <w:pPr>
-              <w:spacing w:before="0" w:after="20" w:line="240" w:lineRule="auto"/>
-            </w:pPr>
-            <w:r>
-              <w:t>Статический анализ</w:t>
+            <w:r>
+              <w:t>Анализ</w:t>
             </w:r>
           </w:p>
         </w:tc>
@@ -1361,11 +1310,8 @@
             <w:tcW w:type="dxa" w:w="2339"/>
           </w:tcPr>
           <w:p>
-            <w:pPr>
-              <w:spacing w:before="0" w:after="20" w:line="240" w:lineRule="auto"/>
-            </w:pPr>
-            <w:r>
-              <w:t>go vet Go 1.27.2</w:t>
+            <w:r>
+              <w:t>go vet</w:t>
             </w:r>
           </w:p>
         </w:tc>
@@ -1374,11 +1320,8 @@
             <w:tcW w:type="dxa" w:w="2339"/>
           </w:tcPr>
           <w:p>
-            <w:pPr>
-              <w:spacing w:before="0" w:after="20" w:line="240" w:lineRule="auto"/>
-            </w:pPr>
-            <w:r>
-              <w:t>go vet ./... from services/delivery</w:t>
+            <w:r>
+              <w:t>go vet ./...</w:t>
             </w:r>
           </w:p>
         </w:tc>
@@ -1387,11 +1330,8 @@
             <w:tcW w:type="dxa" w:w="2339"/>
           </w:tcPr>
           <w:p>
-            <w:pPr>
-              <w:spacing w:before="0" w:after="20" w:line="240" w:lineRule="auto"/>
-            </w:pPr>
-            <w:r>
-              <w:t>PASS locally; log recorded</w:t>
+            <w:r>
+              <w:t>PASS; журнал</w:t>
             </w:r>
           </w:p>
         </w:tc>
@@ -1402,11 +1342,8 @@
             <w:tcW w:type="dxa" w:w="2339"/>
           </w:tcPr>
           <w:p>
-            <w:pPr>
-              <w:spacing w:before="0" w:after="20" w:line="240" w:lineRule="auto"/>
-            </w:pPr>
-            <w:r>
-              <w:t>Динамическая диагностика</w:t>
+            <w:r>
+              <w:t>Smoke</w:t>
             </w:r>
           </w:p>
         </w:tc>
@@ -1415,11 +1352,8 @@
             <w:tcW w:type="dxa" w:w="2339"/>
           </w:tcPr>
           <w:p>
-            <w:pPr>
-              <w:spacing w:before="0" w:after="20" w:line="240" w:lineRule="auto"/>
-            </w:pPr>
-            <w:r>
-              <w:t>delivery-contractcheck synthetic fixture CLI</w:t>
+            <w:r>
+              <w:t>CLI fixture</w:t>
             </w:r>
           </w:p>
         </w:tc>
@@ -1428,11 +1362,8 @@
             <w:tcW w:type="dxa" w:w="2339"/>
           </w:tcPr>
           <w:p>
-            <w:pPr>
-              <w:spacing w:before="0" w:after="20" w:line="240" w:lineRule="auto"/>
-            </w:pPr>
-            <w:r>
-              <w:t>workspace.py smoke delivery --require outside checkout</w:t>
+            <w:r>
+              <w:t>workspace smoke --require</w:t>
             </w:r>
           </w:p>
         </w:tc>
@@ -1441,11 +1372,8 @@
             <w:tcW w:type="dxa" w:w="2339"/>
           </w:tcPr>
           <w:p>
-            <w:pPr>
-              <w:spacing w:before="0" w:after="20" w:line="240" w:lineRule="auto"/>
-            </w:pPr>
-            <w:r>
-              <w:t>PASS; positive and negative exit recorded</w:t>
+            <w:r>
+              <w:t>PASS; positive/negative</w:t>
             </w:r>
           </w:p>
         </w:tc>
@@ -1456,9 +1384,6 @@
             <w:tcW w:type="dxa" w:w="2339"/>
           </w:tcPr>
           <w:p>
-            <w:pPr>
-              <w:spacing w:before="0" w:after="20" w:line="240" w:lineRule="auto"/>
-            </w:pPr>
             <w:r>
               <w:t>Профилирование</w:t>
             </w:r>
@@ -1469,11 +1394,8 @@
             <w:tcW w:type="dxa" w:w="2339"/>
           </w:tcPr>
           <w:p>
-            <w:pPr>
-              <w:spacing w:before="0" w:after="20" w:line="240" w:lineRule="auto"/>
-            </w:pPr>
-            <w:r>
-              <w:t>Go pprof — not executed in this correction</w:t>
+            <w:r>
+              <w:t>Go pprof</w:t>
             </w:r>
           </w:p>
         </w:tc>
@@ -1482,11 +1404,8 @@
             <w:tcW w:type="dxa" w:w="2339"/>
           </w:tcPr>
           <w:p>
-            <w:pPr>
-              <w:spacing w:before="0" w:after="20" w:line="240" w:lineRule="auto"/>
-            </w:pPr>
-            <w:r>
-              <w:t>planned after acceptance for CPU/memory of comparator and FileReader</w:t>
+            <w:r>
+              <w:t>не выполнялось</w:t>
             </w:r>
           </w:p>
         </w:tc>
@@ -1495,11 +1414,8 @@
             <w:tcW w:type="dxa" w:w="2339"/>
           </w:tcPr>
           <w:p>
-            <w:pPr>
-              <w:spacing w:before="0" w:after="20" w:line="240" w:lineRule="auto"/>
-            </w:pPr>
-            <w:r>
-              <w:t>PLANNED; no performance claim</w:t>
+            <w:r>
+              <w:t>PLANNED; без claims</w:t>
             </w:r>
           </w:p>
         </w:tc>
@@ -1510,11 +1426,8 @@
             <w:tcW w:type="dxa" w:w="2339"/>
           </w:tcPr>
           <w:p>
-            <w:pPr>
-              <w:spacing w:before="0" w:after="20" w:line="240" w:lineRule="auto"/>
-            </w:pPr>
-            <w:r>
-              <w:t>Автоматические проверки CI</w:t>
+            <w:r>
+              <w:t>CI</w:t>
             </w:r>
           </w:p>
         </w:tc>
@@ -1523,9 +1436,6 @@
             <w:tcW w:type="dxa" w:w="2339"/>
           </w:tcPr>
           <w:p>
-            <w:pPr>
-              <w:spacing w:before="0" w:after="20" w:line="240" w:lineRule="auto"/>
-            </w:pPr>
             <w:r>
               <w:t>GitHub Actions</w:t>
             </w:r>
@@ -1536,11 +1446,8 @@
             <w:tcW w:type="dxa" w:w="2339"/>
           </w:tcPr>
           <w:p>
-            <w:pPr>
-              <w:spacing w:before="0" w:after="20" w:line="240" w:lineRule="auto"/>
-            </w:pPr>
-            <w:r>
-              <w:t>https://github.com/hitpipe/hitpipe/actions/runs/39271075578 (evidence/report commit c365ad5; latest correction head gets a fresh run after push)</w:t>
+            <w:r>
+              <w:t>workflow run</w:t>
             </w:r>
           </w:p>
         </w:tc>
@@ -1549,11 +1456,8 @@
             <w:tcW w:type="dxa" w:w="2339"/>
           </w:tcPr>
           <w:p>
-            <w:pPr>
-              <w:spacing w:before="0" w:after="20" w:line="240" w:lineRule="auto"/>
-            </w:pPr>
-            <w:r>
-              <w:t>PASS for evidence commit; fresh run for final source head is recorded after push</w:t>
+            <w:r>
+              <w:t>PASS; ссылка в тексте</w:t>
             </w:r>
           </w:p>
         </w:tc>
@@ -2071,9 +1975,6 @@
             <w:tcW w:type="dxa" w:w="2339"/>
           </w:tcPr>
           <w:p>
-            <w:pPr>
-              <w:spacing w:before="0" w:after="20" w:line="240" w:lineRule="auto"/>
-            </w:pPr>
             <w:r>
               <w:t>Проверка</w:t>
             </w:r>
@@ -2084,11 +1985,8 @@
             <w:tcW w:type="dxa" w:w="2339"/>
           </w:tcPr>
           <w:p>
-            <w:pPr>
-              <w:spacing w:before="0" w:after="20" w:line="240" w:lineRule="auto"/>
-            </w:pPr>
-            <w:r>
-              <w:t>Ожидаемый результат</w:t>
+            <w:r>
+              <w:t>Ожидание</w:t>
             </w:r>
           </w:p>
         </w:tc>
@@ -2097,11 +1995,8 @@
             <w:tcW w:type="dxa" w:w="2339"/>
           </w:tcPr>
           <w:p>
-            <w:pPr>
-              <w:spacing w:before="0" w:after="20" w:line="240" w:lineRule="auto"/>
-            </w:pPr>
-            <w:r>
-              <w:t>Фактический результат/статус</w:t>
+            <w:r>
+              <w:t>Факт</w:t>
             </w:r>
           </w:p>
         </w:tc>
@@ -2110,11 +2005,8 @@
             <w:tcW w:type="dxa" w:w="2339"/>
           </w:tcPr>
           <w:p>
-            <w:pPr>
-              <w:spacing w:before="0" w:after="20" w:line="240" w:lineRule="auto"/>
-            </w:pPr>
-            <w:r>
-              <w:t>Команда, версия и журнал</w:t>
+            <w:r>
+              <w:t>Журнал</w:t>
             </w:r>
           </w:p>
         </w:tc>
@@ -2125,11 +2017,8 @@
             <w:tcW w:type="dxa" w:w="2339"/>
           </w:tcPr>
           <w:p>
-            <w:pPr>
-              <w:spacing w:before="0" w:after="20" w:line="240" w:lineRule="auto"/>
-            </w:pPr>
-            <w:r>
-              <w:t>default config</w:t>
+            <w:r>
+              <w:t>Обычная</w:t>
             </w:r>
           </w:p>
         </w:tc>
@@ -2138,11 +2027,8 @@
             <w:tcW w:type="dxa" w:w="2339"/>
           </w:tcPr>
           <w:p>
-            <w:pPr>
-              <w:spacing w:before="0" w:after="20" w:line="240" w:lineRule="auto"/>
-            </w:pPr>
-            <w:r>
-              <w:t>go test ./...; smoke --require</w:t>
+            <w:r>
+              <w:t>PASS</w:t>
             </w:r>
           </w:p>
         </w:tc>
@@ -2151,9 +2037,6 @@
             <w:tcW w:type="dxa" w:w="2339"/>
           </w:tcPr>
           <w:p>
-            <w:pPr>
-              <w:spacing w:before="0" w:after="20" w:line="240" w:lineRule="auto"/>
-            </w:pPr>
             <w:r>
               <w:t>PASS</w:t>
             </w:r>
@@ -2164,11 +2047,8 @@
             <w:tcW w:type="dxa" w:w="2339"/>
           </w:tcPr>
           <w:p>
-            <w:pPr>
-              <w:spacing w:before="0" w:after="20" w:line="240" w:lineRule="auto"/>
-            </w:pPr>
-            <w:r>
-              <w:t>HIT-47-go-test.log / workspace smoke</w:t>
+            <w:r>
+              <w:t>go-test / smoke</w:t>
             </w:r>
           </w:p>
         </w:tc>
@@ -2179,11 +2059,8 @@
             <w:tcW w:type="dxa" w:w="2339"/>
           </w:tcPr>
           <w:p>
-            <w:pPr>
-              <w:spacing w:before="0" w:after="20" w:line="240" w:lineRule="auto"/>
-            </w:pPr>
-            <w:r>
-              <w:t>unsupported config</w:t>
+            <w:r>
+              <w:t>Неверная config</w:t>
             </w:r>
           </w:p>
         </w:tc>
@@ -2192,11 +2069,8 @@
             <w:tcW w:type="dxa" w:w="2339"/>
           </w:tcPr>
           <w:p>
-            <w:pPr>
-              <w:spacing w:before="0" w:after="20" w:line="240" w:lineRule="auto"/>
-            </w:pPr>
-            <w:r>
-              <w:t>delivery-contractcheck --config unsupported ...</w:t>
+            <w:r>
+              <w:t>Ошибка</w:t>
             </w:r>
           </w:p>
         </w:tc>
@@ -2205,11 +2079,8 @@
             <w:tcW w:type="dxa" w:w="2339"/>
           </w:tcPr>
           <w:p>
-            <w:pPr>
-              <w:spacing w:before="0" w:after="20" w:line="240" w:lineRule="auto"/>
-            </w:pPr>
-            <w:r>
-              <w:t>PASS negative gate: exit 2</w:t>
+            <w:r>
+              <w:t>PASS; exit 2</w:t>
             </w:r>
           </w:p>
         </w:tc>
@@ -2218,11 +2089,8 @@
             <w:tcW w:type="dxa" w:w="2339"/>
           </w:tcPr>
           <w:p>
-            <w:pPr>
-              <w:spacing w:before="0" w:after="20" w:line="240" w:lineRule="auto"/>
-            </w:pPr>
-            <w:r>
-              <w:t>negative-gate log</w:t>
+            <w:r>
+              <w:t>negative-gate</w:t>
             </w:r>
           </w:p>
         </w:tc>
@@ -2233,11 +2101,8 @@
             <w:tcW w:type="dxa" w:w="2339"/>
           </w:tcPr>
           <w:p>
-            <w:pPr>
-              <w:spacing w:before="0" w:after="20" w:line="240" w:lineRule="auto"/>
-            </w:pPr>
-            <w:r>
-              <w:t>version/source</w:t>
+            <w:r>
+              <w:t>Версия/SHA</w:t>
             </w:r>
           </w:p>
         </w:tc>
@@ -2246,11 +2111,8 @@
             <w:tcW w:type="dxa" w:w="2339"/>
           </w:tcPr>
           <w:p>
-            <w:pPr>
-              <w:spacing w:before="0" w:after="20" w:line="240" w:lineRule="auto"/>
-            </w:pPr>
-            <w:r>
-              <w:t>delivery-contractcheck --version</w:t>
+            <w:r>
+              <w:t>Видны</w:t>
             </w:r>
           </w:p>
         </w:tc>
@@ -2259,11 +2121,8 @@
             <w:tcW w:type="dxa" w:w="2339"/>
           </w:tcPr>
           <w:p>
-            <w:pPr>
-              <w:spacing w:before="0" w:after="20" w:line="240" w:lineRule="auto"/>
-            </w:pPr>
-            <w:r>
-              <w:t>PASS; version pr12 and source SHA visible</w:t>
+            <w:r>
+              <w:t>PASS</w:t>
             </w:r>
           </w:p>
         </w:tc>
@@ -2272,11 +2131,8 @@
             <w:tcW w:type="dxa" w:w="2339"/>
           </w:tcPr>
           <w:p>
-            <w:pPr>
-              <w:spacing w:before="0" w:after="20" w:line="240" w:lineRule="auto"/>
-            </w:pPr>
-            <w:r>
-              <w:t>workspace smoke log</w:t>
+            <w:r>
+              <w:t>workspace-smoke</w:t>
             </w:r>
           </w:p>
         </w:tc>
@@ -2287,11 +2143,8 @@
             <w:tcW w:type="dxa" w:w="2339"/>
           </w:tcPr>
           <w:p>
-            <w:pPr>
-              <w:spacing w:before="0" w:after="20" w:line="240" w:lineRule="auto"/>
-            </w:pPr>
-            <w:r>
-              <w:t>diagnostics</w:t>
+            <w:r>
+              <w:t>Диагностика</w:t>
             </w:r>
           </w:p>
         </w:tc>
@@ -2300,11 +2153,8 @@
             <w:tcW w:type="dxa" w:w="2339"/>
           </w:tcPr>
           <w:p>
-            <w:pPr>
-              <w:spacing w:before="0" w:after="20" w:line="240" w:lineRule="auto"/>
-            </w:pPr>
-            <w:r>
-              <w:t>delivery-contractcheck --fixture testdata/match.json --format json</w:t>
+            <w:r>
+              <w:t>JSON</w:t>
             </w:r>
           </w:p>
         </w:tc>
@@ -2313,11 +2163,8 @@
             <w:tcW w:type="dxa" w:w="2339"/>
           </w:tcPr>
           <w:p>
-            <w:pPr>
-              <w:spacing w:before="0" w:after="20" w:line="240" w:lineRule="auto"/>
-            </w:pPr>
-            <w:r>
-              <w:t>PASS; no secrets</w:t>
+            <w:r>
+              <w:t>PASS; без секретов</w:t>
             </w:r>
           </w:p>
         </w:tc>
@@ -2326,11 +2173,8 @@
             <w:tcW w:type="dxa" w:w="2339"/>
           </w:tcPr>
           <w:p>
-            <w:pPr>
-              <w:spacing w:before="0" w:after="20" w:line="240" w:lineRule="auto"/>
-            </w:pPr>
-            <w:r>
-              <w:t>workspace smoke log</w:t>
+            <w:r>
+              <w:t>workspace-smoke</w:t>
             </w:r>
           </w:p>
         </w:tc>
@@ -2341,11 +2185,8 @@
             <w:tcW w:type="dxa" w:w="2339"/>
           </w:tcPr>
           <w:p>
-            <w:pPr>
-              <w:spacing w:before="0" w:after="20" w:line="240" w:lineRule="auto"/>
-            </w:pPr>
-            <w:r>
-              <w:t>restore</w:t>
+            <w:r>
+              <w:t>Восстановление</w:t>
             </w:r>
           </w:p>
         </w:tc>
@@ -2354,11 +2195,8 @@
             <w:tcW w:type="dxa" w:w="2339"/>
           </w:tcPr>
           <w:p>
-            <w:pPr>
-              <w:spacing w:before="0" w:after="20" w:line="240" w:lineRule="auto"/>
-            </w:pPr>
-            <w:r>
-              <w:t>rebuild after isolated negative mutation; go test ./...</w:t>
+            <w:r>
+              <w:t>PASS</w:t>
             </w:r>
           </w:p>
         </w:tc>
@@ -2367,11 +2205,8 @@
             <w:tcW w:type="dxa" w:w="2339"/>
           </w:tcPr>
           <w:p>
-            <w:pPr>
-              <w:spacing w:before="0" w:after="20" w:line="240" w:lineRule="auto"/>
-            </w:pPr>
-            <w:r>
-              <w:t>PASS; source restored</w:t>
+            <w:r>
+              <w:t>PASS</w:t>
             </w:r>
           </w:p>
         </w:tc>
@@ -2380,11 +2215,8 @@
             <w:tcW w:type="dxa" w:w="2339"/>
           </w:tcPr>
           <w:p>
-            <w:pPr>
-              <w:spacing w:before="0" w:after="20" w:line="240" w:lineRule="auto"/>
-            </w:pPr>
-            <w:r>
-              <w:t>restoration log</w:t>
+            <w:r>
+              <w:t>restoration</w:t>
             </w:r>
           </w:p>
         </w:tc>

</xml_diff>

<commit_message>
HIT-47: align table formatting across reports
</commit_message>
<xml_diff>
--- a/docs/labs/pr12/ds/reports/0104-pz01-ds.docx
+++ b/docs/labs/pr12/ds/reports/0104-pz01-ds.docx
@@ -68,12 +68,13 @@
               <w:left w:val="nil"/>
               <w:right w:val="nil"/>
             </w:tcBorders>
-            <w:vAlign w:val="bottom"/>
+            <w:vAlign w:val="center"/>
           </w:tcPr>
           <w:p>
             <w:pPr>
               <w:pStyle w:val="-1"/>
-              <w:spacing w:before="0" w:after="20" w:line="240" w:lineRule="auto"/>
+              <w:spacing w:before="0" w:after="0" w:line="240" w:lineRule="auto"/>
+              <w:jc w:val="center"/>
             </w:pPr>
           </w:p>
         </w:tc>
@@ -86,7 +87,7 @@
               <w:bottom w:val="nil"/>
               <w:right w:val="nil"/>
             </w:tcBorders>
-            <w:vAlign w:val="bottom"/>
+            <w:vAlign w:val="center"/>
           </w:tcPr>
           <w:p>
             <w:pPr>
@@ -94,7 +95,7 @@
               <w:autoSpaceDE w:val="0"/>
               <w:autoSpaceDN w:val="0"/>
               <w:adjustRightInd w:val="0"/>
-              <w:spacing w:before="0" w:after="20" w:line="240" w:lineRule="auto"/>
+              <w:spacing w:before="0" w:after="0" w:line="240" w:lineRule="auto"/>
               <w:ind w:firstLine="0"/>
               <w:jc w:val="center"/>
             </w:pPr>
@@ -108,12 +109,13 @@
               <w:left w:val="nil"/>
               <w:right w:val="nil"/>
             </w:tcBorders>
-            <w:vAlign w:val="bottom"/>
+            <w:vAlign w:val="center"/>
           </w:tcPr>
           <w:p>
             <w:pPr>
               <w:pStyle w:val="-1"/>
-              <w:spacing w:before="0" w:after="20" w:line="240" w:lineRule="auto"/>
+              <w:spacing w:before="0" w:after="0" w:line="240" w:lineRule="auto"/>
+              <w:jc w:val="center"/>
             </w:pPr>
           </w:p>
         </w:tc>
@@ -126,7 +128,7 @@
               <w:bottom w:val="nil"/>
               <w:right w:val="nil"/>
             </w:tcBorders>
-            <w:vAlign w:val="bottom"/>
+            <w:vAlign w:val="center"/>
           </w:tcPr>
           <w:p>
             <w:pPr>
@@ -134,7 +136,7 @@
               <w:autoSpaceDE w:val="0"/>
               <w:autoSpaceDN w:val="0"/>
               <w:adjustRightInd w:val="0"/>
-              <w:spacing w:before="0" w:after="20" w:line="240" w:lineRule="auto"/>
+              <w:spacing w:before="0" w:after="0" w:line="240" w:lineRule="auto"/>
               <w:ind w:firstLine="0"/>
               <w:jc w:val="center"/>
             </w:pPr>
@@ -148,12 +150,13 @@
               <w:left w:val="nil"/>
               <w:right w:val="nil"/>
             </w:tcBorders>
-            <w:vAlign w:val="bottom"/>
+            <w:vAlign w:val="center"/>
           </w:tcPr>
           <w:p>
             <w:pPr>
               <w:pStyle w:val="-1"/>
-              <w:spacing w:before="0" w:after="20" w:line="240" w:lineRule="auto"/>
+              <w:spacing w:before="0" w:after="0" w:line="240" w:lineRule="auto"/>
+              <w:jc w:val="center"/>
             </w:pPr>
           </w:p>
         </w:tc>
@@ -183,13 +186,19 @@
           <w:p>
             <w:pPr>
               <w:pStyle w:val="-1"/>
-              <w:spacing w:before="0" w:after="20" w:line="240" w:lineRule="auto"/>
+              <w:spacing w:before="0" w:after="0" w:line="240" w:lineRule="auto"/>
+              <w:jc w:val="left"/>
               <w:rPr>
                 <w:sz w:val="18"/>
                 <w:szCs w:val="18"/>
               </w:rPr>
             </w:pPr>
             <w:r>
+              <w:rPr>
+                <w:rFonts w:ascii="Times New Roman" w:hAnsi="Times New Roman"/>
+                <w:b w:val="0"/>
+                <w:sz w:val="22"/>
+              </w:rPr>
               <w:t>должность, уч. степень, звание</w:t>
             </w:r>
           </w:p>
@@ -208,7 +217,8 @@
           <w:p>
             <w:pPr>
               <w:pStyle w:val="-1"/>
-              <w:spacing w:before="0" w:after="20" w:line="240" w:lineRule="auto"/>
+              <w:spacing w:before="0" w:after="0" w:line="240" w:lineRule="auto"/>
+              <w:jc w:val="left"/>
               <w:rPr>
                 <w:sz w:val="18"/>
                 <w:szCs w:val="18"/>
@@ -230,13 +240,19 @@
           <w:p>
             <w:pPr>
               <w:pStyle w:val="-1"/>
-              <w:spacing w:before="0" w:after="20" w:line="240" w:lineRule="auto"/>
+              <w:spacing w:before="0" w:after="0" w:line="240" w:lineRule="auto"/>
+              <w:jc w:val="left"/>
               <w:rPr>
                 <w:sz w:val="18"/>
                 <w:szCs w:val="18"/>
               </w:rPr>
             </w:pPr>
             <w:r>
+              <w:rPr>
+                <w:rFonts w:ascii="Times New Roman" w:hAnsi="Times New Roman"/>
+                <w:b w:val="0"/>
+                <w:sz w:val="22"/>
+              </w:rPr>
               <w:t>подпись, дата</w:t>
             </w:r>
           </w:p>
@@ -255,7 +271,8 @@
           <w:p>
             <w:pPr>
               <w:pStyle w:val="-1"/>
-              <w:spacing w:before="0" w:after="20" w:line="240" w:lineRule="auto"/>
+              <w:spacing w:before="0" w:after="0" w:line="240" w:lineRule="auto"/>
+              <w:jc w:val="left"/>
               <w:rPr>
                 <w:sz w:val="18"/>
                 <w:szCs w:val="18"/>
@@ -277,13 +294,19 @@
           <w:p>
             <w:pPr>
               <w:pStyle w:val="-1"/>
-              <w:spacing w:before="0" w:after="20" w:line="240" w:lineRule="auto"/>
+              <w:spacing w:before="0" w:after="0" w:line="240" w:lineRule="auto"/>
+              <w:jc w:val="left"/>
               <w:rPr>
                 <w:sz w:val="18"/>
                 <w:szCs w:val="18"/>
               </w:rPr>
             </w:pPr>
             <w:r>
+              <w:rPr>
+                <w:rFonts w:ascii="Times New Roman" w:hAnsi="Times New Roman"/>
+                <w:b w:val="0"/>
+                <w:sz w:val="22"/>
+              </w:rPr>
               <w:t>инициалы, фамилия</w:t>
             </w:r>
           </w:p>
@@ -327,9 +350,15 @@
           </w:tcPr>
           <w:p>
             <w:pPr>
-              <w:spacing w:before="0" w:after="20" w:line="240" w:lineRule="auto"/>
-            </w:pPr>
-            <w:r>
+              <w:spacing w:before="0" w:after="0" w:line="240" w:lineRule="auto"/>
+              <w:jc w:val="center"/>
+            </w:pPr>
+            <w:r>
+              <w:rPr>
+                <w:rFonts w:ascii="Times New Roman" w:hAnsi="Times New Roman"/>
+                <w:b/>
+                <w:sz w:val="22"/>
+              </w:rPr>
               <w:t>Инструментальный контур и воспроизводимое исполнение минимального программного компонента</w:t>
             </w:r>
           </w:p>
@@ -345,12 +374,19 @@
               <w:bottom w:val="nil"/>
               <w:right w:val="nil"/>
             </w:tcBorders>
-          </w:tcPr>
-          <w:p>
-            <w:pPr>
-              <w:spacing w:before="0" w:after="20" w:line="240" w:lineRule="auto"/>
-            </w:pPr>
-            <w:r>
+            <w:vAlign w:val="center"/>
+          </w:tcPr>
+          <w:p>
+            <w:pPr>
+              <w:spacing w:before="0" w:after="0" w:line="240" w:lineRule="auto"/>
+              <w:jc w:val="left"/>
+            </w:pPr>
+            <w:r>
+              <w:rPr>
+                <w:rFonts w:ascii="Times New Roman" w:hAnsi="Times New Roman"/>
+                <w:b w:val="0"/>
+                <w:sz w:val="22"/>
+              </w:rPr>
               <w:t>по МДК.01.04 «Системное программирование»</w:t>
             </w:r>
           </w:p>
@@ -518,14 +554,19 @@
           <w:p>
             <w:pPr>
               <w:pStyle w:val="-1"/>
-              <w:spacing w:before="0" w:after="20" w:line="240" w:lineRule="auto"/>
-              <w:jc w:val="left"/>
+              <w:spacing w:before="0" w:after="0" w:line="240" w:lineRule="auto"/>
+              <w:jc w:val="center"/>
               <w:rPr>
                 <w:rFonts w:eastAsia="Times New Roman"/>
                 <w:lang w:eastAsia="ru-RU"/>
               </w:rPr>
             </w:pPr>
             <w:r>
+              <w:rPr>
+                <w:rFonts w:ascii="Times New Roman" w:hAnsi="Times New Roman"/>
+                <w:b/>
+                <w:sz w:val="22"/>
+              </w:rPr>
               <w:t xml:space="preserve">Студент гр. № </w:t>
             </w:r>
           </w:p>
@@ -547,7 +588,8 @@
           <w:p>
             <w:pPr>
               <w:pStyle w:val="-1"/>
-              <w:spacing w:before="0" w:after="20" w:line="240" w:lineRule="auto"/>
+              <w:spacing w:before="0" w:after="0" w:line="240" w:lineRule="auto"/>
+              <w:jc w:val="center"/>
               <w:rPr>
                 <w:rFonts w:ascii="Times New Roman" w:eastAsia="Times New Roman" w:hAnsi="Times New Roman" w:cs="Times New Roman"/>
                 <w:lang w:eastAsia="ru-RU"/>
@@ -576,7 +618,7 @@
               <w:autoSpaceDE w:val="0"/>
               <w:autoSpaceDN w:val="0"/>
               <w:adjustRightInd w:val="0"/>
-              <w:spacing w:line="240" w:lineRule="auto" w:before="0" w:after="20"/>
+              <w:spacing w:line="240" w:lineRule="auto" w:before="0" w:after="0"/>
               <w:ind w:firstLine="0"/>
               <w:jc w:val="center"/>
               <w:rPr>
@@ -603,7 +645,8 @@
           <w:p>
             <w:pPr>
               <w:pStyle w:val="-1"/>
-              <w:spacing w:before="0" w:after="20" w:line="240" w:lineRule="auto"/>
+              <w:spacing w:before="0" w:after="0" w:line="240" w:lineRule="auto"/>
+              <w:jc w:val="center"/>
               <w:rPr>
                 <w:rFonts w:ascii="Times New Roman" w:eastAsia="Times New Roman" w:hAnsi="Times New Roman" w:cs="Times New Roman"/>
                 <w:szCs w:val="24"/>
@@ -633,7 +676,7 @@
               <w:autoSpaceDE w:val="0"/>
               <w:autoSpaceDN w:val="0"/>
               <w:adjustRightInd w:val="0"/>
-              <w:spacing w:line="240" w:lineRule="auto" w:before="0" w:after="20"/>
+              <w:spacing w:line="240" w:lineRule="auto" w:before="0" w:after="0"/>
               <w:ind w:firstLine="0"/>
               <w:jc w:val="center"/>
               <w:rPr>
@@ -660,7 +703,8 @@
           <w:p>
             <w:pPr>
               <w:pStyle w:val="-1"/>
-              <w:spacing w:before="0" w:after="20" w:line="240" w:lineRule="auto"/>
+              <w:spacing w:before="0" w:after="0" w:line="240" w:lineRule="auto"/>
+              <w:jc w:val="center"/>
               <w:rPr>
                 <w:rFonts w:eastAsia="Times New Roman"/>
                 <w:lang w:eastAsia="ru-RU"/>
@@ -698,7 +742,8 @@
           <w:p>
             <w:pPr>
               <w:pStyle w:val="-1"/>
-              <w:spacing w:before="0" w:after="20" w:line="240" w:lineRule="auto"/>
+              <w:spacing w:before="0" w:after="0" w:line="240" w:lineRule="auto"/>
+              <w:jc w:val="left"/>
               <w:rPr>
                 <w:sz w:val="18"/>
                 <w:szCs w:val="18"/>
@@ -724,7 +769,8 @@
           <w:p>
             <w:pPr>
               <w:pStyle w:val="-1"/>
-              <w:spacing w:before="0" w:after="20" w:line="240" w:lineRule="auto"/>
+              <w:spacing w:before="0" w:after="0" w:line="240" w:lineRule="auto"/>
+              <w:jc w:val="left"/>
               <w:rPr>
                 <w:sz w:val="18"/>
                 <w:szCs w:val="18"/>
@@ -750,7 +796,8 @@
           <w:p>
             <w:pPr>
               <w:pStyle w:val="-1"/>
-              <w:spacing w:before="0" w:after="20" w:line="240" w:lineRule="auto"/>
+              <w:spacing w:before="0" w:after="0" w:line="240" w:lineRule="auto"/>
+              <w:jc w:val="left"/>
               <w:rPr>
                 <w:sz w:val="18"/>
                 <w:szCs w:val="18"/>
@@ -776,13 +823,19 @@
           <w:p>
             <w:pPr>
               <w:pStyle w:val="-1"/>
-              <w:spacing w:before="0" w:after="20" w:line="240" w:lineRule="auto"/>
+              <w:spacing w:before="0" w:after="0" w:line="240" w:lineRule="auto"/>
+              <w:jc w:val="left"/>
               <w:rPr>
                 <w:sz w:val="18"/>
                 <w:szCs w:val="18"/>
               </w:rPr>
             </w:pPr>
             <w:r>
+              <w:rPr>
+                <w:rFonts w:ascii="Times New Roman" w:hAnsi="Times New Roman"/>
+                <w:b w:val="0"/>
+                <w:sz w:val="22"/>
+              </w:rPr>
               <w:t>подпись, дата</w:t>
             </w:r>
           </w:p>
@@ -805,7 +858,8 @@
           <w:p>
             <w:pPr>
               <w:pStyle w:val="-1"/>
-              <w:spacing w:before="0" w:after="20" w:line="240" w:lineRule="auto"/>
+              <w:spacing w:before="0" w:after="0" w:line="240" w:lineRule="auto"/>
+              <w:jc w:val="left"/>
               <w:rPr>
                 <w:sz w:val="18"/>
                 <w:szCs w:val="18"/>
@@ -831,13 +885,19 @@
           <w:p>
             <w:pPr>
               <w:pStyle w:val="-1"/>
-              <w:spacing w:before="0" w:after="20" w:line="240" w:lineRule="auto"/>
+              <w:spacing w:before="0" w:after="0" w:line="240" w:lineRule="auto"/>
+              <w:jc w:val="left"/>
               <w:rPr>
                 <w:sz w:val="18"/>
                 <w:szCs w:val="18"/>
               </w:rPr>
             </w:pPr>
             <w:r>
+              <w:rPr>
+                <w:rFonts w:ascii="Times New Roman" w:hAnsi="Times New Roman"/>
+                <w:b w:val="0"/>
+                <w:sz w:val="22"/>
+              </w:rPr>
               <w:t>инициалы, фамилия</w:t>
             </w:r>
           </w:p>
@@ -897,12 +957,19 @@
         <w:tc>
           <w:tcPr>
             <w:tcW w:type="dxa" w:w="4677"/>
-          </w:tcPr>
-          <w:p>
-            <w:pPr>
-              <w:spacing w:before="0" w:after="20" w:line="240" w:lineRule="auto"/>
-            </w:pPr>
-            <w:r>
+            <w:vAlign w:val="center"/>
+          </w:tcPr>
+          <w:p>
+            <w:pPr>
+              <w:spacing w:before="0" w:after="0" w:line="240" w:lineRule="auto"/>
+              <w:jc w:val="center"/>
+            </w:pPr>
+            <w:r>
+              <w:rPr>
+                <w:rFonts w:ascii="Times New Roman" w:hAnsi="Times New Roman"/>
+                <w:b/>
+                <w:sz w:val="22"/>
+              </w:rPr>
               <w:t>Поле</w:t>
             </w:r>
           </w:p>
@@ -910,12 +977,19 @@
         <w:tc>
           <w:tcPr>
             <w:tcW w:type="dxa" w:w="4677"/>
-          </w:tcPr>
-          <w:p>
-            <w:pPr>
-              <w:spacing w:before="0" w:after="20" w:line="240" w:lineRule="auto"/>
-            </w:pPr>
-            <w:r>
+            <w:vAlign w:val="center"/>
+          </w:tcPr>
+          <w:p>
+            <w:pPr>
+              <w:spacing w:before="0" w:after="0" w:line="240" w:lineRule="auto"/>
+              <w:jc w:val="center"/>
+            </w:pPr>
+            <w:r>
+              <w:rPr>
+                <w:rFonts w:ascii="Times New Roman" w:hAnsi="Times New Roman"/>
+                <w:b/>
+                <w:sz w:val="22"/>
+              </w:rPr>
               <w:t>Значение</w:t>
             </w:r>
           </w:p>
@@ -925,12 +999,19 @@
         <w:tc>
           <w:tcPr>
             <w:tcW w:type="dxa" w:w="4677"/>
-          </w:tcPr>
-          <w:p>
-            <w:pPr>
-              <w:spacing w:before="0" w:after="20" w:line="240" w:lineRule="auto"/>
-            </w:pPr>
-            <w:r>
+            <w:vAlign w:val="center"/>
+          </w:tcPr>
+          <w:p>
+            <w:pPr>
+              <w:spacing w:before="0" w:after="0" w:line="240" w:lineRule="auto"/>
+              <w:jc w:val="left"/>
+            </w:pPr>
+            <w:r>
+              <w:rPr>
+                <w:rFonts w:ascii="Times New Roman" w:hAnsi="Times New Roman"/>
+                <w:b w:val="0"/>
+                <w:sz w:val="22"/>
+              </w:rPr>
               <w:t>ФИО, группа</w:t>
             </w:r>
           </w:p>
@@ -938,12 +1019,19 @@
         <w:tc>
           <w:tcPr>
             <w:tcW w:type="dxa" w:w="4677"/>
-          </w:tcPr>
-          <w:p>
-            <w:pPr>
-              <w:spacing w:before="0" w:after="20" w:line="240" w:lineRule="auto"/>
-            </w:pPr>
-            <w:r>
+            <w:vAlign w:val="center"/>
+          </w:tcPr>
+          <w:p>
+            <w:pPr>
+              <w:spacing w:before="0" w:after="0" w:line="240" w:lineRule="auto"/>
+              <w:jc w:val="left"/>
+            </w:pPr>
+            <w:r>
+              <w:rPr>
+                <w:rFonts w:ascii="Times New Roman" w:hAnsi="Times New Roman"/>
+                <w:b w:val="0"/>
+                <w:sz w:val="22"/>
+              </w:rPr>
               <w:t>Дмитрий Стацюк, не указана</w:t>
             </w:r>
           </w:p>
@@ -953,12 +1041,19 @@
         <w:tc>
           <w:tcPr>
             <w:tcW w:type="dxa" w:w="4677"/>
-          </w:tcPr>
-          <w:p>
-            <w:pPr>
-              <w:spacing w:before="0" w:after="20" w:line="240" w:lineRule="auto"/>
-            </w:pPr>
-            <w:r>
+            <w:vAlign w:val="center"/>
+          </w:tcPr>
+          <w:p>
+            <w:pPr>
+              <w:spacing w:before="0" w:after="0" w:line="240" w:lineRule="auto"/>
+              <w:jc w:val="left"/>
+            </w:pPr>
+            <w:r>
+              <w:rPr>
+                <w:rFonts w:ascii="Times New Roman" w:hAnsi="Times New Roman"/>
+                <w:b w:val="0"/>
+                <w:sz w:val="22"/>
+              </w:rPr>
               <w:t>Проект и команда</w:t>
             </w:r>
           </w:p>
@@ -966,12 +1061,19 @@
         <w:tc>
           <w:tcPr>
             <w:tcW w:type="dxa" w:w="4677"/>
-          </w:tcPr>
-          <w:p>
-            <w:pPr>
-              <w:spacing w:before="0" w:after="20" w:line="240" w:lineRule="auto"/>
-            </w:pPr>
-            <w:r>
+            <w:vAlign w:val="center"/>
+          </w:tcPr>
+          <w:p>
+            <w:pPr>
+              <w:spacing w:before="0" w:after="0" w:line="240" w:lineRule="auto"/>
+              <w:jc w:val="left"/>
+            </w:pPr>
+            <w:r>
+              <w:rPr>
+                <w:rFonts w:ascii="Times New Roman" w:hAnsi="Times New Roman"/>
+                <w:b w:val="0"/>
+                <w:sz w:val="22"/>
+              </w:rPr>
               <w:t>HitPipe; пять участников</w:t>
             </w:r>
           </w:p>
@@ -981,12 +1083,19 @@
         <w:tc>
           <w:tcPr>
             <w:tcW w:type="dxa" w:w="4677"/>
-          </w:tcPr>
-          <w:p>
-            <w:pPr>
-              <w:spacing w:before="0" w:after="20" w:line="240" w:lineRule="auto"/>
-            </w:pPr>
-            <w:r>
+            <w:vAlign w:val="center"/>
+          </w:tcPr>
+          <w:p>
+            <w:pPr>
+              <w:spacing w:before="0" w:after="0" w:line="240" w:lineRule="auto"/>
+              <w:jc w:val="left"/>
+            </w:pPr>
+            <w:r>
+              <w:rPr>
+                <w:rFonts w:ascii="Times New Roman" w:hAnsi="Times New Roman"/>
+                <w:b w:val="0"/>
+                <w:sz w:val="22"/>
+              </w:rPr>
               <w:t>Собственная зона/компонент</w:t>
             </w:r>
           </w:p>
@@ -994,12 +1103,19 @@
         <w:tc>
           <w:tcPr>
             <w:tcW w:type="dxa" w:w="4677"/>
-          </w:tcPr>
-          <w:p>
-            <w:pPr>
-              <w:spacing w:before="0" w:after="20" w:line="240" w:lineRule="auto"/>
-            </w:pPr>
-            <w:r>
+            <w:vAlign w:val="center"/>
+          </w:tcPr>
+          <w:p>
+            <w:pPr>
+              <w:spacing w:before="0" w:after="0" w:line="240" w:lineRule="auto"/>
+              <w:jc w:val="left"/>
+            </w:pPr>
+            <w:r>
+              <w:rPr>
+                <w:rFonts w:ascii="Times New Roman" w:hAnsi="Times New Roman"/>
+                <w:b w:val="0"/>
+                <w:sz w:val="22"/>
+              </w:rPr>
               <w:t>TargetReadback / services/delivery</w:t>
             </w:r>
           </w:p>
@@ -1009,12 +1125,19 @@
         <w:tc>
           <w:tcPr>
             <w:tcW w:type="dxa" w:w="4677"/>
-          </w:tcPr>
-          <w:p>
-            <w:pPr>
-              <w:spacing w:before="0" w:after="20" w:line="240" w:lineRule="auto"/>
-            </w:pPr>
-            <w:r>
+            <w:vAlign w:val="center"/>
+          </w:tcPr>
+          <w:p>
+            <w:pPr>
+              <w:spacing w:before="0" w:after="0" w:line="240" w:lineRule="auto"/>
+              <w:jc w:val="left"/>
+            </w:pPr>
+            <w:r>
+              <w:rPr>
+                <w:rFonts w:ascii="Times New Roman" w:hAnsi="Times New Roman"/>
+                <w:b w:val="0"/>
+                <w:sz w:val="22"/>
+              </w:rPr>
               <w:t>Тег → commit</w:t>
             </w:r>
           </w:p>
@@ -1022,12 +1145,19 @@
         <w:tc>
           <w:tcPr>
             <w:tcW w:type="dxa" w:w="4677"/>
-          </w:tcPr>
-          <w:p>
-            <w:pPr>
-              <w:spacing w:before="0" w:after="20" w:line="240" w:lineRule="auto"/>
-            </w:pPr>
-            <w:r>
+            <w:vAlign w:val="center"/>
+          </w:tcPr>
+          <w:p>
+            <w:pPr>
+              <w:spacing w:before="0" w:after="0" w:line="240" w:lineRule="auto"/>
+              <w:jc w:val="left"/>
+            </w:pPr>
+            <w:r>
+              <w:rPr>
+                <w:rFonts w:ascii="Times New Roman" w:hAnsi="Times New Roman"/>
+                <w:b w:val="0"/>
+                <w:sz w:val="22"/>
+              </w:rPr>
               <w:t>не создан — human/Lead gate; correction source bafc97a0eb5cc2b2aba68c04a74b179b61432d82</w:t>
             </w:r>
           </w:p>
@@ -1037,12 +1167,19 @@
         <w:tc>
           <w:tcPr>
             <w:tcW w:type="dxa" w:w="4677"/>
-          </w:tcPr>
-          <w:p>
-            <w:pPr>
-              <w:spacing w:before="0" w:after="20" w:line="240" w:lineRule="auto"/>
-            </w:pPr>
-            <w:r>
+            <w:vAlign w:val="center"/>
+          </w:tcPr>
+          <w:p>
+            <w:pPr>
+              <w:spacing w:before="0" w:after="0" w:line="240" w:lineRule="auto"/>
+              <w:jc w:val="left"/>
+            </w:pPr>
+            <w:r>
+              <w:rPr>
+                <w:rFonts w:ascii="Times New Roman" w:hAnsi="Times New Roman"/>
+                <w:b w:val="0"/>
+                <w:sz w:val="22"/>
+              </w:rPr>
               <w:t>Репозиторий</w:t>
             </w:r>
           </w:p>
@@ -1050,12 +1187,19 @@
         <w:tc>
           <w:tcPr>
             <w:tcW w:type="dxa" w:w="4677"/>
-          </w:tcPr>
-          <w:p>
-            <w:pPr>
-              <w:spacing w:before="0" w:after="20" w:line="240" w:lineRule="auto"/>
-            </w:pPr>
-            <w:r>
+            <w:vAlign w:val="center"/>
+          </w:tcPr>
+          <w:p>
+            <w:pPr>
+              <w:spacing w:before="0" w:after="0" w:line="240" w:lineRule="auto"/>
+              <w:jc w:val="left"/>
+            </w:pPr>
+            <w:r>
+              <w:rPr>
+                <w:rFonts w:ascii="Times New Roman" w:hAnsi="Times New Roman"/>
+                <w:b w:val="0"/>
+                <w:sz w:val="22"/>
+              </w:rPr>
               <w:t>https://github.com/hitpipe/hitpipe</w:t>
             </w:r>
           </w:p>
@@ -1065,12 +1209,19 @@
         <w:tc>
           <w:tcPr>
             <w:tcW w:type="dxa" w:w="4677"/>
-          </w:tcPr>
-          <w:p>
-            <w:pPr>
-              <w:spacing w:before="0" w:after="20" w:line="240" w:lineRule="auto"/>
-            </w:pPr>
-            <w:r>
+            <w:vAlign w:val="center"/>
+          </w:tcPr>
+          <w:p>
+            <w:pPr>
+              <w:spacing w:before="0" w:after="0" w:line="240" w:lineRule="auto"/>
+              <w:jc w:val="left"/>
+            </w:pPr>
+            <w:r>
+              <w:rPr>
+                <w:rFonts w:ascii="Times New Roman" w:hAnsi="Times New Roman"/>
+                <w:b w:val="0"/>
+                <w:sz w:val="22"/>
+              </w:rPr>
               <w:t>Вариант выполнения</w:t>
             </w:r>
           </w:p>
@@ -1078,12 +1229,19 @@
         <w:tc>
           <w:tcPr>
             <w:tcW w:type="dxa" w:w="4677"/>
-          </w:tcPr>
-          <w:p>
-            <w:pPr>
-              <w:spacing w:before="0" w:after="20" w:line="240" w:lineRule="auto"/>
-            </w:pPr>
-            <w:r>
+            <w:vAlign w:val="center"/>
+          </w:tcPr>
+          <w:p>
+            <w:pPr>
+              <w:spacing w:before="0" w:after="0" w:line="240" w:lineRule="auto"/>
+              <w:jc w:val="left"/>
+            </w:pPr>
+            <w:r>
+              <w:rPr>
+                <w:rFonts w:ascii="Times New Roman" w:hAnsi="Times New Roman"/>
+                <w:b w:val="0"/>
+                <w:sz w:val="22"/>
+              </w:rPr>
               <w:t>Собственная зона ответственности</w:t>
             </w:r>
           </w:p>
@@ -1130,9 +1288,19 @@
         <w:tc>
           <w:tcPr>
             <w:tcW w:type="dxa" w:w="2339"/>
-          </w:tcPr>
-          <w:p>
-            <w:r>
+            <w:vAlign w:val="center"/>
+          </w:tcPr>
+          <w:p>
+            <w:pPr>
+              <w:spacing w:before="0" w:after="0" w:line="240" w:lineRule="auto"/>
+              <w:jc w:val="center"/>
+            </w:pPr>
+            <w:r>
+              <w:rPr>
+                <w:rFonts w:ascii="Times New Roman" w:hAnsi="Times New Roman"/>
+                <w:b/>
+                <w:sz w:val="22"/>
+              </w:rPr>
               <w:t>Элемент</w:t>
             </w:r>
           </w:p>
@@ -1140,9 +1308,19 @@
         <w:tc>
           <w:tcPr>
             <w:tcW w:type="dxa" w:w="2339"/>
-          </w:tcPr>
-          <w:p>
-            <w:r>
+            <w:vAlign w:val="center"/>
+          </w:tcPr>
+          <w:p>
+            <w:pPr>
+              <w:spacing w:before="0" w:after="0" w:line="240" w:lineRule="auto"/>
+              <w:jc w:val="center"/>
+            </w:pPr>
+            <w:r>
+              <w:rPr>
+                <w:rFonts w:ascii="Times New Roman" w:hAnsi="Times New Roman"/>
+                <w:b/>
+                <w:sz w:val="22"/>
+              </w:rPr>
               <w:t>Версия</w:t>
             </w:r>
           </w:p>
@@ -1150,9 +1328,19 @@
         <w:tc>
           <w:tcPr>
             <w:tcW w:type="dxa" w:w="2339"/>
-          </w:tcPr>
-          <w:p>
-            <w:r>
+            <w:vAlign w:val="center"/>
+          </w:tcPr>
+          <w:p>
+            <w:pPr>
+              <w:spacing w:before="0" w:after="0" w:line="240" w:lineRule="auto"/>
+              <w:jc w:val="center"/>
+            </w:pPr>
+            <w:r>
+              <w:rPr>
+                <w:rFonts w:ascii="Times New Roman" w:hAnsi="Times New Roman"/>
+                <w:b/>
+                <w:sz w:val="22"/>
+              </w:rPr>
               <w:t>Действие</w:t>
             </w:r>
           </w:p>
@@ -1160,9 +1348,19 @@
         <w:tc>
           <w:tcPr>
             <w:tcW w:type="dxa" w:w="2339"/>
-          </w:tcPr>
-          <w:p>
-            <w:r>
+            <w:vAlign w:val="center"/>
+          </w:tcPr>
+          <w:p>
+            <w:pPr>
+              <w:spacing w:before="0" w:after="0" w:line="240" w:lineRule="auto"/>
+              <w:jc w:val="center"/>
+            </w:pPr>
+            <w:r>
+              <w:rPr>
+                <w:rFonts w:ascii="Times New Roman" w:hAnsi="Times New Roman"/>
+                <w:b/>
+                <w:sz w:val="22"/>
+              </w:rPr>
               <w:t>Результат</w:t>
             </w:r>
           </w:p>
@@ -1172,9 +1370,19 @@
         <w:tc>
           <w:tcPr>
             <w:tcW w:type="dxa" w:w="2339"/>
-          </w:tcPr>
-          <w:p>
-            <w:r>
+            <w:vAlign w:val="center"/>
+          </w:tcPr>
+          <w:p>
+            <w:pPr>
+              <w:spacing w:before="0" w:after="0" w:line="240" w:lineRule="auto"/>
+              <w:jc w:val="left"/>
+            </w:pPr>
+            <w:r>
+              <w:rPr>
+                <w:rFonts w:ascii="Times New Roman" w:hAnsi="Times New Roman"/>
+                <w:b w:val="0"/>
+                <w:sz w:val="22"/>
+              </w:rPr>
               <w:t>Сборка</w:t>
             </w:r>
           </w:p>
@@ -1182,9 +1390,19 @@
         <w:tc>
           <w:tcPr>
             <w:tcW w:type="dxa" w:w="2339"/>
-          </w:tcPr>
-          <w:p>
-            <w:r>
+            <w:vAlign w:val="center"/>
+          </w:tcPr>
+          <w:p>
+            <w:pPr>
+              <w:spacing w:before="0" w:after="0" w:line="240" w:lineRule="auto"/>
+              <w:jc w:val="left"/>
+            </w:pPr>
+            <w:r>
+              <w:rPr>
+                <w:rFonts w:ascii="Times New Roman" w:hAnsi="Times New Roman"/>
+                <w:b w:val="0"/>
+                <w:sz w:val="22"/>
+              </w:rPr>
               <w:t>Go 1.27.2; GCC 16.2.0</w:t>
             </w:r>
           </w:p>
@@ -1192,9 +1410,19 @@
         <w:tc>
           <w:tcPr>
             <w:tcW w:type="dxa" w:w="2339"/>
-          </w:tcPr>
-          <w:p>
-            <w:r>
+            <w:vAlign w:val="center"/>
+          </w:tcPr>
+          <w:p>
+            <w:pPr>
+              <w:spacing w:before="0" w:after="0" w:line="240" w:lineRule="auto"/>
+              <w:jc w:val="left"/>
+            </w:pPr>
+            <w:r>
+              <w:rPr>
+                <w:rFonts w:ascii="Times New Roman" w:hAnsi="Times New Roman"/>
+                <w:b w:val="0"/>
+                <w:sz w:val="22"/>
+              </w:rPr>
               <w:t>go build; dev/release</w:t>
             </w:r>
           </w:p>
@@ -1202,9 +1430,19 @@
         <w:tc>
           <w:tcPr>
             <w:tcW w:type="dxa" w:w="2339"/>
-          </w:tcPr>
-          <w:p>
-            <w:r>
+            <w:vAlign w:val="center"/>
+          </w:tcPr>
+          <w:p>
+            <w:pPr>
+              <w:spacing w:before="0" w:after="0" w:line="240" w:lineRule="auto"/>
+              <w:jc w:val="left"/>
+            </w:pPr>
+            <w:r>
+              <w:rPr>
+                <w:rFonts w:ascii="Times New Roman" w:hAnsi="Times New Roman"/>
+                <w:b w:val="0"/>
+                <w:sz w:val="22"/>
+              </w:rPr>
               <w:t>PASS; журнал сохранён</w:t>
             </w:r>
           </w:p>
@@ -1214,9 +1452,19 @@
         <w:tc>
           <w:tcPr>
             <w:tcW w:type="dxa" w:w="2339"/>
-          </w:tcPr>
-          <w:p>
-            <w:r>
+            <w:vAlign w:val="center"/>
+          </w:tcPr>
+          <w:p>
+            <w:pPr>
+              <w:spacing w:before="0" w:after="0" w:line="240" w:lineRule="auto"/>
+              <w:jc w:val="left"/>
+            </w:pPr>
+            <w:r>
+              <w:rPr>
+                <w:rFonts w:ascii="Times New Roman" w:hAnsi="Times New Roman"/>
+                <w:b w:val="0"/>
+                <w:sz w:val="22"/>
+              </w:rPr>
               <w:t>Зависимости</w:t>
             </w:r>
           </w:p>
@@ -1224,9 +1472,19 @@
         <w:tc>
           <w:tcPr>
             <w:tcW w:type="dxa" w:w="2339"/>
-          </w:tcPr>
-          <w:p>
-            <w:r>
+            <w:vAlign w:val="center"/>
+          </w:tcPr>
+          <w:p>
+            <w:pPr>
+              <w:spacing w:before="0" w:after="0" w:line="240" w:lineRule="auto"/>
+              <w:jc w:val="left"/>
+            </w:pPr>
+            <w:r>
+              <w:rPr>
+                <w:rFonts w:ascii="Times New Roman" w:hAnsi="Times New Roman"/>
+                <w:b w:val="0"/>
+                <w:sz w:val="22"/>
+              </w:rPr>
               <w:t>Go modules; x/text 0.28.0</w:t>
             </w:r>
           </w:p>
@@ -1234,9 +1492,19 @@
         <w:tc>
           <w:tcPr>
             <w:tcW w:type="dxa" w:w="2339"/>
-          </w:tcPr>
-          <w:p>
-            <w:r>
+            <w:vAlign w:val="center"/>
+          </w:tcPr>
+          <w:p>
+            <w:pPr>
+              <w:spacing w:before="0" w:after="0" w:line="240" w:lineRule="auto"/>
+              <w:jc w:val="left"/>
+            </w:pPr>
+            <w:r>
+              <w:rPr>
+                <w:rFonts w:ascii="Times New Roman" w:hAnsi="Times New Roman"/>
+                <w:b w:val="0"/>
+                <w:sz w:val="22"/>
+              </w:rPr>
               <w:t>go mod tidy/download</w:t>
             </w:r>
           </w:p>
@@ -1244,9 +1512,19 @@
         <w:tc>
           <w:tcPr>
             <w:tcW w:type="dxa" w:w="2339"/>
-          </w:tcPr>
-          <w:p>
-            <w:r>
+            <w:vAlign w:val="center"/>
+          </w:tcPr>
+          <w:p>
+            <w:pPr>
+              <w:spacing w:before="0" w:after="0" w:line="240" w:lineRule="auto"/>
+              <w:jc w:val="left"/>
+            </w:pPr>
+            <w:r>
+              <w:rPr>
+                <w:rFonts w:ascii="Times New Roman" w:hAnsi="Times New Roman"/>
+                <w:b w:val="0"/>
+                <w:sz w:val="22"/>
+              </w:rPr>
               <w:t>PASS; lock-файлы</w:t>
             </w:r>
           </w:p>
@@ -1256,9 +1534,19 @@
         <w:tc>
           <w:tcPr>
             <w:tcW w:type="dxa" w:w="2339"/>
-          </w:tcPr>
-          <w:p>
-            <w:r>
+            <w:vAlign w:val="center"/>
+          </w:tcPr>
+          <w:p>
+            <w:pPr>
+              <w:spacing w:before="0" w:after="0" w:line="240" w:lineRule="auto"/>
+              <w:jc w:val="left"/>
+            </w:pPr>
+            <w:r>
+              <w:rPr>
+                <w:rFonts w:ascii="Times New Roman" w:hAnsi="Times New Roman"/>
+                <w:b w:val="0"/>
+                <w:sz w:val="22"/>
+              </w:rPr>
               <w:t>Тесты</w:t>
             </w:r>
           </w:p>
@@ -1266,9 +1554,19 @@
         <w:tc>
           <w:tcPr>
             <w:tcW w:type="dxa" w:w="2339"/>
-          </w:tcPr>
-          <w:p>
-            <w:r>
+            <w:vAlign w:val="center"/>
+          </w:tcPr>
+          <w:p>
+            <w:pPr>
+              <w:spacing w:before="0" w:after="0" w:line="240" w:lineRule="auto"/>
+              <w:jc w:val="left"/>
+            </w:pPr>
+            <w:r>
+              <w:rPr>
+                <w:rFonts w:ascii="Times New Roman" w:hAnsi="Times New Roman"/>
+                <w:b w:val="0"/>
+                <w:sz w:val="22"/>
+              </w:rPr>
               <w:t>Go test; race</w:t>
             </w:r>
           </w:p>
@@ -1276,9 +1574,19 @@
         <w:tc>
           <w:tcPr>
             <w:tcW w:type="dxa" w:w="2339"/>
-          </w:tcPr>
-          <w:p>
-            <w:r>
+            <w:vAlign w:val="center"/>
+          </w:tcPr>
+          <w:p>
+            <w:pPr>
+              <w:spacing w:before="0" w:after="0" w:line="240" w:lineRule="auto"/>
+              <w:jc w:val="left"/>
+            </w:pPr>
+            <w:r>
+              <w:rPr>
+                <w:rFonts w:ascii="Times New Roman" w:hAnsi="Times New Roman"/>
+                <w:b w:val="0"/>
+                <w:sz w:val="22"/>
+              </w:rPr>
               <w:t>go test ./...; test -race</w:t>
             </w:r>
           </w:p>
@@ -1286,9 +1594,19 @@
         <w:tc>
           <w:tcPr>
             <w:tcW w:type="dxa" w:w="2339"/>
-          </w:tcPr>
-          <w:p>
-            <w:r>
+            <w:vAlign w:val="center"/>
+          </w:tcPr>
+          <w:p>
+            <w:pPr>
+              <w:spacing w:before="0" w:after="0" w:line="240" w:lineRule="auto"/>
+              <w:jc w:val="left"/>
+            </w:pPr>
+            <w:r>
+              <w:rPr>
+                <w:rFonts w:ascii="Times New Roman" w:hAnsi="Times New Roman"/>
+                <w:b w:val="0"/>
+                <w:sz w:val="22"/>
+              </w:rPr>
               <w:t>PASS; журнал</w:t>
             </w:r>
           </w:p>
@@ -1298,9 +1616,19 @@
         <w:tc>
           <w:tcPr>
             <w:tcW w:type="dxa" w:w="2339"/>
-          </w:tcPr>
-          <w:p>
-            <w:r>
+            <w:vAlign w:val="center"/>
+          </w:tcPr>
+          <w:p>
+            <w:pPr>
+              <w:spacing w:before="0" w:after="0" w:line="240" w:lineRule="auto"/>
+              <w:jc w:val="left"/>
+            </w:pPr>
+            <w:r>
+              <w:rPr>
+                <w:rFonts w:ascii="Times New Roman" w:hAnsi="Times New Roman"/>
+                <w:b w:val="0"/>
+                <w:sz w:val="22"/>
+              </w:rPr>
               <w:t>Анализ</w:t>
             </w:r>
           </w:p>
@@ -1308,9 +1636,19 @@
         <w:tc>
           <w:tcPr>
             <w:tcW w:type="dxa" w:w="2339"/>
-          </w:tcPr>
-          <w:p>
-            <w:r>
+            <w:vAlign w:val="center"/>
+          </w:tcPr>
+          <w:p>
+            <w:pPr>
+              <w:spacing w:before="0" w:after="0" w:line="240" w:lineRule="auto"/>
+              <w:jc w:val="left"/>
+            </w:pPr>
+            <w:r>
+              <w:rPr>
+                <w:rFonts w:ascii="Times New Roman" w:hAnsi="Times New Roman"/>
+                <w:b w:val="0"/>
+                <w:sz w:val="22"/>
+              </w:rPr>
               <w:t>go vet</w:t>
             </w:r>
           </w:p>
@@ -1318,9 +1656,19 @@
         <w:tc>
           <w:tcPr>
             <w:tcW w:type="dxa" w:w="2339"/>
-          </w:tcPr>
-          <w:p>
-            <w:r>
+            <w:vAlign w:val="center"/>
+          </w:tcPr>
+          <w:p>
+            <w:pPr>
+              <w:spacing w:before="0" w:after="0" w:line="240" w:lineRule="auto"/>
+              <w:jc w:val="left"/>
+            </w:pPr>
+            <w:r>
+              <w:rPr>
+                <w:rFonts w:ascii="Times New Roman" w:hAnsi="Times New Roman"/>
+                <w:b w:val="0"/>
+                <w:sz w:val="22"/>
+              </w:rPr>
               <w:t>go vet ./...</w:t>
             </w:r>
           </w:p>
@@ -1328,9 +1676,19 @@
         <w:tc>
           <w:tcPr>
             <w:tcW w:type="dxa" w:w="2339"/>
-          </w:tcPr>
-          <w:p>
-            <w:r>
+            <w:vAlign w:val="center"/>
+          </w:tcPr>
+          <w:p>
+            <w:pPr>
+              <w:spacing w:before="0" w:after="0" w:line="240" w:lineRule="auto"/>
+              <w:jc w:val="left"/>
+            </w:pPr>
+            <w:r>
+              <w:rPr>
+                <w:rFonts w:ascii="Times New Roman" w:hAnsi="Times New Roman"/>
+                <w:b w:val="0"/>
+                <w:sz w:val="22"/>
+              </w:rPr>
               <w:t>PASS; журнал</w:t>
             </w:r>
           </w:p>
@@ -1340,9 +1698,19 @@
         <w:tc>
           <w:tcPr>
             <w:tcW w:type="dxa" w:w="2339"/>
-          </w:tcPr>
-          <w:p>
-            <w:r>
+            <w:vAlign w:val="center"/>
+          </w:tcPr>
+          <w:p>
+            <w:pPr>
+              <w:spacing w:before="0" w:after="0" w:line="240" w:lineRule="auto"/>
+              <w:jc w:val="left"/>
+            </w:pPr>
+            <w:r>
+              <w:rPr>
+                <w:rFonts w:ascii="Times New Roman" w:hAnsi="Times New Roman"/>
+                <w:b w:val="0"/>
+                <w:sz w:val="22"/>
+              </w:rPr>
               <w:t>Smoke</w:t>
             </w:r>
           </w:p>
@@ -1350,9 +1718,19 @@
         <w:tc>
           <w:tcPr>
             <w:tcW w:type="dxa" w:w="2339"/>
-          </w:tcPr>
-          <w:p>
-            <w:r>
+            <w:vAlign w:val="center"/>
+          </w:tcPr>
+          <w:p>
+            <w:pPr>
+              <w:spacing w:before="0" w:after="0" w:line="240" w:lineRule="auto"/>
+              <w:jc w:val="left"/>
+            </w:pPr>
+            <w:r>
+              <w:rPr>
+                <w:rFonts w:ascii="Times New Roman" w:hAnsi="Times New Roman"/>
+                <w:b w:val="0"/>
+                <w:sz w:val="22"/>
+              </w:rPr>
               <w:t>CLI fixture</w:t>
             </w:r>
           </w:p>
@@ -1360,9 +1738,19 @@
         <w:tc>
           <w:tcPr>
             <w:tcW w:type="dxa" w:w="2339"/>
-          </w:tcPr>
-          <w:p>
-            <w:r>
+            <w:vAlign w:val="center"/>
+          </w:tcPr>
+          <w:p>
+            <w:pPr>
+              <w:spacing w:before="0" w:after="0" w:line="240" w:lineRule="auto"/>
+              <w:jc w:val="left"/>
+            </w:pPr>
+            <w:r>
+              <w:rPr>
+                <w:rFonts w:ascii="Times New Roman" w:hAnsi="Times New Roman"/>
+                <w:b w:val="0"/>
+                <w:sz w:val="22"/>
+              </w:rPr>
               <w:t>workspace smoke --require</w:t>
             </w:r>
           </w:p>
@@ -1370,9 +1758,19 @@
         <w:tc>
           <w:tcPr>
             <w:tcW w:type="dxa" w:w="2339"/>
-          </w:tcPr>
-          <w:p>
-            <w:r>
+            <w:vAlign w:val="center"/>
+          </w:tcPr>
+          <w:p>
+            <w:pPr>
+              <w:spacing w:before="0" w:after="0" w:line="240" w:lineRule="auto"/>
+              <w:jc w:val="left"/>
+            </w:pPr>
+            <w:r>
+              <w:rPr>
+                <w:rFonts w:ascii="Times New Roman" w:hAnsi="Times New Roman"/>
+                <w:b w:val="0"/>
+                <w:sz w:val="22"/>
+              </w:rPr>
               <w:t>PASS; positive/negative</w:t>
             </w:r>
           </w:p>
@@ -1382,9 +1780,19 @@
         <w:tc>
           <w:tcPr>
             <w:tcW w:type="dxa" w:w="2339"/>
-          </w:tcPr>
-          <w:p>
-            <w:r>
+            <w:vAlign w:val="center"/>
+          </w:tcPr>
+          <w:p>
+            <w:pPr>
+              <w:spacing w:before="0" w:after="0" w:line="240" w:lineRule="auto"/>
+              <w:jc w:val="left"/>
+            </w:pPr>
+            <w:r>
+              <w:rPr>
+                <w:rFonts w:ascii="Times New Roman" w:hAnsi="Times New Roman"/>
+                <w:b w:val="0"/>
+                <w:sz w:val="22"/>
+              </w:rPr>
               <w:t>Профилирование</w:t>
             </w:r>
           </w:p>
@@ -1392,9 +1800,19 @@
         <w:tc>
           <w:tcPr>
             <w:tcW w:type="dxa" w:w="2339"/>
-          </w:tcPr>
-          <w:p>
-            <w:r>
+            <w:vAlign w:val="center"/>
+          </w:tcPr>
+          <w:p>
+            <w:pPr>
+              <w:spacing w:before="0" w:after="0" w:line="240" w:lineRule="auto"/>
+              <w:jc w:val="left"/>
+            </w:pPr>
+            <w:r>
+              <w:rPr>
+                <w:rFonts w:ascii="Times New Roman" w:hAnsi="Times New Roman"/>
+                <w:b w:val="0"/>
+                <w:sz w:val="22"/>
+              </w:rPr>
               <w:t>Go pprof</w:t>
             </w:r>
           </w:p>
@@ -1402,9 +1820,19 @@
         <w:tc>
           <w:tcPr>
             <w:tcW w:type="dxa" w:w="2339"/>
-          </w:tcPr>
-          <w:p>
-            <w:r>
+            <w:vAlign w:val="center"/>
+          </w:tcPr>
+          <w:p>
+            <w:pPr>
+              <w:spacing w:before="0" w:after="0" w:line="240" w:lineRule="auto"/>
+              <w:jc w:val="left"/>
+            </w:pPr>
+            <w:r>
+              <w:rPr>
+                <w:rFonts w:ascii="Times New Roman" w:hAnsi="Times New Roman"/>
+                <w:b w:val="0"/>
+                <w:sz w:val="22"/>
+              </w:rPr>
               <w:t>не выполнялось</w:t>
             </w:r>
           </w:p>
@@ -1412,9 +1840,19 @@
         <w:tc>
           <w:tcPr>
             <w:tcW w:type="dxa" w:w="2339"/>
-          </w:tcPr>
-          <w:p>
-            <w:r>
+            <w:vAlign w:val="center"/>
+          </w:tcPr>
+          <w:p>
+            <w:pPr>
+              <w:spacing w:before="0" w:after="0" w:line="240" w:lineRule="auto"/>
+              <w:jc w:val="left"/>
+            </w:pPr>
+            <w:r>
+              <w:rPr>
+                <w:rFonts w:ascii="Times New Roman" w:hAnsi="Times New Roman"/>
+                <w:b w:val="0"/>
+                <w:sz w:val="22"/>
+              </w:rPr>
               <w:t>PLANNED; без claims</w:t>
             </w:r>
           </w:p>
@@ -1424,9 +1862,19 @@
         <w:tc>
           <w:tcPr>
             <w:tcW w:type="dxa" w:w="2339"/>
-          </w:tcPr>
-          <w:p>
-            <w:r>
+            <w:vAlign w:val="center"/>
+          </w:tcPr>
+          <w:p>
+            <w:pPr>
+              <w:spacing w:before="0" w:after="0" w:line="240" w:lineRule="auto"/>
+              <w:jc w:val="left"/>
+            </w:pPr>
+            <w:r>
+              <w:rPr>
+                <w:rFonts w:ascii="Times New Roman" w:hAnsi="Times New Roman"/>
+                <w:b w:val="0"/>
+                <w:sz w:val="22"/>
+              </w:rPr>
               <w:t>CI</w:t>
             </w:r>
           </w:p>
@@ -1434,9 +1882,19 @@
         <w:tc>
           <w:tcPr>
             <w:tcW w:type="dxa" w:w="2339"/>
-          </w:tcPr>
-          <w:p>
-            <w:r>
+            <w:vAlign w:val="center"/>
+          </w:tcPr>
+          <w:p>
+            <w:pPr>
+              <w:spacing w:before="0" w:after="0" w:line="240" w:lineRule="auto"/>
+              <w:jc w:val="left"/>
+            </w:pPr>
+            <w:r>
+              <w:rPr>
+                <w:rFonts w:ascii="Times New Roman" w:hAnsi="Times New Roman"/>
+                <w:b w:val="0"/>
+                <w:sz w:val="22"/>
+              </w:rPr>
               <w:t>GitHub Actions</w:t>
             </w:r>
           </w:p>
@@ -1444,9 +1902,19 @@
         <w:tc>
           <w:tcPr>
             <w:tcW w:type="dxa" w:w="2339"/>
-          </w:tcPr>
-          <w:p>
-            <w:r>
+            <w:vAlign w:val="center"/>
+          </w:tcPr>
+          <w:p>
+            <w:pPr>
+              <w:spacing w:before="0" w:after="0" w:line="240" w:lineRule="auto"/>
+              <w:jc w:val="left"/>
+            </w:pPr>
+            <w:r>
+              <w:rPr>
+                <w:rFonts w:ascii="Times New Roman" w:hAnsi="Times New Roman"/>
+                <w:b w:val="0"/>
+                <w:sz w:val="22"/>
+              </w:rPr>
               <w:t>workflow run</w:t>
             </w:r>
           </w:p>
@@ -1454,9 +1922,19 @@
         <w:tc>
           <w:tcPr>
             <w:tcW w:type="dxa" w:w="2339"/>
-          </w:tcPr>
-          <w:p>
-            <w:r>
+            <w:vAlign w:val="center"/>
+          </w:tcPr>
+          <w:p>
+            <w:pPr>
+              <w:spacing w:before="0" w:after="0" w:line="240" w:lineRule="auto"/>
+              <w:jc w:val="left"/>
+            </w:pPr>
+            <w:r>
+              <w:rPr>
+                <w:rFonts w:ascii="Times New Roman" w:hAnsi="Times New Roman"/>
+                <w:b w:val="0"/>
+                <w:sz w:val="22"/>
+              </w:rPr>
               <w:t>PASS; ссылка в тексте</w:t>
             </w:r>
           </w:p>
@@ -1607,12 +2085,19 @@
         <w:tc>
           <w:tcPr>
             <w:tcW w:type="dxa" w:w="3118"/>
-          </w:tcPr>
-          <w:p>
-            <w:pPr>
-              <w:spacing w:after="40" w:line="240" w:lineRule="auto"/>
-            </w:pPr>
-            <w:r>
+            <w:vAlign w:val="center"/>
+          </w:tcPr>
+          <w:p>
+            <w:pPr>
+              <w:spacing w:after="0" w:line="240" w:lineRule="auto" w:before="0"/>
+              <w:jc w:val="center"/>
+            </w:pPr>
+            <w:r>
+              <w:rPr>
+                <w:rFonts w:ascii="Times New Roman" w:hAnsi="Times New Roman"/>
+                <w:b/>
+                <w:sz w:val="22"/>
+              </w:rPr>
               <w:t>Что проверяем</w:t>
             </w:r>
           </w:p>
@@ -1620,12 +2105,19 @@
         <w:tc>
           <w:tcPr>
             <w:tcW w:type="dxa" w:w="3118"/>
-          </w:tcPr>
-          <w:p>
-            <w:pPr>
-              <w:spacing w:after="40" w:line="240" w:lineRule="auto"/>
-            </w:pPr>
-            <w:r>
+            <w:vAlign w:val="center"/>
+          </w:tcPr>
+          <w:p>
+            <w:pPr>
+              <w:spacing w:after="0" w:line="240" w:lineRule="auto" w:before="0"/>
+              <w:jc w:val="center"/>
+            </w:pPr>
+            <w:r>
+              <w:rPr>
+                <w:rFonts w:ascii="Times New Roman" w:hAnsi="Times New Roman"/>
+                <w:b/>
+                <w:sz w:val="22"/>
+              </w:rPr>
               <w:t>Разработка</w:t>
             </w:r>
           </w:p>
@@ -1633,12 +2125,19 @@
         <w:tc>
           <w:tcPr>
             <w:tcW w:type="dxa" w:w="3118"/>
-          </w:tcPr>
-          <w:p>
-            <w:pPr>
-              <w:spacing w:after="40" w:line="240" w:lineRule="auto"/>
-            </w:pPr>
-            <w:r>
+            <w:vAlign w:val="center"/>
+          </w:tcPr>
+          <w:p>
+            <w:pPr>
+              <w:spacing w:after="0" w:line="240" w:lineRule="auto" w:before="0"/>
+              <w:jc w:val="center"/>
+            </w:pPr>
+            <w:r>
+              <w:rPr>
+                <w:rFonts w:ascii="Times New Roman" w:hAnsi="Times New Roman"/>
+                <w:b/>
+                <w:sz w:val="22"/>
+              </w:rPr>
               <w:t>Поставка</w:t>
             </w:r>
           </w:p>
@@ -1648,12 +2147,19 @@
         <w:tc>
           <w:tcPr>
             <w:tcW w:type="dxa" w:w="3118"/>
-          </w:tcPr>
-          <w:p>
-            <w:pPr>
-              <w:spacing w:after="40" w:line="240" w:lineRule="auto"/>
-            </w:pPr>
-            <w:r>
+            <w:vAlign w:val="center"/>
+          </w:tcPr>
+          <w:p>
+            <w:pPr>
+              <w:spacing w:after="0" w:line="240" w:lineRule="auto" w:before="0"/>
+              <w:jc w:val="left"/>
+            </w:pPr>
+            <w:r>
+              <w:rPr>
+                <w:rFonts w:ascii="Times New Roman" w:hAnsi="Times New Roman"/>
+                <w:b w:val="0"/>
+                <w:sz w:val="22"/>
+              </w:rPr>
               <w:t>Сборка программы</w:t>
             </w:r>
           </w:p>
@@ -1661,12 +2167,19 @@
         <w:tc>
           <w:tcPr>
             <w:tcW w:type="dxa" w:w="3118"/>
-          </w:tcPr>
-          <w:p>
-            <w:pPr>
-              <w:spacing w:after="40" w:line="240" w:lineRule="auto"/>
-            </w:pPr>
-            <w:r>
+            <w:vAlign w:val="center"/>
+          </w:tcPr>
+          <w:p>
+            <w:pPr>
+              <w:spacing w:after="0" w:line="240" w:lineRule="auto" w:before="0"/>
+              <w:jc w:val="left"/>
+            </w:pPr>
+            <w:r>
+              <w:rPr>
+                <w:rFonts w:ascii="Times New Roman" w:hAnsi="Times New Roman"/>
+                <w:b w:val="0"/>
+                <w:sz w:val="22"/>
+              </w:rPr>
               <w:t>Программа собрана для проверки.</w:t>
             </w:r>
           </w:p>
@@ -1674,12 +2187,19 @@
         <w:tc>
           <w:tcPr>
             <w:tcW w:type="dxa" w:w="3118"/>
-          </w:tcPr>
-          <w:p>
-            <w:pPr>
-              <w:spacing w:after="40" w:line="240" w:lineRule="auto"/>
-            </w:pPr>
-            <w:r>
+            <w:vAlign w:val="center"/>
+          </w:tcPr>
+          <w:p>
+            <w:pPr>
+              <w:spacing w:after="0" w:line="240" w:lineRule="auto" w:before="0"/>
+              <w:jc w:val="left"/>
+            </w:pPr>
+            <w:r>
+              <w:rPr>
+                <w:rFonts w:ascii="Times New Roman" w:hAnsi="Times New Roman"/>
+                <w:b w:val="0"/>
+                <w:sz w:val="22"/>
+              </w:rPr>
               <w:t>Программа собрана для поставки.</w:t>
             </w:r>
           </w:p>
@@ -1689,12 +2209,19 @@
         <w:tc>
           <w:tcPr>
             <w:tcW w:type="dxa" w:w="3118"/>
-          </w:tcPr>
-          <w:p>
-            <w:pPr>
-              <w:spacing w:after="40" w:line="240" w:lineRule="auto"/>
-            </w:pPr>
-            <w:r>
+            <w:vAlign w:val="center"/>
+          </w:tcPr>
+          <w:p>
+            <w:pPr>
+              <w:spacing w:after="0" w:line="240" w:lineRule="auto" w:before="0"/>
+              <w:jc w:val="left"/>
+            </w:pPr>
+            <w:r>
+              <w:rPr>
+                <w:rFonts w:ascii="Times New Roman" w:hAnsi="Times New Roman"/>
+                <w:b w:val="0"/>
+                <w:sz w:val="22"/>
+              </w:rPr>
               <w:t>Подготовка проекта</w:t>
             </w:r>
           </w:p>
@@ -1702,12 +2229,19 @@
         <w:tc>
           <w:tcPr>
             <w:tcW w:type="dxa" w:w="3118"/>
-          </w:tcPr>
-          <w:p>
-            <w:pPr>
-              <w:spacing w:after="40" w:line="240" w:lineRule="auto"/>
-            </w:pPr>
-            <w:r>
+            <w:vAlign w:val="center"/>
+          </w:tcPr>
+          <w:p>
+            <w:pPr>
+              <w:spacing w:after="0" w:line="240" w:lineRule="auto" w:before="0"/>
+              <w:jc w:val="left"/>
+            </w:pPr>
+            <w:r>
+              <w:rPr>
+                <w:rFonts w:ascii="Times New Roman" w:hAnsi="Times New Roman"/>
+                <w:b w:val="0"/>
+                <w:sz w:val="22"/>
+              </w:rPr>
               <w:t>Зависимости установлены, проект готов к запуску.</w:t>
             </w:r>
           </w:p>
@@ -1715,12 +2249,19 @@
         <w:tc>
           <w:tcPr>
             <w:tcW w:type="dxa" w:w="3118"/>
-          </w:tcPr>
-          <w:p>
-            <w:pPr>
-              <w:spacing w:after="40" w:line="240" w:lineRule="auto"/>
-            </w:pPr>
-            <w:r>
+            <w:vAlign w:val="center"/>
+          </w:tcPr>
+          <w:p>
+            <w:pPr>
+              <w:spacing w:after="0" w:line="240" w:lineRule="auto" w:before="0"/>
+              <w:jc w:val="left"/>
+            </w:pPr>
+            <w:r>
+              <w:rPr>
+                <w:rFonts w:ascii="Times New Roman" w:hAnsi="Times New Roman"/>
+                <w:b w:val="0"/>
+                <w:sz w:val="22"/>
+              </w:rPr>
               <w:t>Зависимости установлены, проект готов к запуску.</w:t>
             </w:r>
           </w:p>
@@ -1730,12 +2271,19 @@
         <w:tc>
           <w:tcPr>
             <w:tcW w:type="dxa" w:w="3118"/>
-          </w:tcPr>
-          <w:p>
-            <w:pPr>
-              <w:spacing w:after="40" w:line="240" w:lineRule="auto"/>
-            </w:pPr>
-            <w:r>
+            <w:vAlign w:val="center"/>
+          </w:tcPr>
+          <w:p>
+            <w:pPr>
+              <w:spacing w:after="0" w:line="240" w:lineRule="auto" w:before="0"/>
+              <w:jc w:val="left"/>
+            </w:pPr>
+            <w:r>
+              <w:rPr>
+                <w:rFonts w:ascii="Times New Roman" w:hAnsi="Times New Roman"/>
+                <w:b w:val="0"/>
+                <w:sz w:val="22"/>
+              </w:rPr>
               <w:t>Проверка результата</w:t>
             </w:r>
           </w:p>
@@ -1743,12 +2291,19 @@
         <w:tc>
           <w:tcPr>
             <w:tcW w:type="dxa" w:w="3118"/>
-          </w:tcPr>
-          <w:p>
-            <w:pPr>
-              <w:spacing w:after="40" w:line="240" w:lineRule="auto"/>
-            </w:pPr>
-            <w:r>
+            <w:vAlign w:val="center"/>
+          </w:tcPr>
+          <w:p>
+            <w:pPr>
+              <w:spacing w:after="0" w:line="240" w:lineRule="auto" w:before="0"/>
+              <w:jc w:val="left"/>
+            </w:pPr>
+            <w:r>
+              <w:rPr>
+                <w:rFonts w:ascii="Times New Roman" w:hAnsi="Times New Roman"/>
+                <w:b w:val="0"/>
+                <w:sz w:val="22"/>
+              </w:rPr>
               <w:t>Тесты выполнены успешно.</w:t>
             </w:r>
           </w:p>
@@ -1756,12 +2311,19 @@
         <w:tc>
           <w:tcPr>
             <w:tcW w:type="dxa" w:w="3118"/>
-          </w:tcPr>
-          <w:p>
-            <w:pPr>
-              <w:spacing w:after="40" w:line="240" w:lineRule="auto"/>
-            </w:pPr>
-            <w:r>
+            <w:vAlign w:val="center"/>
+          </w:tcPr>
+          <w:p>
+            <w:pPr>
+              <w:spacing w:after="0" w:line="240" w:lineRule="auto" w:before="0"/>
+              <w:jc w:val="left"/>
+            </w:pPr>
+            <w:r>
+              <w:rPr>
+                <w:rFonts w:ascii="Times New Roman" w:hAnsi="Times New Roman"/>
+                <w:b w:val="0"/>
+                <w:sz w:val="22"/>
+              </w:rPr>
               <w:t>Тесты выполнены успешно.</w:t>
             </w:r>
           </w:p>
@@ -1771,12 +2333,19 @@
         <w:tc>
           <w:tcPr>
             <w:tcW w:type="dxa" w:w="3118"/>
-          </w:tcPr>
-          <w:p>
-            <w:pPr>
-              <w:spacing w:after="40" w:line="240" w:lineRule="auto"/>
-            </w:pPr>
-            <w:r>
+            <w:vAlign w:val="center"/>
+          </w:tcPr>
+          <w:p>
+            <w:pPr>
+              <w:spacing w:after="0" w:line="240" w:lineRule="auto" w:before="0"/>
+              <w:jc w:val="left"/>
+            </w:pPr>
+            <w:r>
+              <w:rPr>
+                <w:rFonts w:ascii="Times New Roman" w:hAnsi="Times New Roman"/>
+                <w:b w:val="0"/>
+                <w:sz w:val="22"/>
+              </w:rPr>
               <w:t>Диагностика</w:t>
             </w:r>
           </w:p>
@@ -1784,12 +2353,19 @@
         <w:tc>
           <w:tcPr>
             <w:tcW w:type="dxa" w:w="3118"/>
-          </w:tcPr>
-          <w:p>
-            <w:pPr>
-              <w:spacing w:after="40" w:line="240" w:lineRule="auto"/>
-            </w:pPr>
-            <w:r>
+            <w:vAlign w:val="center"/>
+          </w:tcPr>
+          <w:p>
+            <w:pPr>
+              <w:spacing w:after="0" w:line="240" w:lineRule="auto" w:before="0"/>
+              <w:jc w:val="left"/>
+            </w:pPr>
+            <w:r>
+              <w:rPr>
+                <w:rFonts w:ascii="Times New Roman" w:hAnsi="Times New Roman"/>
+                <w:b w:val="0"/>
+                <w:sz w:val="22"/>
+              </w:rPr>
               <w:t>Получена информация о версии и настройках.</w:t>
             </w:r>
           </w:p>
@@ -1797,12 +2373,19 @@
         <w:tc>
           <w:tcPr>
             <w:tcW w:type="dxa" w:w="3118"/>
-          </w:tcPr>
-          <w:p>
-            <w:pPr>
-              <w:spacing w:after="40" w:line="240" w:lineRule="auto"/>
-            </w:pPr>
-            <w:r>
+            <w:vAlign w:val="center"/>
+          </w:tcPr>
+          <w:p>
+            <w:pPr>
+              <w:spacing w:after="0" w:line="240" w:lineRule="auto" w:before="0"/>
+              <w:jc w:val="left"/>
+            </w:pPr>
+            <w:r>
+              <w:rPr>
+                <w:rFonts w:ascii="Times New Roman" w:hAnsi="Times New Roman"/>
+                <w:b w:val="0"/>
+                <w:sz w:val="22"/>
+              </w:rPr>
               <w:t>Получена информация о версии и настройках.</w:t>
             </w:r>
           </w:p>
@@ -1812,12 +2395,19 @@
         <w:tc>
           <w:tcPr>
             <w:tcW w:type="dxa" w:w="3118"/>
-          </w:tcPr>
-          <w:p>
-            <w:pPr>
-              <w:spacing w:after="40" w:line="240" w:lineRule="auto"/>
-            </w:pPr>
-            <w:r>
+            <w:vAlign w:val="center"/>
+          </w:tcPr>
+          <w:p>
+            <w:pPr>
+              <w:spacing w:after="0" w:line="240" w:lineRule="auto" w:before="0"/>
+              <w:jc w:val="left"/>
+            </w:pPr>
+            <w:r>
+              <w:rPr>
+                <w:rFonts w:ascii="Times New Roman" w:hAnsi="Times New Roman"/>
+                <w:b w:val="0"/>
+                <w:sz w:val="22"/>
+              </w:rPr>
               <w:t>Проверка запуска</w:t>
             </w:r>
           </w:p>
@@ -1825,12 +2415,19 @@
         <w:tc>
           <w:tcPr>
             <w:tcW w:type="dxa" w:w="3118"/>
-          </w:tcPr>
-          <w:p>
-            <w:pPr>
-              <w:spacing w:after="40" w:line="240" w:lineRule="auto"/>
-            </w:pPr>
-            <w:r>
+            <w:vAlign w:val="center"/>
+          </w:tcPr>
+          <w:p>
+            <w:pPr>
+              <w:spacing w:after="0" w:line="240" w:lineRule="auto" w:before="0"/>
+              <w:jc w:val="left"/>
+            </w:pPr>
+            <w:r>
+              <w:rPr>
+                <w:rFonts w:ascii="Times New Roman" w:hAnsi="Times New Roman"/>
+                <w:b w:val="0"/>
+                <w:sz w:val="22"/>
+              </w:rPr>
               <w:t>Программа запускается по заданному сценарию.</w:t>
             </w:r>
           </w:p>
@@ -1838,12 +2435,19 @@
         <w:tc>
           <w:tcPr>
             <w:tcW w:type="dxa" w:w="3118"/>
-          </w:tcPr>
-          <w:p>
-            <w:pPr>
-              <w:spacing w:after="40" w:line="240" w:lineRule="auto"/>
-            </w:pPr>
-            <w:r>
+            <w:vAlign w:val="center"/>
+          </w:tcPr>
+          <w:p>
+            <w:pPr>
+              <w:spacing w:after="0" w:line="240" w:lineRule="auto" w:before="0"/>
+              <w:jc w:val="left"/>
+            </w:pPr>
+            <w:r>
+              <w:rPr>
+                <w:rFonts w:ascii="Times New Roman" w:hAnsi="Times New Roman"/>
+                <w:b w:val="0"/>
+                <w:sz w:val="22"/>
+              </w:rPr>
               <w:t>Программа запускается по заданному сценарию.</w:t>
             </w:r>
           </w:p>
@@ -1853,12 +2457,19 @@
         <w:tc>
           <w:tcPr>
             <w:tcW w:type="dxa" w:w="3118"/>
-          </w:tcPr>
-          <w:p>
-            <w:pPr>
-              <w:spacing w:after="40" w:line="240" w:lineRule="auto"/>
-            </w:pPr>
-            <w:r>
+            <w:vAlign w:val="center"/>
+          </w:tcPr>
+          <w:p>
+            <w:pPr>
+              <w:spacing w:after="0" w:line="240" w:lineRule="auto" w:before="0"/>
+              <w:jc w:val="left"/>
+            </w:pPr>
+            <w:r>
+              <w:rPr>
+                <w:rFonts w:ascii="Times New Roman" w:hAnsi="Times New Roman"/>
+                <w:b w:val="0"/>
+                <w:sz w:val="22"/>
+              </w:rPr>
               <w:t>Итог</w:t>
             </w:r>
           </w:p>
@@ -1866,12 +2477,19 @@
         <w:tc>
           <w:tcPr>
             <w:tcW w:type="dxa" w:w="3118"/>
-          </w:tcPr>
-          <w:p>
-            <w:pPr>
-              <w:spacing w:after="40" w:line="240" w:lineRule="auto"/>
-            </w:pPr>
-            <w:r>
+            <w:vAlign w:val="center"/>
+          </w:tcPr>
+          <w:p>
+            <w:pPr>
+              <w:spacing w:after="0" w:line="240" w:lineRule="auto" w:before="0"/>
+              <w:jc w:val="left"/>
+            </w:pPr>
+            <w:r>
+              <w:rPr>
+                <w:rFonts w:ascii="Times New Roman" w:hAnsi="Times New Roman"/>
+                <w:b w:val="0"/>
+                <w:sz w:val="22"/>
+              </w:rPr>
               <w:t>Получен рабочий результат.</w:t>
             </w:r>
           </w:p>
@@ -1879,12 +2497,19 @@
         <w:tc>
           <w:tcPr>
             <w:tcW w:type="dxa" w:w="3118"/>
-          </w:tcPr>
-          <w:p>
-            <w:pPr>
-              <w:spacing w:after="40" w:line="240" w:lineRule="auto"/>
-            </w:pPr>
-            <w:r>
+            <w:vAlign w:val="center"/>
+          </w:tcPr>
+          <w:p>
+            <w:pPr>
+              <w:spacing w:after="0" w:line="240" w:lineRule="auto" w:before="0"/>
+              <w:jc w:val="left"/>
+            </w:pPr>
+            <w:r>
+              <w:rPr>
+                <w:rFonts w:ascii="Times New Roman" w:hAnsi="Times New Roman"/>
+                <w:b w:val="0"/>
+                <w:sz w:val="22"/>
+              </w:rPr>
               <w:t>Получен рабочий результат.</w:t>
             </w:r>
           </w:p>
@@ -1973,9 +2598,19 @@
         <w:tc>
           <w:tcPr>
             <w:tcW w:type="dxa" w:w="2339"/>
-          </w:tcPr>
-          <w:p>
-            <w:r>
+            <w:vAlign w:val="center"/>
+          </w:tcPr>
+          <w:p>
+            <w:pPr>
+              <w:spacing w:before="0" w:after="0" w:line="240" w:lineRule="auto"/>
+              <w:jc w:val="center"/>
+            </w:pPr>
+            <w:r>
+              <w:rPr>
+                <w:rFonts w:ascii="Times New Roman" w:hAnsi="Times New Roman"/>
+                <w:b/>
+                <w:sz w:val="22"/>
+              </w:rPr>
               <w:t>Проверка</w:t>
             </w:r>
           </w:p>
@@ -1983,9 +2618,19 @@
         <w:tc>
           <w:tcPr>
             <w:tcW w:type="dxa" w:w="2339"/>
-          </w:tcPr>
-          <w:p>
-            <w:r>
+            <w:vAlign w:val="center"/>
+          </w:tcPr>
+          <w:p>
+            <w:pPr>
+              <w:spacing w:before="0" w:after="0" w:line="240" w:lineRule="auto"/>
+              <w:jc w:val="center"/>
+            </w:pPr>
+            <w:r>
+              <w:rPr>
+                <w:rFonts w:ascii="Times New Roman" w:hAnsi="Times New Roman"/>
+                <w:b/>
+                <w:sz w:val="22"/>
+              </w:rPr>
               <w:t>Ожидание</w:t>
             </w:r>
           </w:p>
@@ -1993,9 +2638,19 @@
         <w:tc>
           <w:tcPr>
             <w:tcW w:type="dxa" w:w="2339"/>
-          </w:tcPr>
-          <w:p>
-            <w:r>
+            <w:vAlign w:val="center"/>
+          </w:tcPr>
+          <w:p>
+            <w:pPr>
+              <w:spacing w:before="0" w:after="0" w:line="240" w:lineRule="auto"/>
+              <w:jc w:val="center"/>
+            </w:pPr>
+            <w:r>
+              <w:rPr>
+                <w:rFonts w:ascii="Times New Roman" w:hAnsi="Times New Roman"/>
+                <w:b/>
+                <w:sz w:val="22"/>
+              </w:rPr>
               <w:t>Факт</w:t>
             </w:r>
           </w:p>
@@ -2003,9 +2658,19 @@
         <w:tc>
           <w:tcPr>
             <w:tcW w:type="dxa" w:w="2339"/>
-          </w:tcPr>
-          <w:p>
-            <w:r>
+            <w:vAlign w:val="center"/>
+          </w:tcPr>
+          <w:p>
+            <w:pPr>
+              <w:spacing w:before="0" w:after="0" w:line="240" w:lineRule="auto"/>
+              <w:jc w:val="center"/>
+            </w:pPr>
+            <w:r>
+              <w:rPr>
+                <w:rFonts w:ascii="Times New Roman" w:hAnsi="Times New Roman"/>
+                <w:b/>
+                <w:sz w:val="22"/>
+              </w:rPr>
               <w:t>Журнал</w:t>
             </w:r>
           </w:p>
@@ -2015,9 +2680,19 @@
         <w:tc>
           <w:tcPr>
             <w:tcW w:type="dxa" w:w="2339"/>
-          </w:tcPr>
-          <w:p>
-            <w:r>
+            <w:vAlign w:val="center"/>
+          </w:tcPr>
+          <w:p>
+            <w:pPr>
+              <w:spacing w:before="0" w:after="0" w:line="240" w:lineRule="auto"/>
+              <w:jc w:val="left"/>
+            </w:pPr>
+            <w:r>
+              <w:rPr>
+                <w:rFonts w:ascii="Times New Roman" w:hAnsi="Times New Roman"/>
+                <w:b w:val="0"/>
+                <w:sz w:val="22"/>
+              </w:rPr>
               <w:t>Обычная</w:t>
             </w:r>
           </w:p>
@@ -2025,9 +2700,19 @@
         <w:tc>
           <w:tcPr>
             <w:tcW w:type="dxa" w:w="2339"/>
-          </w:tcPr>
-          <w:p>
-            <w:r>
+            <w:vAlign w:val="center"/>
+          </w:tcPr>
+          <w:p>
+            <w:pPr>
+              <w:spacing w:before="0" w:after="0" w:line="240" w:lineRule="auto"/>
+              <w:jc w:val="left"/>
+            </w:pPr>
+            <w:r>
+              <w:rPr>
+                <w:rFonts w:ascii="Times New Roman" w:hAnsi="Times New Roman"/>
+                <w:b w:val="0"/>
+                <w:sz w:val="22"/>
+              </w:rPr>
               <w:t>PASS</w:t>
             </w:r>
           </w:p>
@@ -2035,9 +2720,19 @@
         <w:tc>
           <w:tcPr>
             <w:tcW w:type="dxa" w:w="2339"/>
-          </w:tcPr>
-          <w:p>
-            <w:r>
+            <w:vAlign w:val="center"/>
+          </w:tcPr>
+          <w:p>
+            <w:pPr>
+              <w:spacing w:before="0" w:after="0" w:line="240" w:lineRule="auto"/>
+              <w:jc w:val="left"/>
+            </w:pPr>
+            <w:r>
+              <w:rPr>
+                <w:rFonts w:ascii="Times New Roman" w:hAnsi="Times New Roman"/>
+                <w:b w:val="0"/>
+                <w:sz w:val="22"/>
+              </w:rPr>
               <w:t>PASS</w:t>
             </w:r>
           </w:p>
@@ -2045,9 +2740,19 @@
         <w:tc>
           <w:tcPr>
             <w:tcW w:type="dxa" w:w="2339"/>
-          </w:tcPr>
-          <w:p>
-            <w:r>
+            <w:vAlign w:val="center"/>
+          </w:tcPr>
+          <w:p>
+            <w:pPr>
+              <w:spacing w:before="0" w:after="0" w:line="240" w:lineRule="auto"/>
+              <w:jc w:val="left"/>
+            </w:pPr>
+            <w:r>
+              <w:rPr>
+                <w:rFonts w:ascii="Times New Roman" w:hAnsi="Times New Roman"/>
+                <w:b w:val="0"/>
+                <w:sz w:val="22"/>
+              </w:rPr>
               <w:t>go-test / smoke</w:t>
             </w:r>
           </w:p>
@@ -2057,9 +2762,19 @@
         <w:tc>
           <w:tcPr>
             <w:tcW w:type="dxa" w:w="2339"/>
-          </w:tcPr>
-          <w:p>
-            <w:r>
+            <w:vAlign w:val="center"/>
+          </w:tcPr>
+          <w:p>
+            <w:pPr>
+              <w:spacing w:before="0" w:after="0" w:line="240" w:lineRule="auto"/>
+              <w:jc w:val="left"/>
+            </w:pPr>
+            <w:r>
+              <w:rPr>
+                <w:rFonts w:ascii="Times New Roman" w:hAnsi="Times New Roman"/>
+                <w:b w:val="0"/>
+                <w:sz w:val="22"/>
+              </w:rPr>
               <w:t>Неверная config</w:t>
             </w:r>
           </w:p>
@@ -2067,9 +2782,19 @@
         <w:tc>
           <w:tcPr>
             <w:tcW w:type="dxa" w:w="2339"/>
-          </w:tcPr>
-          <w:p>
-            <w:r>
+            <w:vAlign w:val="center"/>
+          </w:tcPr>
+          <w:p>
+            <w:pPr>
+              <w:spacing w:before="0" w:after="0" w:line="240" w:lineRule="auto"/>
+              <w:jc w:val="left"/>
+            </w:pPr>
+            <w:r>
+              <w:rPr>
+                <w:rFonts w:ascii="Times New Roman" w:hAnsi="Times New Roman"/>
+                <w:b w:val="0"/>
+                <w:sz w:val="22"/>
+              </w:rPr>
               <w:t>Ошибка</w:t>
             </w:r>
           </w:p>
@@ -2077,9 +2802,19 @@
         <w:tc>
           <w:tcPr>
             <w:tcW w:type="dxa" w:w="2339"/>
-          </w:tcPr>
-          <w:p>
-            <w:r>
+            <w:vAlign w:val="center"/>
+          </w:tcPr>
+          <w:p>
+            <w:pPr>
+              <w:spacing w:before="0" w:after="0" w:line="240" w:lineRule="auto"/>
+              <w:jc w:val="left"/>
+            </w:pPr>
+            <w:r>
+              <w:rPr>
+                <w:rFonts w:ascii="Times New Roman" w:hAnsi="Times New Roman"/>
+                <w:b w:val="0"/>
+                <w:sz w:val="22"/>
+              </w:rPr>
               <w:t>PASS; exit 2</w:t>
             </w:r>
           </w:p>
@@ -2087,9 +2822,19 @@
         <w:tc>
           <w:tcPr>
             <w:tcW w:type="dxa" w:w="2339"/>
-          </w:tcPr>
-          <w:p>
-            <w:r>
+            <w:vAlign w:val="center"/>
+          </w:tcPr>
+          <w:p>
+            <w:pPr>
+              <w:spacing w:before="0" w:after="0" w:line="240" w:lineRule="auto"/>
+              <w:jc w:val="left"/>
+            </w:pPr>
+            <w:r>
+              <w:rPr>
+                <w:rFonts w:ascii="Times New Roman" w:hAnsi="Times New Roman"/>
+                <w:b w:val="0"/>
+                <w:sz w:val="22"/>
+              </w:rPr>
               <w:t>negative-gate</w:t>
             </w:r>
           </w:p>
@@ -2099,9 +2844,19 @@
         <w:tc>
           <w:tcPr>
             <w:tcW w:type="dxa" w:w="2339"/>
-          </w:tcPr>
-          <w:p>
-            <w:r>
+            <w:vAlign w:val="center"/>
+          </w:tcPr>
+          <w:p>
+            <w:pPr>
+              <w:spacing w:before="0" w:after="0" w:line="240" w:lineRule="auto"/>
+              <w:jc w:val="left"/>
+            </w:pPr>
+            <w:r>
+              <w:rPr>
+                <w:rFonts w:ascii="Times New Roman" w:hAnsi="Times New Roman"/>
+                <w:b w:val="0"/>
+                <w:sz w:val="22"/>
+              </w:rPr>
               <w:t>Версия/SHA</w:t>
             </w:r>
           </w:p>
@@ -2109,9 +2864,19 @@
         <w:tc>
           <w:tcPr>
             <w:tcW w:type="dxa" w:w="2339"/>
-          </w:tcPr>
-          <w:p>
-            <w:r>
+            <w:vAlign w:val="center"/>
+          </w:tcPr>
+          <w:p>
+            <w:pPr>
+              <w:spacing w:before="0" w:after="0" w:line="240" w:lineRule="auto"/>
+              <w:jc w:val="left"/>
+            </w:pPr>
+            <w:r>
+              <w:rPr>
+                <w:rFonts w:ascii="Times New Roman" w:hAnsi="Times New Roman"/>
+                <w:b w:val="0"/>
+                <w:sz w:val="22"/>
+              </w:rPr>
               <w:t>Видны</w:t>
             </w:r>
           </w:p>
@@ -2119,9 +2884,19 @@
         <w:tc>
           <w:tcPr>
             <w:tcW w:type="dxa" w:w="2339"/>
-          </w:tcPr>
-          <w:p>
-            <w:r>
+            <w:vAlign w:val="center"/>
+          </w:tcPr>
+          <w:p>
+            <w:pPr>
+              <w:spacing w:before="0" w:after="0" w:line="240" w:lineRule="auto"/>
+              <w:jc w:val="left"/>
+            </w:pPr>
+            <w:r>
+              <w:rPr>
+                <w:rFonts w:ascii="Times New Roman" w:hAnsi="Times New Roman"/>
+                <w:b w:val="0"/>
+                <w:sz w:val="22"/>
+              </w:rPr>
               <w:t>PASS</w:t>
             </w:r>
           </w:p>
@@ -2129,9 +2904,19 @@
         <w:tc>
           <w:tcPr>
             <w:tcW w:type="dxa" w:w="2339"/>
-          </w:tcPr>
-          <w:p>
-            <w:r>
+            <w:vAlign w:val="center"/>
+          </w:tcPr>
+          <w:p>
+            <w:pPr>
+              <w:spacing w:before="0" w:after="0" w:line="240" w:lineRule="auto"/>
+              <w:jc w:val="left"/>
+            </w:pPr>
+            <w:r>
+              <w:rPr>
+                <w:rFonts w:ascii="Times New Roman" w:hAnsi="Times New Roman"/>
+                <w:b w:val="0"/>
+                <w:sz w:val="22"/>
+              </w:rPr>
               <w:t>workspace-smoke</w:t>
             </w:r>
           </w:p>
@@ -2141,9 +2926,19 @@
         <w:tc>
           <w:tcPr>
             <w:tcW w:type="dxa" w:w="2339"/>
-          </w:tcPr>
-          <w:p>
-            <w:r>
+            <w:vAlign w:val="center"/>
+          </w:tcPr>
+          <w:p>
+            <w:pPr>
+              <w:spacing w:before="0" w:after="0" w:line="240" w:lineRule="auto"/>
+              <w:jc w:val="left"/>
+            </w:pPr>
+            <w:r>
+              <w:rPr>
+                <w:rFonts w:ascii="Times New Roman" w:hAnsi="Times New Roman"/>
+                <w:b w:val="0"/>
+                <w:sz w:val="22"/>
+              </w:rPr>
               <w:t>Диагностика</w:t>
             </w:r>
           </w:p>
@@ -2151,9 +2946,19 @@
         <w:tc>
           <w:tcPr>
             <w:tcW w:type="dxa" w:w="2339"/>
-          </w:tcPr>
-          <w:p>
-            <w:r>
+            <w:vAlign w:val="center"/>
+          </w:tcPr>
+          <w:p>
+            <w:pPr>
+              <w:spacing w:before="0" w:after="0" w:line="240" w:lineRule="auto"/>
+              <w:jc w:val="left"/>
+            </w:pPr>
+            <w:r>
+              <w:rPr>
+                <w:rFonts w:ascii="Times New Roman" w:hAnsi="Times New Roman"/>
+                <w:b w:val="0"/>
+                <w:sz w:val="22"/>
+              </w:rPr>
               <w:t>JSON</w:t>
             </w:r>
           </w:p>
@@ -2161,9 +2966,19 @@
         <w:tc>
           <w:tcPr>
             <w:tcW w:type="dxa" w:w="2339"/>
-          </w:tcPr>
-          <w:p>
-            <w:r>
+            <w:vAlign w:val="center"/>
+          </w:tcPr>
+          <w:p>
+            <w:pPr>
+              <w:spacing w:before="0" w:after="0" w:line="240" w:lineRule="auto"/>
+              <w:jc w:val="left"/>
+            </w:pPr>
+            <w:r>
+              <w:rPr>
+                <w:rFonts w:ascii="Times New Roman" w:hAnsi="Times New Roman"/>
+                <w:b w:val="0"/>
+                <w:sz w:val="22"/>
+              </w:rPr>
               <w:t>PASS; без секретов</w:t>
             </w:r>
           </w:p>
@@ -2171,9 +2986,19 @@
         <w:tc>
           <w:tcPr>
             <w:tcW w:type="dxa" w:w="2339"/>
-          </w:tcPr>
-          <w:p>
-            <w:r>
+            <w:vAlign w:val="center"/>
+          </w:tcPr>
+          <w:p>
+            <w:pPr>
+              <w:spacing w:before="0" w:after="0" w:line="240" w:lineRule="auto"/>
+              <w:jc w:val="left"/>
+            </w:pPr>
+            <w:r>
+              <w:rPr>
+                <w:rFonts w:ascii="Times New Roman" w:hAnsi="Times New Roman"/>
+                <w:b w:val="0"/>
+                <w:sz w:val="22"/>
+              </w:rPr>
               <w:t>workspace-smoke</w:t>
             </w:r>
           </w:p>
@@ -2183,9 +3008,19 @@
         <w:tc>
           <w:tcPr>
             <w:tcW w:type="dxa" w:w="2339"/>
-          </w:tcPr>
-          <w:p>
-            <w:r>
+            <w:vAlign w:val="center"/>
+          </w:tcPr>
+          <w:p>
+            <w:pPr>
+              <w:spacing w:before="0" w:after="0" w:line="240" w:lineRule="auto"/>
+              <w:jc w:val="left"/>
+            </w:pPr>
+            <w:r>
+              <w:rPr>
+                <w:rFonts w:ascii="Times New Roman" w:hAnsi="Times New Roman"/>
+                <w:b w:val="0"/>
+                <w:sz w:val="22"/>
+              </w:rPr>
               <w:t>Восстановление</w:t>
             </w:r>
           </w:p>
@@ -2193,9 +3028,19 @@
         <w:tc>
           <w:tcPr>
             <w:tcW w:type="dxa" w:w="2339"/>
-          </w:tcPr>
-          <w:p>
-            <w:r>
+            <w:vAlign w:val="center"/>
+          </w:tcPr>
+          <w:p>
+            <w:pPr>
+              <w:spacing w:before="0" w:after="0" w:line="240" w:lineRule="auto"/>
+              <w:jc w:val="left"/>
+            </w:pPr>
+            <w:r>
+              <w:rPr>
+                <w:rFonts w:ascii="Times New Roman" w:hAnsi="Times New Roman"/>
+                <w:b w:val="0"/>
+                <w:sz w:val="22"/>
+              </w:rPr>
               <w:t>PASS</w:t>
             </w:r>
           </w:p>
@@ -2203,9 +3048,19 @@
         <w:tc>
           <w:tcPr>
             <w:tcW w:type="dxa" w:w="2339"/>
-          </w:tcPr>
-          <w:p>
-            <w:r>
+            <w:vAlign w:val="center"/>
+          </w:tcPr>
+          <w:p>
+            <w:pPr>
+              <w:spacing w:before="0" w:after="0" w:line="240" w:lineRule="auto"/>
+              <w:jc w:val="left"/>
+            </w:pPr>
+            <w:r>
+              <w:rPr>
+                <w:rFonts w:ascii="Times New Roman" w:hAnsi="Times New Roman"/>
+                <w:b w:val="0"/>
+                <w:sz w:val="22"/>
+              </w:rPr>
               <w:t>PASS</w:t>
             </w:r>
           </w:p>
@@ -2213,9 +3068,19 @@
         <w:tc>
           <w:tcPr>
             <w:tcW w:type="dxa" w:w="2339"/>
-          </w:tcPr>
-          <w:p>
-            <w:r>
+            <w:vAlign w:val="center"/>
+          </w:tcPr>
+          <w:p>
+            <w:pPr>
+              <w:spacing w:before="0" w:after="0" w:line="240" w:lineRule="auto"/>
+              <w:jc w:val="left"/>
+            </w:pPr>
+            <w:r>
+              <w:rPr>
+                <w:rFonts w:ascii="Times New Roman" w:hAnsi="Times New Roman"/>
+                <w:b w:val="0"/>
+                <w:sz w:val="22"/>
+              </w:rPr>
               <w:t>restoration</w:t>
             </w:r>
           </w:p>

</xml_diff>